<commit_message>
Fix bug in MPDA sort, if 'cluster log 0' is used.
</commit_message>
<xml_diff>
--- a/doc/GeoPIXE open mods needed.docx
+++ b/doc/GeoPIXE open mods needed.docx
@@ -250,6 +250,149 @@
         <w:autoSpaceDN w:val="0"/>
         <w:adjustRightInd w:val="0"/>
       </w:pPr>
+      <w:r>
+        <w:t>MPDA mode with Cluster bombs somewhere …</w:t>
+      </w:r>
+    </w:p>
+    <w:p>
+      <w:pPr>
+        <w:widowControl w:val="0"/>
+        <w:numPr>
+          <w:ilvl w:val="2"/>
+          <w:numId w:val="6"/>
+        </w:numPr>
+        <w:tabs>
+          <w:tab w:val="left" w:pos="6521"/>
+        </w:tabs>
+        <w:autoSpaceDE w:val="0"/>
+        <w:autoSpaceDN w:val="0"/>
+        <w:adjustRightInd w:val="0"/>
+      </w:pPr>
+      <w:r>
+        <w:t xml:space="preserve">Works if “cluster log 1” enabled, </w:t>
+      </w:r>
+    </w:p>
+    <w:p>
+      <w:pPr>
+        <w:widowControl w:val="0"/>
+        <w:numPr>
+          <w:ilvl w:val="3"/>
+          <w:numId w:val="6"/>
+        </w:numPr>
+        <w:tabs>
+          <w:tab w:val="left" w:pos="6521"/>
+        </w:tabs>
+        <w:autoSpaceDE w:val="0"/>
+        <w:autoSpaceDN w:val="0"/>
+        <w:adjustRightInd w:val="0"/>
+      </w:pPr>
+      <w:r>
+        <w:t>so it’s a print statement somewhere</w:t>
+      </w:r>
+      <w:r>
+        <w:t>, which causes a crash</w:t>
+      </w:r>
+    </w:p>
+    <w:p>
+      <w:pPr>
+        <w:widowControl w:val="0"/>
+        <w:numPr>
+          <w:ilvl w:val="3"/>
+          <w:numId w:val="6"/>
+        </w:numPr>
+        <w:tabs>
+          <w:tab w:val="left" w:pos="6521"/>
+        </w:tabs>
+        <w:autoSpaceDE w:val="0"/>
+        <w:autoSpaceDN w:val="0"/>
+        <w:adjustRightInd w:val="0"/>
+        <w:ind w:left="2520"/>
+      </w:pPr>
+      <w:r>
+        <w:t>crash in ‘geopixe_execute’ causes ‘cleanup’, which return error=1</w:t>
+      </w:r>
+    </w:p>
+    <w:p>
+      <w:pPr>
+        <w:widowControl w:val="0"/>
+        <w:numPr>
+          <w:ilvl w:val="3"/>
+          <w:numId w:val="6"/>
+        </w:numPr>
+        <w:tabs>
+          <w:tab w:val="left" w:pos="6521"/>
+        </w:tabs>
+        <w:autoSpaceDE w:val="0"/>
+        <w:autoSpaceDN w:val="0"/>
+        <w:adjustRightInd w:val="0"/>
+        <w:ind w:left="2520"/>
+      </w:pPr>
+      <w:r>
+        <w:t>this would be caused by crash in ‘execute’ of ‘da_evt’</w:t>
+      </w:r>
+    </w:p>
+    <w:p>
+      <w:pPr>
+        <w:widowControl w:val="0"/>
+        <w:numPr>
+          <w:ilvl w:val="3"/>
+          <w:numId w:val="6"/>
+        </w:numPr>
+        <w:tabs>
+          <w:tab w:val="left" w:pos="6521"/>
+        </w:tabs>
+        <w:autoSpaceDE w:val="0"/>
+        <w:autoSpaceDN w:val="0"/>
+        <w:adjustRightInd w:val="0"/>
+        <w:ind w:left="2520"/>
+      </w:pPr>
+      <w:r>
+        <w:t xml:space="preserve">found some prints in ‘read_da’, which gets called in MPDA mode. </w:t>
+      </w:r>
+    </w:p>
+    <w:p>
+      <w:pPr>
+        <w:widowControl w:val="0"/>
+        <w:numPr>
+          <w:ilvl w:val="3"/>
+          <w:numId w:val="6"/>
+        </w:numPr>
+        <w:tabs>
+          <w:tab w:val="left" w:pos="6521"/>
+        </w:tabs>
+        <w:autoSpaceDE w:val="0"/>
+        <w:autoSpaceDN w:val="0"/>
+        <w:adjustRightInd w:val="0"/>
+        <w:ind w:left="2520"/>
+      </w:pPr>
+      <w:r>
+        <w:t>Fixed these and compile, so restore geopixe gets it.</w:t>
+      </w:r>
+    </w:p>
+    <w:p>
+      <w:pPr>
+        <w:widowControl w:val="0"/>
+        <w:numPr>
+          <w:ilvl w:val="3"/>
+          <w:numId w:val="6"/>
+        </w:numPr>
+        <w:tabs>
+          <w:tab w:val="left" w:pos="6521"/>
+        </w:tabs>
+        <w:autoSpaceDE w:val="0"/>
+        <w:autoSpaceDN w:val="0"/>
+        <w:adjustRightInd w:val="0"/>
+        <w:ind w:left="2520"/>
+      </w:pPr>
+      <w:r>
+        <w:t xml:space="preserve">MPDA does read of phase maps, does this </w:t>
+      </w:r>
+      <w:r>
+        <w:t>g</w:t>
+      </w:r>
+      <w:r>
+        <w:t>print?</w:t>
+      </w:r>
     </w:p>
     <w:p>
       <w:pPr>
@@ -728,6 +871,7 @@
         </w:numPr>
       </w:pPr>
       <w:r>
+        <w:lastRenderedPageBreak/>
         <w:t>Does it include expected elements too?</w:t>
       </w:r>
     </w:p>
@@ -840,7 +984,6 @@
         </w:numPr>
       </w:pPr>
       <w:r>
-        <w:lastRenderedPageBreak/>
         <w:t>Working with small ROI in huge images</w:t>
       </w:r>
     </w:p>
@@ -1408,6 +1551,7 @@
         </w:numPr>
       </w:pPr>
       <w:r>
+        <w:lastRenderedPageBreak/>
         <w:t>Maybe from a Wizard calling ‘geopixe_execute’ directly?</w:t>
       </w:r>
     </w:p>
@@ -1504,7 +1648,6 @@
         <w:rPr>
           <w:highlight w:val="yellow"/>
         </w:rPr>
-        <w:lastRenderedPageBreak/>
         <w:t>Perhaps detect lack of a .GCF file as argv[0</w:t>
       </w:r>
       <w:r>
@@ -2161,6 +2304,7 @@
         <w:rPr>
           <w:highlight w:val="yellow"/>
         </w:rPr>
+        <w:lastRenderedPageBreak/>
         <w:t>Filters?</w:t>
       </w:r>
     </w:p>
@@ -2261,7 +2405,6 @@
         </w:numPr>
       </w:pPr>
       <w:r>
-        <w:lastRenderedPageBreak/>
         <w:t>This should keep connection open.</w:t>
       </w:r>
     </w:p>
@@ -2979,6 +3122,7 @@
         <w:adjustRightInd w:val="0"/>
       </w:pPr>
       <w:r>
+        <w:lastRenderedPageBreak/>
         <w:t xml:space="preserve">‘Get_linear’ probably assumes (single) old format vector. </w:t>
       </w:r>
     </w:p>
@@ -3058,7 +3202,6 @@
         </w:numPr>
       </w:pPr>
       <w:r>
-        <w:lastRenderedPageBreak/>
         <w:t xml:space="preserve">Does not export the </w:t>
       </w:r>
       <w:r>
@@ -3620,6 +3763,7 @@
         </w:numPr>
       </w:pPr>
       <w:r>
+        <w:lastRenderedPageBreak/>
         <w:t>Wizard general</w:t>
       </w:r>
     </w:p>
@@ -3706,41 +3850,467 @@
         </w:numPr>
       </w:pPr>
       <w:r>
+        <w:t>MPDA work-flow</w:t>
+      </w:r>
+    </w:p>
+    <w:p>
+      <w:pPr>
+        <w:numPr>
+          <w:ilvl w:val="2"/>
+          <w:numId w:val="6"/>
+        </w:numPr>
+      </w:pPr>
+      <w:r>
+        <w:t>Options?</w:t>
+      </w:r>
+    </w:p>
+    <w:p>
+      <w:pPr>
+        <w:numPr>
+          <w:ilvl w:val="3"/>
+          <w:numId w:val="6"/>
+        </w:numPr>
+      </w:pPr>
+      <w:r>
+        <w:t xml:space="preserve">As Batch sort extras, </w:t>
+      </w:r>
+    </w:p>
+    <w:p>
+      <w:pPr>
+        <w:numPr>
+          <w:ilvl w:val="3"/>
+          <w:numId w:val="6"/>
+        </w:numPr>
+      </w:pPr>
+      <w:r>
+        <w:t>Or start to build MPDA Wizard?</w:t>
+      </w:r>
+    </w:p>
+    <w:p>
+      <w:pPr>
+        <w:numPr>
+          <w:ilvl w:val="4"/>
+          <w:numId w:val="6"/>
+        </w:numPr>
+      </w:pPr>
+      <w:r>
+        <w:t>May take over much of Batch Sort functionality?</w:t>
+      </w:r>
+    </w:p>
+    <w:p>
+      <w:pPr>
+        <w:numPr>
+          <w:ilvl w:val="3"/>
+          <w:numId w:val="6"/>
+        </w:numPr>
+      </w:pPr>
+      <w:r>
+        <w:t>Or, just a simple flow-on from a MPDA sort</w:t>
+      </w:r>
+    </w:p>
+    <w:p>
+      <w:pPr>
+        <w:numPr>
+          <w:ilvl w:val="4"/>
+          <w:numId w:val="6"/>
+        </w:numPr>
+      </w:pPr>
+      <w:r>
+        <w:t>In absence of phases, it does normal sort, correct, project Minerals?</w:t>
+      </w:r>
+    </w:p>
+    <w:p>
+      <w:pPr>
+        <w:numPr>
+          <w:ilvl w:val="4"/>
+          <w:numId w:val="6"/>
+        </w:numPr>
+      </w:pPr>
+      <w:r>
+        <w:t>And then builds mpdam file and repeats as MPDA sort?</w:t>
+      </w:r>
+    </w:p>
+    <w:p>
+      <w:pPr>
+        <w:numPr>
+          <w:ilvl w:val="2"/>
+          <w:numId w:val="6"/>
+        </w:numPr>
+      </w:pPr>
+      <w:r>
+        <w:t>Distinguish between</w:t>
+      </w:r>
+    </w:p>
+    <w:p>
+      <w:pPr>
+        <w:numPr>
+          <w:ilvl w:val="3"/>
+          <w:numId w:val="6"/>
+        </w:numPr>
+      </w:pPr>
+      <w:r>
+        <w:t>Building phase regions, all DA matrix files and a new .correct file.</w:t>
+      </w:r>
+    </w:p>
+    <w:p>
+      <w:pPr>
+        <w:numPr>
+          <w:ilvl w:val="4"/>
+          <w:numId w:val="6"/>
+        </w:numPr>
+      </w:pPr>
+      <w:r>
+        <w:t>Extract suitable regions and spectra.</w:t>
+      </w:r>
+    </w:p>
+    <w:p>
+      <w:pPr>
+        <w:numPr>
+          <w:ilvl w:val="4"/>
+          <w:numId w:val="6"/>
+        </w:numPr>
+      </w:pPr>
+      <w:r>
+        <w:t>Fit spectra, with appropriate yield for phase, and make DA matrix.</w:t>
+      </w:r>
+    </w:p>
+    <w:p>
+      <w:pPr>
+        <w:numPr>
+          <w:ilvl w:val="4"/>
+          <w:numId w:val="6"/>
+        </w:numPr>
+      </w:pPr>
+      <w:r>
+        <w:t>Use “MPDA Master Weights” in DA matrix</w:t>
+      </w:r>
+    </w:p>
+    <w:p>
+      <w:pPr>
+        <w:numPr>
+          <w:ilvl w:val="4"/>
+          <w:numId w:val="6"/>
+        </w:numPr>
+      </w:pPr>
+      <w:r>
+        <w:t>Construct .correct file.</w:t>
+      </w:r>
+    </w:p>
+    <w:p>
+      <w:pPr>
+        <w:numPr>
+          <w:ilvl w:val="3"/>
+          <w:numId w:val="6"/>
+        </w:numPr>
+      </w:pPr>
+      <w:r>
+        <w:t>Using an existing .correct file (including DA matrix files) to:</w:t>
+      </w:r>
+    </w:p>
+    <w:p>
+      <w:pPr>
+        <w:numPr>
+          <w:ilvl w:val="4"/>
+          <w:numId w:val="6"/>
+        </w:numPr>
+      </w:pPr>
+      <w:r>
+        <w:t>Extend Sort Evt behaviour.</w:t>
+      </w:r>
+    </w:p>
+    <w:p>
+      <w:pPr>
+        <w:numPr>
+          <w:ilvl w:val="1"/>
+          <w:numId w:val="6"/>
+        </w:numPr>
+      </w:pPr>
+      <w:r>
+        <w:t>MPDA issues</w:t>
+      </w:r>
+    </w:p>
+    <w:p>
+      <w:pPr>
+        <w:numPr>
+          <w:ilvl w:val="2"/>
+          <w:numId w:val="6"/>
+        </w:numPr>
+      </w:pPr>
+      <w:r>
+        <w:t>If not cluster mode, how to do ‘geopixe_do_DA’?</w:t>
+      </w:r>
+    </w:p>
+    <w:p>
+      <w:pPr>
+        <w:numPr>
+          <w:ilvl w:val="3"/>
+          <w:numId w:val="6"/>
+        </w:numPr>
+      </w:pPr>
+      <w:r>
+        <w:t>Perhaps always build ‘args’ and call ‘geopixe_execute’ as used in ‘geopixe_do_command’.</w:t>
+      </w:r>
+    </w:p>
+    <w:p>
+      <w:pPr>
+        <w:numPr>
+          <w:ilvl w:val="3"/>
+          <w:numId w:val="6"/>
+        </w:numPr>
+      </w:pPr>
+      <w:r>
+        <w:t>But then can’t run in VM mode!</w:t>
+      </w:r>
+    </w:p>
+    <w:p>
+      <w:pPr>
+        <w:numPr>
+          <w:ilvl w:val="2"/>
+          <w:numId w:val="6"/>
+        </w:numPr>
+      </w:pPr>
+      <w:r>
+        <w:t xml:space="preserve">Pt hotspots may appear as only 3% Pt mineral and 97% silicates. But ALL of the Pt in them is from the Pt phase component. </w:t>
+      </w:r>
+    </w:p>
+    <w:p>
+      <w:pPr>
+        <w:numPr>
+          <w:ilvl w:val="3"/>
+          <w:numId w:val="6"/>
+        </w:numPr>
+      </w:pPr>
+      <w:r>
+        <w:t>Fit using straight Pt works, MPDA rel int poor (Lg too high).</w:t>
+      </w:r>
+    </w:p>
+    <w:p>
+      <w:pPr>
+        <w:numPr>
+          <w:ilvl w:val="3"/>
+          <w:numId w:val="6"/>
+        </w:numPr>
+      </w:pPr>
+      <w:r>
+        <w:t>What relative intensities should be used?</w:t>
+      </w:r>
+    </w:p>
+    <w:p>
+      <w:pPr>
+        <w:numPr>
+          <w:ilvl w:val="2"/>
+          <w:numId w:val="6"/>
+        </w:numPr>
+      </w:pPr>
+      <w:r>
+        <w:t>Perhaps distinguish between trace elements and majors in formula?</w:t>
+      </w:r>
+    </w:p>
+    <w:p>
+      <w:pPr>
+        <w:numPr>
+          <w:ilvl w:val="3"/>
+          <w:numId w:val="6"/>
+        </w:numPr>
+      </w:pPr>
+      <w:r>
+        <w:t>But you weight by phase DA matrix, not element.</w:t>
+      </w:r>
+    </w:p>
+    <w:p>
+      <w:pPr>
+        <w:numPr>
+          <w:ilvl w:val="1"/>
+          <w:numId w:val="6"/>
+        </w:numPr>
+      </w:pPr>
+      <w:r>
+        <w:t>Correct Yield Wizard</w:t>
+      </w:r>
+    </w:p>
+    <w:p>
+      <w:pPr>
+        <w:numPr>
+          <w:ilvl w:val="2"/>
+          <w:numId w:val="6"/>
+        </w:numPr>
+      </w:pPr>
+      <w:r>
+        <w:t>How to guide through regions analysis?</w:t>
+      </w:r>
+    </w:p>
+    <w:p>
+      <w:pPr>
+        <w:numPr>
+          <w:ilvl w:val="3"/>
+          <w:numId w:val="6"/>
+        </w:numPr>
+      </w:pPr>
+      <w:r>
+        <w:t>Define major distinct phases and extract spectra from them.</w:t>
+      </w:r>
+    </w:p>
+    <w:p>
+      <w:pPr>
+        <w:numPr>
+          <w:ilvl w:val="4"/>
+          <w:numId w:val="6"/>
+        </w:numPr>
+      </w:pPr>
+      <w:r>
+        <w:t>Try to find pixels close to the pure phases.</w:t>
+      </w:r>
+    </w:p>
+    <w:p>
+      <w:pPr>
+        <w:numPr>
+          <w:ilvl w:val="4"/>
+          <w:numId w:val="6"/>
+        </w:numPr>
+      </w:pPr>
+      <w:r>
+        <w:t>Don’t want them too diluted with non-pure phase contributions.</w:t>
+      </w:r>
+    </w:p>
+    <w:p>
+      <w:pPr>
+        <w:numPr>
+          <w:ilvl w:val="3"/>
+          <w:numId w:val="6"/>
+        </w:numPr>
+      </w:pPr>
+      <w:r>
+        <w:t>Fit each one to create a DA matrix for each using correct yields.</w:t>
+      </w:r>
+    </w:p>
+    <w:p>
+      <w:pPr>
+        <w:numPr>
+          <w:ilvl w:val="2"/>
+          <w:numId w:val="6"/>
+        </w:numPr>
+      </w:pPr>
+      <w:r>
+        <w:t>Need a “wt%” tool/help to fill in composition matrix.</w:t>
+      </w:r>
+    </w:p>
+    <w:p>
+      <w:pPr>
+        <w:numPr>
+          <w:ilvl w:val="3"/>
+          <w:numId w:val="6"/>
+        </w:numPr>
+      </w:pPr>
+      <w:r>
+        <w:t>If define element columns first, then a “get” of a DA matrix row just fills in the wt% for these elements in the table?</w:t>
+      </w:r>
+    </w:p>
+    <w:p>
+      <w:pPr>
+        <w:numPr>
+          <w:ilvl w:val="4"/>
+          <w:numId w:val="6"/>
+        </w:numPr>
+      </w:pPr>
+      <w:r>
+        <w:t>DA matrix file does NOT have this info.</w:t>
+      </w:r>
+    </w:p>
+    <w:p>
+      <w:pPr>
+        <w:numPr>
+          <w:ilvl w:val="5"/>
+          <w:numId w:val="6"/>
+        </w:numPr>
+      </w:pPr>
+      <w:r>
+        <w:t>Yield file does, so perhaps save this filename in DA matrix?</w:t>
+      </w:r>
+    </w:p>
+    <w:p>
+      <w:pPr>
+        <w:numPr>
+          <w:ilvl w:val="5"/>
+          <w:numId w:val="6"/>
+        </w:numPr>
+      </w:pPr>
+      <w:r>
+        <w:t>New version would be a pain for existing files.</w:t>
+      </w:r>
+    </w:p>
+    <w:p>
+      <w:pPr>
+        <w:numPr>
+          <w:ilvl w:val="4"/>
+          <w:numId w:val="6"/>
+        </w:numPr>
+      </w:pPr>
+      <w:r>
+        <w:t>Or, read_yield when typing in mineral name?</w:t>
+      </w:r>
+    </w:p>
+    <w:p>
+      <w:pPr>
+        <w:numPr>
+          <w:ilvl w:val="4"/>
+          <w:numId w:val="6"/>
+        </w:numPr>
+      </w:pPr>
+      <w:r>
+        <w:t>OK in COMAT file, as we use yield files there.</w:t>
+      </w:r>
+    </w:p>
+    <w:p>
+      <w:pPr>
+        <w:numPr>
+          <w:ilvl w:val="5"/>
+          <w:numId w:val="6"/>
+        </w:numPr>
+      </w:pPr>
+      <w:r>
+        <w:t>But do we want yields to override table entries?</w:t>
+      </w:r>
+    </w:p>
+    <w:p>
+      <w:pPr>
+        <w:numPr>
+          <w:ilvl w:val="3"/>
+          <w:numId w:val="6"/>
+        </w:numPr>
+      </w:pPr>
+      <w:r>
+        <w:t>Or, have a pop-up tool that reports wt% from a selected .yield file?</w:t>
+      </w:r>
+    </w:p>
+    <w:p>
+      <w:pPr>
+        <w:numPr>
+          <w:ilvl w:val="4"/>
+          <w:numId w:val="6"/>
+        </w:numPr>
+      </w:pPr>
+    </w:p>
+    <w:p>
+      <w:pPr>
+        <w:numPr>
+          <w:ilvl w:val="2"/>
+          <w:numId w:val="6"/>
+        </w:numPr>
+      </w:pPr>
+      <w:r>
+        <w:t>Save .Correct file for image correction.</w:t>
+      </w:r>
+    </w:p>
+    <w:p>
+      <w:pPr>
+        <w:numPr>
+          <w:ilvl w:val="3"/>
+          <w:numId w:val="6"/>
+        </w:numPr>
+      </w:pPr>
+      <w:r>
         <w:lastRenderedPageBreak/>
-        <w:t>MPDA work-flow</w:t>
-      </w:r>
-    </w:p>
-    <w:p>
-      <w:pPr>
-        <w:numPr>
-          <w:ilvl w:val="2"/>
-          <w:numId w:val="6"/>
-        </w:numPr>
-      </w:pPr>
-      <w:r>
-        <w:t>Options?</w:t>
-      </w:r>
-    </w:p>
-    <w:p>
-      <w:pPr>
-        <w:numPr>
-          <w:ilvl w:val="3"/>
-          <w:numId w:val="6"/>
-        </w:numPr>
-      </w:pPr>
-      <w:r>
-        <w:t xml:space="preserve">As Batch sort extras, </w:t>
-      </w:r>
-    </w:p>
-    <w:p>
-      <w:pPr>
-        <w:numPr>
-          <w:ilvl w:val="3"/>
-          <w:numId w:val="6"/>
-        </w:numPr>
-      </w:pPr>
-      <w:r>
-        <w:t>Or start to build MPDA Wizard?</w:t>
+        <w:t>Do we correct images here, or below?</w:t>
       </w:r>
     </w:p>
     <w:p>
@@ -3751,18 +4321,7 @@
         </w:numPr>
       </w:pPr>
       <w:r>
-        <w:t>May take over much of Batch Sort functionality?</w:t>
-      </w:r>
-    </w:p>
-    <w:p>
-      <w:pPr>
-        <w:numPr>
-          <w:ilvl w:val="3"/>
-          <w:numId w:val="6"/>
-        </w:numPr>
-      </w:pPr>
-      <w:r>
-        <w:t>Or, just a simple flow-on from a MPDA sort</w:t>
+        <w:t>Have another tab for image correction and projecting phase maps.</w:t>
       </w:r>
     </w:p>
     <w:p>
@@ -3773,7 +4332,18 @@
         </w:numPr>
       </w:pPr>
       <w:r>
-        <w:t>In absence of phases, it does normal sort, correct, project Minerals?</w:t>
+        <w:t>Some overlap with first tab of MPDA Wizard?</w:t>
+      </w:r>
+    </w:p>
+    <w:p>
+      <w:pPr>
+        <w:numPr>
+          <w:ilvl w:val="3"/>
+          <w:numId w:val="6"/>
+        </w:numPr>
+      </w:pPr>
+      <w:r>
+        <w:t>Should have guides, or tests, to ensure phases are reasonable</w:t>
       </w:r>
     </w:p>
     <w:p>
@@ -3784,29 +4354,7 @@
         </w:numPr>
       </w:pPr>
       <w:r>
-        <w:t>And then builds mpdam file and repeats as MPDA sort?</w:t>
-      </w:r>
-    </w:p>
-    <w:p>
-      <w:pPr>
-        <w:numPr>
-          <w:ilvl w:val="2"/>
-          <w:numId w:val="6"/>
-        </w:numPr>
-      </w:pPr>
-      <w:r>
-        <w:t>Distinguish between</w:t>
-      </w:r>
-    </w:p>
-    <w:p>
-      <w:pPr>
-        <w:numPr>
-          <w:ilvl w:val="3"/>
-          <w:numId w:val="6"/>
-        </w:numPr>
-      </w:pPr>
-      <w:r>
-        <w:t>Building phase regions, all DA matrix files and a new .correct file.</w:t>
+        <w:t>Should not go well above 1.0 before clipping.</w:t>
       </w:r>
     </w:p>
     <w:p>
@@ -3817,260 +4365,7 @@
         </w:numPr>
       </w:pPr>
       <w:r>
-        <w:t>Extract suitable regions and spectra.</w:t>
-      </w:r>
-    </w:p>
-    <w:p>
-      <w:pPr>
-        <w:numPr>
-          <w:ilvl w:val="4"/>
-          <w:numId w:val="6"/>
-        </w:numPr>
-      </w:pPr>
-      <w:r>
-        <w:t>Fit spectra, with appropriate yield for phase, and make DA matrix.</w:t>
-      </w:r>
-    </w:p>
-    <w:p>
-      <w:pPr>
-        <w:numPr>
-          <w:ilvl w:val="4"/>
-          <w:numId w:val="6"/>
-        </w:numPr>
-      </w:pPr>
-      <w:r>
-        <w:t>Use “MPDA Master Weights” in DA matrix</w:t>
-      </w:r>
-    </w:p>
-    <w:p>
-      <w:pPr>
-        <w:numPr>
-          <w:ilvl w:val="4"/>
-          <w:numId w:val="6"/>
-        </w:numPr>
-      </w:pPr>
-      <w:r>
-        <w:t>Construct .correct file.</w:t>
-      </w:r>
-    </w:p>
-    <w:p>
-      <w:pPr>
-        <w:numPr>
-          <w:ilvl w:val="3"/>
-          <w:numId w:val="6"/>
-        </w:numPr>
-      </w:pPr>
-      <w:r>
-        <w:t>Using an existing .correct file (including DA matrix files) to:</w:t>
-      </w:r>
-    </w:p>
-    <w:p>
-      <w:pPr>
-        <w:numPr>
-          <w:ilvl w:val="4"/>
-          <w:numId w:val="6"/>
-        </w:numPr>
-      </w:pPr>
-      <w:r>
-        <w:t>Extend Sort Evt behaviour.</w:t>
-      </w:r>
-    </w:p>
-    <w:p>
-      <w:pPr>
-        <w:numPr>
-          <w:ilvl w:val="1"/>
-          <w:numId w:val="6"/>
-        </w:numPr>
-      </w:pPr>
-      <w:r>
-        <w:t>MPDA issues</w:t>
-      </w:r>
-    </w:p>
-    <w:p>
-      <w:pPr>
-        <w:numPr>
-          <w:ilvl w:val="2"/>
-          <w:numId w:val="6"/>
-        </w:numPr>
-      </w:pPr>
-      <w:r>
-        <w:t>If not cluster mode, how to do ‘geopixe_do_DA’?</w:t>
-      </w:r>
-    </w:p>
-    <w:p>
-      <w:pPr>
-        <w:numPr>
-          <w:ilvl w:val="3"/>
-          <w:numId w:val="6"/>
-        </w:numPr>
-      </w:pPr>
-      <w:r>
-        <w:t>Perhaps always build ‘args’ and call ‘geopixe_execute’ as used in ‘geopixe_do_command’.</w:t>
-      </w:r>
-    </w:p>
-    <w:p>
-      <w:pPr>
-        <w:numPr>
-          <w:ilvl w:val="3"/>
-          <w:numId w:val="6"/>
-        </w:numPr>
-      </w:pPr>
-      <w:r>
-        <w:t>But then can’t run in VM mode!</w:t>
-      </w:r>
-    </w:p>
-    <w:p>
-      <w:pPr>
-        <w:numPr>
-          <w:ilvl w:val="2"/>
-          <w:numId w:val="6"/>
-        </w:numPr>
-      </w:pPr>
-      <w:r>
-        <w:t xml:space="preserve">Pt hotspots may appear as only 3% Pt mineral and 97% silicates. But ALL of the Pt in them is from the Pt phase component. </w:t>
-      </w:r>
-    </w:p>
-    <w:p>
-      <w:pPr>
-        <w:numPr>
-          <w:ilvl w:val="3"/>
-          <w:numId w:val="6"/>
-        </w:numPr>
-      </w:pPr>
-      <w:r>
-        <w:t>Fit using straight Pt works, MPDA rel int poor (Lg too high).</w:t>
-      </w:r>
-    </w:p>
-    <w:p>
-      <w:pPr>
-        <w:numPr>
-          <w:ilvl w:val="3"/>
-          <w:numId w:val="6"/>
-        </w:numPr>
-      </w:pPr>
-      <w:r>
-        <w:t>What relative intensities should be used?</w:t>
-      </w:r>
-    </w:p>
-    <w:p>
-      <w:pPr>
-        <w:numPr>
-          <w:ilvl w:val="2"/>
-          <w:numId w:val="6"/>
-        </w:numPr>
-      </w:pPr>
-      <w:r>
-        <w:t>Perhaps distinguish between trace elements and majors in formula?</w:t>
-      </w:r>
-    </w:p>
-    <w:p>
-      <w:pPr>
-        <w:numPr>
-          <w:ilvl w:val="3"/>
-          <w:numId w:val="6"/>
-        </w:numPr>
-      </w:pPr>
-      <w:r>
-        <w:t>But you weight by phase DA matrix, not element.</w:t>
-      </w:r>
-    </w:p>
-    <w:p>
-      <w:pPr>
-        <w:numPr>
-          <w:ilvl w:val="1"/>
-          <w:numId w:val="6"/>
-        </w:numPr>
-      </w:pPr>
-      <w:r>
-        <w:t>Correct Yield Wizard</w:t>
-      </w:r>
-    </w:p>
-    <w:p>
-      <w:pPr>
-        <w:numPr>
-          <w:ilvl w:val="2"/>
-          <w:numId w:val="6"/>
-        </w:numPr>
-      </w:pPr>
-      <w:r>
-        <w:t>How to guide through regions analysis?</w:t>
-      </w:r>
-    </w:p>
-    <w:p>
-      <w:pPr>
-        <w:numPr>
-          <w:ilvl w:val="3"/>
-          <w:numId w:val="6"/>
-        </w:numPr>
-      </w:pPr>
-      <w:r>
-        <w:t>Define major distinct phases and extract spectra from them.</w:t>
-      </w:r>
-    </w:p>
-    <w:p>
-      <w:pPr>
-        <w:numPr>
-          <w:ilvl w:val="4"/>
-          <w:numId w:val="6"/>
-        </w:numPr>
-      </w:pPr>
-      <w:r>
-        <w:t>Try to find pixels close to the pure phases.</w:t>
-      </w:r>
-    </w:p>
-    <w:p>
-      <w:pPr>
-        <w:numPr>
-          <w:ilvl w:val="4"/>
-          <w:numId w:val="6"/>
-        </w:numPr>
-      </w:pPr>
-      <w:r>
-        <w:t>Don’t want them too diluted with non-pure phase contributions.</w:t>
-      </w:r>
-    </w:p>
-    <w:p>
-      <w:pPr>
-        <w:numPr>
-          <w:ilvl w:val="3"/>
-          <w:numId w:val="6"/>
-        </w:numPr>
-      </w:pPr>
-      <w:r>
-        <w:t>Fit each one to create a DA matrix for each using correct yields.</w:t>
-      </w:r>
-    </w:p>
-    <w:p>
-      <w:pPr>
-        <w:numPr>
-          <w:ilvl w:val="2"/>
-          <w:numId w:val="6"/>
-        </w:numPr>
-      </w:pPr>
-      <w:r>
-        <w:t>Need a “wt%” tool/help to fill in composition matrix.</w:t>
-      </w:r>
-    </w:p>
-    <w:p>
-      <w:pPr>
-        <w:numPr>
-          <w:ilvl w:val="3"/>
-          <w:numId w:val="6"/>
-        </w:numPr>
-      </w:pPr>
-      <w:r>
-        <w:t>If define element columns first, then a “get” of a DA matrix row just fills in the wt% for these elements in the table?</w:t>
-      </w:r>
-    </w:p>
-    <w:p>
-      <w:pPr>
-        <w:numPr>
-          <w:ilvl w:val="4"/>
-          <w:numId w:val="6"/>
-        </w:numPr>
-      </w:pPr>
-      <w:r>
-        <w:t>DA matrix file does NOT have this info.</w:t>
+        <w:t>Should not be too small (Rest too close to 1.0 for most pixels).</w:t>
       </w:r>
     </w:p>
     <w:p>
@@ -4081,158 +4376,6 @@
         </w:numPr>
       </w:pPr>
       <w:r>
-        <w:t>Yield file does, so perhaps save this filename in DA matrix?</w:t>
-      </w:r>
-    </w:p>
-    <w:p>
-      <w:pPr>
-        <w:numPr>
-          <w:ilvl w:val="5"/>
-          <w:numId w:val="6"/>
-        </w:numPr>
-      </w:pPr>
-      <w:r>
-        <w:t>New version would be a pain for existing files.</w:t>
-      </w:r>
-    </w:p>
-    <w:p>
-      <w:pPr>
-        <w:numPr>
-          <w:ilvl w:val="4"/>
-          <w:numId w:val="6"/>
-        </w:numPr>
-      </w:pPr>
-      <w:r>
-        <w:t>Or, read_yield when typing in mineral name?</w:t>
-      </w:r>
-    </w:p>
-    <w:p>
-      <w:pPr>
-        <w:numPr>
-          <w:ilvl w:val="4"/>
-          <w:numId w:val="6"/>
-        </w:numPr>
-      </w:pPr>
-      <w:r>
-        <w:t>OK in COMAT file, as we use yield files there.</w:t>
-      </w:r>
-    </w:p>
-    <w:p>
-      <w:pPr>
-        <w:numPr>
-          <w:ilvl w:val="5"/>
-          <w:numId w:val="6"/>
-        </w:numPr>
-      </w:pPr>
-      <w:r>
-        <w:t>But do we want yields to override table entries?</w:t>
-      </w:r>
-    </w:p>
-    <w:p>
-      <w:pPr>
-        <w:numPr>
-          <w:ilvl w:val="3"/>
-          <w:numId w:val="6"/>
-        </w:numPr>
-      </w:pPr>
-      <w:r>
-        <w:t>Or, have a pop-up tool that reports wt% from a selected .yield file?</w:t>
-      </w:r>
-    </w:p>
-    <w:p>
-      <w:pPr>
-        <w:numPr>
-          <w:ilvl w:val="4"/>
-          <w:numId w:val="6"/>
-        </w:numPr>
-      </w:pPr>
-    </w:p>
-    <w:p>
-      <w:pPr>
-        <w:numPr>
-          <w:ilvl w:val="2"/>
-          <w:numId w:val="6"/>
-        </w:numPr>
-      </w:pPr>
-      <w:r>
-        <w:t>Save .Correct file for image correction.</w:t>
-      </w:r>
-    </w:p>
-    <w:p>
-      <w:pPr>
-        <w:numPr>
-          <w:ilvl w:val="3"/>
-          <w:numId w:val="6"/>
-        </w:numPr>
-      </w:pPr>
-      <w:r>
-        <w:t>Do we correct images here, or below?</w:t>
-      </w:r>
-    </w:p>
-    <w:p>
-      <w:pPr>
-        <w:numPr>
-          <w:ilvl w:val="4"/>
-          <w:numId w:val="6"/>
-        </w:numPr>
-      </w:pPr>
-      <w:r>
-        <w:t>Have another tab for image correction and projecting phase maps.</w:t>
-      </w:r>
-    </w:p>
-    <w:p>
-      <w:pPr>
-        <w:numPr>
-          <w:ilvl w:val="4"/>
-          <w:numId w:val="6"/>
-        </w:numPr>
-      </w:pPr>
-      <w:r>
-        <w:t>Some overlap with first tab of MPDA Wizard?</w:t>
-      </w:r>
-    </w:p>
-    <w:p>
-      <w:pPr>
-        <w:numPr>
-          <w:ilvl w:val="3"/>
-          <w:numId w:val="6"/>
-        </w:numPr>
-      </w:pPr>
-      <w:r>
-        <w:t>Should have guides, or tests, to ensure phases are reasonable</w:t>
-      </w:r>
-    </w:p>
-    <w:p>
-      <w:pPr>
-        <w:numPr>
-          <w:ilvl w:val="4"/>
-          <w:numId w:val="6"/>
-        </w:numPr>
-      </w:pPr>
-      <w:r>
-        <w:t>Should not go well above 1.0 before clipping.</w:t>
-      </w:r>
-    </w:p>
-    <w:p>
-      <w:pPr>
-        <w:numPr>
-          <w:ilvl w:val="4"/>
-          <w:numId w:val="6"/>
-        </w:numPr>
-      </w:pPr>
-      <w:r>
-        <w:t>Should not be too small (Rest too close to 1.0 for most pixels).</w:t>
-      </w:r>
-    </w:p>
-    <w:p>
-      <w:pPr>
-        <w:numPr>
-          <w:ilvl w:val="5"/>
-          <w:numId w:val="6"/>
-        </w:numPr>
-      </w:pPr>
-      <w:r>
-        <w:lastRenderedPageBreak/>
         <w:t>Exception might be bone-like endmember in tissue ‘Rest’.</w:t>
       </w:r>
     </w:p>
@@ -4690,6 +4833,7 @@
         </w:numPr>
       </w:pPr>
       <w:r>
+        <w:lastRenderedPageBreak/>
         <w:t>The rel-int for these lines has been modified by source, windows, air and beam filters; they are not the same as rel-int usually. It really needs a different model integration, with decay with depth as effective conc, and modification of the beam lines rel-int on way out.</w:t>
       </w:r>
     </w:p>
@@ -4701,7 +4845,6 @@
         </w:numPr>
       </w:pPr>
       <w:r>
-        <w:lastRenderedPageBreak/>
         <w:t>Then in a real spectrum, there may be BOTH real conc in sample and scattered lines from source, for the same element (e.g., Ga). Need to be able to select, perhaps, or combine?</w:t>
       </w:r>
     </w:p>
@@ -5161,6 +5304,7 @@
         </w:numPr>
       </w:pPr>
       <w:r>
+        <w:lastRenderedPageBreak/>
         <w:t xml:space="preserve">IDL does </w:t>
       </w:r>
       <w:r>
@@ -5214,7 +5358,6 @@
         </w:numPr>
       </w:pPr>
       <w:r>
-        <w:lastRenderedPageBreak/>
         <w:t>Also look for -q2, -q3, -q4</w:t>
       </w:r>
     </w:p>

</xml_diff>

<commit_message>
Fixed more 'print,' and 'help,' in spawned routines.
</commit_message>
<xml_diff>
--- a/doc/GeoPIXE open mods needed.docx
+++ b/doc/GeoPIXE open mods needed.docx
@@ -74,6 +74,7 @@
         <w:autoSpaceDN w:val="0"/>
         <w:adjustRightInd w:val="0"/>
       </w:pPr>
+      <w:proofErr w:type="spellStart"/>
       <w:r>
         <w:t>X</w:t>
       </w:r>
@@ -81,7 +82,11 @@
         <w:t>Q</w:t>
       </w:r>
       <w:r>
-        <w:t xml:space="preserve">uartz upgrade needed first for </w:t>
+        <w:t>uartz</w:t>
+      </w:r>
+      <w:proofErr w:type="spellEnd"/>
+      <w:r>
+        <w:t xml:space="preserve"> upgrade needed first for </w:t>
       </w:r>
       <w:r>
         <w:t xml:space="preserve">MAC </w:t>
@@ -112,7 +117,23 @@
           <w:b/>
           <w:bCs/>
         </w:rPr>
-        <w:t>X11/XQuartz windowing system</w:t>
+        <w:t>X11/</w:t>
+      </w:r>
+      <w:proofErr w:type="spellStart"/>
+      <w:r>
+        <w:rPr>
+          <w:b/>
+          <w:bCs/>
+        </w:rPr>
+        <w:t>XQuartz</w:t>
+      </w:r>
+      <w:proofErr w:type="spellEnd"/>
+      <w:r>
+        <w:rPr>
+          <w:b/>
+          <w:bCs/>
+        </w:rPr>
+        <w:t xml:space="preserve"> windowing system</w:t>
       </w:r>
       <w:r>
         <w:t> and macOS’s native </w:t>
@@ -203,7 +224,15 @@
         <w:adjustRightInd w:val="0"/>
       </w:pPr>
       <w:r>
-        <w:t>Sav files moved to “geopixe/</w:t>
+        <w:t>Sav files moved to “</w:t>
+      </w:r>
+      <w:proofErr w:type="spellStart"/>
+      <w:r>
+        <w:t>geopixe</w:t>
+      </w:r>
+      <w:proofErr w:type="spellEnd"/>
+      <w:r>
+        <w:t>/</w:t>
       </w:r>
       <w:r>
         <w:t>off</w:t>
@@ -250,149 +279,6 @@
         <w:autoSpaceDN w:val="0"/>
         <w:adjustRightInd w:val="0"/>
       </w:pPr>
-      <w:r>
-        <w:t>MPDA mode with Cluster bombs somewhere …</w:t>
-      </w:r>
-    </w:p>
-    <w:p>
-      <w:pPr>
-        <w:widowControl w:val="0"/>
-        <w:numPr>
-          <w:ilvl w:val="2"/>
-          <w:numId w:val="6"/>
-        </w:numPr>
-        <w:tabs>
-          <w:tab w:val="left" w:pos="6521"/>
-        </w:tabs>
-        <w:autoSpaceDE w:val="0"/>
-        <w:autoSpaceDN w:val="0"/>
-        <w:adjustRightInd w:val="0"/>
-      </w:pPr>
-      <w:r>
-        <w:t xml:space="preserve">Works if “cluster log 1” enabled, </w:t>
-      </w:r>
-    </w:p>
-    <w:p>
-      <w:pPr>
-        <w:widowControl w:val="0"/>
-        <w:numPr>
-          <w:ilvl w:val="3"/>
-          <w:numId w:val="6"/>
-        </w:numPr>
-        <w:tabs>
-          <w:tab w:val="left" w:pos="6521"/>
-        </w:tabs>
-        <w:autoSpaceDE w:val="0"/>
-        <w:autoSpaceDN w:val="0"/>
-        <w:adjustRightInd w:val="0"/>
-      </w:pPr>
-      <w:r>
-        <w:t>so it’s a print statement somewhere</w:t>
-      </w:r>
-      <w:r>
-        <w:t>, which causes a crash</w:t>
-      </w:r>
-    </w:p>
-    <w:p>
-      <w:pPr>
-        <w:widowControl w:val="0"/>
-        <w:numPr>
-          <w:ilvl w:val="3"/>
-          <w:numId w:val="6"/>
-        </w:numPr>
-        <w:tabs>
-          <w:tab w:val="left" w:pos="6521"/>
-        </w:tabs>
-        <w:autoSpaceDE w:val="0"/>
-        <w:autoSpaceDN w:val="0"/>
-        <w:adjustRightInd w:val="0"/>
-        <w:ind w:left="2520"/>
-      </w:pPr>
-      <w:r>
-        <w:t>crash in ‘geopixe_execute’ causes ‘cleanup’, which return error=1</w:t>
-      </w:r>
-    </w:p>
-    <w:p>
-      <w:pPr>
-        <w:widowControl w:val="0"/>
-        <w:numPr>
-          <w:ilvl w:val="3"/>
-          <w:numId w:val="6"/>
-        </w:numPr>
-        <w:tabs>
-          <w:tab w:val="left" w:pos="6521"/>
-        </w:tabs>
-        <w:autoSpaceDE w:val="0"/>
-        <w:autoSpaceDN w:val="0"/>
-        <w:adjustRightInd w:val="0"/>
-        <w:ind w:left="2520"/>
-      </w:pPr>
-      <w:r>
-        <w:t>this would be caused by crash in ‘execute’ of ‘da_evt’</w:t>
-      </w:r>
-    </w:p>
-    <w:p>
-      <w:pPr>
-        <w:widowControl w:val="0"/>
-        <w:numPr>
-          <w:ilvl w:val="3"/>
-          <w:numId w:val="6"/>
-        </w:numPr>
-        <w:tabs>
-          <w:tab w:val="left" w:pos="6521"/>
-        </w:tabs>
-        <w:autoSpaceDE w:val="0"/>
-        <w:autoSpaceDN w:val="0"/>
-        <w:adjustRightInd w:val="0"/>
-        <w:ind w:left="2520"/>
-      </w:pPr>
-      <w:r>
-        <w:t xml:space="preserve">found some prints in ‘read_da’, which gets called in MPDA mode. </w:t>
-      </w:r>
-    </w:p>
-    <w:p>
-      <w:pPr>
-        <w:widowControl w:val="0"/>
-        <w:numPr>
-          <w:ilvl w:val="3"/>
-          <w:numId w:val="6"/>
-        </w:numPr>
-        <w:tabs>
-          <w:tab w:val="left" w:pos="6521"/>
-        </w:tabs>
-        <w:autoSpaceDE w:val="0"/>
-        <w:autoSpaceDN w:val="0"/>
-        <w:adjustRightInd w:val="0"/>
-        <w:ind w:left="2520"/>
-      </w:pPr>
-      <w:r>
-        <w:t>Fixed these and compile, so restore geopixe gets it.</w:t>
-      </w:r>
-    </w:p>
-    <w:p>
-      <w:pPr>
-        <w:widowControl w:val="0"/>
-        <w:numPr>
-          <w:ilvl w:val="3"/>
-          <w:numId w:val="6"/>
-        </w:numPr>
-        <w:tabs>
-          <w:tab w:val="left" w:pos="6521"/>
-        </w:tabs>
-        <w:autoSpaceDE w:val="0"/>
-        <w:autoSpaceDN w:val="0"/>
-        <w:adjustRightInd w:val="0"/>
-        <w:ind w:left="2520"/>
-      </w:pPr>
-      <w:r>
-        <w:t xml:space="preserve">MPDA does read of phase maps, does this </w:t>
-      </w:r>
-      <w:r>
-        <w:t>g</w:t>
-      </w:r>
-      <w:r>
-        <w:t>print?</w:t>
-      </w:r>
     </w:p>
     <w:p>
       <w:pPr>
@@ -486,7 +372,23 @@
           <w:rFonts w:ascii="Calibri" w:eastAsiaTheme="minorHAnsi" w:hAnsi="Calibri"/>
           <w:lang w:eastAsia="en-AU"/>
         </w:rPr>
-        <w:t>Local plugins in geopixe/plugins</w:t>
+        <w:t xml:space="preserve">Local plugins in </w:t>
+      </w:r>
+      <w:proofErr w:type="spellStart"/>
+      <w:r>
+        <w:rPr>
+          <w:rFonts w:ascii="Calibri" w:eastAsiaTheme="minorHAnsi" w:hAnsi="Calibri"/>
+          <w:lang w:eastAsia="en-AU"/>
+        </w:rPr>
+        <w:t>geopixe</w:t>
+      </w:r>
+      <w:proofErr w:type="spellEnd"/>
+      <w:r>
+        <w:rPr>
+          <w:rFonts w:ascii="Calibri" w:eastAsiaTheme="minorHAnsi" w:hAnsi="Calibri"/>
+          <w:lang w:eastAsia="en-AU"/>
+        </w:rPr>
+        <w:t>/plugins</w:t>
       </w:r>
     </w:p>
     <w:p>
@@ -741,7 +643,15 @@
         </w:numPr>
       </w:pPr>
       <w:r>
-        <w:t>Perhaps add this to the ‘detector_map’ window?</w:t>
+        <w:t>Perhaps add this to the ‘</w:t>
+      </w:r>
+      <w:proofErr w:type="spellStart"/>
+      <w:r>
+        <w:t>detector_map</w:t>
+      </w:r>
+      <w:proofErr w:type="spellEnd"/>
+      <w:r>
+        <w:t>’ window?</w:t>
       </w:r>
     </w:p>
     <w:p>
@@ -765,7 +675,15 @@
         </w:numPr>
       </w:pPr>
       <w:r>
-        <w:t>Perhaps add this to ‘da_evt’ to accumulate this stat as a map.</w:t>
+        <w:t>Perhaps add this to ‘</w:t>
+      </w:r>
+      <w:proofErr w:type="spellStart"/>
+      <w:r>
+        <w:t>da_evt</w:t>
+      </w:r>
+      <w:proofErr w:type="spellEnd"/>
+      <w:r>
+        <w:t>’ to accumulate this stat as a map.</w:t>
       </w:r>
     </w:p>
     <w:p>
@@ -777,7 +695,15 @@
         </w:numPr>
       </w:pPr>
       <w:r>
-        <w:t>DA: Perhaps add error matrix to DA fit output to DAMx files</w:t>
+        <w:t xml:space="preserve">DA: Perhaps add error matrix to DA fit output to </w:t>
+      </w:r>
+      <w:proofErr w:type="spellStart"/>
+      <w:r>
+        <w:t>DAMx</w:t>
+      </w:r>
+      <w:proofErr w:type="spellEnd"/>
+      <w:r>
+        <w:t xml:space="preserve"> files</w:t>
       </w:r>
     </w:p>
     <w:p>
@@ -871,7 +797,6 @@
         </w:numPr>
       </w:pPr>
       <w:r>
-        <w:lastRenderedPageBreak/>
         <w:t>Does it include expected elements too?</w:t>
       </w:r>
     </w:p>
@@ -949,6 +874,7 @@
       <w:r>
         <w:t>Why does “</w:t>
       </w:r>
+      <w:proofErr w:type="spellStart"/>
       <w:r>
         <w:rPr>
           <w:b/>
@@ -956,8 +882,17 @@
         </w:rPr>
         <w:t>maia_device</w:t>
       </w:r>
-      <w:r>
-        <w:t>::ylut” not enforce a veto on Y Encoder mode?</w:t>
+      <w:proofErr w:type="spellEnd"/>
+      <w:r>
+        <w:t>::</w:t>
+      </w:r>
+      <w:proofErr w:type="spellStart"/>
+      <w:r>
+        <w:t>ylut</w:t>
+      </w:r>
+      <w:proofErr w:type="spellEnd"/>
+      <w:r>
+        <w:t>” not enforce a veto on Y Encoder mode?</w:t>
       </w:r>
       <w:r>
         <w:t xml:space="preserve"> </w:t>
@@ -984,6 +919,7 @@
         </w:numPr>
       </w:pPr>
       <w:r>
+        <w:lastRenderedPageBreak/>
         <w:t>Working with small ROI in huge images</w:t>
       </w:r>
     </w:p>
@@ -1074,7 +1010,15 @@
         </w:numPr>
       </w:pPr>
       <w:r>
-        <w:t>PDF HowTo doc for beamline/ASCI</w:t>
+        <w:t xml:space="preserve">PDF </w:t>
+      </w:r>
+      <w:proofErr w:type="spellStart"/>
+      <w:r>
+        <w:t>HowTo</w:t>
+      </w:r>
+      <w:proofErr w:type="spellEnd"/>
+      <w:r>
+        <w:t xml:space="preserve"> doc for beamline/ASCI</w:t>
       </w:r>
     </w:p>
     <w:p>
@@ -1317,7 +1261,15 @@
         </w:numPr>
       </w:pPr>
       <w:r>
-        <w:t>Need to use ‘fit_setup’ GUI to load PCM (and data) and do calculation.</w:t>
+        <w:t>Need to use ‘</w:t>
+      </w:r>
+      <w:proofErr w:type="spellStart"/>
+      <w:r>
+        <w:t>fit_setup</w:t>
+      </w:r>
+      <w:proofErr w:type="spellEnd"/>
+      <w:r>
+        <w:t>’ GUI to load PCM (and data) and do calculation.</w:t>
       </w:r>
     </w:p>
     <w:p>
@@ -1329,7 +1281,15 @@
         </w:numPr>
       </w:pPr>
       <w:r>
-        <w:t>Results saved in ‘fit_results’ to PFR file.</w:t>
+        <w:t>Results saved in ‘</w:t>
+      </w:r>
+      <w:proofErr w:type="spellStart"/>
+      <w:r>
+        <w:t>fit_results</w:t>
+      </w:r>
+      <w:proofErr w:type="spellEnd"/>
+      <w:r>
+        <w:t>’ to PFR file.</w:t>
       </w:r>
     </w:p>
     <w:p>
@@ -1503,152 +1463,196 @@
         <w:rPr>
           <w:highlight w:val="yellow"/>
         </w:rPr>
-        <w:t>included in the ‘geopixe’ distribution</w:t>
-      </w:r>
-    </w:p>
-    <w:p>
-      <w:pPr>
-        <w:pStyle w:val="ListParagraph"/>
-        <w:numPr>
-          <w:ilvl w:val="3"/>
-          <w:numId w:val="6"/>
-        </w:numPr>
-      </w:pPr>
-      <w:r>
-        <w:t>Need to be able to construct a long list of tests and run them all</w:t>
-      </w:r>
-    </w:p>
-    <w:p>
-      <w:pPr>
-        <w:pStyle w:val="ListParagraph"/>
-        <w:numPr>
-          <w:ilvl w:val="4"/>
-          <w:numId w:val="6"/>
-        </w:numPr>
-      </w:pPr>
-      <w:r>
-        <w:t xml:space="preserve">Perhaps only after setting the Demo root path. </w:t>
-      </w:r>
-    </w:p>
-    <w:p>
-      <w:pPr>
-        <w:pStyle w:val="ListParagraph"/>
-        <w:numPr>
-          <w:ilvl w:val="4"/>
-          <w:numId w:val="6"/>
-        </w:numPr>
-      </w:pPr>
-      <w:r>
-        <w:t>Multiple for each test (e.g. a few yield sample/beam combinations).</w:t>
-      </w:r>
-    </w:p>
-    <w:p>
-      <w:pPr>
-        <w:pStyle w:val="ListParagraph"/>
-        <w:numPr>
-          <w:ilvl w:val="4"/>
-          <w:numId w:val="6"/>
-        </w:numPr>
-      </w:pPr>
-      <w:r>
-        <w:lastRenderedPageBreak/>
-        <w:t>Maybe from a Wizard calling ‘geopixe_execute’ directly?</w:t>
-      </w:r>
-    </w:p>
-    <w:p>
-      <w:pPr>
-        <w:pStyle w:val="ListParagraph"/>
-        <w:numPr>
-          <w:ilvl w:val="4"/>
-          <w:numId w:val="6"/>
-        </w:numPr>
-      </w:pPr>
-      <w:r>
-        <w:t>After manually running each module (e.g. yields)</w:t>
-      </w:r>
-      <w:r>
-        <w:t>, or …</w:t>
-      </w:r>
-    </w:p>
-    <w:p>
-      <w:pPr>
-        <w:pStyle w:val="ListParagraph"/>
-        <w:numPr>
-          <w:ilvl w:val="4"/>
-          <w:numId w:val="6"/>
-        </w:numPr>
-      </w:pPr>
-      <w:r>
-        <w:t>Wizard could trigger ‘layer_setup’ to load LCM and run it</w:t>
-      </w:r>
-      <w:r>
-        <w:t>, etc</w:t>
-      </w:r>
-      <w:r>
-        <w:t>.</w:t>
-      </w:r>
-    </w:p>
-    <w:p>
-      <w:pPr>
-        <w:pStyle w:val="ListParagraph"/>
-        <w:numPr>
-          <w:ilvl w:val="2"/>
-          <w:numId w:val="6"/>
-        </w:numPr>
-      </w:pPr>
-      <w:r>
-        <w:t>May make sense to execute these by the GCF mechanism.</w:t>
-      </w:r>
-    </w:p>
-    <w:p>
-      <w:pPr>
-        <w:pStyle w:val="ListParagraph"/>
-        <w:numPr>
-          <w:ilvl w:val="3"/>
-          <w:numId w:val="6"/>
-        </w:numPr>
-      </w:pPr>
-      <w:r>
-        <w:t>Need to add entry points for yields and fitting.</w:t>
-      </w:r>
-    </w:p>
-    <w:p>
-      <w:pPr>
-        <w:pStyle w:val="ListParagraph"/>
-        <w:numPr>
-          <w:ilvl w:val="3"/>
-          <w:numId w:val="6"/>
-        </w:numPr>
-      </w:pPr>
-      <w:r>
-        <w:t>Then they can be run from a shell script.</w:t>
-      </w:r>
-    </w:p>
-    <w:p>
-      <w:pPr>
-        <w:pStyle w:val="ListParagraph"/>
-        <w:numPr>
-          <w:ilvl w:val="3"/>
-          <w:numId w:val="6"/>
-        </w:numPr>
-      </w:pPr>
-      <w:r>
-        <w:t>Need to log smart test results (minimal if results seem OK).</w:t>
-      </w:r>
-    </w:p>
-    <w:p>
-      <w:pPr>
-        <w:pStyle w:val="ListParagraph"/>
-        <w:numPr>
-          <w:ilvl w:val="3"/>
-          <w:numId w:val="6"/>
-        </w:numPr>
-      </w:pPr>
+        <w:t>included in the ‘</w:t>
+      </w:r>
+      <w:proofErr w:type="spellStart"/>
       <w:r>
         <w:rPr>
           <w:highlight w:val="yellow"/>
         </w:rPr>
-        <w:t>Perhaps detect lack of a .GCF file as argv[0</w:t>
+        <w:t>geopixe</w:t>
+      </w:r>
+      <w:proofErr w:type="spellEnd"/>
+      <w:r>
+        <w:rPr>
+          <w:highlight w:val="yellow"/>
+        </w:rPr>
+        <w:t>’ distribution</w:t>
+      </w:r>
+    </w:p>
+    <w:p>
+      <w:pPr>
+        <w:pStyle w:val="ListParagraph"/>
+        <w:numPr>
+          <w:ilvl w:val="3"/>
+          <w:numId w:val="6"/>
+        </w:numPr>
+      </w:pPr>
+      <w:r>
+        <w:t>Need to be able to construct a long list of tests and run them all</w:t>
+      </w:r>
+    </w:p>
+    <w:p>
+      <w:pPr>
+        <w:pStyle w:val="ListParagraph"/>
+        <w:numPr>
+          <w:ilvl w:val="4"/>
+          <w:numId w:val="6"/>
+        </w:numPr>
+      </w:pPr>
+      <w:r>
+        <w:t xml:space="preserve">Perhaps only after setting the Demo root path. </w:t>
+      </w:r>
+    </w:p>
+    <w:p>
+      <w:pPr>
+        <w:pStyle w:val="ListParagraph"/>
+        <w:numPr>
+          <w:ilvl w:val="4"/>
+          <w:numId w:val="6"/>
+        </w:numPr>
+      </w:pPr>
+      <w:r>
+        <w:t>Multiple for each test (e.g. a few yield sample/beam combinations).</w:t>
+      </w:r>
+    </w:p>
+    <w:p>
+      <w:pPr>
+        <w:pStyle w:val="ListParagraph"/>
+        <w:numPr>
+          <w:ilvl w:val="4"/>
+          <w:numId w:val="6"/>
+        </w:numPr>
+      </w:pPr>
+      <w:r>
+        <w:t>Maybe from a Wizard calling ‘</w:t>
+      </w:r>
+      <w:proofErr w:type="spellStart"/>
+      <w:r>
+        <w:t>geopixe_execute</w:t>
+      </w:r>
+      <w:proofErr w:type="spellEnd"/>
+      <w:r>
+        <w:t>’ directly?</w:t>
+      </w:r>
+    </w:p>
+    <w:p>
+      <w:pPr>
+        <w:pStyle w:val="ListParagraph"/>
+        <w:numPr>
+          <w:ilvl w:val="4"/>
+          <w:numId w:val="6"/>
+        </w:numPr>
+      </w:pPr>
+      <w:r>
+        <w:t>After manually running each module (e.g. yields)</w:t>
+      </w:r>
+      <w:r>
+        <w:t>, or …</w:t>
+      </w:r>
+    </w:p>
+    <w:p>
+      <w:pPr>
+        <w:pStyle w:val="ListParagraph"/>
+        <w:numPr>
+          <w:ilvl w:val="4"/>
+          <w:numId w:val="6"/>
+        </w:numPr>
+      </w:pPr>
+      <w:r>
+        <w:t>Wizard could trigger ‘</w:t>
+      </w:r>
+      <w:proofErr w:type="spellStart"/>
+      <w:r>
+        <w:t>layer_setup</w:t>
+      </w:r>
+      <w:proofErr w:type="spellEnd"/>
+      <w:r>
+        <w:t>’ to load LCM and run it</w:t>
+      </w:r>
+      <w:r>
+        <w:t>, etc</w:t>
+      </w:r>
+      <w:r>
+        <w:t>.</w:t>
+      </w:r>
+    </w:p>
+    <w:p>
+      <w:pPr>
+        <w:pStyle w:val="ListParagraph"/>
+        <w:numPr>
+          <w:ilvl w:val="2"/>
+          <w:numId w:val="6"/>
+        </w:numPr>
+      </w:pPr>
+      <w:r>
+        <w:t>May make sense to execute these by the GCF mechanism.</w:t>
+      </w:r>
+    </w:p>
+    <w:p>
+      <w:pPr>
+        <w:pStyle w:val="ListParagraph"/>
+        <w:numPr>
+          <w:ilvl w:val="3"/>
+          <w:numId w:val="6"/>
+        </w:numPr>
+      </w:pPr>
+      <w:r>
+        <w:t>Need to add entry points for yields and fitting.</w:t>
+      </w:r>
+    </w:p>
+    <w:p>
+      <w:pPr>
+        <w:pStyle w:val="ListParagraph"/>
+        <w:numPr>
+          <w:ilvl w:val="3"/>
+          <w:numId w:val="6"/>
+        </w:numPr>
+      </w:pPr>
+      <w:r>
+        <w:t>Then they can be run from a shell script.</w:t>
+      </w:r>
+    </w:p>
+    <w:p>
+      <w:pPr>
+        <w:pStyle w:val="ListParagraph"/>
+        <w:numPr>
+          <w:ilvl w:val="3"/>
+          <w:numId w:val="6"/>
+        </w:numPr>
+      </w:pPr>
+      <w:r>
+        <w:t>Need to log smart test results (minimal if results seem OK).</w:t>
+      </w:r>
+    </w:p>
+    <w:p>
+      <w:pPr>
+        <w:pStyle w:val="ListParagraph"/>
+        <w:numPr>
+          <w:ilvl w:val="3"/>
+          <w:numId w:val="6"/>
+        </w:numPr>
+      </w:pPr>
+      <w:r>
+        <w:rPr>
+          <w:highlight w:val="yellow"/>
+        </w:rPr>
+        <w:lastRenderedPageBreak/>
+        <w:t xml:space="preserve">Perhaps detect lack of a .GCF file as </w:t>
+      </w:r>
+      <w:proofErr w:type="spellStart"/>
+      <w:r>
+        <w:rPr>
+          <w:highlight w:val="yellow"/>
+        </w:rPr>
+        <w:t>argv</w:t>
+      </w:r>
+      <w:proofErr w:type="spellEnd"/>
+      <w:r>
+        <w:rPr>
+          <w:highlight w:val="yellow"/>
+        </w:rPr>
+        <w:t>[0</w:t>
       </w:r>
       <w:r>
         <w:t>]</w:t>
@@ -1663,7 +1667,15 @@
         </w:numPr>
       </w:pPr>
       <w:r>
-        <w:t>interpret argv[0] as simply the routine to run.</w:t>
+        <w:t xml:space="preserve">interpret </w:t>
+      </w:r>
+      <w:proofErr w:type="spellStart"/>
+      <w:r>
+        <w:t>argv</w:t>
+      </w:r>
+      <w:proofErr w:type="spellEnd"/>
+      <w:r>
+        <w:t>[0] as simply the routine to run.</w:t>
       </w:r>
     </w:p>
     <w:p>
@@ -2021,7 +2033,15 @@
         <w:adjustRightInd w:val="0"/>
       </w:pPr>
       <w:r>
-        <w:t>To follow da_evt to DAI, as in Batch Sort.</w:t>
+        <w:t xml:space="preserve">To follow </w:t>
+      </w:r>
+      <w:proofErr w:type="spellStart"/>
+      <w:r>
+        <w:t>da_evt</w:t>
+      </w:r>
+      <w:proofErr w:type="spellEnd"/>
+      <w:r>
+        <w:t xml:space="preserve"> to DAI, as in Batch Sort.</w:t>
       </w:r>
     </w:p>
     <w:p>
@@ -2111,7 +2131,39 @@
         <w:adjustRightInd w:val="0"/>
       </w:pPr>
       <w:r>
-        <w:t>Perhaps add these as new keywords to ‘da_evt’ in GCF, which get detected (in ‘geopixe_do_command’) and removed from args passed to ‘da_evt’.</w:t>
+        <w:t>Perhaps add these as new keywords to ‘</w:t>
+      </w:r>
+      <w:proofErr w:type="spellStart"/>
+      <w:r>
+        <w:t>da_evt</w:t>
+      </w:r>
+      <w:proofErr w:type="spellEnd"/>
+      <w:r>
+        <w:t>’ in GCF, which get detected (in ‘</w:t>
+      </w:r>
+      <w:proofErr w:type="spellStart"/>
+      <w:r>
+        <w:t>geopixe_do_command</w:t>
+      </w:r>
+      <w:proofErr w:type="spellEnd"/>
+      <w:r>
+        <w:t xml:space="preserve">’) and removed from </w:t>
+      </w:r>
+      <w:proofErr w:type="spellStart"/>
+      <w:r>
+        <w:t>args</w:t>
+      </w:r>
+      <w:proofErr w:type="spellEnd"/>
+      <w:r>
+        <w:t xml:space="preserve"> passed to ‘</w:t>
+      </w:r>
+      <w:proofErr w:type="spellStart"/>
+      <w:r>
+        <w:t>da_evt</w:t>
+      </w:r>
+      <w:proofErr w:type="spellEnd"/>
+      <w:r>
+        <w:t>’.</w:t>
       </w:r>
     </w:p>
     <w:p>
@@ -2304,7 +2356,6 @@
         <w:rPr>
           <w:highlight w:val="yellow"/>
         </w:rPr>
-        <w:lastRenderedPageBreak/>
         <w:t>Filters?</w:t>
       </w:r>
     </w:p>
@@ -2405,6 +2456,7 @@
         </w:numPr>
       </w:pPr>
       <w:r>
+        <w:lastRenderedPageBreak/>
         <w:t>This should keep connection open.</w:t>
       </w:r>
     </w:p>
@@ -2438,18 +2490,34 @@
         </w:numPr>
       </w:pPr>
       <w:r>
-        <w:t>sort evt – 3D mode</w:t>
-      </w:r>
-    </w:p>
-    <w:p>
-      <w:pPr>
-        <w:numPr>
-          <w:ilvl w:val="3"/>
-          <w:numId w:val="6"/>
-        </w:numPr>
-      </w:pPr>
-      <w:r>
-        <w:t>“da_xanes_base” is undefined, when switching to tomo XY mode.</w:t>
+        <w:t xml:space="preserve">sort </w:t>
+      </w:r>
+      <w:proofErr w:type="spellStart"/>
+      <w:r>
+        <w:t>evt</w:t>
+      </w:r>
+      <w:proofErr w:type="spellEnd"/>
+      <w:r>
+        <w:t xml:space="preserve"> – 3D mode</w:t>
+      </w:r>
+    </w:p>
+    <w:p>
+      <w:pPr>
+        <w:numPr>
+          <w:ilvl w:val="3"/>
+          <w:numId w:val="6"/>
+        </w:numPr>
+      </w:pPr>
+      <w:r>
+        <w:t>“</w:t>
+      </w:r>
+      <w:proofErr w:type="spellStart"/>
+      <w:r>
+        <w:t>da_xanes_base</w:t>
+      </w:r>
+      <w:proofErr w:type="spellEnd"/>
+      <w:r>
+        <w:t>” is undefined, when switching to tomo XY mode.</w:t>
       </w:r>
     </w:p>
     <w:p>
@@ -2660,7 +2728,15 @@
         <w:adjustRightInd w:val="0"/>
       </w:pPr>
       <w:r>
-        <w:t xml:space="preserve">Would need some extra ‘filter’ option on file_requester. </w:t>
+        <w:t xml:space="preserve">Would need some extra ‘filter’ option on </w:t>
+      </w:r>
+      <w:proofErr w:type="spellStart"/>
+      <w:r>
+        <w:t>file_requester</w:t>
+      </w:r>
+      <w:proofErr w:type="spellEnd"/>
+      <w:r>
+        <w:t xml:space="preserve">. </w:t>
       </w:r>
     </w:p>
     <w:p>
@@ -2678,7 +2754,15 @@
         <w:adjustRightInd w:val="0"/>
       </w:pPr>
       <w:r>
-        <w:t xml:space="preserve">Pass a ‘filter_routine’ option. </w:t>
+        <w:t>Pass a ‘</w:t>
+      </w:r>
+      <w:proofErr w:type="spellStart"/>
+      <w:r>
+        <w:t>filter_routine</w:t>
+      </w:r>
+      <w:proofErr w:type="spellEnd"/>
+      <w:r>
+        <w:t xml:space="preserve">’ option. </w:t>
       </w:r>
     </w:p>
     <w:p>
@@ -2825,7 +2909,15 @@
         <w:t>When selected from list, call routine</w:t>
       </w:r>
       <w:r>
-        <w:t xml:space="preserve"> (“??_special_filter)</w:t>
+        <w:t xml:space="preserve"> (“??_</w:t>
+      </w:r>
+      <w:proofErr w:type="spellStart"/>
+      <w:r>
+        <w:t>special_filter</w:t>
+      </w:r>
+      <w:proofErr w:type="spellEnd"/>
+      <w:r>
+        <w:t>)</w:t>
       </w:r>
     </w:p>
     <w:p>
@@ -2843,7 +2935,15 @@
         <w:adjustRightInd w:val="0"/>
       </w:pPr>
       <w:r>
-        <w:t>Pass ‘pspecial’ to allow old settings to return</w:t>
+        <w:t>Pass ‘</w:t>
+      </w:r>
+      <w:proofErr w:type="spellStart"/>
+      <w:r>
+        <w:t>pspecial</w:t>
+      </w:r>
+      <w:proofErr w:type="spellEnd"/>
+      <w:r>
+        <w:t>’ to allow old settings to return</w:t>
       </w:r>
     </w:p>
     <w:p>
@@ -2878,8 +2978,13 @@
         <w:autoSpaceDN w:val="0"/>
         <w:adjustRightInd w:val="0"/>
       </w:pPr>
-      <w:r>
-        <w:t>Pspecial pointer</w:t>
+      <w:proofErr w:type="spellStart"/>
+      <w:r>
+        <w:t>Pspecial</w:t>
+      </w:r>
+      <w:proofErr w:type="spellEnd"/>
+      <w:r>
+        <w:t xml:space="preserve"> pointer</w:t>
       </w:r>
     </w:p>
     <w:p>
@@ -2969,7 +3074,23 @@
         <w:adjustRightInd w:val="0"/>
       </w:pPr>
       <w:r>
-        <w:t>See “select_periodic”, which does this to ‘source_setup’</w:t>
+        <w:t>See “</w:t>
+      </w:r>
+      <w:proofErr w:type="spellStart"/>
+      <w:r>
+        <w:t>select_periodic</w:t>
+      </w:r>
+      <w:proofErr w:type="spellEnd"/>
+      <w:r>
+        <w:t>”, which does this to ‘</w:t>
+      </w:r>
+      <w:proofErr w:type="spellStart"/>
+      <w:r>
+        <w:t>source_setup</w:t>
+      </w:r>
+      <w:proofErr w:type="spellEnd"/>
+      <w:r>
+        <w:t>’</w:t>
       </w:r>
     </w:p>
     <w:p>
@@ -3068,7 +3189,31 @@
         <w:adjustRightInd w:val="0"/>
       </w:pPr>
       <w:r>
-        <w:t xml:space="preserve">ASCII version seems to be missing: ca, cb, adc, n_det. </w:t>
+        <w:t xml:space="preserve">ASCII version seems to be missing: ca, </w:t>
+      </w:r>
+      <w:proofErr w:type="spellStart"/>
+      <w:r>
+        <w:t>cb</w:t>
+      </w:r>
+      <w:proofErr w:type="spellEnd"/>
+      <w:r>
+        <w:t xml:space="preserve">, </w:t>
+      </w:r>
+      <w:proofErr w:type="spellStart"/>
+      <w:r>
+        <w:t>adc</w:t>
+      </w:r>
+      <w:proofErr w:type="spellEnd"/>
+      <w:r>
+        <w:t xml:space="preserve">, </w:t>
+      </w:r>
+      <w:proofErr w:type="spellStart"/>
+      <w:r>
+        <w:t>n_det</w:t>
+      </w:r>
+      <w:proofErr w:type="spellEnd"/>
+      <w:r>
+        <w:t xml:space="preserve">. </w:t>
       </w:r>
     </w:p>
     <w:p>
@@ -3122,8 +3267,15 @@
         <w:adjustRightInd w:val="0"/>
       </w:pPr>
       <w:r>
-        <w:lastRenderedPageBreak/>
-        <w:t xml:space="preserve">‘Get_linear’ probably assumes (single) old format vector. </w:t>
+        <w:t>‘</w:t>
+      </w:r>
+      <w:proofErr w:type="spellStart"/>
+      <w:r>
+        <w:t>Get_linear</w:t>
+      </w:r>
+      <w:proofErr w:type="spellEnd"/>
+      <w:r>
+        <w:t xml:space="preserve">’ probably assumes (single) old format vector. </w:t>
       </w:r>
     </w:p>
     <w:p>
@@ -3177,7 +3329,15 @@
         <w:adjustRightInd w:val="0"/>
       </w:pPr>
       <w:r>
-        <w:t>Where is ‘da.ecompress’ used?</w:t>
+        <w:t>Where is ‘</w:t>
+      </w:r>
+      <w:proofErr w:type="spellStart"/>
+      <w:r>
+        <w:t>da.ecompress</w:t>
+      </w:r>
+      <w:proofErr w:type="spellEnd"/>
+      <w:r>
+        <w:t>’ used?</w:t>
       </w:r>
       <w:r>
         <w:t xml:space="preserve"> Lund old format?</w:t>
@@ -3202,8 +3362,10 @@
         </w:numPr>
       </w:pPr>
       <w:r>
+        <w:lastRenderedPageBreak/>
         <w:t xml:space="preserve">Does not export the </w:t>
       </w:r>
+      <w:proofErr w:type="spellStart"/>
       <w:r>
         <w:rPr>
           <w:i/>
@@ -3211,6 +3373,7 @@
         </w:rPr>
         <w:t>rGamma</w:t>
       </w:r>
+      <w:proofErr w:type="spellEnd"/>
       <w:r>
         <w:t xml:space="preserve"> matrix or </w:t>
       </w:r>
@@ -3281,9 +3444,11 @@
       <w:r>
         <w:t>Fudged in ‘</w:t>
       </w:r>
+      <w:proofErr w:type="spellStart"/>
       <w:r>
         <w:t>Spectrum_Mark_Pileup_Image</w:t>
       </w:r>
+      <w:proofErr w:type="spellEnd"/>
       <w:r>
         <w:t>’ at 0.2% fixed for now.</w:t>
       </w:r>
@@ -3687,8 +3852,13 @@
         </w:numPr>
       </w:pPr>
       <w:r>
-        <w:t>Need: include, refine, reject, clear menus – like corr</w:t>
-      </w:r>
+        <w:t xml:space="preserve">Need: include, refine, reject, clear menus – like </w:t>
+      </w:r>
+      <w:proofErr w:type="spellStart"/>
+      <w:r>
+        <w:t>corr</w:t>
+      </w:r>
+      <w:proofErr w:type="spellEnd"/>
     </w:p>
     <w:p>
       <w:pPr>
@@ -3752,6 +3922,17 @@
         </w:numPr>
       </w:pPr>
       <w:r>
+        <w:t>Does the History decode the order OK?</w:t>
+      </w:r>
+    </w:p>
+    <w:p>
+      <w:pPr>
+        <w:numPr>
+          <w:ilvl w:val="3"/>
+          <w:numId w:val="6"/>
+        </w:numPr>
+      </w:pPr>
+      <w:r>
         <w:t>How do encode a sequence number in the History info.</w:t>
       </w:r>
     </w:p>
@@ -3763,52 +3944,95 @@
         </w:numPr>
       </w:pPr>
       <w:r>
+        <w:t>Wizard general</w:t>
+      </w:r>
+    </w:p>
+    <w:p>
+      <w:pPr>
+        <w:numPr>
+          <w:ilvl w:val="2"/>
+          <w:numId w:val="6"/>
+        </w:numPr>
+      </w:pPr>
+      <w:r>
+        <w:t xml:space="preserve">Use </w:t>
+      </w:r>
+      <w:r>
+        <w:t>new ‘</w:t>
+      </w:r>
+      <w:proofErr w:type="spellStart"/>
+      <w:r>
+        <w:t>widget_browser</w:t>
+      </w:r>
+      <w:proofErr w:type="spellEnd"/>
+      <w:r>
+        <w:t>’</w:t>
+      </w:r>
+      <w:r>
+        <w:t xml:space="preserve"> for rich text options?</w:t>
+      </w:r>
+    </w:p>
+    <w:p>
+      <w:pPr>
+        <w:numPr>
+          <w:ilvl w:val="2"/>
+          <w:numId w:val="6"/>
+        </w:numPr>
+      </w:pPr>
+      <w:bookmarkStart w:id="0" w:name="_Hlk126678996"/>
+      <w:r>
+        <w:t>See ‘</w:t>
+      </w:r>
+      <w:proofErr w:type="spellStart"/>
+      <w:r>
+        <w:t>test_browser_wizard</w:t>
+      </w:r>
+      <w:proofErr w:type="spellEnd"/>
+      <w:r>
+        <w:t>’ in project test</w:t>
+      </w:r>
+      <w:r>
+        <w:t>/IDL</w:t>
+      </w:r>
+      <w:r>
+        <w:t xml:space="preserve"> (GeoPIXE3).</w:t>
+      </w:r>
+    </w:p>
+    <w:bookmarkEnd w:id="0"/>
+    <w:p>
+      <w:pPr>
+        <w:numPr>
+          <w:ilvl w:val="1"/>
+          <w:numId w:val="6"/>
+        </w:numPr>
+      </w:pPr>
+      <w:r>
+        <w:t>Standards Wizard</w:t>
+      </w:r>
+    </w:p>
+    <w:p>
+      <w:pPr>
+        <w:numPr>
+          <w:ilvl w:val="2"/>
+          <w:numId w:val="6"/>
+        </w:numPr>
+      </w:pPr>
+      <w:r>
+        <w:t>Sequence ends if an error is found – should just skip to next?</w:t>
+      </w:r>
+    </w:p>
+    <w:p>
+      <w:pPr>
+        <w:numPr>
+          <w:ilvl w:val="2"/>
+          <w:numId w:val="6"/>
+        </w:numPr>
+      </w:pPr>
+      <w:r>
         <w:lastRenderedPageBreak/>
-        <w:t>Wizard general</w:t>
-      </w:r>
-    </w:p>
-    <w:p>
-      <w:pPr>
-        <w:numPr>
-          <w:ilvl w:val="2"/>
-          <w:numId w:val="6"/>
-        </w:numPr>
-      </w:pPr>
-      <w:r>
-        <w:t xml:space="preserve">Use </w:t>
-      </w:r>
-      <w:r>
-        <w:t>new ‘</w:t>
-      </w:r>
-      <w:r>
-        <w:t>widget_browser</w:t>
-      </w:r>
-      <w:r>
-        <w:t>’</w:t>
-      </w:r>
-      <w:r>
-        <w:t xml:space="preserve"> for rich text options?</w:t>
-      </w:r>
-    </w:p>
-    <w:p>
-      <w:pPr>
-        <w:numPr>
-          <w:ilvl w:val="2"/>
-          <w:numId w:val="6"/>
-        </w:numPr>
-      </w:pPr>
-      <w:bookmarkStart w:id="0" w:name="_Hlk126678996"/>
-      <w:r>
-        <w:t>See ‘test_browser_wizard’ in project test</w:t>
-      </w:r>
-      <w:r>
-        <w:t>/IDL</w:t>
-      </w:r>
-      <w:r>
-        <w:t xml:space="preserve"> (GeoPIXE3).</w:t>
-      </w:r>
-    </w:p>
-    <w:bookmarkEnd w:id="0"/>
+        <w:t>If a result is posted, then “Process” should not do it again - skip?</w:t>
+      </w:r>
+    </w:p>
     <w:p>
       <w:pPr>
         <w:numPr>
@@ -3817,29 +4041,188 @@
         </w:numPr>
       </w:pPr>
       <w:r>
-        <w:t>Standards Wizard</w:t>
-      </w:r>
-    </w:p>
-    <w:p>
-      <w:pPr>
-        <w:numPr>
-          <w:ilvl w:val="2"/>
-          <w:numId w:val="6"/>
-        </w:numPr>
-      </w:pPr>
-      <w:r>
-        <w:t>Sequence ends if an error is found – should just skip to next?</w:t>
-      </w:r>
-    </w:p>
-    <w:p>
-      <w:pPr>
-        <w:numPr>
-          <w:ilvl w:val="2"/>
-          <w:numId w:val="6"/>
-        </w:numPr>
-      </w:pPr>
-      <w:r>
-        <w:t>If a result is posted, then “Process” should not do it again - skip?</w:t>
+        <w:t>MPDA work-flow</w:t>
+      </w:r>
+    </w:p>
+    <w:p>
+      <w:pPr>
+        <w:numPr>
+          <w:ilvl w:val="2"/>
+          <w:numId w:val="6"/>
+        </w:numPr>
+      </w:pPr>
+      <w:r>
+        <w:t>Options?</w:t>
+      </w:r>
+    </w:p>
+    <w:p>
+      <w:pPr>
+        <w:numPr>
+          <w:ilvl w:val="3"/>
+          <w:numId w:val="6"/>
+        </w:numPr>
+      </w:pPr>
+      <w:r>
+        <w:t xml:space="preserve">As Batch sort extras, </w:t>
+      </w:r>
+    </w:p>
+    <w:p>
+      <w:pPr>
+        <w:numPr>
+          <w:ilvl w:val="3"/>
+          <w:numId w:val="6"/>
+        </w:numPr>
+      </w:pPr>
+      <w:r>
+        <w:t>Or start to build MPDA Wizard?</w:t>
+      </w:r>
+    </w:p>
+    <w:p>
+      <w:pPr>
+        <w:numPr>
+          <w:ilvl w:val="4"/>
+          <w:numId w:val="6"/>
+        </w:numPr>
+      </w:pPr>
+      <w:r>
+        <w:t>May take over much of Batch Sort functionality?</w:t>
+      </w:r>
+    </w:p>
+    <w:p>
+      <w:pPr>
+        <w:numPr>
+          <w:ilvl w:val="3"/>
+          <w:numId w:val="6"/>
+        </w:numPr>
+      </w:pPr>
+      <w:r>
+        <w:t>Or, just a simple flow-on from a MPDA sort</w:t>
+      </w:r>
+    </w:p>
+    <w:p>
+      <w:pPr>
+        <w:numPr>
+          <w:ilvl w:val="4"/>
+          <w:numId w:val="6"/>
+        </w:numPr>
+      </w:pPr>
+      <w:r>
+        <w:t>In absence of phases, it does normal sort, correct, project Minerals?</w:t>
+      </w:r>
+    </w:p>
+    <w:p>
+      <w:pPr>
+        <w:numPr>
+          <w:ilvl w:val="4"/>
+          <w:numId w:val="6"/>
+        </w:numPr>
+      </w:pPr>
+      <w:r>
+        <w:t xml:space="preserve">And then builds </w:t>
+      </w:r>
+      <w:proofErr w:type="spellStart"/>
+      <w:r>
+        <w:t>mpdam</w:t>
+      </w:r>
+      <w:proofErr w:type="spellEnd"/>
+      <w:r>
+        <w:t xml:space="preserve"> file and repeats as MPDA sort?</w:t>
+      </w:r>
+    </w:p>
+    <w:p>
+      <w:pPr>
+        <w:numPr>
+          <w:ilvl w:val="2"/>
+          <w:numId w:val="6"/>
+        </w:numPr>
+      </w:pPr>
+      <w:r>
+        <w:t>Distinguish between</w:t>
+      </w:r>
+    </w:p>
+    <w:p>
+      <w:pPr>
+        <w:numPr>
+          <w:ilvl w:val="3"/>
+          <w:numId w:val="6"/>
+        </w:numPr>
+      </w:pPr>
+      <w:r>
+        <w:t>Building phase regions, all DA matrix files and a new .correct file.</w:t>
+      </w:r>
+    </w:p>
+    <w:p>
+      <w:pPr>
+        <w:numPr>
+          <w:ilvl w:val="4"/>
+          <w:numId w:val="6"/>
+        </w:numPr>
+      </w:pPr>
+      <w:r>
+        <w:t>Extract suitable regions and spectra.</w:t>
+      </w:r>
+    </w:p>
+    <w:p>
+      <w:pPr>
+        <w:numPr>
+          <w:ilvl w:val="4"/>
+          <w:numId w:val="6"/>
+        </w:numPr>
+      </w:pPr>
+      <w:r>
+        <w:t>Fit spectra, with appropriate yield for phase, and make DA matrix.</w:t>
+      </w:r>
+    </w:p>
+    <w:p>
+      <w:pPr>
+        <w:numPr>
+          <w:ilvl w:val="4"/>
+          <w:numId w:val="6"/>
+        </w:numPr>
+      </w:pPr>
+      <w:r>
+        <w:t>Use “MPDA Master Weights” in DA matrix</w:t>
+      </w:r>
+    </w:p>
+    <w:p>
+      <w:pPr>
+        <w:numPr>
+          <w:ilvl w:val="4"/>
+          <w:numId w:val="6"/>
+        </w:numPr>
+      </w:pPr>
+      <w:r>
+        <w:t>Construct .correct file.</w:t>
+      </w:r>
+    </w:p>
+    <w:p>
+      <w:pPr>
+        <w:numPr>
+          <w:ilvl w:val="3"/>
+          <w:numId w:val="6"/>
+        </w:numPr>
+      </w:pPr>
+      <w:r>
+        <w:t>Using an existing .correct file (including DA matrix files) to:</w:t>
+      </w:r>
+    </w:p>
+    <w:p>
+      <w:pPr>
+        <w:numPr>
+          <w:ilvl w:val="4"/>
+          <w:numId w:val="6"/>
+        </w:numPr>
+      </w:pPr>
+      <w:r>
+        <w:t xml:space="preserve">Extend Sort </w:t>
+      </w:r>
+      <w:proofErr w:type="spellStart"/>
+      <w:r>
+        <w:t>Evt</w:t>
+      </w:r>
+      <w:proofErr w:type="spellEnd"/>
+      <w:r>
+        <w:t xml:space="preserve"> behaviour.</w:t>
       </w:r>
     </w:p>
     <w:p>
@@ -3850,40 +4233,168 @@
         </w:numPr>
       </w:pPr>
       <w:r>
-        <w:t>MPDA work-flow</w:t>
-      </w:r>
-    </w:p>
-    <w:p>
-      <w:pPr>
-        <w:numPr>
-          <w:ilvl w:val="2"/>
-          <w:numId w:val="6"/>
-        </w:numPr>
-      </w:pPr>
-      <w:r>
-        <w:t>Options?</w:t>
-      </w:r>
-    </w:p>
-    <w:p>
-      <w:pPr>
-        <w:numPr>
-          <w:ilvl w:val="3"/>
-          <w:numId w:val="6"/>
-        </w:numPr>
-      </w:pPr>
-      <w:r>
-        <w:t xml:space="preserve">As Batch sort extras, </w:t>
-      </w:r>
-    </w:p>
-    <w:p>
-      <w:pPr>
-        <w:numPr>
-          <w:ilvl w:val="3"/>
-          <w:numId w:val="6"/>
-        </w:numPr>
-      </w:pPr>
-      <w:r>
-        <w:t>Or start to build MPDA Wizard?</w:t>
+        <w:t>MPDA issues</w:t>
+      </w:r>
+    </w:p>
+    <w:p>
+      <w:pPr>
+        <w:numPr>
+          <w:ilvl w:val="2"/>
+          <w:numId w:val="6"/>
+        </w:numPr>
+      </w:pPr>
+      <w:r>
+        <w:t>If not cluster mode, how to do ‘</w:t>
+      </w:r>
+      <w:proofErr w:type="spellStart"/>
+      <w:r>
+        <w:t>geopixe_do_DA</w:t>
+      </w:r>
+      <w:proofErr w:type="spellEnd"/>
+      <w:r>
+        <w:t>’?</w:t>
+      </w:r>
+    </w:p>
+    <w:p>
+      <w:pPr>
+        <w:numPr>
+          <w:ilvl w:val="3"/>
+          <w:numId w:val="6"/>
+        </w:numPr>
+      </w:pPr>
+      <w:r>
+        <w:t>Perhaps always build ‘</w:t>
+      </w:r>
+      <w:proofErr w:type="spellStart"/>
+      <w:r>
+        <w:t>args</w:t>
+      </w:r>
+      <w:proofErr w:type="spellEnd"/>
+      <w:r>
+        <w:t>’ and call ‘</w:t>
+      </w:r>
+      <w:proofErr w:type="spellStart"/>
+      <w:r>
+        <w:t>geopixe_execute</w:t>
+      </w:r>
+      <w:proofErr w:type="spellEnd"/>
+      <w:r>
+        <w:t>’ as used in ‘</w:t>
+      </w:r>
+      <w:proofErr w:type="spellStart"/>
+      <w:r>
+        <w:t>geopixe_do_command</w:t>
+      </w:r>
+      <w:proofErr w:type="spellEnd"/>
+      <w:r>
+        <w:t>’.</w:t>
+      </w:r>
+    </w:p>
+    <w:p>
+      <w:pPr>
+        <w:numPr>
+          <w:ilvl w:val="3"/>
+          <w:numId w:val="6"/>
+        </w:numPr>
+      </w:pPr>
+      <w:r>
+        <w:t>But then can’t run in VM mode!</w:t>
+      </w:r>
+    </w:p>
+    <w:p>
+      <w:pPr>
+        <w:numPr>
+          <w:ilvl w:val="2"/>
+          <w:numId w:val="6"/>
+        </w:numPr>
+      </w:pPr>
+      <w:r>
+        <w:t xml:space="preserve">Pt hotspots may appear as only 3% Pt mineral and 97% silicates. But ALL of the Pt in them is from the Pt phase component. </w:t>
+      </w:r>
+    </w:p>
+    <w:p>
+      <w:pPr>
+        <w:numPr>
+          <w:ilvl w:val="3"/>
+          <w:numId w:val="6"/>
+        </w:numPr>
+      </w:pPr>
+      <w:r>
+        <w:t xml:space="preserve">Fit using straight Pt works, MPDA </w:t>
+      </w:r>
+      <w:proofErr w:type="spellStart"/>
+      <w:r>
+        <w:t>rel</w:t>
+      </w:r>
+      <w:proofErr w:type="spellEnd"/>
+      <w:r>
+        <w:t xml:space="preserve"> int poor (Lg too high).</w:t>
+      </w:r>
+    </w:p>
+    <w:p>
+      <w:pPr>
+        <w:numPr>
+          <w:ilvl w:val="3"/>
+          <w:numId w:val="6"/>
+        </w:numPr>
+      </w:pPr>
+      <w:r>
+        <w:t>What relative intensities should be used?</w:t>
+      </w:r>
+    </w:p>
+    <w:p>
+      <w:pPr>
+        <w:numPr>
+          <w:ilvl w:val="2"/>
+          <w:numId w:val="6"/>
+        </w:numPr>
+      </w:pPr>
+      <w:r>
+        <w:t>Perhaps distinguish between trace elements and majors in formula?</w:t>
+      </w:r>
+    </w:p>
+    <w:p>
+      <w:pPr>
+        <w:numPr>
+          <w:ilvl w:val="3"/>
+          <w:numId w:val="6"/>
+        </w:numPr>
+      </w:pPr>
+      <w:r>
+        <w:t>But you weight by phase DA matrix, not element.</w:t>
+      </w:r>
+    </w:p>
+    <w:p>
+      <w:pPr>
+        <w:numPr>
+          <w:ilvl w:val="1"/>
+          <w:numId w:val="6"/>
+        </w:numPr>
+      </w:pPr>
+      <w:r>
+        <w:t>Correct Yield Wizard</w:t>
+      </w:r>
+    </w:p>
+    <w:p>
+      <w:pPr>
+        <w:numPr>
+          <w:ilvl w:val="2"/>
+          <w:numId w:val="6"/>
+        </w:numPr>
+      </w:pPr>
+      <w:r>
+        <w:t>How to guide through regions analysis?</w:t>
+      </w:r>
+    </w:p>
+    <w:p>
+      <w:pPr>
+        <w:numPr>
+          <w:ilvl w:val="3"/>
+          <w:numId w:val="6"/>
+        </w:numPr>
+      </w:pPr>
+      <w:r>
+        <w:t>Define major distinct phases and extract spectra from them.</w:t>
       </w:r>
     </w:p>
     <w:p>
@@ -3894,18 +4405,7 @@
         </w:numPr>
       </w:pPr>
       <w:r>
-        <w:t>May take over much of Batch Sort functionality?</w:t>
-      </w:r>
-    </w:p>
-    <w:p>
-      <w:pPr>
-        <w:numPr>
-          <w:ilvl w:val="3"/>
-          <w:numId w:val="6"/>
-        </w:numPr>
-      </w:pPr>
-      <w:r>
-        <w:t>Or, just a simple flow-on from a MPDA sort</w:t>
+        <w:t>Try to find pixels close to the pure phases.</w:t>
       </w:r>
     </w:p>
     <w:p>
@@ -3916,7 +4416,56 @@
         </w:numPr>
       </w:pPr>
       <w:r>
-        <w:t>In absence of phases, it does normal sort, correct, project Minerals?</w:t>
+        <w:t>Don’t want them too diluted with non-pure phase contributions.</w:t>
+      </w:r>
+    </w:p>
+    <w:p>
+      <w:pPr>
+        <w:numPr>
+          <w:ilvl w:val="3"/>
+          <w:numId w:val="6"/>
+        </w:numPr>
+      </w:pPr>
+      <w:r>
+        <w:t>Fit each one to create a DA matrix for each using correct yields.</w:t>
+      </w:r>
+    </w:p>
+    <w:p>
+      <w:pPr>
+        <w:numPr>
+          <w:ilvl w:val="2"/>
+          <w:numId w:val="6"/>
+        </w:numPr>
+      </w:pPr>
+      <w:r>
+        <w:t>Need a “</w:t>
+      </w:r>
+      <w:proofErr w:type="spellStart"/>
+      <w:r>
+        <w:t>wt</w:t>
+      </w:r>
+      <w:proofErr w:type="spellEnd"/>
+      <w:r>
+        <w:t>%” tool/help to fill in composition matrix.</w:t>
+      </w:r>
+    </w:p>
+    <w:p>
+      <w:pPr>
+        <w:numPr>
+          <w:ilvl w:val="3"/>
+          <w:numId w:val="6"/>
+        </w:numPr>
+      </w:pPr>
+      <w:r>
+        <w:t xml:space="preserve">If define element columns first, then a “get” of a DA matrix row just fills in the </w:t>
+      </w:r>
+      <w:proofErr w:type="spellStart"/>
+      <w:r>
+        <w:t>wt</w:t>
+      </w:r>
+      <w:proofErr w:type="spellEnd"/>
+      <w:r>
+        <w:t>% for these elements in the table?</w:t>
       </w:r>
     </w:p>
     <w:p>
@@ -3927,29 +4476,29 @@
         </w:numPr>
       </w:pPr>
       <w:r>
-        <w:t>And then builds mpdam file and repeats as MPDA sort?</w:t>
-      </w:r>
-    </w:p>
-    <w:p>
-      <w:pPr>
-        <w:numPr>
-          <w:ilvl w:val="2"/>
-          <w:numId w:val="6"/>
-        </w:numPr>
-      </w:pPr>
-      <w:r>
-        <w:t>Distinguish between</w:t>
-      </w:r>
-    </w:p>
-    <w:p>
-      <w:pPr>
-        <w:numPr>
-          <w:ilvl w:val="3"/>
-          <w:numId w:val="6"/>
-        </w:numPr>
-      </w:pPr>
-      <w:r>
-        <w:t>Building phase regions, all DA matrix files and a new .correct file.</w:t>
+        <w:t>DA matrix file does NOT have this info.</w:t>
+      </w:r>
+    </w:p>
+    <w:p>
+      <w:pPr>
+        <w:numPr>
+          <w:ilvl w:val="5"/>
+          <w:numId w:val="6"/>
+        </w:numPr>
+      </w:pPr>
+      <w:r>
+        <w:t>Yield file does, so perhaps save this filename in DA matrix?</w:t>
+      </w:r>
+    </w:p>
+    <w:p>
+      <w:pPr>
+        <w:numPr>
+          <w:ilvl w:val="5"/>
+          <w:numId w:val="6"/>
+        </w:numPr>
+      </w:pPr>
+      <w:r>
+        <w:t>New version would be a pain for existing files.</w:t>
       </w:r>
     </w:p>
     <w:p>
@@ -3960,7 +4509,15 @@
         </w:numPr>
       </w:pPr>
       <w:r>
-        <w:t>Extract suitable regions and spectra.</w:t>
+        <w:t xml:space="preserve">Or, </w:t>
+      </w:r>
+      <w:proofErr w:type="spellStart"/>
+      <w:r>
+        <w:t>read_yield</w:t>
+      </w:r>
+      <w:proofErr w:type="spellEnd"/>
+      <w:r>
+        <w:t xml:space="preserve"> when typing in mineral name?</w:t>
       </w:r>
     </w:p>
     <w:p>
@@ -3971,7 +4528,37 @@
         </w:numPr>
       </w:pPr>
       <w:r>
-        <w:t>Fit spectra, with appropriate yield for phase, and make DA matrix.</w:t>
+        <w:t>OK in COMAT file, as we use yield files there.</w:t>
+      </w:r>
+    </w:p>
+    <w:p>
+      <w:pPr>
+        <w:numPr>
+          <w:ilvl w:val="5"/>
+          <w:numId w:val="6"/>
+        </w:numPr>
+      </w:pPr>
+      <w:r>
+        <w:t>But do we want yields to override table entries?</w:t>
+      </w:r>
+    </w:p>
+    <w:p>
+      <w:pPr>
+        <w:numPr>
+          <w:ilvl w:val="3"/>
+          <w:numId w:val="6"/>
+        </w:numPr>
+      </w:pPr>
+      <w:r>
+        <w:t xml:space="preserve">Or, have a pop-up tool that reports </w:t>
+      </w:r>
+      <w:proofErr w:type="spellStart"/>
+      <w:r>
+        <w:t>wt</w:t>
+      </w:r>
+      <w:proofErr w:type="spellEnd"/>
+      <w:r>
+        <w:t>% from a selected .yield file?</w:t>
       </w:r>
     </w:p>
     <w:p>
@@ -3981,8 +4568,27 @@
           <w:numId w:val="6"/>
         </w:numPr>
       </w:pPr>
-      <w:r>
-        <w:t>Use “MPDA Master Weights” in DA matrix</w:t>
+    </w:p>
+    <w:p>
+      <w:pPr>
+        <w:numPr>
+          <w:ilvl w:val="2"/>
+          <w:numId w:val="6"/>
+        </w:numPr>
+      </w:pPr>
+      <w:r>
+        <w:t>Save .Correct file for image correction.</w:t>
+      </w:r>
+    </w:p>
+    <w:p>
+      <w:pPr>
+        <w:numPr>
+          <w:ilvl w:val="3"/>
+          <w:numId w:val="6"/>
+        </w:numPr>
+      </w:pPr>
+      <w:r>
+        <w:t>Do we correct images here, or below?</w:t>
       </w:r>
     </w:p>
     <w:p>
@@ -3993,18 +4599,7 @@
         </w:numPr>
       </w:pPr>
       <w:r>
-        <w:t>Construct .correct file.</w:t>
-      </w:r>
-    </w:p>
-    <w:p>
-      <w:pPr>
-        <w:numPr>
-          <w:ilvl w:val="3"/>
-          <w:numId w:val="6"/>
-        </w:numPr>
-      </w:pPr>
-      <w:r>
-        <w:t>Using an existing .correct file (including DA matrix files) to:</w:t>
+        <w:t>Have another tab for image correction and projecting phase maps.</w:t>
       </w:r>
     </w:p>
     <w:p>
@@ -4015,139 +4610,18 @@
         </w:numPr>
       </w:pPr>
       <w:r>
-        <w:t>Extend Sort Evt behaviour.</w:t>
-      </w:r>
-    </w:p>
-    <w:p>
-      <w:pPr>
-        <w:numPr>
-          <w:ilvl w:val="1"/>
-          <w:numId w:val="6"/>
-        </w:numPr>
-      </w:pPr>
-      <w:r>
-        <w:t>MPDA issues</w:t>
-      </w:r>
-    </w:p>
-    <w:p>
-      <w:pPr>
-        <w:numPr>
-          <w:ilvl w:val="2"/>
-          <w:numId w:val="6"/>
-        </w:numPr>
-      </w:pPr>
-      <w:r>
-        <w:t>If not cluster mode, how to do ‘geopixe_do_DA’?</w:t>
-      </w:r>
-    </w:p>
-    <w:p>
-      <w:pPr>
-        <w:numPr>
-          <w:ilvl w:val="3"/>
-          <w:numId w:val="6"/>
-        </w:numPr>
-      </w:pPr>
-      <w:r>
-        <w:t>Perhaps always build ‘args’ and call ‘geopixe_execute’ as used in ‘geopixe_do_command’.</w:t>
-      </w:r>
-    </w:p>
-    <w:p>
-      <w:pPr>
-        <w:numPr>
-          <w:ilvl w:val="3"/>
-          <w:numId w:val="6"/>
-        </w:numPr>
-      </w:pPr>
-      <w:r>
-        <w:t>But then can’t run in VM mode!</w:t>
-      </w:r>
-    </w:p>
-    <w:p>
-      <w:pPr>
-        <w:numPr>
-          <w:ilvl w:val="2"/>
-          <w:numId w:val="6"/>
-        </w:numPr>
-      </w:pPr>
-      <w:r>
-        <w:t xml:space="preserve">Pt hotspots may appear as only 3% Pt mineral and 97% silicates. But ALL of the Pt in them is from the Pt phase component. </w:t>
-      </w:r>
-    </w:p>
-    <w:p>
-      <w:pPr>
-        <w:numPr>
-          <w:ilvl w:val="3"/>
-          <w:numId w:val="6"/>
-        </w:numPr>
-      </w:pPr>
-      <w:r>
-        <w:t>Fit using straight Pt works, MPDA rel int poor (Lg too high).</w:t>
-      </w:r>
-    </w:p>
-    <w:p>
-      <w:pPr>
-        <w:numPr>
-          <w:ilvl w:val="3"/>
-          <w:numId w:val="6"/>
-        </w:numPr>
-      </w:pPr>
-      <w:r>
-        <w:t>What relative intensities should be used?</w:t>
-      </w:r>
-    </w:p>
-    <w:p>
-      <w:pPr>
-        <w:numPr>
-          <w:ilvl w:val="2"/>
-          <w:numId w:val="6"/>
-        </w:numPr>
-      </w:pPr>
-      <w:r>
-        <w:t>Perhaps distinguish between trace elements and majors in formula?</w:t>
-      </w:r>
-    </w:p>
-    <w:p>
-      <w:pPr>
-        <w:numPr>
-          <w:ilvl w:val="3"/>
-          <w:numId w:val="6"/>
-        </w:numPr>
-      </w:pPr>
-      <w:r>
-        <w:t>But you weight by phase DA matrix, not element.</w:t>
-      </w:r>
-    </w:p>
-    <w:p>
-      <w:pPr>
-        <w:numPr>
-          <w:ilvl w:val="1"/>
-          <w:numId w:val="6"/>
-        </w:numPr>
-      </w:pPr>
-      <w:r>
-        <w:t>Correct Yield Wizard</w:t>
-      </w:r>
-    </w:p>
-    <w:p>
-      <w:pPr>
-        <w:numPr>
-          <w:ilvl w:val="2"/>
-          <w:numId w:val="6"/>
-        </w:numPr>
-      </w:pPr>
-      <w:r>
-        <w:t>How to guide through regions analysis?</w:t>
-      </w:r>
-    </w:p>
-    <w:p>
-      <w:pPr>
-        <w:numPr>
-          <w:ilvl w:val="3"/>
-          <w:numId w:val="6"/>
-        </w:numPr>
-      </w:pPr>
-      <w:r>
-        <w:t>Define major distinct phases and extract spectra from them.</w:t>
+        <w:t>Some overlap with first tab of MPDA Wizard?</w:t>
+      </w:r>
+    </w:p>
+    <w:p>
+      <w:pPr>
+        <w:numPr>
+          <w:ilvl w:val="3"/>
+          <w:numId w:val="6"/>
+        </w:numPr>
+      </w:pPr>
+      <w:r>
+        <w:t>Should have guides, or tests, to ensure phases are reasonable</w:t>
       </w:r>
     </w:p>
     <w:p>
@@ -4158,7 +4632,7 @@
         </w:numPr>
       </w:pPr>
       <w:r>
-        <w:t>Try to find pixels close to the pure phases.</w:t>
+        <w:t>Should not go well above 1.0 before clipping.</w:t>
       </w:r>
     </w:p>
     <w:p>
@@ -4169,40 +4643,19 @@
         </w:numPr>
       </w:pPr>
       <w:r>
-        <w:t>Don’t want them too diluted with non-pure phase contributions.</w:t>
-      </w:r>
-    </w:p>
-    <w:p>
-      <w:pPr>
-        <w:numPr>
-          <w:ilvl w:val="3"/>
-          <w:numId w:val="6"/>
-        </w:numPr>
-      </w:pPr>
-      <w:r>
-        <w:t>Fit each one to create a DA matrix for each using correct yields.</w:t>
-      </w:r>
-    </w:p>
-    <w:p>
-      <w:pPr>
-        <w:numPr>
-          <w:ilvl w:val="2"/>
-          <w:numId w:val="6"/>
-        </w:numPr>
-      </w:pPr>
-      <w:r>
-        <w:t>Need a “wt%” tool/help to fill in composition matrix.</w:t>
-      </w:r>
-    </w:p>
-    <w:p>
-      <w:pPr>
-        <w:numPr>
-          <w:ilvl w:val="3"/>
-          <w:numId w:val="6"/>
-        </w:numPr>
-      </w:pPr>
-      <w:r>
-        <w:t>If define element columns first, then a “get” of a DA matrix row just fills in the wt% for these elements in the table?</w:t>
+        <w:lastRenderedPageBreak/>
+        <w:t>Should not be too small (Rest too close to 1.0 for most pixels).</w:t>
+      </w:r>
+    </w:p>
+    <w:p>
+      <w:pPr>
+        <w:numPr>
+          <w:ilvl w:val="5"/>
+          <w:numId w:val="6"/>
+        </w:numPr>
+      </w:pPr>
+      <w:r>
+        <w:t>Exception might be bone-like endmember in tissue ‘Rest’.</w:t>
       </w:r>
     </w:p>
     <w:p>
@@ -4213,181 +4666,15 @@
         </w:numPr>
       </w:pPr>
       <w:r>
-        <w:t>DA matrix file does NOT have this info.</w:t>
-      </w:r>
-    </w:p>
-    <w:p>
-      <w:pPr>
-        <w:numPr>
-          <w:ilvl w:val="5"/>
-          <w:numId w:val="6"/>
-        </w:numPr>
-      </w:pPr>
-      <w:r>
-        <w:t>Yield file does, so perhaps save this filename in DA matrix?</w:t>
-      </w:r>
-    </w:p>
-    <w:p>
-      <w:pPr>
-        <w:numPr>
-          <w:ilvl w:val="5"/>
-          <w:numId w:val="6"/>
-        </w:numPr>
-      </w:pPr>
-      <w:r>
-        <w:t>New version would be a pain for existing files.</w:t>
-      </w:r>
-    </w:p>
-    <w:p>
-      <w:pPr>
-        <w:numPr>
-          <w:ilvl w:val="4"/>
-          <w:numId w:val="6"/>
-        </w:numPr>
-      </w:pPr>
-      <w:r>
-        <w:t>Or, read_yield when typing in mineral name?</w:t>
-      </w:r>
-    </w:p>
-    <w:p>
-      <w:pPr>
-        <w:numPr>
-          <w:ilvl w:val="4"/>
-          <w:numId w:val="6"/>
-        </w:numPr>
-      </w:pPr>
-      <w:r>
-        <w:t>OK in COMAT file, as we use yield files there.</w:t>
-      </w:r>
-    </w:p>
-    <w:p>
-      <w:pPr>
-        <w:numPr>
-          <w:ilvl w:val="5"/>
-          <w:numId w:val="6"/>
-        </w:numPr>
-      </w:pPr>
-      <w:r>
-        <w:t>But do we want yields to override table entries?</w:t>
-      </w:r>
-    </w:p>
-    <w:p>
-      <w:pPr>
-        <w:numPr>
-          <w:ilvl w:val="3"/>
-          <w:numId w:val="6"/>
-        </w:numPr>
-      </w:pPr>
-      <w:r>
-        <w:t>Or, have a pop-up tool that reports wt% from a selected .yield file?</w:t>
-      </w:r>
-    </w:p>
-    <w:p>
-      <w:pPr>
-        <w:numPr>
-          <w:ilvl w:val="4"/>
-          <w:numId w:val="6"/>
-        </w:numPr>
-      </w:pPr>
-    </w:p>
-    <w:p>
-      <w:pPr>
-        <w:numPr>
-          <w:ilvl w:val="2"/>
-          <w:numId w:val="6"/>
-        </w:numPr>
-      </w:pPr>
-      <w:r>
-        <w:t>Save .Correct file for image correction.</w:t>
-      </w:r>
-    </w:p>
-    <w:p>
-      <w:pPr>
-        <w:numPr>
-          <w:ilvl w:val="3"/>
-          <w:numId w:val="6"/>
-        </w:numPr>
-      </w:pPr>
-      <w:r>
-        <w:lastRenderedPageBreak/>
-        <w:t>Do we correct images here, or below?</w:t>
-      </w:r>
-    </w:p>
-    <w:p>
-      <w:pPr>
-        <w:numPr>
-          <w:ilvl w:val="4"/>
-          <w:numId w:val="6"/>
-        </w:numPr>
-      </w:pPr>
-      <w:r>
-        <w:t>Have another tab for image correction and projecting phase maps.</w:t>
-      </w:r>
-    </w:p>
-    <w:p>
-      <w:pPr>
-        <w:numPr>
-          <w:ilvl w:val="4"/>
-          <w:numId w:val="6"/>
-        </w:numPr>
-      </w:pPr>
-      <w:r>
-        <w:t>Some overlap with first tab of MPDA Wizard?</w:t>
-      </w:r>
-    </w:p>
-    <w:p>
-      <w:pPr>
-        <w:numPr>
-          <w:ilvl w:val="3"/>
-          <w:numId w:val="6"/>
-        </w:numPr>
-      </w:pPr>
-      <w:r>
-        <w:t>Should have guides, or tests, to ensure phases are reasonable</w:t>
-      </w:r>
-    </w:p>
-    <w:p>
-      <w:pPr>
-        <w:numPr>
-          <w:ilvl w:val="4"/>
-          <w:numId w:val="6"/>
-        </w:numPr>
-      </w:pPr>
-      <w:r>
-        <w:t>Should not go well above 1.0 before clipping.</w:t>
-      </w:r>
-    </w:p>
-    <w:p>
-      <w:pPr>
-        <w:numPr>
-          <w:ilvl w:val="4"/>
-          <w:numId w:val="6"/>
-        </w:numPr>
-      </w:pPr>
-      <w:r>
-        <w:t>Should not be too small (Rest too close to 1.0 for most pixels).</w:t>
-      </w:r>
-    </w:p>
-    <w:p>
-      <w:pPr>
-        <w:numPr>
-          <w:ilvl w:val="5"/>
-          <w:numId w:val="6"/>
-        </w:numPr>
-      </w:pPr>
-      <w:r>
-        <w:t>Exception might be bone-like endmember in tissue ‘Rest’.</w:t>
-      </w:r>
-    </w:p>
-    <w:p>
-      <w:pPr>
-        <w:numPr>
-          <w:ilvl w:val="4"/>
-          <w:numId w:val="6"/>
-        </w:numPr>
-      </w:pPr>
-      <w:r>
-        <w:t>Build this into existing ‘correct_yields’ as tests and pop-ups.</w:t>
+        <w:t>Build this into existing ‘</w:t>
+      </w:r>
+      <w:proofErr w:type="spellStart"/>
+      <w:r>
+        <w:t>correct_yields</w:t>
+      </w:r>
+      <w:proofErr w:type="spellEnd"/>
+      <w:r>
+        <w:t>’ as tests and pop-ups.</w:t>
       </w:r>
     </w:p>
     <w:p>
@@ -4555,7 +4842,15 @@
         </w:numPr>
       </w:pPr>
       <w:r>
-        <w:t>Can ‘worker_progress’ keep it alive?</w:t>
+        <w:t>Can ‘</w:t>
+      </w:r>
+      <w:proofErr w:type="spellStart"/>
+      <w:r>
+        <w:t>worker_progress</w:t>
+      </w:r>
+      <w:proofErr w:type="spellEnd"/>
+      <w:r>
+        <w:t>’ keep it alive?</w:t>
       </w:r>
     </w:p>
     <w:p>
@@ -4587,8 +4882,13 @@
           <w:numId w:val="6"/>
         </w:numPr>
       </w:pPr>
-      <w:r>
-        <w:t xml:space="preserve">parallel_client </w:t>
+      <w:proofErr w:type="spellStart"/>
+      <w:r>
+        <w:t>parallel_client</w:t>
+      </w:r>
+      <w:proofErr w:type="spellEnd"/>
+      <w:r>
+        <w:t xml:space="preserve"> </w:t>
       </w:r>
     </w:p>
     <w:p>
@@ -4665,7 +4965,15 @@
         </w:numPr>
       </w:pPr>
       <w:r>
-        <w:t>Load command and args as before</w:t>
+        <w:t xml:space="preserve">Load command and </w:t>
+      </w:r>
+      <w:proofErr w:type="spellStart"/>
+      <w:r>
+        <w:t>args</w:t>
+      </w:r>
+      <w:proofErr w:type="spellEnd"/>
+      <w:r>
+        <w:t xml:space="preserve"> as before</w:t>
       </w:r>
     </w:p>
     <w:p>
@@ -4745,7 +5053,15 @@
         <w:t>Cancel from spawn background processes, in</w:t>
       </w:r>
       <w:r>
-        <w:t xml:space="preserve"> parallel_init?</w:t>
+        <w:t xml:space="preserve"> </w:t>
+      </w:r>
+      <w:proofErr w:type="spellStart"/>
+      <w:r>
+        <w:t>parallel_init</w:t>
+      </w:r>
+      <w:proofErr w:type="spellEnd"/>
+      <w:r>
+        <w:t>?</w:t>
       </w:r>
     </w:p>
     <w:p>
@@ -4778,7 +5094,15 @@
         </w:numPr>
       </w:pPr>
       <w:r>
-        <w:t>How to deal with Ga Kb peak in MM spectra</w:t>
+        <w:t xml:space="preserve">How to deal with Ga </w:t>
+      </w:r>
+      <w:proofErr w:type="spellStart"/>
+      <w:r>
+        <w:t>Kb</w:t>
+      </w:r>
+      <w:proofErr w:type="spellEnd"/>
+      <w:r>
+        <w:t xml:space="preserve"> peak in MM spectra</w:t>
       </w:r>
     </w:p>
     <w:p>
@@ -4833,18 +5157,42 @@
         </w:numPr>
       </w:pPr>
       <w:r>
+        <w:t xml:space="preserve">The </w:t>
+      </w:r>
+      <w:proofErr w:type="spellStart"/>
+      <w:r>
+        <w:t>rel</w:t>
+      </w:r>
+      <w:proofErr w:type="spellEnd"/>
+      <w:r>
+        <w:t xml:space="preserve">-int for these lines has been modified by source, windows, air and beam filters; they are not the same as </w:t>
+      </w:r>
+      <w:proofErr w:type="spellStart"/>
+      <w:r>
+        <w:t>rel</w:t>
+      </w:r>
+      <w:proofErr w:type="spellEnd"/>
+      <w:r>
+        <w:t xml:space="preserve">-int usually. It really needs a different model integration, with decay with depth as effective conc, and modification of the beam lines </w:t>
+      </w:r>
+      <w:proofErr w:type="spellStart"/>
+      <w:r>
+        <w:t>rel</w:t>
+      </w:r>
+      <w:proofErr w:type="spellEnd"/>
+      <w:r>
+        <w:t>-int on way out.</w:t>
+      </w:r>
+    </w:p>
+    <w:p>
+      <w:pPr>
+        <w:numPr>
+          <w:ilvl w:val="3"/>
+          <w:numId w:val="6"/>
+        </w:numPr>
+      </w:pPr>
+      <w:r>
         <w:lastRenderedPageBreak/>
-        <w:t>The rel-int for these lines has been modified by source, windows, air and beam filters; they are not the same as rel-int usually. It really needs a different model integration, with decay with depth as effective conc, and modification of the beam lines rel-int on way out.</w:t>
-      </w:r>
-    </w:p>
-    <w:p>
-      <w:pPr>
-        <w:numPr>
-          <w:ilvl w:val="3"/>
-          <w:numId w:val="6"/>
-        </w:numPr>
-      </w:pPr>
-      <w:r>
         <w:t>Then in a real spectrum, there may be BOTH real conc in sample and scattered lines from source, for the same element (e.g., Ga). Need to be able to select, perhaps, or combine?</w:t>
       </w:r>
     </w:p>
@@ -4867,7 +5215,23 @@
         </w:numPr>
       </w:pPr>
       <w:r>
-        <w:t>‘get_lines’ does not use source lines now, but it could, if enabled. Then these could be jammed in for matching Z and shell. Would still follow sample conc with depth, which is wrong, but may give reasonable rel-int anyway.</w:t>
+        <w:t>‘</w:t>
+      </w:r>
+      <w:proofErr w:type="spellStart"/>
+      <w:r>
+        <w:t>get_lines</w:t>
+      </w:r>
+      <w:proofErr w:type="spellEnd"/>
+      <w:r>
+        <w:t xml:space="preserve">’ does not use source lines now, but it could, if enabled. Then these could be jammed in for matching Z and shell. Would still follow sample conc with depth, which is wrong, but may give reasonable </w:t>
+      </w:r>
+      <w:proofErr w:type="spellStart"/>
+      <w:r>
+        <w:t>rel</w:t>
+      </w:r>
+      <w:proofErr w:type="spellEnd"/>
+      <w:r>
+        <w:t>-int anyway.</w:t>
       </w:r>
     </w:p>
     <w:p>
@@ -4900,7 +5264,15 @@
         </w:numPr>
       </w:pPr>
       <w:r>
-        <w:t>Could select in ‘get_lines’ called from ‘geo_yield2’.</w:t>
+        <w:t>Could select in ‘</w:t>
+      </w:r>
+      <w:proofErr w:type="spellStart"/>
+      <w:r>
+        <w:t>get_lines</w:t>
+      </w:r>
+      <w:proofErr w:type="spellEnd"/>
+      <w:r>
+        <w:t>’ called from ‘geo_yield2’.</w:t>
       </w:r>
     </w:p>
     <w:p>
@@ -4922,7 +5294,15 @@
         </w:numPr>
       </w:pPr>
       <w:r>
-        <w:t>Then just jam them in, in ‘get_lines’.</w:t>
+        <w:t>Then just jam them in, in ‘</w:t>
+      </w:r>
+      <w:proofErr w:type="spellStart"/>
+      <w:r>
+        <w:t>get_lines</w:t>
+      </w:r>
+      <w:proofErr w:type="spellEnd"/>
+      <w:r>
+        <w:t>’.</w:t>
       </w:r>
     </w:p>
     <w:p>
@@ -4955,40 +5335,112 @@
         </w:numPr>
       </w:pPr>
       <w:r>
-        <w:t>Could add a ‘sum_spread’ argument to pixe() to broaden sum peaks.</w:t>
-      </w:r>
-    </w:p>
-    <w:p>
-      <w:pPr>
-        <w:numPr>
-          <w:ilvl w:val="2"/>
-          <w:numId w:val="6"/>
-        </w:numPr>
-      </w:pPr>
-      <w:r>
-        <w:t>In ‘pixe’ set ‘sum’ flag (like ‘comp’) to broaden sum peaks in ‘line’ using a new ‘sum_spread’ parameter. Set this in ‘pixe_fit’ based on ‘sum_deficit’.</w:t>
-      </w:r>
-    </w:p>
-    <w:p>
-      <w:pPr>
-        <w:numPr>
-          <w:ilvl w:val="2"/>
-          <w:numId w:val="6"/>
-        </w:numPr>
-      </w:pPr>
-      <w:r>
-        <w:t>Try: sum_spread = (1.0 + sum_deficit/100.)^2</w:t>
-      </w:r>
-    </w:p>
-    <w:p>
-      <w:pPr>
-        <w:numPr>
-          <w:ilvl w:val="2"/>
-          <w:numId w:val="6"/>
-        </w:numPr>
-      </w:pPr>
-      <w:r>
-        <w:t>Test using spectrum: software/data/UQ-iXRF/Loren-July-2021/…</w:t>
+        <w:t>Could add a ‘</w:t>
+      </w:r>
+      <w:proofErr w:type="spellStart"/>
+      <w:r>
+        <w:t>sum_spread</w:t>
+      </w:r>
+      <w:proofErr w:type="spellEnd"/>
+      <w:r>
+        <w:t xml:space="preserve">’ argument to </w:t>
+      </w:r>
+      <w:proofErr w:type="spellStart"/>
+      <w:r>
+        <w:t>pixe</w:t>
+      </w:r>
+      <w:proofErr w:type="spellEnd"/>
+      <w:r>
+        <w:t>() to broaden sum peaks.</w:t>
+      </w:r>
+    </w:p>
+    <w:p>
+      <w:pPr>
+        <w:numPr>
+          <w:ilvl w:val="2"/>
+          <w:numId w:val="6"/>
+        </w:numPr>
+      </w:pPr>
+      <w:r>
+        <w:t>In ‘</w:t>
+      </w:r>
+      <w:proofErr w:type="spellStart"/>
+      <w:r>
+        <w:t>pixe</w:t>
+      </w:r>
+      <w:proofErr w:type="spellEnd"/>
+      <w:r>
+        <w:t>’ set ‘sum’ flag (like ‘comp’) to broaden sum peaks in ‘line’ using a new ‘</w:t>
+      </w:r>
+      <w:proofErr w:type="spellStart"/>
+      <w:r>
+        <w:t>sum_spread</w:t>
+      </w:r>
+      <w:proofErr w:type="spellEnd"/>
+      <w:r>
+        <w:t>’ parameter. Set this in ‘</w:t>
+      </w:r>
+      <w:proofErr w:type="spellStart"/>
+      <w:r>
+        <w:t>pixe_fit</w:t>
+      </w:r>
+      <w:proofErr w:type="spellEnd"/>
+      <w:r>
+        <w:t>’ based on ‘</w:t>
+      </w:r>
+      <w:proofErr w:type="spellStart"/>
+      <w:r>
+        <w:t>sum_deficit</w:t>
+      </w:r>
+      <w:proofErr w:type="spellEnd"/>
+      <w:r>
+        <w:t>’.</w:t>
+      </w:r>
+    </w:p>
+    <w:p>
+      <w:pPr>
+        <w:numPr>
+          <w:ilvl w:val="2"/>
+          <w:numId w:val="6"/>
+        </w:numPr>
+      </w:pPr>
+      <w:r>
+        <w:t xml:space="preserve">Try: </w:t>
+      </w:r>
+      <w:proofErr w:type="spellStart"/>
+      <w:r>
+        <w:t>sum_spread</w:t>
+      </w:r>
+      <w:proofErr w:type="spellEnd"/>
+      <w:r>
+        <w:t xml:space="preserve"> = (1.0 + </w:t>
+      </w:r>
+      <w:proofErr w:type="spellStart"/>
+      <w:r>
+        <w:t>sum_deficit</w:t>
+      </w:r>
+      <w:proofErr w:type="spellEnd"/>
+      <w:r>
+        <w:t>/100.)^2</w:t>
+      </w:r>
+    </w:p>
+    <w:p>
+      <w:pPr>
+        <w:numPr>
+          <w:ilvl w:val="2"/>
+          <w:numId w:val="6"/>
+        </w:numPr>
+      </w:pPr>
+      <w:r>
+        <w:t>Test using spectrum: software/data/UQ-</w:t>
+      </w:r>
+      <w:proofErr w:type="spellStart"/>
+      <w:r>
+        <w:t>iXRF</w:t>
+      </w:r>
+      <w:proofErr w:type="spellEnd"/>
+      <w:r>
+        <w:t>/Loren-July-2021/…</w:t>
       </w:r>
     </w:p>
     <w:p>
@@ -4998,19 +5450,40 @@
           <w:numId w:val="6"/>
         </w:numPr>
       </w:pPr>
-      <w:r>
-        <w:t xml:space="preserve">file_requester </w:t>
-      </w:r>
-    </w:p>
-    <w:p>
-      <w:pPr>
-        <w:numPr>
-          <w:ilvl w:val="2"/>
-          <w:numId w:val="6"/>
-        </w:numPr>
-      </w:pPr>
-      <w:r>
-        <w:t>Add controls under dir tree in ‘file_requester’:</w:t>
+      <w:proofErr w:type="spellStart"/>
+      <w:r>
+        <w:t>file_requester</w:t>
+      </w:r>
+      <w:proofErr w:type="spellEnd"/>
+      <w:r>
+        <w:t xml:space="preserve"> </w:t>
+      </w:r>
+    </w:p>
+    <w:p>
+      <w:pPr>
+        <w:numPr>
+          <w:ilvl w:val="2"/>
+          <w:numId w:val="6"/>
+        </w:numPr>
+      </w:pPr>
+      <w:r>
+        <w:t xml:space="preserve">Add controls under </w:t>
+      </w:r>
+      <w:proofErr w:type="spellStart"/>
+      <w:r>
+        <w:t>dir</w:t>
+      </w:r>
+      <w:proofErr w:type="spellEnd"/>
+      <w:r>
+        <w:t xml:space="preserve"> tree in ‘</w:t>
+      </w:r>
+      <w:proofErr w:type="spellStart"/>
+      <w:r>
+        <w:t>file_requester</w:t>
+      </w:r>
+      <w:proofErr w:type="spellEnd"/>
+      <w:r>
+        <w:t>’:</w:t>
       </w:r>
     </w:p>
     <w:p>
@@ -5054,18 +5527,34 @@
         </w:numPr>
       </w:pPr>
       <w:r>
-        <w:t>Knob arrow-key inc/dec appears too small?</w:t>
-      </w:r>
-    </w:p>
-    <w:p>
-      <w:pPr>
-        <w:numPr>
-          <w:ilvl w:val="3"/>
-          <w:numId w:val="6"/>
-        </w:numPr>
-      </w:pPr>
-      <w:r>
-        <w:t>Tests show it only incs/decs 1 integer unit and then no more with more clicks.</w:t>
+        <w:t xml:space="preserve">Knob arrow-key </w:t>
+      </w:r>
+      <w:proofErr w:type="spellStart"/>
+      <w:r>
+        <w:t>inc</w:t>
+      </w:r>
+      <w:proofErr w:type="spellEnd"/>
+      <w:r>
+        <w:t>/dec appears too small?</w:t>
+      </w:r>
+    </w:p>
+    <w:p>
+      <w:pPr>
+        <w:numPr>
+          <w:ilvl w:val="3"/>
+          <w:numId w:val="6"/>
+        </w:numPr>
+      </w:pPr>
+      <w:r>
+        <w:t xml:space="preserve">Tests show it only </w:t>
+      </w:r>
+      <w:proofErr w:type="spellStart"/>
+      <w:r>
+        <w:t>incs</w:t>
+      </w:r>
+      <w:proofErr w:type="spellEnd"/>
+      <w:r>
+        <w:t>/decs 1 integer unit and then no more with more clicks.</w:t>
       </w:r>
     </w:p>
     <w:p>
@@ -5142,18 +5631,34 @@
         </w:numPr>
       </w:pPr>
       <w:r>
-        <w:t>Perhaps add arrows at ends, like in Windows, and control the small inc/dec directly?</w:t>
-      </w:r>
-    </w:p>
-    <w:p>
-      <w:pPr>
-        <w:numPr>
-          <w:ilvl w:val="2"/>
-          <w:numId w:val="6"/>
-        </w:numPr>
-      </w:pPr>
-      <w:r>
-        <w:t>Make these inc/dec in ‘scroll’ steps.</w:t>
+        <w:t xml:space="preserve">Perhaps add arrows at ends, like in Windows, and control the small </w:t>
+      </w:r>
+      <w:proofErr w:type="spellStart"/>
+      <w:r>
+        <w:t>inc</w:t>
+      </w:r>
+      <w:proofErr w:type="spellEnd"/>
+      <w:r>
+        <w:t>/dec directly?</w:t>
+      </w:r>
+    </w:p>
+    <w:p>
+      <w:pPr>
+        <w:numPr>
+          <w:ilvl w:val="2"/>
+          <w:numId w:val="6"/>
+        </w:numPr>
+      </w:pPr>
+      <w:r>
+        <w:t xml:space="preserve">Make these </w:t>
+      </w:r>
+      <w:proofErr w:type="spellStart"/>
+      <w:r>
+        <w:t>inc</w:t>
+      </w:r>
+      <w:proofErr w:type="spellEnd"/>
+      <w:r>
+        <w:t>/dec in ‘scroll’ steps.</w:t>
       </w:r>
     </w:p>
     <w:p>
@@ -5187,9 +5692,11 @@
       <w:r>
         <w:t>Also, make these available via ‘</w:t>
       </w:r>
+      <w:proofErr w:type="spellStart"/>
       <w:r>
         <w:t>OnButton_Image_Process_Get</w:t>
       </w:r>
+      <w:proofErr w:type="spellEnd"/>
       <w:r>
         <w:t>’, so they work with “Get” and also triggered from “Apply Digital Filters” in batch sorting.</w:t>
       </w:r>
@@ -5293,7 +5800,15 @@
         </w:numPr>
       </w:pPr>
       <w:r>
-        <w:t>X^(1./3), X^(1./5), X^(1./10), atan(x)</w:t>
+        <w:t xml:space="preserve">X^(1./3), X^(1./5), X^(1./10), </w:t>
+      </w:r>
+      <w:proofErr w:type="spellStart"/>
+      <w:r>
+        <w:t>atan</w:t>
+      </w:r>
+      <w:proofErr w:type="spellEnd"/>
+      <w:r>
+        <w:t>(x)</w:t>
       </w:r>
     </w:p>
     <w:p>
@@ -5304,7 +5819,6 @@
         </w:numPr>
       </w:pPr>
       <w:r>
-        <w:lastRenderedPageBreak/>
         <w:t xml:space="preserve">IDL does </w:t>
       </w:r>
       <w:r>
@@ -5314,7 +5828,23 @@
         <w:t>not</w:t>
       </w:r>
       <w:r>
-        <w:t xml:space="preserve"> have ‘asinh’ or ‘atanh’ functions.</w:t>
+        <w:t xml:space="preserve"> have ‘</w:t>
+      </w:r>
+      <w:proofErr w:type="spellStart"/>
+      <w:r>
+        <w:t>asinh</w:t>
+      </w:r>
+      <w:proofErr w:type="spellEnd"/>
+      <w:r>
+        <w:t>’ or ‘</w:t>
+      </w:r>
+      <w:proofErr w:type="spellStart"/>
+      <w:r>
+        <w:t>atanh</w:t>
+      </w:r>
+      <w:proofErr w:type="spellEnd"/>
+      <w:r>
+        <w:t>’ functions.</w:t>
       </w:r>
     </w:p>
     <w:p>
@@ -5358,6 +5888,7 @@
         </w:numPr>
       </w:pPr>
       <w:r>
+        <w:lastRenderedPageBreak/>
         <w:t>Also look for -q2, -q3, -q4</w:t>
       </w:r>
     </w:p>
@@ -5369,7 +5900,23 @@
         </w:numPr>
       </w:pPr>
       <w:r>
-        <w:t>Perhaps use util routine:  ‘strip_file_keys, /file_m’ more universally?</w:t>
+        <w:t>Perhaps use util routine:  ‘</w:t>
+      </w:r>
+      <w:proofErr w:type="spellStart"/>
+      <w:r>
+        <w:t>strip_file_keys</w:t>
+      </w:r>
+      <w:proofErr w:type="spellEnd"/>
+      <w:r>
+        <w:t>, /</w:t>
+      </w:r>
+      <w:proofErr w:type="spellStart"/>
+      <w:r>
+        <w:t>file_m</w:t>
+      </w:r>
+      <w:proofErr w:type="spellEnd"/>
+      <w:r>
+        <w:t>’ more universally?</w:t>
       </w:r>
     </w:p>
     <w:p>

</xml_diff>

<commit_message>
Update manuals for v9.0.
</commit_message>
<xml_diff>
--- a/doc/GeoPIXE open mods needed.docx
+++ b/doc/GeoPIXE open mods needed.docx
@@ -74,7 +74,6 @@
         <w:autoSpaceDN w:val="0"/>
         <w:adjustRightInd w:val="0"/>
       </w:pPr>
-      <w:proofErr w:type="spellStart"/>
       <w:r>
         <w:t>X</w:t>
       </w:r>
@@ -82,11 +81,7 @@
         <w:t>Q</w:t>
       </w:r>
       <w:r>
-        <w:t>uartz</w:t>
-      </w:r>
-      <w:proofErr w:type="spellEnd"/>
-      <w:r>
-        <w:t xml:space="preserve"> upgrade needed first for </w:t>
+        <w:t xml:space="preserve">uartz upgrade needed first for </w:t>
       </w:r>
       <w:r>
         <w:t xml:space="preserve">MAC </w:t>
@@ -117,23 +112,7 @@
           <w:b/>
           <w:bCs/>
         </w:rPr>
-        <w:t>X11/</w:t>
-      </w:r>
-      <w:proofErr w:type="spellStart"/>
-      <w:r>
-        <w:rPr>
-          <w:b/>
-          <w:bCs/>
-        </w:rPr>
-        <w:t>XQuartz</w:t>
-      </w:r>
-      <w:proofErr w:type="spellEnd"/>
-      <w:r>
-        <w:rPr>
-          <w:b/>
-          <w:bCs/>
-        </w:rPr>
-        <w:t xml:space="preserve"> windowing system</w:t>
+        <w:t>X11/XQuartz windowing system</w:t>
       </w:r>
       <w:r>
         <w:t> and macOS’s native </w:t>
@@ -224,15 +203,7 @@
         <w:adjustRightInd w:val="0"/>
       </w:pPr>
       <w:r>
-        <w:t>Sav files moved to “</w:t>
-      </w:r>
-      <w:proofErr w:type="spellStart"/>
-      <w:r>
-        <w:t>geopixe</w:t>
-      </w:r>
-      <w:proofErr w:type="spellEnd"/>
-      <w:r>
-        <w:t>/</w:t>
+        <w:t>Sav files moved to “geopixe/</w:t>
       </w:r>
       <w:r>
         <w:t>off</w:t>
@@ -372,23 +343,7 @@
           <w:rFonts w:ascii="Calibri" w:eastAsiaTheme="minorHAnsi" w:hAnsi="Calibri"/>
           <w:lang w:eastAsia="en-AU"/>
         </w:rPr>
-        <w:t xml:space="preserve">Local plugins in </w:t>
-      </w:r>
-      <w:proofErr w:type="spellStart"/>
-      <w:r>
-        <w:rPr>
-          <w:rFonts w:ascii="Calibri" w:eastAsiaTheme="minorHAnsi" w:hAnsi="Calibri"/>
-          <w:lang w:eastAsia="en-AU"/>
-        </w:rPr>
-        <w:t>geopixe</w:t>
-      </w:r>
-      <w:proofErr w:type="spellEnd"/>
-      <w:r>
-        <w:rPr>
-          <w:rFonts w:ascii="Calibri" w:eastAsiaTheme="minorHAnsi" w:hAnsi="Calibri"/>
-          <w:lang w:eastAsia="en-AU"/>
-        </w:rPr>
-        <w:t>/plugins</w:t>
+        <w:t>Local plugins in geopixe/plugins</w:t>
       </w:r>
     </w:p>
     <w:p>
@@ -457,6 +412,162 @@
         </w:rPr>
         <w:t>dea</w:t>
       </w:r>
+      <w:r>
+        <w:rPr>
+          <w:highlight w:val="yellow"/>
+        </w:rPr>
+        <w:t>s</w:t>
+      </w:r>
+    </w:p>
+    <w:p>
+      <w:pPr>
+        <w:widowControl w:val="0"/>
+        <w:numPr>
+          <w:ilvl w:val="1"/>
+          <w:numId w:val="6"/>
+        </w:numPr>
+        <w:tabs>
+          <w:tab w:val="left" w:pos="6521"/>
+        </w:tabs>
+        <w:autoSpaceDE w:val="0"/>
+        <w:autoSpaceDN w:val="0"/>
+        <w:adjustRightInd w:val="0"/>
+      </w:pPr>
+      <w:r>
+        <w:rPr>
+          <w:highlight w:val="magenta"/>
+        </w:rPr>
+        <w:t>MPDA adapted to target radical changing background shapes rather than yields</w:t>
+      </w:r>
+      <w:r>
+        <w:t>.</w:t>
+      </w:r>
+    </w:p>
+    <w:p>
+      <w:pPr>
+        <w:widowControl w:val="0"/>
+        <w:numPr>
+          <w:ilvl w:val="2"/>
+          <w:numId w:val="6"/>
+        </w:numPr>
+        <w:tabs>
+          <w:tab w:val="left" w:pos="6521"/>
+        </w:tabs>
+        <w:autoSpaceDE w:val="0"/>
+        <w:autoSpaceDN w:val="0"/>
+        <w:adjustRightInd w:val="0"/>
+      </w:pPr>
+      <w:r>
+        <w:t>The idea is to identify very different/ contrasting composition areas that produce very different background shapes and use these as “endmembers” for MPDA.</w:t>
+      </w:r>
+    </w:p>
+    <w:p>
+      <w:pPr>
+        <w:widowControl w:val="0"/>
+        <w:numPr>
+          <w:ilvl w:val="2"/>
+          <w:numId w:val="6"/>
+        </w:numPr>
+        <w:tabs>
+          <w:tab w:val="left" w:pos="6521"/>
+        </w:tabs>
+        <w:autoSpaceDE w:val="0"/>
+        <w:autoSpaceDN w:val="0"/>
+        <w:adjustRightInd w:val="0"/>
+      </w:pPr>
+      <w:r>
+        <w:t>But full MPDA will refine images, changing composition due to yield correction, hence these contrasting compositions will shift in value, complicating this idea.</w:t>
+      </w:r>
+    </w:p>
+    <w:p>
+      <w:pPr>
+        <w:widowControl w:val="0"/>
+        <w:numPr>
+          <w:ilvl w:val="2"/>
+          <w:numId w:val="6"/>
+        </w:numPr>
+        <w:tabs>
+          <w:tab w:val="left" w:pos="6521"/>
+        </w:tabs>
+        <w:autoSpaceDE w:val="0"/>
+        <w:autoSpaceDN w:val="0"/>
+        <w:adjustRightInd w:val="0"/>
+      </w:pPr>
+      <w:r>
+        <w:t>Can we usefully disable some of this “yield correction”, so that these “endmember” regions do not move in composition, so we still benefit from the mixing of background shapes (in proportion to endmember fraction) while not iterating on composition?</w:t>
+      </w:r>
+    </w:p>
+    <w:p>
+      <w:pPr>
+        <w:widowControl w:val="0"/>
+        <w:numPr>
+          <w:ilvl w:val="1"/>
+          <w:numId w:val="6"/>
+        </w:numPr>
+        <w:tabs>
+          <w:tab w:val="left" w:pos="6521"/>
+        </w:tabs>
+        <w:autoSpaceDE w:val="0"/>
+        <w:autoSpaceDN w:val="0"/>
+        <w:adjustRightInd w:val="0"/>
+      </w:pPr>
+      <w:r>
+        <w:t>How to do background-only-MPDA?</w:t>
+      </w:r>
+    </w:p>
+    <w:p>
+      <w:pPr>
+        <w:widowControl w:val="0"/>
+        <w:numPr>
+          <w:ilvl w:val="2"/>
+          <w:numId w:val="6"/>
+        </w:numPr>
+        <w:tabs>
+          <w:tab w:val="left" w:pos="6521"/>
+        </w:tabs>
+        <w:autoSpaceDE w:val="0"/>
+        <w:autoSpaceDN w:val="0"/>
+        <w:adjustRightInd w:val="0"/>
+      </w:pPr>
+      <w:r>
+        <w:t>Have a normal MPDAM file, where read_da() returns arrays of ‘matrix’ and ‘yield’ over all phases, and set all ‘yield’ the same, so the inverse yield ratios all stay 1.</w:t>
+      </w:r>
+    </w:p>
+    <w:p>
+      <w:pPr>
+        <w:widowControl w:val="0"/>
+        <w:numPr>
+          <w:ilvl w:val="2"/>
+          <w:numId w:val="6"/>
+        </w:numPr>
+        <w:tabs>
+          <w:tab w:val="left" w:pos="6521"/>
+        </w:tabs>
+        <w:autoSpaceDE w:val="0"/>
+        <w:autoSpaceDN w:val="0"/>
+        <w:adjustRightInd w:val="0"/>
+      </w:pPr>
+      <w:r>
+        <w:t>But keep the ‘ncomp’ dimension ‘matrix’, which uses different backgrounds.</w:t>
+      </w:r>
+    </w:p>
+    <w:p>
+      <w:pPr>
+        <w:widowControl w:val="0"/>
+        <w:numPr>
+          <w:ilvl w:val="2"/>
+          <w:numId w:val="6"/>
+        </w:numPr>
+        <w:tabs>
+          <w:tab w:val="left" w:pos="6521"/>
+        </w:tabs>
+        <w:autoSpaceDE w:val="0"/>
+        <w:autoSpaceDN w:val="0"/>
+        <w:adjustRightInd w:val="0"/>
+      </w:pPr>
+      <w:r>
+        <w:t>Perhaps just set all ‘matrix.yield’ equal to 1.0</w:t>
+      </w:r>
     </w:p>
     <w:p>
       <w:pPr>
@@ -643,15 +754,7 @@
         </w:numPr>
       </w:pPr>
       <w:r>
-        <w:t>Perhaps add this to the ‘</w:t>
-      </w:r>
-      <w:proofErr w:type="spellStart"/>
-      <w:r>
-        <w:t>detector_map</w:t>
-      </w:r>
-      <w:proofErr w:type="spellEnd"/>
-      <w:r>
-        <w:t>’ window?</w:t>
+        <w:t>Perhaps add this to the ‘detector_map’ window?</w:t>
       </w:r>
     </w:p>
     <w:p>
@@ -675,15 +778,8 @@
         </w:numPr>
       </w:pPr>
       <w:r>
-        <w:t>Perhaps add this to ‘</w:t>
-      </w:r>
-      <w:proofErr w:type="spellStart"/>
-      <w:r>
-        <w:t>da_evt</w:t>
-      </w:r>
-      <w:proofErr w:type="spellEnd"/>
-      <w:r>
-        <w:t>’ to accumulate this stat as a map.</w:t>
+        <w:lastRenderedPageBreak/>
+        <w:t>Perhaps add this to ‘da_evt’ to accumulate this stat as a map.</w:t>
       </w:r>
     </w:p>
     <w:p>
@@ -695,15 +791,7 @@
         </w:numPr>
       </w:pPr>
       <w:r>
-        <w:t xml:space="preserve">DA: Perhaps add error matrix to DA fit output to </w:t>
-      </w:r>
-      <w:proofErr w:type="spellStart"/>
-      <w:r>
-        <w:t>DAMx</w:t>
-      </w:r>
-      <w:proofErr w:type="spellEnd"/>
-      <w:r>
-        <w:t xml:space="preserve"> files</w:t>
+        <w:t>DA: Perhaps add error matrix to DA fit output to DAMx files</w:t>
       </w:r>
     </w:p>
     <w:p>
@@ -874,7 +962,6 @@
       <w:r>
         <w:t>Why does “</w:t>
       </w:r>
-      <w:proofErr w:type="spellStart"/>
       <w:r>
         <w:rPr>
           <w:b/>
@@ -882,17 +969,8 @@
         </w:rPr>
         <w:t>maia_device</w:t>
       </w:r>
-      <w:proofErr w:type="spellEnd"/>
-      <w:r>
-        <w:t>::</w:t>
-      </w:r>
-      <w:proofErr w:type="spellStart"/>
-      <w:r>
-        <w:t>ylut</w:t>
-      </w:r>
-      <w:proofErr w:type="spellEnd"/>
-      <w:r>
-        <w:t>” not enforce a veto on Y Encoder mode?</w:t>
+      <w:r>
+        <w:t>::ylut” not enforce a veto on Y Encoder mode?</w:t>
       </w:r>
       <w:r>
         <w:t xml:space="preserve"> </w:t>
@@ -919,7 +997,6 @@
         </w:numPr>
       </w:pPr>
       <w:r>
-        <w:lastRenderedPageBreak/>
         <w:t>Working with small ROI in huge images</w:t>
       </w:r>
     </w:p>
@@ -1010,15 +1087,7 @@
         </w:numPr>
       </w:pPr>
       <w:r>
-        <w:t xml:space="preserve">PDF </w:t>
-      </w:r>
-      <w:proofErr w:type="spellStart"/>
-      <w:r>
-        <w:t>HowTo</w:t>
-      </w:r>
-      <w:proofErr w:type="spellEnd"/>
-      <w:r>
-        <w:t xml:space="preserve"> doc for beamline/ASCI</w:t>
+        <w:t>PDF HowTo doc for beamline/ASCI</w:t>
       </w:r>
     </w:p>
     <w:p>
@@ -1261,15 +1330,7 @@
         </w:numPr>
       </w:pPr>
       <w:r>
-        <w:t>Need to use ‘</w:t>
-      </w:r>
-      <w:proofErr w:type="spellStart"/>
-      <w:r>
-        <w:t>fit_setup</w:t>
-      </w:r>
-      <w:proofErr w:type="spellEnd"/>
-      <w:r>
-        <w:t>’ GUI to load PCM (and data) and do calculation.</w:t>
+        <w:t>Need to use ‘fit_setup’ GUI to load PCM (and data) and do calculation.</w:t>
       </w:r>
     </w:p>
     <w:p>
@@ -1281,15 +1342,7 @@
         </w:numPr>
       </w:pPr>
       <w:r>
-        <w:t>Results saved in ‘</w:t>
-      </w:r>
-      <w:proofErr w:type="spellStart"/>
-      <w:r>
-        <w:t>fit_results</w:t>
-      </w:r>
-      <w:proofErr w:type="spellEnd"/>
-      <w:r>
-        <w:t>’ to PFR file.</w:t>
+        <w:t>Results saved in ‘fit_results’ to PFR file.</w:t>
       </w:r>
     </w:p>
     <w:p>
@@ -1412,6 +1465,7 @@
         </w:numPr>
       </w:pPr>
       <w:r>
+        <w:lastRenderedPageBreak/>
         <w:t>Sorting from raw data</w:t>
       </w:r>
       <w:r>
@@ -1463,33 +1517,154 @@
         <w:rPr>
           <w:highlight w:val="yellow"/>
         </w:rPr>
-        <w:t>included in the ‘</w:t>
-      </w:r>
-      <w:proofErr w:type="spellStart"/>
+        <w:t>included in the ‘geopixe’ distribution</w:t>
+      </w:r>
+    </w:p>
+    <w:p>
+      <w:pPr>
+        <w:pStyle w:val="ListParagraph"/>
+        <w:numPr>
+          <w:ilvl w:val="3"/>
+          <w:numId w:val="6"/>
+        </w:numPr>
+      </w:pPr>
+      <w:r>
+        <w:t>Need to be able to construct a long list of tests and run them all</w:t>
+      </w:r>
+    </w:p>
+    <w:p>
+      <w:pPr>
+        <w:pStyle w:val="ListParagraph"/>
+        <w:numPr>
+          <w:ilvl w:val="4"/>
+          <w:numId w:val="6"/>
+        </w:numPr>
+      </w:pPr>
+      <w:r>
+        <w:t xml:space="preserve">Perhaps only after setting the Demo root path. </w:t>
+      </w:r>
+    </w:p>
+    <w:p>
+      <w:pPr>
+        <w:pStyle w:val="ListParagraph"/>
+        <w:numPr>
+          <w:ilvl w:val="4"/>
+          <w:numId w:val="6"/>
+        </w:numPr>
+      </w:pPr>
+      <w:r>
+        <w:t>Multiple for each test (e.g. a few yield sample/beam combinations).</w:t>
+      </w:r>
+    </w:p>
+    <w:p>
+      <w:pPr>
+        <w:pStyle w:val="ListParagraph"/>
+        <w:numPr>
+          <w:ilvl w:val="4"/>
+          <w:numId w:val="6"/>
+        </w:numPr>
+      </w:pPr>
+      <w:r>
+        <w:t>Maybe from a Wizard calling ‘geopixe_execute’ directly?</w:t>
+      </w:r>
+    </w:p>
+    <w:p>
+      <w:pPr>
+        <w:pStyle w:val="ListParagraph"/>
+        <w:numPr>
+          <w:ilvl w:val="4"/>
+          <w:numId w:val="6"/>
+        </w:numPr>
+      </w:pPr>
+      <w:r>
+        <w:t>After manually running each module (e.g. yields)</w:t>
+      </w:r>
+      <w:r>
+        <w:t>, or …</w:t>
+      </w:r>
+    </w:p>
+    <w:p>
+      <w:pPr>
+        <w:pStyle w:val="ListParagraph"/>
+        <w:numPr>
+          <w:ilvl w:val="4"/>
+          <w:numId w:val="6"/>
+        </w:numPr>
+      </w:pPr>
+      <w:r>
+        <w:t>Wizard could trigger ‘layer_setup’ to load LCM and run it</w:t>
+      </w:r>
+      <w:r>
+        <w:t>, etc</w:t>
+      </w:r>
+      <w:r>
+        <w:t>.</w:t>
+      </w:r>
+    </w:p>
+    <w:p>
+      <w:pPr>
+        <w:pStyle w:val="ListParagraph"/>
+        <w:numPr>
+          <w:ilvl w:val="2"/>
+          <w:numId w:val="6"/>
+        </w:numPr>
+      </w:pPr>
+      <w:r>
+        <w:t>May make sense to execute these by the GCF mechanism.</w:t>
+      </w:r>
+    </w:p>
+    <w:p>
+      <w:pPr>
+        <w:pStyle w:val="ListParagraph"/>
+        <w:numPr>
+          <w:ilvl w:val="3"/>
+          <w:numId w:val="6"/>
+        </w:numPr>
+      </w:pPr>
+      <w:r>
+        <w:t>Need to add entry points for yields and fitting.</w:t>
+      </w:r>
+    </w:p>
+    <w:p>
+      <w:pPr>
+        <w:pStyle w:val="ListParagraph"/>
+        <w:numPr>
+          <w:ilvl w:val="3"/>
+          <w:numId w:val="6"/>
+        </w:numPr>
+      </w:pPr>
+      <w:r>
+        <w:t>Then they can be run from a shell script.</w:t>
+      </w:r>
+    </w:p>
+    <w:p>
+      <w:pPr>
+        <w:pStyle w:val="ListParagraph"/>
+        <w:numPr>
+          <w:ilvl w:val="3"/>
+          <w:numId w:val="6"/>
+        </w:numPr>
+      </w:pPr>
+      <w:r>
+        <w:t>Need to log smart test results (minimal if results seem OK).</w:t>
+      </w:r>
+    </w:p>
+    <w:p>
+      <w:pPr>
+        <w:pStyle w:val="ListParagraph"/>
+        <w:numPr>
+          <w:ilvl w:val="3"/>
+          <w:numId w:val="6"/>
+        </w:numPr>
+      </w:pPr>
       <w:r>
         <w:rPr>
           <w:highlight w:val="yellow"/>
         </w:rPr>
-        <w:t>geopixe</w:t>
-      </w:r>
-      <w:proofErr w:type="spellEnd"/>
-      <w:r>
-        <w:rPr>
-          <w:highlight w:val="yellow"/>
-        </w:rPr>
-        <w:t>’ distribution</w:t>
-      </w:r>
-    </w:p>
-    <w:p>
-      <w:pPr>
-        <w:pStyle w:val="ListParagraph"/>
-        <w:numPr>
-          <w:ilvl w:val="3"/>
-          <w:numId w:val="6"/>
-        </w:numPr>
-      </w:pPr>
-      <w:r>
-        <w:t>Need to be able to construct a long list of tests and run them all</w:t>
+        <w:t>Perhaps detect lack of a .GCF file as argv[0</w:t>
+      </w:r>
+      <w:r>
+        <w:t>]</w:t>
       </w:r>
     </w:p>
     <w:p>
@@ -1501,181 +1676,7 @@
         </w:numPr>
       </w:pPr>
       <w:r>
-        <w:t xml:space="preserve">Perhaps only after setting the Demo root path. </w:t>
-      </w:r>
-    </w:p>
-    <w:p>
-      <w:pPr>
-        <w:pStyle w:val="ListParagraph"/>
-        <w:numPr>
-          <w:ilvl w:val="4"/>
-          <w:numId w:val="6"/>
-        </w:numPr>
-      </w:pPr>
-      <w:r>
-        <w:t>Multiple for each test (e.g. a few yield sample/beam combinations).</w:t>
-      </w:r>
-    </w:p>
-    <w:p>
-      <w:pPr>
-        <w:pStyle w:val="ListParagraph"/>
-        <w:numPr>
-          <w:ilvl w:val="4"/>
-          <w:numId w:val="6"/>
-        </w:numPr>
-      </w:pPr>
-      <w:r>
-        <w:t>Maybe from a Wizard calling ‘</w:t>
-      </w:r>
-      <w:proofErr w:type="spellStart"/>
-      <w:r>
-        <w:t>geopixe_execute</w:t>
-      </w:r>
-      <w:proofErr w:type="spellEnd"/>
-      <w:r>
-        <w:t>’ directly?</w:t>
-      </w:r>
-    </w:p>
-    <w:p>
-      <w:pPr>
-        <w:pStyle w:val="ListParagraph"/>
-        <w:numPr>
-          <w:ilvl w:val="4"/>
-          <w:numId w:val="6"/>
-        </w:numPr>
-      </w:pPr>
-      <w:r>
-        <w:t>After manually running each module (e.g. yields)</w:t>
-      </w:r>
-      <w:r>
-        <w:t>, or …</w:t>
-      </w:r>
-    </w:p>
-    <w:p>
-      <w:pPr>
-        <w:pStyle w:val="ListParagraph"/>
-        <w:numPr>
-          <w:ilvl w:val="4"/>
-          <w:numId w:val="6"/>
-        </w:numPr>
-      </w:pPr>
-      <w:r>
-        <w:t>Wizard could trigger ‘</w:t>
-      </w:r>
-      <w:proofErr w:type="spellStart"/>
-      <w:r>
-        <w:t>layer_setup</w:t>
-      </w:r>
-      <w:proofErr w:type="spellEnd"/>
-      <w:r>
-        <w:t>’ to load LCM and run it</w:t>
-      </w:r>
-      <w:r>
-        <w:t>, etc</w:t>
-      </w:r>
-      <w:r>
-        <w:t>.</w:t>
-      </w:r>
-    </w:p>
-    <w:p>
-      <w:pPr>
-        <w:pStyle w:val="ListParagraph"/>
-        <w:numPr>
-          <w:ilvl w:val="2"/>
-          <w:numId w:val="6"/>
-        </w:numPr>
-      </w:pPr>
-      <w:r>
-        <w:t>May make sense to execute these by the GCF mechanism.</w:t>
-      </w:r>
-    </w:p>
-    <w:p>
-      <w:pPr>
-        <w:pStyle w:val="ListParagraph"/>
-        <w:numPr>
-          <w:ilvl w:val="3"/>
-          <w:numId w:val="6"/>
-        </w:numPr>
-      </w:pPr>
-      <w:r>
-        <w:t>Need to add entry points for yields and fitting.</w:t>
-      </w:r>
-    </w:p>
-    <w:p>
-      <w:pPr>
-        <w:pStyle w:val="ListParagraph"/>
-        <w:numPr>
-          <w:ilvl w:val="3"/>
-          <w:numId w:val="6"/>
-        </w:numPr>
-      </w:pPr>
-      <w:r>
-        <w:t>Then they can be run from a shell script.</w:t>
-      </w:r>
-    </w:p>
-    <w:p>
-      <w:pPr>
-        <w:pStyle w:val="ListParagraph"/>
-        <w:numPr>
-          <w:ilvl w:val="3"/>
-          <w:numId w:val="6"/>
-        </w:numPr>
-      </w:pPr>
-      <w:r>
-        <w:t>Need to log smart test results (minimal if results seem OK).</w:t>
-      </w:r>
-    </w:p>
-    <w:p>
-      <w:pPr>
-        <w:pStyle w:val="ListParagraph"/>
-        <w:numPr>
-          <w:ilvl w:val="3"/>
-          <w:numId w:val="6"/>
-        </w:numPr>
-      </w:pPr>
-      <w:r>
-        <w:rPr>
-          <w:highlight w:val="yellow"/>
-        </w:rPr>
-        <w:lastRenderedPageBreak/>
-        <w:t xml:space="preserve">Perhaps detect lack of a .GCF file as </w:t>
-      </w:r>
-      <w:proofErr w:type="spellStart"/>
-      <w:r>
-        <w:rPr>
-          <w:highlight w:val="yellow"/>
-        </w:rPr>
-        <w:t>argv</w:t>
-      </w:r>
-      <w:proofErr w:type="spellEnd"/>
-      <w:r>
-        <w:rPr>
-          <w:highlight w:val="yellow"/>
-        </w:rPr>
-        <w:t>[0</w:t>
-      </w:r>
-      <w:r>
-        <w:t>]</w:t>
-      </w:r>
-    </w:p>
-    <w:p>
-      <w:pPr>
-        <w:pStyle w:val="ListParagraph"/>
-        <w:numPr>
-          <w:ilvl w:val="4"/>
-          <w:numId w:val="6"/>
-        </w:numPr>
-      </w:pPr>
-      <w:r>
-        <w:t xml:space="preserve">interpret </w:t>
-      </w:r>
-      <w:proofErr w:type="spellStart"/>
-      <w:r>
-        <w:t>argv</w:t>
-      </w:r>
-      <w:proofErr w:type="spellEnd"/>
-      <w:r>
-        <w:t>[0] as simply the routine to run.</w:t>
+        <w:t>interpret argv[0] as simply the routine to run.</w:t>
       </w:r>
     </w:p>
     <w:p>
@@ -2033,15 +2034,7 @@
         <w:adjustRightInd w:val="0"/>
       </w:pPr>
       <w:r>
-        <w:t xml:space="preserve">To follow </w:t>
-      </w:r>
-      <w:proofErr w:type="spellStart"/>
-      <w:r>
-        <w:t>da_evt</w:t>
-      </w:r>
-      <w:proofErr w:type="spellEnd"/>
-      <w:r>
-        <w:t xml:space="preserve"> to DAI, as in Batch Sort.</w:t>
+        <w:t>To follow da_evt to DAI, as in Batch Sort.</w:t>
       </w:r>
     </w:p>
     <w:p>
@@ -2131,39 +2124,7 @@
         <w:adjustRightInd w:val="0"/>
       </w:pPr>
       <w:r>
-        <w:t>Perhaps add these as new keywords to ‘</w:t>
-      </w:r>
-      <w:proofErr w:type="spellStart"/>
-      <w:r>
-        <w:t>da_evt</w:t>
-      </w:r>
-      <w:proofErr w:type="spellEnd"/>
-      <w:r>
-        <w:t>’ in GCF, which get detected (in ‘</w:t>
-      </w:r>
-      <w:proofErr w:type="spellStart"/>
-      <w:r>
-        <w:t>geopixe_do_command</w:t>
-      </w:r>
-      <w:proofErr w:type="spellEnd"/>
-      <w:r>
-        <w:t xml:space="preserve">’) and removed from </w:t>
-      </w:r>
-      <w:proofErr w:type="spellStart"/>
-      <w:r>
-        <w:t>args</w:t>
-      </w:r>
-      <w:proofErr w:type="spellEnd"/>
-      <w:r>
-        <w:t xml:space="preserve"> passed to ‘</w:t>
-      </w:r>
-      <w:proofErr w:type="spellStart"/>
-      <w:r>
-        <w:t>da_evt</w:t>
-      </w:r>
-      <w:proofErr w:type="spellEnd"/>
-      <w:r>
-        <w:t>’.</w:t>
+        <w:t>Perhaps add these as new keywords to ‘da_evt’ in GCF, which get detected (in ‘geopixe_do_command’) and removed from args passed to ‘da_evt’.</w:t>
       </w:r>
     </w:p>
     <w:p>
@@ -2252,6 +2213,7 @@
         </w:numPr>
       </w:pPr>
       <w:r>
+        <w:lastRenderedPageBreak/>
         <w:t xml:space="preserve">Support for Unit Tests – see </w:t>
       </w:r>
       <w:r>
@@ -2456,7 +2418,6 @@
         </w:numPr>
       </w:pPr>
       <w:r>
-        <w:lastRenderedPageBreak/>
         <w:t>This should keep connection open.</w:t>
       </w:r>
     </w:p>
@@ -2490,34 +2451,18 @@
         </w:numPr>
       </w:pPr>
       <w:r>
-        <w:t xml:space="preserve">sort </w:t>
-      </w:r>
-      <w:proofErr w:type="spellStart"/>
-      <w:r>
-        <w:t>evt</w:t>
-      </w:r>
-      <w:proofErr w:type="spellEnd"/>
-      <w:r>
-        <w:t xml:space="preserve"> – 3D mode</w:t>
-      </w:r>
-    </w:p>
-    <w:p>
-      <w:pPr>
-        <w:numPr>
-          <w:ilvl w:val="3"/>
-          <w:numId w:val="6"/>
-        </w:numPr>
-      </w:pPr>
-      <w:r>
-        <w:t>“</w:t>
-      </w:r>
-      <w:proofErr w:type="spellStart"/>
-      <w:r>
-        <w:t>da_xanes_base</w:t>
-      </w:r>
-      <w:proofErr w:type="spellEnd"/>
-      <w:r>
-        <w:t>” is undefined, when switching to tomo XY mode.</w:t>
+        <w:t>sort evt – 3D mode</w:t>
+      </w:r>
+    </w:p>
+    <w:p>
+      <w:pPr>
+        <w:numPr>
+          <w:ilvl w:val="3"/>
+          <w:numId w:val="6"/>
+        </w:numPr>
+      </w:pPr>
+      <w:r>
+        <w:t>“da_xanes_base” is undefined, when switching to tomo XY mode.</w:t>
       </w:r>
     </w:p>
     <w:p>
@@ -2728,15 +2673,7 @@
         <w:adjustRightInd w:val="0"/>
       </w:pPr>
       <w:r>
-        <w:t xml:space="preserve">Would need some extra ‘filter’ option on </w:t>
-      </w:r>
-      <w:proofErr w:type="spellStart"/>
-      <w:r>
-        <w:t>file_requester</w:t>
-      </w:r>
-      <w:proofErr w:type="spellEnd"/>
-      <w:r>
-        <w:t xml:space="preserve">. </w:t>
+        <w:t xml:space="preserve">Would need some extra ‘filter’ option on file_requester. </w:t>
       </w:r>
     </w:p>
     <w:p>
@@ -2754,15 +2691,7 @@
         <w:adjustRightInd w:val="0"/>
       </w:pPr>
       <w:r>
-        <w:t>Pass a ‘</w:t>
-      </w:r>
-      <w:proofErr w:type="spellStart"/>
-      <w:r>
-        <w:t>filter_routine</w:t>
-      </w:r>
-      <w:proofErr w:type="spellEnd"/>
-      <w:r>
-        <w:t xml:space="preserve">’ option. </w:t>
+        <w:t xml:space="preserve">Pass a ‘filter_routine’ option. </w:t>
       </w:r>
     </w:p>
     <w:p>
@@ -2909,15 +2838,7 @@
         <w:t>When selected from list, call routine</w:t>
       </w:r>
       <w:r>
-        <w:t xml:space="preserve"> (“??_</w:t>
-      </w:r>
-      <w:proofErr w:type="spellStart"/>
-      <w:r>
-        <w:t>special_filter</w:t>
-      </w:r>
-      <w:proofErr w:type="spellEnd"/>
-      <w:r>
-        <w:t>)</w:t>
+        <w:t xml:space="preserve"> (“??_special_filter)</w:t>
       </w:r>
     </w:p>
     <w:p>
@@ -2935,15 +2856,7 @@
         <w:adjustRightInd w:val="0"/>
       </w:pPr>
       <w:r>
-        <w:t>Pass ‘</w:t>
-      </w:r>
-      <w:proofErr w:type="spellStart"/>
-      <w:r>
-        <w:t>pspecial</w:t>
-      </w:r>
-      <w:proofErr w:type="spellEnd"/>
-      <w:r>
-        <w:t>’ to allow old settings to return</w:t>
+        <w:t>Pass ‘pspecial’ to allow old settings to return</w:t>
       </w:r>
     </w:p>
     <w:p>
@@ -2978,13 +2891,8 @@
         <w:autoSpaceDN w:val="0"/>
         <w:adjustRightInd w:val="0"/>
       </w:pPr>
-      <w:proofErr w:type="spellStart"/>
-      <w:r>
-        <w:t>Pspecial</w:t>
-      </w:r>
-      <w:proofErr w:type="spellEnd"/>
-      <w:r>
-        <w:t xml:space="preserve"> pointer</w:t>
+      <w:r>
+        <w:t>Pspecial pointer</w:t>
       </w:r>
     </w:p>
     <w:p>
@@ -3074,23 +2982,7 @@
         <w:adjustRightInd w:val="0"/>
       </w:pPr>
       <w:r>
-        <w:t>See “</w:t>
-      </w:r>
-      <w:proofErr w:type="spellStart"/>
-      <w:r>
-        <w:t>select_periodic</w:t>
-      </w:r>
-      <w:proofErr w:type="spellEnd"/>
-      <w:r>
-        <w:t>”, which does this to ‘</w:t>
-      </w:r>
-      <w:proofErr w:type="spellStart"/>
-      <w:r>
-        <w:t>source_setup</w:t>
-      </w:r>
-      <w:proofErr w:type="spellEnd"/>
-      <w:r>
-        <w:t>’</w:t>
+        <w:t>See “select_periodic”, which does this to ‘source_setup’</w:t>
       </w:r>
     </w:p>
     <w:p>
@@ -3132,6 +3024,7 @@
         <w:adjustRightInd w:val="0"/>
       </w:pPr>
       <w:r>
+        <w:lastRenderedPageBreak/>
         <w:t>Something better than planes 2-4</w:t>
       </w:r>
       <w:r>
@@ -3189,31 +3082,7 @@
         <w:adjustRightInd w:val="0"/>
       </w:pPr>
       <w:r>
-        <w:t xml:space="preserve">ASCII version seems to be missing: ca, </w:t>
-      </w:r>
-      <w:proofErr w:type="spellStart"/>
-      <w:r>
-        <w:t>cb</w:t>
-      </w:r>
-      <w:proofErr w:type="spellEnd"/>
-      <w:r>
-        <w:t xml:space="preserve">, </w:t>
-      </w:r>
-      <w:proofErr w:type="spellStart"/>
-      <w:r>
-        <w:t>adc</w:t>
-      </w:r>
-      <w:proofErr w:type="spellEnd"/>
-      <w:r>
-        <w:t xml:space="preserve">, </w:t>
-      </w:r>
-      <w:proofErr w:type="spellStart"/>
-      <w:r>
-        <w:t>n_det</w:t>
-      </w:r>
-      <w:proofErr w:type="spellEnd"/>
-      <w:r>
-        <w:t xml:space="preserve">. </w:t>
+        <w:t xml:space="preserve">ASCII version seems to be missing: ca, cb, adc, n_det. </w:t>
       </w:r>
     </w:p>
     <w:p>
@@ -3267,15 +3136,7 @@
         <w:adjustRightInd w:val="0"/>
       </w:pPr>
       <w:r>
-        <w:t>‘</w:t>
-      </w:r>
-      <w:proofErr w:type="spellStart"/>
-      <w:r>
-        <w:t>Get_linear</w:t>
-      </w:r>
-      <w:proofErr w:type="spellEnd"/>
-      <w:r>
-        <w:t xml:space="preserve">’ probably assumes (single) old format vector. </w:t>
+        <w:t xml:space="preserve">‘Get_linear’ probably assumes (single) old format vector. </w:t>
       </w:r>
     </w:p>
     <w:p>
@@ -3329,15 +3190,7 @@
         <w:adjustRightInd w:val="0"/>
       </w:pPr>
       <w:r>
-        <w:t>Where is ‘</w:t>
-      </w:r>
-      <w:proofErr w:type="spellStart"/>
-      <w:r>
-        <w:t>da.ecompress</w:t>
-      </w:r>
-      <w:proofErr w:type="spellEnd"/>
-      <w:r>
-        <w:t>’ used?</w:t>
+        <w:t>Where is ‘da.ecompress’ used?</w:t>
       </w:r>
       <w:r>
         <w:t xml:space="preserve"> Lund old format?</w:t>
@@ -3362,10 +3215,8 @@
         </w:numPr>
       </w:pPr>
       <w:r>
-        <w:lastRenderedPageBreak/>
         <w:t xml:space="preserve">Does not export the </w:t>
       </w:r>
-      <w:proofErr w:type="spellStart"/>
       <w:r>
         <w:rPr>
           <w:i/>
@@ -3373,7 +3224,6 @@
         </w:rPr>
         <w:t>rGamma</w:t>
       </w:r>
-      <w:proofErr w:type="spellEnd"/>
       <w:r>
         <w:t xml:space="preserve"> matrix or </w:t>
       </w:r>
@@ -3444,11 +3294,9 @@
       <w:r>
         <w:t>Fudged in ‘</w:t>
       </w:r>
-      <w:proofErr w:type="spellStart"/>
       <w:r>
         <w:t>Spectrum_Mark_Pileup_Image</w:t>
       </w:r>
-      <w:proofErr w:type="spellEnd"/>
       <w:r>
         <w:t>’ at 0.2% fixed for now.</w:t>
       </w:r>
@@ -3852,13 +3700,8 @@
         </w:numPr>
       </w:pPr>
       <w:r>
-        <w:t xml:space="preserve">Need: include, refine, reject, clear menus – like </w:t>
-      </w:r>
-      <w:proofErr w:type="spellStart"/>
-      <w:r>
-        <w:t>corr</w:t>
-      </w:r>
-      <w:proofErr w:type="spellEnd"/>
+        <w:t>Need: include, refine, reject, clear menus – like corr</w:t>
+      </w:r>
     </w:p>
     <w:p>
       <w:pPr>
@@ -3887,6 +3730,7 @@
           <w:b/>
           <w:bCs/>
         </w:rPr>
+        <w:lastRenderedPageBreak/>
         <w:t>Operation order?</w:t>
       </w:r>
     </w:p>
@@ -3960,11 +3804,9 @@
       <w:r>
         <w:t>new ‘</w:t>
       </w:r>
-      <w:proofErr w:type="spellStart"/>
       <w:r>
         <w:t>widget_browser</w:t>
       </w:r>
-      <w:proofErr w:type="spellEnd"/>
       <w:r>
         <w:t>’</w:t>
       </w:r>
@@ -3981,15 +3823,7 @@
       </w:pPr>
       <w:bookmarkStart w:id="0" w:name="_Hlk126678996"/>
       <w:r>
-        <w:t>See ‘</w:t>
-      </w:r>
-      <w:proofErr w:type="spellStart"/>
-      <w:r>
-        <w:t>test_browser_wizard</w:t>
-      </w:r>
-      <w:proofErr w:type="spellEnd"/>
-      <w:r>
-        <w:t>’ in project test</w:t>
+        <w:t>See ‘test_browser_wizard’ in project test</w:t>
       </w:r>
       <w:r>
         <w:t>/IDL</w:t>
@@ -4029,52 +3863,404 @@
         </w:numPr>
       </w:pPr>
       <w:r>
+        <w:t>If a result is posted, then “Process” should not do it again - skip?</w:t>
+      </w:r>
+    </w:p>
+    <w:p>
+      <w:pPr>
+        <w:numPr>
+          <w:ilvl w:val="1"/>
+          <w:numId w:val="6"/>
+        </w:numPr>
+      </w:pPr>
+      <w:r>
+        <w:t>MPDA work-flow</w:t>
+      </w:r>
+    </w:p>
+    <w:p>
+      <w:pPr>
+        <w:numPr>
+          <w:ilvl w:val="2"/>
+          <w:numId w:val="6"/>
+        </w:numPr>
+      </w:pPr>
+      <w:r>
+        <w:t>Options?</w:t>
+      </w:r>
+    </w:p>
+    <w:p>
+      <w:pPr>
+        <w:numPr>
+          <w:ilvl w:val="3"/>
+          <w:numId w:val="6"/>
+        </w:numPr>
+      </w:pPr>
+      <w:r>
+        <w:t xml:space="preserve">As Batch sort extras, </w:t>
+      </w:r>
+    </w:p>
+    <w:p>
+      <w:pPr>
+        <w:numPr>
+          <w:ilvl w:val="3"/>
+          <w:numId w:val="6"/>
+        </w:numPr>
+      </w:pPr>
+      <w:r>
+        <w:t>Or start to build MPDA Wizard?</w:t>
+      </w:r>
+    </w:p>
+    <w:p>
+      <w:pPr>
+        <w:numPr>
+          <w:ilvl w:val="4"/>
+          <w:numId w:val="6"/>
+        </w:numPr>
+      </w:pPr>
+      <w:r>
+        <w:t>May take over much of Batch Sort functionality?</w:t>
+      </w:r>
+    </w:p>
+    <w:p>
+      <w:pPr>
+        <w:numPr>
+          <w:ilvl w:val="3"/>
+          <w:numId w:val="6"/>
+        </w:numPr>
+      </w:pPr>
+      <w:r>
+        <w:t>Or, just a simple flow-on from a MPDA sort</w:t>
+      </w:r>
+    </w:p>
+    <w:p>
+      <w:pPr>
+        <w:numPr>
+          <w:ilvl w:val="4"/>
+          <w:numId w:val="6"/>
+        </w:numPr>
+      </w:pPr>
+      <w:r>
+        <w:t>In absence of phases, it does normal sort, correct, project Minerals?</w:t>
+      </w:r>
+    </w:p>
+    <w:p>
+      <w:pPr>
+        <w:numPr>
+          <w:ilvl w:val="4"/>
+          <w:numId w:val="6"/>
+        </w:numPr>
+      </w:pPr>
+      <w:r>
+        <w:t>And then builds mpdam file and repeats as MPDA sort?</w:t>
+      </w:r>
+    </w:p>
+    <w:p>
+      <w:pPr>
+        <w:numPr>
+          <w:ilvl w:val="2"/>
+          <w:numId w:val="6"/>
+        </w:numPr>
+      </w:pPr>
+      <w:r>
+        <w:t>Distinguish between</w:t>
+      </w:r>
+    </w:p>
+    <w:p>
+      <w:pPr>
+        <w:numPr>
+          <w:ilvl w:val="3"/>
+          <w:numId w:val="6"/>
+        </w:numPr>
+      </w:pPr>
+      <w:r>
+        <w:t>Building phase regions, all DA matrix files and a new .correct file.</w:t>
+      </w:r>
+    </w:p>
+    <w:p>
+      <w:pPr>
+        <w:numPr>
+          <w:ilvl w:val="4"/>
+          <w:numId w:val="6"/>
+        </w:numPr>
+      </w:pPr>
+      <w:r>
+        <w:t>Extract suitable regions and spectra.</w:t>
+      </w:r>
+    </w:p>
+    <w:p>
+      <w:pPr>
+        <w:numPr>
+          <w:ilvl w:val="4"/>
+          <w:numId w:val="6"/>
+        </w:numPr>
+      </w:pPr>
+      <w:r>
+        <w:t>Fit spectra, with appropriate yield for phase, and make DA matrix.</w:t>
+      </w:r>
+    </w:p>
+    <w:p>
+      <w:pPr>
+        <w:numPr>
+          <w:ilvl w:val="4"/>
+          <w:numId w:val="6"/>
+        </w:numPr>
+      </w:pPr>
+      <w:r>
+        <w:t>Use “MPDA Master Weights” in DA matrix</w:t>
+      </w:r>
+    </w:p>
+    <w:p>
+      <w:pPr>
+        <w:numPr>
+          <w:ilvl w:val="4"/>
+          <w:numId w:val="6"/>
+        </w:numPr>
+      </w:pPr>
+      <w:r>
+        <w:t>Construct .correct file.</w:t>
+      </w:r>
+    </w:p>
+    <w:p>
+      <w:pPr>
+        <w:numPr>
+          <w:ilvl w:val="3"/>
+          <w:numId w:val="6"/>
+        </w:numPr>
+      </w:pPr>
+      <w:r>
+        <w:t>Using an existing .correct file (including DA matrix files) to:</w:t>
+      </w:r>
+    </w:p>
+    <w:p>
+      <w:pPr>
+        <w:numPr>
+          <w:ilvl w:val="4"/>
+          <w:numId w:val="6"/>
+        </w:numPr>
+      </w:pPr>
+      <w:r>
+        <w:t>Extend Sort Evt behaviour.</w:t>
+      </w:r>
+    </w:p>
+    <w:p>
+      <w:pPr>
+        <w:numPr>
+          <w:ilvl w:val="1"/>
+          <w:numId w:val="6"/>
+        </w:numPr>
+      </w:pPr>
+      <w:r>
+        <w:t>MPDA issues</w:t>
+      </w:r>
+    </w:p>
+    <w:p>
+      <w:pPr>
+        <w:numPr>
+          <w:ilvl w:val="2"/>
+          <w:numId w:val="6"/>
+        </w:numPr>
+      </w:pPr>
+      <w:r>
+        <w:t>If not cluster mode, how to do ‘geopixe_do_DA’?</w:t>
+      </w:r>
+    </w:p>
+    <w:p>
+      <w:pPr>
+        <w:numPr>
+          <w:ilvl w:val="3"/>
+          <w:numId w:val="6"/>
+        </w:numPr>
+      </w:pPr>
+      <w:r>
+        <w:t>Perhaps always build ‘args’ and call ‘geopixe_execute’ as used in ‘geopixe_do_command’.</w:t>
+      </w:r>
+    </w:p>
+    <w:p>
+      <w:pPr>
+        <w:numPr>
+          <w:ilvl w:val="3"/>
+          <w:numId w:val="6"/>
+        </w:numPr>
+      </w:pPr>
+      <w:r>
+        <w:t>But then can’t run in VM mode!</w:t>
+      </w:r>
+    </w:p>
+    <w:p>
+      <w:pPr>
+        <w:numPr>
+          <w:ilvl w:val="2"/>
+          <w:numId w:val="6"/>
+        </w:numPr>
+      </w:pPr>
+      <w:r>
+        <w:t xml:space="preserve">Pt hotspots may appear as only 3% Pt mineral and 97% silicates. But ALL of the Pt in them is from the Pt phase component. </w:t>
+      </w:r>
+    </w:p>
+    <w:p>
+      <w:pPr>
+        <w:numPr>
+          <w:ilvl w:val="3"/>
+          <w:numId w:val="6"/>
+        </w:numPr>
+      </w:pPr>
+      <w:r>
+        <w:t>Fit using straight Pt works, MPDA rel int poor (Lg too high).</w:t>
+      </w:r>
+    </w:p>
+    <w:p>
+      <w:pPr>
+        <w:numPr>
+          <w:ilvl w:val="3"/>
+          <w:numId w:val="6"/>
+        </w:numPr>
+      </w:pPr>
+      <w:r>
+        <w:t>What relative intensities should be used?</w:t>
+      </w:r>
+    </w:p>
+    <w:p>
+      <w:pPr>
+        <w:numPr>
+          <w:ilvl w:val="2"/>
+          <w:numId w:val="6"/>
+        </w:numPr>
+      </w:pPr>
+      <w:r>
+        <w:t>Perhaps distinguish between trace elements and majors in formula?</w:t>
+      </w:r>
+    </w:p>
+    <w:p>
+      <w:pPr>
+        <w:numPr>
+          <w:ilvl w:val="3"/>
+          <w:numId w:val="6"/>
+        </w:numPr>
+      </w:pPr>
+      <w:r>
+        <w:t>But you weight by phase DA matrix, not element.</w:t>
+      </w:r>
+    </w:p>
+    <w:p>
+      <w:pPr>
+        <w:numPr>
+          <w:ilvl w:val="1"/>
+          <w:numId w:val="6"/>
+        </w:numPr>
+      </w:pPr>
+      <w:r>
+        <w:t>Correct Yield Wizard</w:t>
+      </w:r>
+    </w:p>
+    <w:p>
+      <w:pPr>
+        <w:numPr>
+          <w:ilvl w:val="2"/>
+          <w:numId w:val="6"/>
+        </w:numPr>
+      </w:pPr>
+      <w:r>
+        <w:t>How to guide through regions analysis?</w:t>
+      </w:r>
+    </w:p>
+    <w:p>
+      <w:pPr>
+        <w:numPr>
+          <w:ilvl w:val="3"/>
+          <w:numId w:val="6"/>
+        </w:numPr>
+      </w:pPr>
+      <w:r>
+        <w:t>Define major distinct phases and extract spectra from them.</w:t>
+      </w:r>
+    </w:p>
+    <w:p>
+      <w:pPr>
+        <w:numPr>
+          <w:ilvl w:val="4"/>
+          <w:numId w:val="6"/>
+        </w:numPr>
+      </w:pPr>
+      <w:r>
+        <w:t>Try to find pixels close to the pure phases.</w:t>
+      </w:r>
+    </w:p>
+    <w:p>
+      <w:pPr>
+        <w:numPr>
+          <w:ilvl w:val="4"/>
+          <w:numId w:val="6"/>
+        </w:numPr>
+      </w:pPr>
+      <w:r>
+        <w:t>Don’t want them too diluted with non-pure phase contributions.</w:t>
+      </w:r>
+    </w:p>
+    <w:p>
+      <w:pPr>
+        <w:numPr>
+          <w:ilvl w:val="3"/>
+          <w:numId w:val="6"/>
+        </w:numPr>
+      </w:pPr>
+      <w:r>
+        <w:t>Fit each one to create a DA matrix for each using correct yields.</w:t>
+      </w:r>
+    </w:p>
+    <w:p>
+      <w:pPr>
+        <w:numPr>
+          <w:ilvl w:val="2"/>
+          <w:numId w:val="6"/>
+        </w:numPr>
+      </w:pPr>
+      <w:r>
+        <w:t>Need a “wt%” tool/help to fill in composition matrix.</w:t>
+      </w:r>
+    </w:p>
+    <w:p>
+      <w:pPr>
+        <w:numPr>
+          <w:ilvl w:val="3"/>
+          <w:numId w:val="6"/>
+        </w:numPr>
+      </w:pPr>
+      <w:r>
+        <w:t>If define element columns first, then a “get” of a DA matrix row just fills in the wt% for these elements in the table?</w:t>
+      </w:r>
+    </w:p>
+    <w:p>
+      <w:pPr>
+        <w:numPr>
+          <w:ilvl w:val="4"/>
+          <w:numId w:val="6"/>
+        </w:numPr>
+      </w:pPr>
+      <w:r>
+        <w:t>DA matrix file does NOT have this info.</w:t>
+      </w:r>
+    </w:p>
+    <w:p>
+      <w:pPr>
+        <w:numPr>
+          <w:ilvl w:val="5"/>
+          <w:numId w:val="6"/>
+        </w:numPr>
+      </w:pPr>
+      <w:r>
         <w:lastRenderedPageBreak/>
-        <w:t>If a result is posted, then “Process” should not do it again - skip?</w:t>
-      </w:r>
-    </w:p>
-    <w:p>
-      <w:pPr>
-        <w:numPr>
-          <w:ilvl w:val="1"/>
-          <w:numId w:val="6"/>
-        </w:numPr>
-      </w:pPr>
-      <w:r>
-        <w:t>MPDA work-flow</w:t>
-      </w:r>
-    </w:p>
-    <w:p>
-      <w:pPr>
-        <w:numPr>
-          <w:ilvl w:val="2"/>
-          <w:numId w:val="6"/>
-        </w:numPr>
-      </w:pPr>
-      <w:r>
-        <w:t>Options?</w:t>
-      </w:r>
-    </w:p>
-    <w:p>
-      <w:pPr>
-        <w:numPr>
-          <w:ilvl w:val="3"/>
-          <w:numId w:val="6"/>
-        </w:numPr>
-      </w:pPr>
-      <w:r>
-        <w:t xml:space="preserve">As Batch sort extras, </w:t>
-      </w:r>
-    </w:p>
-    <w:p>
-      <w:pPr>
-        <w:numPr>
-          <w:ilvl w:val="3"/>
-          <w:numId w:val="6"/>
-        </w:numPr>
-      </w:pPr>
-      <w:r>
-        <w:t>Or start to build MPDA Wizard?</w:t>
+        <w:t>Yield file does, so perhaps save this filename in DA matrix?</w:t>
+      </w:r>
+    </w:p>
+    <w:p>
+      <w:pPr>
+        <w:numPr>
+          <w:ilvl w:val="5"/>
+          <w:numId w:val="6"/>
+        </w:numPr>
+      </w:pPr>
+      <w:r>
+        <w:t>New version would be a pain for existing files.</w:t>
       </w:r>
     </w:p>
     <w:p>
@@ -4085,18 +4271,7 @@
         </w:numPr>
       </w:pPr>
       <w:r>
-        <w:t>May take over much of Batch Sort functionality?</w:t>
-      </w:r>
-    </w:p>
-    <w:p>
-      <w:pPr>
-        <w:numPr>
-          <w:ilvl w:val="3"/>
-          <w:numId w:val="6"/>
-        </w:numPr>
-      </w:pPr>
-      <w:r>
-        <w:t>Or, just a simple flow-on from a MPDA sort</w:t>
+        <w:t>Or, read_yield when typing in mineral name?</w:t>
       </w:r>
     </w:p>
     <w:p>
@@ -4107,7 +4282,29 @@
         </w:numPr>
       </w:pPr>
       <w:r>
-        <w:t>In absence of phases, it does normal sort, correct, project Minerals?</w:t>
+        <w:t>OK in COMAT file, as we use yield files there.</w:t>
+      </w:r>
+    </w:p>
+    <w:p>
+      <w:pPr>
+        <w:numPr>
+          <w:ilvl w:val="5"/>
+          <w:numId w:val="6"/>
+        </w:numPr>
+      </w:pPr>
+      <w:r>
+        <w:t>But do we want yields to override table entries?</w:t>
+      </w:r>
+    </w:p>
+    <w:p>
+      <w:pPr>
+        <w:numPr>
+          <w:ilvl w:val="3"/>
+          <w:numId w:val="6"/>
+        </w:numPr>
+      </w:pPr>
+      <w:r>
+        <w:t>Or, have a pop-up tool that reports wt% from a selected .yield file?</w:t>
       </w:r>
     </w:p>
     <w:p>
@@ -4117,38 +4314,27 @@
           <w:numId w:val="6"/>
         </w:numPr>
       </w:pPr>
-      <w:r>
-        <w:t xml:space="preserve">And then builds </w:t>
-      </w:r>
-      <w:proofErr w:type="spellStart"/>
-      <w:r>
-        <w:t>mpdam</w:t>
-      </w:r>
-      <w:proofErr w:type="spellEnd"/>
-      <w:r>
-        <w:t xml:space="preserve"> file and repeats as MPDA sort?</w:t>
-      </w:r>
-    </w:p>
-    <w:p>
-      <w:pPr>
-        <w:numPr>
-          <w:ilvl w:val="2"/>
-          <w:numId w:val="6"/>
-        </w:numPr>
-      </w:pPr>
-      <w:r>
-        <w:t>Distinguish between</w:t>
-      </w:r>
-    </w:p>
-    <w:p>
-      <w:pPr>
-        <w:numPr>
-          <w:ilvl w:val="3"/>
-          <w:numId w:val="6"/>
-        </w:numPr>
-      </w:pPr>
-      <w:r>
-        <w:t>Building phase regions, all DA matrix files and a new .correct file.</w:t>
+    </w:p>
+    <w:p>
+      <w:pPr>
+        <w:numPr>
+          <w:ilvl w:val="2"/>
+          <w:numId w:val="6"/>
+        </w:numPr>
+      </w:pPr>
+      <w:r>
+        <w:t>Save .Correct file for image correction.</w:t>
+      </w:r>
+    </w:p>
+    <w:p>
+      <w:pPr>
+        <w:numPr>
+          <w:ilvl w:val="3"/>
+          <w:numId w:val="6"/>
+        </w:numPr>
+      </w:pPr>
+      <w:r>
+        <w:t>Do we correct images here, or below?</w:t>
       </w:r>
     </w:p>
     <w:p>
@@ -4159,7 +4345,7 @@
         </w:numPr>
       </w:pPr>
       <w:r>
-        <w:t>Extract suitable regions and spectra.</w:t>
+        <w:t>Have another tab for image correction and projecting phase maps.</w:t>
       </w:r>
     </w:p>
     <w:p>
@@ -4170,7 +4356,18 @@
         </w:numPr>
       </w:pPr>
       <w:r>
-        <w:t>Fit spectra, with appropriate yield for phase, and make DA matrix.</w:t>
+        <w:t>Some overlap with first tab of MPDA Wizard?</w:t>
+      </w:r>
+    </w:p>
+    <w:p>
+      <w:pPr>
+        <w:numPr>
+          <w:ilvl w:val="3"/>
+          <w:numId w:val="6"/>
+        </w:numPr>
+      </w:pPr>
+      <w:r>
+        <w:t>Should have guides, or tests, to ensure phases are reasonable</w:t>
       </w:r>
     </w:p>
     <w:p>
@@ -4181,7 +4378,7 @@
         </w:numPr>
       </w:pPr>
       <w:r>
-        <w:t>Use “MPDA Master Weights” in DA matrix</w:t>
+        <w:t>Should not go well above 1.0 before clipping.</w:t>
       </w:r>
     </w:p>
     <w:p>
@@ -4192,18 +4389,18 @@
         </w:numPr>
       </w:pPr>
       <w:r>
-        <w:t>Construct .correct file.</w:t>
-      </w:r>
-    </w:p>
-    <w:p>
-      <w:pPr>
-        <w:numPr>
-          <w:ilvl w:val="3"/>
-          <w:numId w:val="6"/>
-        </w:numPr>
-      </w:pPr>
-      <w:r>
-        <w:t>Using an existing .correct file (including DA matrix files) to:</w:t>
+        <w:t>Should not be too small (Rest too close to 1.0 for most pixels).</w:t>
+      </w:r>
+    </w:p>
+    <w:p>
+      <w:pPr>
+        <w:numPr>
+          <w:ilvl w:val="5"/>
+          <w:numId w:val="6"/>
+        </w:numPr>
+      </w:pPr>
+      <w:r>
+        <w:t>Exception might be bone-like endmember in tissue ‘Rest’.</w:t>
       </w:r>
     </w:p>
     <w:p>
@@ -4214,467 +4411,7 @@
         </w:numPr>
       </w:pPr>
       <w:r>
-        <w:t xml:space="preserve">Extend Sort </w:t>
-      </w:r>
-      <w:proofErr w:type="spellStart"/>
-      <w:r>
-        <w:t>Evt</w:t>
-      </w:r>
-      <w:proofErr w:type="spellEnd"/>
-      <w:r>
-        <w:t xml:space="preserve"> behaviour.</w:t>
-      </w:r>
-    </w:p>
-    <w:p>
-      <w:pPr>
-        <w:numPr>
-          <w:ilvl w:val="1"/>
-          <w:numId w:val="6"/>
-        </w:numPr>
-      </w:pPr>
-      <w:r>
-        <w:t>MPDA issues</w:t>
-      </w:r>
-    </w:p>
-    <w:p>
-      <w:pPr>
-        <w:numPr>
-          <w:ilvl w:val="2"/>
-          <w:numId w:val="6"/>
-        </w:numPr>
-      </w:pPr>
-      <w:r>
-        <w:t>If not cluster mode, how to do ‘</w:t>
-      </w:r>
-      <w:proofErr w:type="spellStart"/>
-      <w:r>
-        <w:t>geopixe_do_DA</w:t>
-      </w:r>
-      <w:proofErr w:type="spellEnd"/>
-      <w:r>
-        <w:t>’?</w:t>
-      </w:r>
-    </w:p>
-    <w:p>
-      <w:pPr>
-        <w:numPr>
-          <w:ilvl w:val="3"/>
-          <w:numId w:val="6"/>
-        </w:numPr>
-      </w:pPr>
-      <w:r>
-        <w:t>Perhaps always build ‘</w:t>
-      </w:r>
-      <w:proofErr w:type="spellStart"/>
-      <w:r>
-        <w:t>args</w:t>
-      </w:r>
-      <w:proofErr w:type="spellEnd"/>
-      <w:r>
-        <w:t>’ and call ‘</w:t>
-      </w:r>
-      <w:proofErr w:type="spellStart"/>
-      <w:r>
-        <w:t>geopixe_execute</w:t>
-      </w:r>
-      <w:proofErr w:type="spellEnd"/>
-      <w:r>
-        <w:t>’ as used in ‘</w:t>
-      </w:r>
-      <w:proofErr w:type="spellStart"/>
-      <w:r>
-        <w:t>geopixe_do_command</w:t>
-      </w:r>
-      <w:proofErr w:type="spellEnd"/>
-      <w:r>
-        <w:t>’.</w:t>
-      </w:r>
-    </w:p>
-    <w:p>
-      <w:pPr>
-        <w:numPr>
-          <w:ilvl w:val="3"/>
-          <w:numId w:val="6"/>
-        </w:numPr>
-      </w:pPr>
-      <w:r>
-        <w:t>But then can’t run in VM mode!</w:t>
-      </w:r>
-    </w:p>
-    <w:p>
-      <w:pPr>
-        <w:numPr>
-          <w:ilvl w:val="2"/>
-          <w:numId w:val="6"/>
-        </w:numPr>
-      </w:pPr>
-      <w:r>
-        <w:t xml:space="preserve">Pt hotspots may appear as only 3% Pt mineral and 97% silicates. But ALL of the Pt in them is from the Pt phase component. </w:t>
-      </w:r>
-    </w:p>
-    <w:p>
-      <w:pPr>
-        <w:numPr>
-          <w:ilvl w:val="3"/>
-          <w:numId w:val="6"/>
-        </w:numPr>
-      </w:pPr>
-      <w:r>
-        <w:t xml:space="preserve">Fit using straight Pt works, MPDA </w:t>
-      </w:r>
-      <w:proofErr w:type="spellStart"/>
-      <w:r>
-        <w:t>rel</w:t>
-      </w:r>
-      <w:proofErr w:type="spellEnd"/>
-      <w:r>
-        <w:t xml:space="preserve"> int poor (Lg too high).</w:t>
-      </w:r>
-    </w:p>
-    <w:p>
-      <w:pPr>
-        <w:numPr>
-          <w:ilvl w:val="3"/>
-          <w:numId w:val="6"/>
-        </w:numPr>
-      </w:pPr>
-      <w:r>
-        <w:t>What relative intensities should be used?</w:t>
-      </w:r>
-    </w:p>
-    <w:p>
-      <w:pPr>
-        <w:numPr>
-          <w:ilvl w:val="2"/>
-          <w:numId w:val="6"/>
-        </w:numPr>
-      </w:pPr>
-      <w:r>
-        <w:t>Perhaps distinguish between trace elements and majors in formula?</w:t>
-      </w:r>
-    </w:p>
-    <w:p>
-      <w:pPr>
-        <w:numPr>
-          <w:ilvl w:val="3"/>
-          <w:numId w:val="6"/>
-        </w:numPr>
-      </w:pPr>
-      <w:r>
-        <w:t>But you weight by phase DA matrix, not element.</w:t>
-      </w:r>
-    </w:p>
-    <w:p>
-      <w:pPr>
-        <w:numPr>
-          <w:ilvl w:val="1"/>
-          <w:numId w:val="6"/>
-        </w:numPr>
-      </w:pPr>
-      <w:r>
-        <w:t>Correct Yield Wizard</w:t>
-      </w:r>
-    </w:p>
-    <w:p>
-      <w:pPr>
-        <w:numPr>
-          <w:ilvl w:val="2"/>
-          <w:numId w:val="6"/>
-        </w:numPr>
-      </w:pPr>
-      <w:r>
-        <w:t>How to guide through regions analysis?</w:t>
-      </w:r>
-    </w:p>
-    <w:p>
-      <w:pPr>
-        <w:numPr>
-          <w:ilvl w:val="3"/>
-          <w:numId w:val="6"/>
-        </w:numPr>
-      </w:pPr>
-      <w:r>
-        <w:t>Define major distinct phases and extract spectra from them.</w:t>
-      </w:r>
-    </w:p>
-    <w:p>
-      <w:pPr>
-        <w:numPr>
-          <w:ilvl w:val="4"/>
-          <w:numId w:val="6"/>
-        </w:numPr>
-      </w:pPr>
-      <w:r>
-        <w:t>Try to find pixels close to the pure phases.</w:t>
-      </w:r>
-    </w:p>
-    <w:p>
-      <w:pPr>
-        <w:numPr>
-          <w:ilvl w:val="4"/>
-          <w:numId w:val="6"/>
-        </w:numPr>
-      </w:pPr>
-      <w:r>
-        <w:t>Don’t want them too diluted with non-pure phase contributions.</w:t>
-      </w:r>
-    </w:p>
-    <w:p>
-      <w:pPr>
-        <w:numPr>
-          <w:ilvl w:val="3"/>
-          <w:numId w:val="6"/>
-        </w:numPr>
-      </w:pPr>
-      <w:r>
-        <w:t>Fit each one to create a DA matrix for each using correct yields.</w:t>
-      </w:r>
-    </w:p>
-    <w:p>
-      <w:pPr>
-        <w:numPr>
-          <w:ilvl w:val="2"/>
-          <w:numId w:val="6"/>
-        </w:numPr>
-      </w:pPr>
-      <w:r>
-        <w:t>Need a “</w:t>
-      </w:r>
-      <w:proofErr w:type="spellStart"/>
-      <w:r>
-        <w:t>wt</w:t>
-      </w:r>
-      <w:proofErr w:type="spellEnd"/>
-      <w:r>
-        <w:t>%” tool/help to fill in composition matrix.</w:t>
-      </w:r>
-    </w:p>
-    <w:p>
-      <w:pPr>
-        <w:numPr>
-          <w:ilvl w:val="3"/>
-          <w:numId w:val="6"/>
-        </w:numPr>
-      </w:pPr>
-      <w:r>
-        <w:t xml:space="preserve">If define element columns first, then a “get” of a DA matrix row just fills in the </w:t>
-      </w:r>
-      <w:proofErr w:type="spellStart"/>
-      <w:r>
-        <w:t>wt</w:t>
-      </w:r>
-      <w:proofErr w:type="spellEnd"/>
-      <w:r>
-        <w:t>% for these elements in the table?</w:t>
-      </w:r>
-    </w:p>
-    <w:p>
-      <w:pPr>
-        <w:numPr>
-          <w:ilvl w:val="4"/>
-          <w:numId w:val="6"/>
-        </w:numPr>
-      </w:pPr>
-      <w:r>
-        <w:t>DA matrix file does NOT have this info.</w:t>
-      </w:r>
-    </w:p>
-    <w:p>
-      <w:pPr>
-        <w:numPr>
-          <w:ilvl w:val="5"/>
-          <w:numId w:val="6"/>
-        </w:numPr>
-      </w:pPr>
-      <w:r>
-        <w:t>Yield file does, so perhaps save this filename in DA matrix?</w:t>
-      </w:r>
-    </w:p>
-    <w:p>
-      <w:pPr>
-        <w:numPr>
-          <w:ilvl w:val="5"/>
-          <w:numId w:val="6"/>
-        </w:numPr>
-      </w:pPr>
-      <w:r>
-        <w:t>New version would be a pain for existing files.</w:t>
-      </w:r>
-    </w:p>
-    <w:p>
-      <w:pPr>
-        <w:numPr>
-          <w:ilvl w:val="4"/>
-          <w:numId w:val="6"/>
-        </w:numPr>
-      </w:pPr>
-      <w:r>
-        <w:t xml:space="preserve">Or, </w:t>
-      </w:r>
-      <w:proofErr w:type="spellStart"/>
-      <w:r>
-        <w:t>read_yield</w:t>
-      </w:r>
-      <w:proofErr w:type="spellEnd"/>
-      <w:r>
-        <w:t xml:space="preserve"> when typing in mineral name?</w:t>
-      </w:r>
-    </w:p>
-    <w:p>
-      <w:pPr>
-        <w:numPr>
-          <w:ilvl w:val="4"/>
-          <w:numId w:val="6"/>
-        </w:numPr>
-      </w:pPr>
-      <w:r>
-        <w:t>OK in COMAT file, as we use yield files there.</w:t>
-      </w:r>
-    </w:p>
-    <w:p>
-      <w:pPr>
-        <w:numPr>
-          <w:ilvl w:val="5"/>
-          <w:numId w:val="6"/>
-        </w:numPr>
-      </w:pPr>
-      <w:r>
-        <w:t>But do we want yields to override table entries?</w:t>
-      </w:r>
-    </w:p>
-    <w:p>
-      <w:pPr>
-        <w:numPr>
-          <w:ilvl w:val="3"/>
-          <w:numId w:val="6"/>
-        </w:numPr>
-      </w:pPr>
-      <w:r>
-        <w:t xml:space="preserve">Or, have a pop-up tool that reports </w:t>
-      </w:r>
-      <w:proofErr w:type="spellStart"/>
-      <w:r>
-        <w:t>wt</w:t>
-      </w:r>
-      <w:proofErr w:type="spellEnd"/>
-      <w:r>
-        <w:t>% from a selected .yield file?</w:t>
-      </w:r>
-    </w:p>
-    <w:p>
-      <w:pPr>
-        <w:numPr>
-          <w:ilvl w:val="4"/>
-          <w:numId w:val="6"/>
-        </w:numPr>
-      </w:pPr>
-    </w:p>
-    <w:p>
-      <w:pPr>
-        <w:numPr>
-          <w:ilvl w:val="2"/>
-          <w:numId w:val="6"/>
-        </w:numPr>
-      </w:pPr>
-      <w:r>
-        <w:t>Save .Correct file for image correction.</w:t>
-      </w:r>
-    </w:p>
-    <w:p>
-      <w:pPr>
-        <w:numPr>
-          <w:ilvl w:val="3"/>
-          <w:numId w:val="6"/>
-        </w:numPr>
-      </w:pPr>
-      <w:r>
-        <w:t>Do we correct images here, or below?</w:t>
-      </w:r>
-    </w:p>
-    <w:p>
-      <w:pPr>
-        <w:numPr>
-          <w:ilvl w:val="4"/>
-          <w:numId w:val="6"/>
-        </w:numPr>
-      </w:pPr>
-      <w:r>
-        <w:t>Have another tab for image correction and projecting phase maps.</w:t>
-      </w:r>
-    </w:p>
-    <w:p>
-      <w:pPr>
-        <w:numPr>
-          <w:ilvl w:val="4"/>
-          <w:numId w:val="6"/>
-        </w:numPr>
-      </w:pPr>
-      <w:r>
-        <w:t>Some overlap with first tab of MPDA Wizard?</w:t>
-      </w:r>
-    </w:p>
-    <w:p>
-      <w:pPr>
-        <w:numPr>
-          <w:ilvl w:val="3"/>
-          <w:numId w:val="6"/>
-        </w:numPr>
-      </w:pPr>
-      <w:r>
-        <w:t>Should have guides, or tests, to ensure phases are reasonable</w:t>
-      </w:r>
-    </w:p>
-    <w:p>
-      <w:pPr>
-        <w:numPr>
-          <w:ilvl w:val="4"/>
-          <w:numId w:val="6"/>
-        </w:numPr>
-      </w:pPr>
-      <w:r>
-        <w:t>Should not go well above 1.0 before clipping.</w:t>
-      </w:r>
-    </w:p>
-    <w:p>
-      <w:pPr>
-        <w:numPr>
-          <w:ilvl w:val="4"/>
-          <w:numId w:val="6"/>
-        </w:numPr>
-      </w:pPr>
-      <w:r>
-        <w:lastRenderedPageBreak/>
-        <w:t>Should not be too small (Rest too close to 1.0 for most pixels).</w:t>
-      </w:r>
-    </w:p>
-    <w:p>
-      <w:pPr>
-        <w:numPr>
-          <w:ilvl w:val="5"/>
-          <w:numId w:val="6"/>
-        </w:numPr>
-      </w:pPr>
-      <w:r>
-        <w:t>Exception might be bone-like endmember in tissue ‘Rest’.</w:t>
-      </w:r>
-    </w:p>
-    <w:p>
-      <w:pPr>
-        <w:numPr>
-          <w:ilvl w:val="4"/>
-          <w:numId w:val="6"/>
-        </w:numPr>
-      </w:pPr>
-      <w:r>
-        <w:t>Build this into existing ‘</w:t>
-      </w:r>
-      <w:proofErr w:type="spellStart"/>
-      <w:r>
-        <w:t>correct_yields</w:t>
-      </w:r>
-      <w:proofErr w:type="spellEnd"/>
-      <w:r>
-        <w:t>’ as tests and pop-ups.</w:t>
+        <w:t>Build this into existing ‘correct_yields’ as tests and pop-ups.</w:t>
       </w:r>
     </w:p>
     <w:p>
@@ -4842,15 +4579,7 @@
         </w:numPr>
       </w:pPr>
       <w:r>
-        <w:t>Can ‘</w:t>
-      </w:r>
-      <w:proofErr w:type="spellStart"/>
-      <w:r>
-        <w:t>worker_progress</w:t>
-      </w:r>
-      <w:proofErr w:type="spellEnd"/>
-      <w:r>
-        <w:t>’ keep it alive?</w:t>
+        <w:t>Can ‘worker_progress’ keep it alive?</w:t>
       </w:r>
     </w:p>
     <w:p>
@@ -4882,13 +4611,8 @@
           <w:numId w:val="6"/>
         </w:numPr>
       </w:pPr>
-      <w:proofErr w:type="spellStart"/>
-      <w:r>
-        <w:t>parallel_client</w:t>
-      </w:r>
-      <w:proofErr w:type="spellEnd"/>
-      <w:r>
-        <w:t xml:space="preserve"> </w:t>
+      <w:r>
+        <w:t xml:space="preserve">parallel_client </w:t>
       </w:r>
     </w:p>
     <w:p>
@@ -4965,15 +4689,7 @@
         </w:numPr>
       </w:pPr>
       <w:r>
-        <w:t xml:space="preserve">Load command and </w:t>
-      </w:r>
-      <w:proofErr w:type="spellStart"/>
-      <w:r>
-        <w:t>args</w:t>
-      </w:r>
-      <w:proofErr w:type="spellEnd"/>
-      <w:r>
-        <w:t xml:space="preserve"> as before</w:t>
+        <w:t>Load command and args as before</w:t>
       </w:r>
     </w:p>
     <w:p>
@@ -5053,15 +4769,7 @@
         <w:t>Cancel from spawn background processes, in</w:t>
       </w:r>
       <w:r>
-        <w:t xml:space="preserve"> </w:t>
-      </w:r>
-      <w:proofErr w:type="spellStart"/>
-      <w:r>
-        <w:t>parallel_init</w:t>
-      </w:r>
-      <w:proofErr w:type="spellEnd"/>
-      <w:r>
-        <w:t>?</w:t>
+        <w:t xml:space="preserve"> parallel_init?</w:t>
       </w:r>
     </w:p>
     <w:p>
@@ -5094,15 +4802,8 @@
         </w:numPr>
       </w:pPr>
       <w:r>
-        <w:t xml:space="preserve">How to deal with Ga </w:t>
-      </w:r>
-      <w:proofErr w:type="spellStart"/>
-      <w:r>
-        <w:t>Kb</w:t>
-      </w:r>
-      <w:proofErr w:type="spellEnd"/>
-      <w:r>
-        <w:t xml:space="preserve"> peak in MM spectra</w:t>
+        <w:lastRenderedPageBreak/>
+        <w:t>How to deal with Ga Kb peak in MM spectra</w:t>
       </w:r>
     </w:p>
     <w:p>
@@ -5157,42 +4858,17 @@
         </w:numPr>
       </w:pPr>
       <w:r>
-        <w:t xml:space="preserve">The </w:t>
-      </w:r>
-      <w:proofErr w:type="spellStart"/>
-      <w:r>
-        <w:t>rel</w:t>
-      </w:r>
-      <w:proofErr w:type="spellEnd"/>
-      <w:r>
-        <w:t xml:space="preserve">-int for these lines has been modified by source, windows, air and beam filters; they are not the same as </w:t>
-      </w:r>
-      <w:proofErr w:type="spellStart"/>
-      <w:r>
-        <w:t>rel</w:t>
-      </w:r>
-      <w:proofErr w:type="spellEnd"/>
-      <w:r>
-        <w:t xml:space="preserve">-int usually. It really needs a different model integration, with decay with depth as effective conc, and modification of the beam lines </w:t>
-      </w:r>
-      <w:proofErr w:type="spellStart"/>
-      <w:r>
-        <w:t>rel</w:t>
-      </w:r>
-      <w:proofErr w:type="spellEnd"/>
-      <w:r>
-        <w:t>-int on way out.</w:t>
-      </w:r>
-    </w:p>
-    <w:p>
-      <w:pPr>
-        <w:numPr>
-          <w:ilvl w:val="3"/>
-          <w:numId w:val="6"/>
-        </w:numPr>
-      </w:pPr>
-      <w:r>
-        <w:lastRenderedPageBreak/>
+        <w:t>The rel-int for these lines has been modified by source, windows, air and beam filters; they are not the same as rel-int usually. It really needs a different model integration, with decay with depth as effective conc, and modification of the beam lines rel-int on way out.</w:t>
+      </w:r>
+    </w:p>
+    <w:p>
+      <w:pPr>
+        <w:numPr>
+          <w:ilvl w:val="3"/>
+          <w:numId w:val="6"/>
+        </w:numPr>
+      </w:pPr>
+      <w:r>
         <w:t>Then in a real spectrum, there may be BOTH real conc in sample and scattered lines from source, for the same element (e.g., Ga). Need to be able to select, perhaps, or combine?</w:t>
       </w:r>
     </w:p>
@@ -5215,23 +4891,7 @@
         </w:numPr>
       </w:pPr>
       <w:r>
-        <w:t>‘</w:t>
-      </w:r>
-      <w:proofErr w:type="spellStart"/>
-      <w:r>
-        <w:t>get_lines</w:t>
-      </w:r>
-      <w:proofErr w:type="spellEnd"/>
-      <w:r>
-        <w:t xml:space="preserve">’ does not use source lines now, but it could, if enabled. Then these could be jammed in for matching Z and shell. Would still follow sample conc with depth, which is wrong, but may give reasonable </w:t>
-      </w:r>
-      <w:proofErr w:type="spellStart"/>
-      <w:r>
-        <w:t>rel</w:t>
-      </w:r>
-      <w:proofErr w:type="spellEnd"/>
-      <w:r>
-        <w:t>-int anyway.</w:t>
+        <w:t>‘get_lines’ does not use source lines now, but it could, if enabled. Then these could be jammed in for matching Z and shell. Would still follow sample conc with depth, which is wrong, but may give reasonable rel-int anyway.</w:t>
       </w:r>
     </w:p>
     <w:p>
@@ -5264,15 +4924,7 @@
         </w:numPr>
       </w:pPr>
       <w:r>
-        <w:t>Could select in ‘</w:t>
-      </w:r>
-      <w:proofErr w:type="spellStart"/>
-      <w:r>
-        <w:t>get_lines</w:t>
-      </w:r>
-      <w:proofErr w:type="spellEnd"/>
-      <w:r>
-        <w:t>’ called from ‘geo_yield2’.</w:t>
+        <w:t>Could select in ‘get_lines’ called from ‘geo_yield2’.</w:t>
       </w:r>
     </w:p>
     <w:p>
@@ -5294,15 +4946,7 @@
         </w:numPr>
       </w:pPr>
       <w:r>
-        <w:t>Then just jam them in, in ‘</w:t>
-      </w:r>
-      <w:proofErr w:type="spellStart"/>
-      <w:r>
-        <w:t>get_lines</w:t>
-      </w:r>
-      <w:proofErr w:type="spellEnd"/>
-      <w:r>
-        <w:t>’.</w:t>
+        <w:t>Then just jam them in, in ‘get_lines’.</w:t>
       </w:r>
     </w:p>
     <w:p>
@@ -5335,112 +4979,40 @@
         </w:numPr>
       </w:pPr>
       <w:r>
-        <w:t>Could add a ‘</w:t>
-      </w:r>
-      <w:proofErr w:type="spellStart"/>
-      <w:r>
-        <w:t>sum_spread</w:t>
-      </w:r>
-      <w:proofErr w:type="spellEnd"/>
-      <w:r>
-        <w:t xml:space="preserve">’ argument to </w:t>
-      </w:r>
-      <w:proofErr w:type="spellStart"/>
-      <w:r>
-        <w:t>pixe</w:t>
-      </w:r>
-      <w:proofErr w:type="spellEnd"/>
-      <w:r>
-        <w:t>() to broaden sum peaks.</w:t>
-      </w:r>
-    </w:p>
-    <w:p>
-      <w:pPr>
-        <w:numPr>
-          <w:ilvl w:val="2"/>
-          <w:numId w:val="6"/>
-        </w:numPr>
-      </w:pPr>
-      <w:r>
-        <w:t>In ‘</w:t>
-      </w:r>
-      <w:proofErr w:type="spellStart"/>
-      <w:r>
-        <w:t>pixe</w:t>
-      </w:r>
-      <w:proofErr w:type="spellEnd"/>
-      <w:r>
-        <w:t>’ set ‘sum’ flag (like ‘comp’) to broaden sum peaks in ‘line’ using a new ‘</w:t>
-      </w:r>
-      <w:proofErr w:type="spellStart"/>
-      <w:r>
-        <w:t>sum_spread</w:t>
-      </w:r>
-      <w:proofErr w:type="spellEnd"/>
-      <w:r>
-        <w:t>’ parameter. Set this in ‘</w:t>
-      </w:r>
-      <w:proofErr w:type="spellStart"/>
-      <w:r>
-        <w:t>pixe_fit</w:t>
-      </w:r>
-      <w:proofErr w:type="spellEnd"/>
-      <w:r>
-        <w:t>’ based on ‘</w:t>
-      </w:r>
-      <w:proofErr w:type="spellStart"/>
-      <w:r>
-        <w:t>sum_deficit</w:t>
-      </w:r>
-      <w:proofErr w:type="spellEnd"/>
-      <w:r>
-        <w:t>’.</w:t>
-      </w:r>
-    </w:p>
-    <w:p>
-      <w:pPr>
-        <w:numPr>
-          <w:ilvl w:val="2"/>
-          <w:numId w:val="6"/>
-        </w:numPr>
-      </w:pPr>
-      <w:r>
-        <w:t xml:space="preserve">Try: </w:t>
-      </w:r>
-      <w:proofErr w:type="spellStart"/>
-      <w:r>
-        <w:t>sum_spread</w:t>
-      </w:r>
-      <w:proofErr w:type="spellEnd"/>
-      <w:r>
-        <w:t xml:space="preserve"> = (1.0 + </w:t>
-      </w:r>
-      <w:proofErr w:type="spellStart"/>
-      <w:r>
-        <w:t>sum_deficit</w:t>
-      </w:r>
-      <w:proofErr w:type="spellEnd"/>
-      <w:r>
-        <w:t>/100.)^2</w:t>
-      </w:r>
-    </w:p>
-    <w:p>
-      <w:pPr>
-        <w:numPr>
-          <w:ilvl w:val="2"/>
-          <w:numId w:val="6"/>
-        </w:numPr>
-      </w:pPr>
-      <w:r>
-        <w:t>Test using spectrum: software/data/UQ-</w:t>
-      </w:r>
-      <w:proofErr w:type="spellStart"/>
-      <w:r>
-        <w:t>iXRF</w:t>
-      </w:r>
-      <w:proofErr w:type="spellEnd"/>
-      <w:r>
-        <w:t>/Loren-July-2021/…</w:t>
+        <w:t>Could add a ‘sum_spread’ argument to pixe() to broaden sum peaks.</w:t>
+      </w:r>
+    </w:p>
+    <w:p>
+      <w:pPr>
+        <w:numPr>
+          <w:ilvl w:val="2"/>
+          <w:numId w:val="6"/>
+        </w:numPr>
+      </w:pPr>
+      <w:r>
+        <w:t>In ‘pixe’ set ‘sum’ flag (like ‘comp’) to broaden sum peaks in ‘line’ using a new ‘sum_spread’ parameter. Set this in ‘pixe_fit’ based on ‘sum_deficit’.</w:t>
+      </w:r>
+    </w:p>
+    <w:p>
+      <w:pPr>
+        <w:numPr>
+          <w:ilvl w:val="2"/>
+          <w:numId w:val="6"/>
+        </w:numPr>
+      </w:pPr>
+      <w:r>
+        <w:t>Try: sum_spread = (1.0 + sum_deficit/100.)^2</w:t>
+      </w:r>
+    </w:p>
+    <w:p>
+      <w:pPr>
+        <w:numPr>
+          <w:ilvl w:val="2"/>
+          <w:numId w:val="6"/>
+        </w:numPr>
+      </w:pPr>
+      <w:r>
+        <w:t>Test using spectrum: software/data/UQ-iXRF/Loren-July-2021/…</w:t>
       </w:r>
     </w:p>
     <w:p>
@@ -5450,40 +5022,19 @@
           <w:numId w:val="6"/>
         </w:numPr>
       </w:pPr>
-      <w:proofErr w:type="spellStart"/>
-      <w:r>
-        <w:t>file_requester</w:t>
-      </w:r>
-      <w:proofErr w:type="spellEnd"/>
-      <w:r>
-        <w:t xml:space="preserve"> </w:t>
-      </w:r>
-    </w:p>
-    <w:p>
-      <w:pPr>
-        <w:numPr>
-          <w:ilvl w:val="2"/>
-          <w:numId w:val="6"/>
-        </w:numPr>
-      </w:pPr>
-      <w:r>
-        <w:t xml:space="preserve">Add controls under </w:t>
-      </w:r>
-      <w:proofErr w:type="spellStart"/>
-      <w:r>
-        <w:t>dir</w:t>
-      </w:r>
-      <w:proofErr w:type="spellEnd"/>
-      <w:r>
-        <w:t xml:space="preserve"> tree in ‘</w:t>
-      </w:r>
-      <w:proofErr w:type="spellStart"/>
-      <w:r>
-        <w:t>file_requester</w:t>
-      </w:r>
-      <w:proofErr w:type="spellEnd"/>
-      <w:r>
-        <w:t>’:</w:t>
+      <w:r>
+        <w:t xml:space="preserve">file_requester </w:t>
+      </w:r>
+    </w:p>
+    <w:p>
+      <w:pPr>
+        <w:numPr>
+          <w:ilvl w:val="2"/>
+          <w:numId w:val="6"/>
+        </w:numPr>
+      </w:pPr>
+      <w:r>
+        <w:t>Add controls under dir tree in ‘file_requester’:</w:t>
       </w:r>
     </w:p>
     <w:p>
@@ -5527,34 +5078,18 @@
         </w:numPr>
       </w:pPr>
       <w:r>
-        <w:t xml:space="preserve">Knob arrow-key </w:t>
-      </w:r>
-      <w:proofErr w:type="spellStart"/>
-      <w:r>
-        <w:t>inc</w:t>
-      </w:r>
-      <w:proofErr w:type="spellEnd"/>
-      <w:r>
-        <w:t>/dec appears too small?</w:t>
-      </w:r>
-    </w:p>
-    <w:p>
-      <w:pPr>
-        <w:numPr>
-          <w:ilvl w:val="3"/>
-          <w:numId w:val="6"/>
-        </w:numPr>
-      </w:pPr>
-      <w:r>
-        <w:t xml:space="preserve">Tests show it only </w:t>
-      </w:r>
-      <w:proofErr w:type="spellStart"/>
-      <w:r>
-        <w:t>incs</w:t>
-      </w:r>
-      <w:proofErr w:type="spellEnd"/>
-      <w:r>
-        <w:t>/decs 1 integer unit and then no more with more clicks.</w:t>
+        <w:t>Knob arrow-key inc/dec appears too small?</w:t>
+      </w:r>
+    </w:p>
+    <w:p>
+      <w:pPr>
+        <w:numPr>
+          <w:ilvl w:val="3"/>
+          <w:numId w:val="6"/>
+        </w:numPr>
+      </w:pPr>
+      <w:r>
+        <w:t>Tests show it only incs/decs 1 integer unit and then no more with more clicks.</w:t>
       </w:r>
     </w:p>
     <w:p>
@@ -5631,34 +5166,18 @@
         </w:numPr>
       </w:pPr>
       <w:r>
-        <w:t xml:space="preserve">Perhaps add arrows at ends, like in Windows, and control the small </w:t>
-      </w:r>
-      <w:proofErr w:type="spellStart"/>
-      <w:r>
-        <w:t>inc</w:t>
-      </w:r>
-      <w:proofErr w:type="spellEnd"/>
-      <w:r>
-        <w:t>/dec directly?</w:t>
-      </w:r>
-    </w:p>
-    <w:p>
-      <w:pPr>
-        <w:numPr>
-          <w:ilvl w:val="2"/>
-          <w:numId w:val="6"/>
-        </w:numPr>
-      </w:pPr>
-      <w:r>
-        <w:t xml:space="preserve">Make these </w:t>
-      </w:r>
-      <w:proofErr w:type="spellStart"/>
-      <w:r>
-        <w:t>inc</w:t>
-      </w:r>
-      <w:proofErr w:type="spellEnd"/>
-      <w:r>
-        <w:t>/dec in ‘scroll’ steps.</w:t>
+        <w:t>Perhaps add arrows at ends, like in Windows, and control the small inc/dec directly?</w:t>
+      </w:r>
+    </w:p>
+    <w:p>
+      <w:pPr>
+        <w:numPr>
+          <w:ilvl w:val="2"/>
+          <w:numId w:val="6"/>
+        </w:numPr>
+      </w:pPr>
+      <w:r>
+        <w:t>Make these inc/dec in ‘scroll’ steps.</w:t>
       </w:r>
     </w:p>
     <w:p>
@@ -5692,11 +5211,9 @@
       <w:r>
         <w:t>Also, make these available via ‘</w:t>
       </w:r>
-      <w:proofErr w:type="spellStart"/>
       <w:r>
         <w:t>OnButton_Image_Process_Get</w:t>
       </w:r>
-      <w:proofErr w:type="spellEnd"/>
       <w:r>
         <w:t>’, so they work with “Get” and also triggered from “Apply Digital Filters” in batch sorting.</w:t>
       </w:r>
@@ -5723,6 +5240,7 @@
         </w:numPr>
       </w:pPr>
       <w:r>
+        <w:lastRenderedPageBreak/>
         <w:t>Possibles:</w:t>
       </w:r>
     </w:p>
@@ -5800,15 +5318,7 @@
         </w:numPr>
       </w:pPr>
       <w:r>
-        <w:t xml:space="preserve">X^(1./3), X^(1./5), X^(1./10), </w:t>
-      </w:r>
-      <w:proofErr w:type="spellStart"/>
-      <w:r>
-        <w:t>atan</w:t>
-      </w:r>
-      <w:proofErr w:type="spellEnd"/>
-      <w:r>
-        <w:t>(x)</w:t>
+        <w:t>X^(1./3), X^(1./5), X^(1./10), atan(x)</w:t>
       </w:r>
     </w:p>
     <w:p>
@@ -5828,23 +5338,7 @@
         <w:t>not</w:t>
       </w:r>
       <w:r>
-        <w:t xml:space="preserve"> have ‘</w:t>
-      </w:r>
-      <w:proofErr w:type="spellStart"/>
-      <w:r>
-        <w:t>asinh</w:t>
-      </w:r>
-      <w:proofErr w:type="spellEnd"/>
-      <w:r>
-        <w:t>’ or ‘</w:t>
-      </w:r>
-      <w:proofErr w:type="spellStart"/>
-      <w:r>
-        <w:t>atanh</w:t>
-      </w:r>
-      <w:proofErr w:type="spellEnd"/>
-      <w:r>
-        <w:t>’ functions.</w:t>
+        <w:t xml:space="preserve"> have ‘asinh’ or ‘atanh’ functions.</w:t>
       </w:r>
     </w:p>
     <w:p>
@@ -5888,7 +5382,6 @@
         </w:numPr>
       </w:pPr>
       <w:r>
-        <w:lastRenderedPageBreak/>
         <w:t>Also look for -q2, -q3, -q4</w:t>
       </w:r>
     </w:p>
@@ -5900,23 +5393,7 @@
         </w:numPr>
       </w:pPr>
       <w:r>
-        <w:t>Perhaps use util routine:  ‘</w:t>
-      </w:r>
-      <w:proofErr w:type="spellStart"/>
-      <w:r>
-        <w:t>strip_file_keys</w:t>
-      </w:r>
-      <w:proofErr w:type="spellEnd"/>
-      <w:r>
-        <w:t>, /</w:t>
-      </w:r>
-      <w:proofErr w:type="spellStart"/>
-      <w:r>
-        <w:t>file_m</w:t>
-      </w:r>
-      <w:proofErr w:type="spellEnd"/>
-      <w:r>
-        <w:t>’ more universally?</w:t>
+        <w:t>Perhaps use util routine:  ‘strip_file_keys, /file_m’ more universally?</w:t>
       </w:r>
     </w:p>
     <w:p>

</xml_diff>

<commit_message>
Fixed infinite loop to 'file_requester' from 'image_da_preview'. Used /silent.
</commit_message>
<xml_diff>
--- a/doc/GeoPIXE open mods needed.docx
+++ b/doc/GeoPIXE open mods needed.docx
@@ -74,6 +74,7 @@
         <w:autoSpaceDN w:val="0"/>
         <w:adjustRightInd w:val="0"/>
       </w:pPr>
+      <w:proofErr w:type="spellStart"/>
       <w:r>
         <w:t>X</w:t>
       </w:r>
@@ -81,7 +82,11 @@
         <w:t>Q</w:t>
       </w:r>
       <w:r>
-        <w:t xml:space="preserve">uartz upgrade needed first for </w:t>
+        <w:t>uartz</w:t>
+      </w:r>
+      <w:proofErr w:type="spellEnd"/>
+      <w:r>
+        <w:t xml:space="preserve"> upgrade needed first for </w:t>
       </w:r>
       <w:r>
         <w:t xml:space="preserve">MAC </w:t>
@@ -112,7 +117,23 @@
           <w:b/>
           <w:bCs/>
         </w:rPr>
-        <w:t>X11/XQuartz windowing system</w:t>
+        <w:t>X11/</w:t>
+      </w:r>
+      <w:proofErr w:type="spellStart"/>
+      <w:r>
+        <w:rPr>
+          <w:b/>
+          <w:bCs/>
+        </w:rPr>
+        <w:t>XQuartz</w:t>
+      </w:r>
+      <w:proofErr w:type="spellEnd"/>
+      <w:r>
+        <w:rPr>
+          <w:b/>
+          <w:bCs/>
+        </w:rPr>
+        <w:t xml:space="preserve"> windowing system</w:t>
       </w:r>
       <w:r>
         <w:t> and macOS’s native </w:t>
@@ -203,7 +224,15 @@
         <w:adjustRightInd w:val="0"/>
       </w:pPr>
       <w:r>
-        <w:t>Sav files moved to “geopixe/</w:t>
+        <w:t>Sav files moved to “</w:t>
+      </w:r>
+      <w:proofErr w:type="spellStart"/>
+      <w:r>
+        <w:t>geopixe</w:t>
+      </w:r>
+      <w:proofErr w:type="spellEnd"/>
+      <w:r>
+        <w:t>/</w:t>
       </w:r>
       <w:r>
         <w:t>off</w:t>
@@ -250,6 +279,95 @@
         <w:autoSpaceDN w:val="0"/>
         <w:adjustRightInd w:val="0"/>
       </w:pPr>
+      <w:proofErr w:type="spellStart"/>
+      <w:r>
+        <w:t>Correct_yield</w:t>
+      </w:r>
+      <w:proofErr w:type="spellEnd"/>
+    </w:p>
+    <w:p>
+      <w:pPr>
+        <w:widowControl w:val="0"/>
+        <w:numPr>
+          <w:ilvl w:val="2"/>
+          <w:numId w:val="6"/>
+        </w:numPr>
+        <w:tabs>
+          <w:tab w:val="left" w:pos="6521"/>
+        </w:tabs>
+        <w:autoSpaceDE w:val="0"/>
+        <w:autoSpaceDN w:val="0"/>
+        <w:adjustRightInd w:val="0"/>
+      </w:pPr>
+      <w:r>
+        <w:t xml:space="preserve">If current image is already a </w:t>
+      </w:r>
+      <w:proofErr w:type="spellStart"/>
+      <w:r>
+        <w:t>mpdam</w:t>
+      </w:r>
+      <w:proofErr w:type="spellEnd"/>
+      <w:r>
+        <w:t>, then the test to form the extensions “dame” comes out .</w:t>
+      </w:r>
+      <w:proofErr w:type="spellStart"/>
+      <w:r>
+        <w:t>mpdam</w:t>
+      </w:r>
+      <w:proofErr w:type="spellEnd"/>
+      <w:r>
+        <w:t xml:space="preserve"> instead of .</w:t>
+      </w:r>
+      <w:proofErr w:type="spellStart"/>
+      <w:r>
+        <w:t>damx</w:t>
+      </w:r>
+      <w:proofErr w:type="spellEnd"/>
+      <w:r>
+        <w:t>.</w:t>
+      </w:r>
+    </w:p>
+    <w:p>
+      <w:pPr>
+        <w:widowControl w:val="0"/>
+        <w:numPr>
+          <w:ilvl w:val="2"/>
+          <w:numId w:val="6"/>
+        </w:numPr>
+        <w:tabs>
+          <w:tab w:val="left" w:pos="6521"/>
+        </w:tabs>
+        <w:autoSpaceDE w:val="0"/>
+        <w:autoSpaceDN w:val="0"/>
+        <w:adjustRightInd w:val="0"/>
+      </w:pPr>
+      <w:r>
+        <w:t>Seems to cause infinite loop (executes ‘</w:t>
+      </w:r>
+      <w:proofErr w:type="spellStart"/>
+      <w:r>
+        <w:t>read_mpdam</w:t>
+      </w:r>
+      <w:proofErr w:type="spellEnd"/>
+      <w:r>
+        <w:t>’ over and over): is trying to find .</w:t>
+      </w:r>
+      <w:proofErr w:type="spellStart"/>
+      <w:r>
+        <w:t>mpdam</w:t>
+      </w:r>
+      <w:proofErr w:type="spellEnd"/>
+      <w:r>
+        <w:t xml:space="preserve"> file instead of a .</w:t>
+      </w:r>
+      <w:proofErr w:type="spellStart"/>
+      <w:r>
+        <w:t>damx</w:t>
+      </w:r>
+      <w:proofErr w:type="spellEnd"/>
+      <w:r>
+        <w:t xml:space="preserve"> file in execution of MPDA.</w:t>
+      </w:r>
     </w:p>
     <w:p>
       <w:pPr>
@@ -343,7 +461,23 @@
           <w:rFonts w:ascii="Calibri" w:eastAsiaTheme="minorHAnsi" w:hAnsi="Calibri"/>
           <w:lang w:eastAsia="en-AU"/>
         </w:rPr>
-        <w:t>Local plugins in geopixe/plugins</w:t>
+        <w:t xml:space="preserve">Local plugins in </w:t>
+      </w:r>
+      <w:proofErr w:type="spellStart"/>
+      <w:r>
+        <w:rPr>
+          <w:rFonts w:ascii="Calibri" w:eastAsiaTheme="minorHAnsi" w:hAnsi="Calibri"/>
+          <w:lang w:eastAsia="en-AU"/>
+        </w:rPr>
+        <w:t>geopixe</w:t>
+      </w:r>
+      <w:proofErr w:type="spellEnd"/>
+      <w:r>
+        <w:rPr>
+          <w:rFonts w:ascii="Calibri" w:eastAsiaTheme="minorHAnsi" w:hAnsi="Calibri"/>
+          <w:lang w:eastAsia="en-AU"/>
+        </w:rPr>
+        <w:t>/plugins</w:t>
       </w:r>
     </w:p>
     <w:p>
@@ -512,61 +646,416 @@
         <w:adjustRightInd w:val="0"/>
       </w:pPr>
       <w:r>
-        <w:t>How to do background-only-MPDA?</w:t>
-      </w:r>
-    </w:p>
-    <w:p>
-      <w:pPr>
-        <w:widowControl w:val="0"/>
-        <w:numPr>
-          <w:ilvl w:val="2"/>
-          <w:numId w:val="6"/>
-        </w:numPr>
-        <w:tabs>
-          <w:tab w:val="left" w:pos="6521"/>
-        </w:tabs>
-        <w:autoSpaceDE w:val="0"/>
-        <w:autoSpaceDN w:val="0"/>
-        <w:adjustRightInd w:val="0"/>
-      </w:pPr>
-      <w:r>
-        <w:t>Have a normal MPDAM file, where read_da() returns arrays of ‘matrix’ and ‘yield’ over all phases, and set all ‘yield’ the same, so the inverse yield ratios all stay 1.</w:t>
-      </w:r>
-    </w:p>
-    <w:p>
-      <w:pPr>
-        <w:widowControl w:val="0"/>
-        <w:numPr>
-          <w:ilvl w:val="2"/>
-          <w:numId w:val="6"/>
-        </w:numPr>
-        <w:tabs>
-          <w:tab w:val="left" w:pos="6521"/>
-        </w:tabs>
-        <w:autoSpaceDE w:val="0"/>
-        <w:autoSpaceDN w:val="0"/>
-        <w:adjustRightInd w:val="0"/>
-      </w:pPr>
-      <w:r>
-        <w:t>But keep the ‘ncomp’ dimension ‘matrix’, which uses different backgrounds.</w:t>
-      </w:r>
-    </w:p>
-    <w:p>
-      <w:pPr>
-        <w:widowControl w:val="0"/>
-        <w:numPr>
-          <w:ilvl w:val="2"/>
-          <w:numId w:val="6"/>
-        </w:numPr>
-        <w:tabs>
-          <w:tab w:val="left" w:pos="6521"/>
-        </w:tabs>
-        <w:autoSpaceDE w:val="0"/>
-        <w:autoSpaceDN w:val="0"/>
-        <w:adjustRightInd w:val="0"/>
-      </w:pPr>
-      <w:r>
-        <w:t>Perhaps just set all ‘matrix.yield’ equal to 1.0</w:t>
+        <w:t>How to do background-only-M</w:t>
+      </w:r>
+      <w:r>
+        <w:t>B</w:t>
+      </w:r>
+      <w:r>
+        <w:t>DA?</w:t>
+      </w:r>
+    </w:p>
+    <w:p>
+      <w:pPr>
+        <w:widowControl w:val="0"/>
+        <w:numPr>
+          <w:ilvl w:val="2"/>
+          <w:numId w:val="6"/>
+        </w:numPr>
+        <w:tabs>
+          <w:tab w:val="left" w:pos="6521"/>
+        </w:tabs>
+        <w:autoSpaceDE w:val="0"/>
+        <w:autoSpaceDN w:val="0"/>
+        <w:adjustRightInd w:val="0"/>
+      </w:pPr>
+      <w:r>
+        <w:t xml:space="preserve">Have a normal MPDAM file, where </w:t>
+      </w:r>
+      <w:proofErr w:type="spellStart"/>
+      <w:r>
+        <w:t>read_da</w:t>
+      </w:r>
+      <w:proofErr w:type="spellEnd"/>
+      <w:r>
+        <w:t>() returns arrays of ‘matrix’ and ‘yield’ over all phases, and set all ‘yield’ the same, so the inverse yield ratios all stay 1.</w:t>
+      </w:r>
+    </w:p>
+    <w:p>
+      <w:pPr>
+        <w:widowControl w:val="0"/>
+        <w:numPr>
+          <w:ilvl w:val="2"/>
+          <w:numId w:val="6"/>
+        </w:numPr>
+        <w:tabs>
+          <w:tab w:val="left" w:pos="6521"/>
+        </w:tabs>
+        <w:autoSpaceDE w:val="0"/>
+        <w:autoSpaceDN w:val="0"/>
+        <w:adjustRightInd w:val="0"/>
+      </w:pPr>
+      <w:r>
+        <w:t>But keep the ‘</w:t>
+      </w:r>
+      <w:proofErr w:type="spellStart"/>
+      <w:r>
+        <w:t>ncomp</w:t>
+      </w:r>
+      <w:proofErr w:type="spellEnd"/>
+      <w:r>
+        <w:t>’ dimension ‘matrix’, which uses different backgrounds.</w:t>
+      </w:r>
+    </w:p>
+    <w:p>
+      <w:pPr>
+        <w:widowControl w:val="0"/>
+        <w:numPr>
+          <w:ilvl w:val="2"/>
+          <w:numId w:val="6"/>
+        </w:numPr>
+        <w:tabs>
+          <w:tab w:val="left" w:pos="6521"/>
+        </w:tabs>
+        <w:autoSpaceDE w:val="0"/>
+        <w:autoSpaceDN w:val="0"/>
+        <w:adjustRightInd w:val="0"/>
+      </w:pPr>
+      <w:r>
+        <w:t>Perhaps just set all ‘</w:t>
+      </w:r>
+      <w:proofErr w:type="spellStart"/>
+      <w:r>
+        <w:t>matrix.yield</w:t>
+      </w:r>
+      <w:proofErr w:type="spellEnd"/>
+      <w:r>
+        <w:t xml:space="preserve">’ equal to </w:t>
+      </w:r>
+      <w:r>
+        <w:t>‘original’.</w:t>
+      </w:r>
+    </w:p>
+    <w:p>
+      <w:pPr>
+        <w:widowControl w:val="0"/>
+        <w:numPr>
+          <w:ilvl w:val="2"/>
+          <w:numId w:val="6"/>
+        </w:numPr>
+        <w:tabs>
+          <w:tab w:val="left" w:pos="6521"/>
+        </w:tabs>
+        <w:autoSpaceDE w:val="0"/>
+        <w:autoSpaceDN w:val="0"/>
+        <w:adjustRightInd w:val="0"/>
+      </w:pPr>
+      <w:r>
+        <w:t xml:space="preserve">Saved all this test as </w:t>
+      </w:r>
+      <w:r>
+        <w:rPr>
+          <w:highlight w:val="yellow"/>
+        </w:rPr>
+        <w:t>branch “</w:t>
+      </w:r>
+      <w:proofErr w:type="spellStart"/>
+      <w:r>
+        <w:rPr>
+          <w:highlight w:val="yellow"/>
+        </w:rPr>
+        <w:t>mbda</w:t>
+      </w:r>
+      <w:proofErr w:type="spellEnd"/>
+      <w:r>
+        <w:rPr>
+          <w:highlight w:val="yellow"/>
+        </w:rPr>
+        <w:t>” on GitHub</w:t>
+      </w:r>
+      <w:r>
+        <w:t>.</w:t>
+      </w:r>
+    </w:p>
+    <w:p>
+      <w:pPr>
+        <w:widowControl w:val="0"/>
+        <w:numPr>
+          <w:ilvl w:val="1"/>
+          <w:numId w:val="6"/>
+        </w:numPr>
+        <w:tabs>
+          <w:tab w:val="left" w:pos="6521"/>
+        </w:tabs>
+        <w:autoSpaceDE w:val="0"/>
+        <w:autoSpaceDN w:val="0"/>
+        <w:adjustRightInd w:val="0"/>
+        <w:rPr>
+          <w:highlight w:val="magenta"/>
+        </w:rPr>
+      </w:pPr>
+      <w:r>
+        <w:rPr>
+          <w:highlight w:val="magenta"/>
+        </w:rPr>
+        <w:t>May be better to use MPDA in a different way instead of adding MBDA</w:t>
+      </w:r>
+    </w:p>
+    <w:p>
+      <w:pPr>
+        <w:widowControl w:val="0"/>
+        <w:numPr>
+          <w:ilvl w:val="2"/>
+          <w:numId w:val="6"/>
+        </w:numPr>
+        <w:tabs>
+          <w:tab w:val="left" w:pos="6521"/>
+        </w:tabs>
+        <w:autoSpaceDE w:val="0"/>
+        <w:autoSpaceDN w:val="0"/>
+        <w:adjustRightInd w:val="0"/>
+      </w:pPr>
+      <w:r>
+        <w:t>Simple method:</w:t>
+      </w:r>
+    </w:p>
+    <w:p>
+      <w:pPr>
+        <w:widowControl w:val="0"/>
+        <w:numPr>
+          <w:ilvl w:val="3"/>
+          <w:numId w:val="6"/>
+        </w:numPr>
+        <w:tabs>
+          <w:tab w:val="left" w:pos="6521"/>
+        </w:tabs>
+        <w:autoSpaceDE w:val="0"/>
+        <w:autoSpaceDN w:val="0"/>
+        <w:adjustRightInd w:val="0"/>
+      </w:pPr>
+      <w:r>
+        <w:t>Target extreme background shape area (e.g. with different hot major elements).</w:t>
+      </w:r>
+    </w:p>
+    <w:p>
+      <w:pPr>
+        <w:widowControl w:val="0"/>
+        <w:numPr>
+          <w:ilvl w:val="3"/>
+          <w:numId w:val="6"/>
+        </w:numPr>
+        <w:tabs>
+          <w:tab w:val="left" w:pos="6521"/>
+        </w:tabs>
+        <w:autoSpaceDE w:val="0"/>
+        <w:autoSpaceDN w:val="0"/>
+        <w:adjustRightInd w:val="0"/>
+      </w:pPr>
+      <w:r>
+        <w:t>Fit each as a pseudo-endmember using the same yields, which means new background shape but the same yields. Make DAMX for each.</w:t>
+      </w:r>
+    </w:p>
+    <w:p>
+      <w:pPr>
+        <w:widowControl w:val="0"/>
+        <w:numPr>
+          <w:ilvl w:val="3"/>
+          <w:numId w:val="6"/>
+        </w:numPr>
+        <w:tabs>
+          <w:tab w:val="left" w:pos="6521"/>
+        </w:tabs>
+        <w:autoSpaceDE w:val="0"/>
+        <w:autoSpaceDN w:val="0"/>
+        <w:adjustRightInd w:val="0"/>
+      </w:pPr>
+      <w:r>
+        <w:t>Correct Yields: Make a matrix that uses the major elements and the composition as measured for these hotspots. Add the DAMX from the fitting. Minerals: Create Phase maps.</w:t>
+      </w:r>
+    </w:p>
+    <w:p>
+      <w:pPr>
+        <w:widowControl w:val="0"/>
+        <w:numPr>
+          <w:ilvl w:val="3"/>
+          <w:numId w:val="6"/>
+        </w:numPr>
+        <w:tabs>
+          <w:tab w:val="left" w:pos="6521"/>
+        </w:tabs>
+        <w:autoSpaceDE w:val="0"/>
+        <w:autoSpaceDN w:val="0"/>
+        <w:adjustRightInd w:val="0"/>
+      </w:pPr>
+      <w:r>
+        <w:lastRenderedPageBreak/>
+        <w:t>Apply MPDA sorting using new MPDAM.</w:t>
+      </w:r>
+    </w:p>
+    <w:p>
+      <w:pPr>
+        <w:widowControl w:val="0"/>
+        <w:numPr>
+          <w:ilvl w:val="3"/>
+          <w:numId w:val="6"/>
+        </w:numPr>
+        <w:tabs>
+          <w:tab w:val="left" w:pos="6521"/>
+        </w:tabs>
+        <w:autoSpaceDE w:val="0"/>
+        <w:autoSpaceDN w:val="0"/>
+        <w:adjustRightInd w:val="0"/>
+      </w:pPr>
+      <w:r>
+        <w:t>Does it track the backgrounds better?</w:t>
+      </w:r>
+    </w:p>
+    <w:p>
+      <w:pPr>
+        <w:widowControl w:val="0"/>
+        <w:numPr>
+          <w:ilvl w:val="3"/>
+          <w:numId w:val="6"/>
+        </w:numPr>
+        <w:tabs>
+          <w:tab w:val="left" w:pos="6521"/>
+        </w:tabs>
+        <w:autoSpaceDE w:val="0"/>
+        <w:autoSpaceDN w:val="0"/>
+        <w:adjustRightInd w:val="0"/>
+      </w:pPr>
+      <w:r>
+        <w:t>But perhaps it doesn’t do so well on spectrum overlay element peak heights.</w:t>
+      </w:r>
+    </w:p>
+    <w:p>
+      <w:pPr>
+        <w:widowControl w:val="0"/>
+        <w:numPr>
+          <w:ilvl w:val="3"/>
+          <w:numId w:val="6"/>
+        </w:numPr>
+        <w:tabs>
+          <w:tab w:val="left" w:pos="6521"/>
+        </w:tabs>
+        <w:autoSpaceDE w:val="0"/>
+        <w:autoSpaceDN w:val="0"/>
+        <w:adjustRightInd w:val="0"/>
+      </w:pPr>
+      <w:r>
+        <w:t>But may be suitable for a Wizard tool for automation of this:</w:t>
+      </w:r>
+    </w:p>
+    <w:p>
+      <w:pPr>
+        <w:widowControl w:val="0"/>
+        <w:numPr>
+          <w:ilvl w:val="4"/>
+          <w:numId w:val="6"/>
+        </w:numPr>
+        <w:tabs>
+          <w:tab w:val="left" w:pos="6521"/>
+        </w:tabs>
+        <w:autoSpaceDE w:val="0"/>
+        <w:autoSpaceDN w:val="0"/>
+        <w:adjustRightInd w:val="0"/>
+      </w:pPr>
+      <w:r>
+        <w:t>Have a region file and association extracted spectra.</w:t>
+      </w:r>
+    </w:p>
+    <w:p>
+      <w:pPr>
+        <w:widowControl w:val="0"/>
+        <w:numPr>
+          <w:ilvl w:val="4"/>
+          <w:numId w:val="6"/>
+        </w:numPr>
+        <w:tabs>
+          <w:tab w:val="left" w:pos="6521"/>
+        </w:tabs>
+        <w:autoSpaceDE w:val="0"/>
+        <w:autoSpaceDN w:val="0"/>
+        <w:adjustRightInd w:val="0"/>
+      </w:pPr>
+      <w:r>
+        <w:t xml:space="preserve">Wizard can fit all using a given PCM, make DAMX for each, add </w:t>
+      </w:r>
+      <w:proofErr w:type="spellStart"/>
+      <w:r>
+        <w:t>concs</w:t>
+      </w:r>
+      <w:proofErr w:type="spellEnd"/>
+      <w:r>
+        <w:t xml:space="preserve"> of selected elements () to matrix </w:t>
+      </w:r>
+      <w:proofErr w:type="spellStart"/>
+      <w:r>
+        <w:t>wt</w:t>
+      </w:r>
+      <w:proofErr w:type="spellEnd"/>
+      <w:r>
+        <w:t>%, project onto endmembers, save as Phase maps, save a CORRECT file and generate a MPDAM file. User can simple use it as MPDA.</w:t>
+      </w:r>
+    </w:p>
+    <w:p>
+      <w:pPr>
+        <w:widowControl w:val="0"/>
+        <w:numPr>
+          <w:ilvl w:val="2"/>
+          <w:numId w:val="6"/>
+        </w:numPr>
+        <w:tabs>
+          <w:tab w:val="left" w:pos="6521"/>
+        </w:tabs>
+        <w:autoSpaceDE w:val="0"/>
+        <w:autoSpaceDN w:val="0"/>
+        <w:adjustRightInd w:val="0"/>
+      </w:pPr>
+      <w:r>
+        <w:t>Better method:</w:t>
+      </w:r>
+    </w:p>
+    <w:p>
+      <w:pPr>
+        <w:widowControl w:val="0"/>
+        <w:numPr>
+          <w:ilvl w:val="3"/>
+          <w:numId w:val="6"/>
+        </w:numPr>
+        <w:tabs>
+          <w:tab w:val="left" w:pos="6521"/>
+        </w:tabs>
+        <w:autoSpaceDE w:val="0"/>
+        <w:autoSpaceDN w:val="0"/>
+        <w:adjustRightInd w:val="0"/>
+      </w:pPr>
+      <w:r>
+        <w:t>As above but use more accurate yield calcs that use the measured hot-spot values (perhaps X1.2 of majors to allow for shift after Correction).</w:t>
+      </w:r>
+    </w:p>
+    <w:p>
+      <w:pPr>
+        <w:widowControl w:val="0"/>
+        <w:numPr>
+          <w:ilvl w:val="3"/>
+          <w:numId w:val="6"/>
+        </w:numPr>
+        <w:tabs>
+          <w:tab w:val="left" w:pos="6521"/>
+        </w:tabs>
+        <w:autoSpaceDE w:val="0"/>
+        <w:autoSpaceDN w:val="0"/>
+        <w:adjustRightInd w:val="0"/>
+      </w:pPr>
+      <w:r>
+        <w:t>Does it track the backgrounds</w:t>
+      </w:r>
+      <w:r>
+        <w:t>, overlays and concentrations</w:t>
+      </w:r>
+      <w:r>
+        <w:t xml:space="preserve"> better?</w:t>
       </w:r>
     </w:p>
     <w:p>
@@ -754,7 +1243,15 @@
         </w:numPr>
       </w:pPr>
       <w:r>
-        <w:t>Perhaps add this to the ‘detector_map’ window?</w:t>
+        <w:t>Perhaps add this to the ‘</w:t>
+      </w:r>
+      <w:proofErr w:type="spellStart"/>
+      <w:r>
+        <w:t>detector_map</w:t>
+      </w:r>
+      <w:proofErr w:type="spellEnd"/>
+      <w:r>
+        <w:t>’ window?</w:t>
       </w:r>
     </w:p>
     <w:p>
@@ -778,8 +1275,15 @@
         </w:numPr>
       </w:pPr>
       <w:r>
-        <w:lastRenderedPageBreak/>
-        <w:t>Perhaps add this to ‘da_evt’ to accumulate this stat as a map.</w:t>
+        <w:t>Perhaps add this to ‘</w:t>
+      </w:r>
+      <w:proofErr w:type="spellStart"/>
+      <w:r>
+        <w:t>da_evt</w:t>
+      </w:r>
+      <w:proofErr w:type="spellEnd"/>
+      <w:r>
+        <w:t>’ to accumulate this stat as a map.</w:t>
       </w:r>
     </w:p>
     <w:p>
@@ -791,7 +1295,15 @@
         </w:numPr>
       </w:pPr>
       <w:r>
-        <w:t>DA: Perhaps add error matrix to DA fit output to DAMx files</w:t>
+        <w:t xml:space="preserve">DA: Perhaps add error matrix to DA fit output to </w:t>
+      </w:r>
+      <w:proofErr w:type="spellStart"/>
+      <w:r>
+        <w:t>DAMx</w:t>
+      </w:r>
+      <w:proofErr w:type="spellEnd"/>
+      <w:r>
+        <w:t xml:space="preserve"> files</w:t>
       </w:r>
     </w:p>
     <w:p>
@@ -962,6 +1474,7 @@
       <w:r>
         <w:t>Why does “</w:t>
       </w:r>
+      <w:proofErr w:type="spellStart"/>
       <w:r>
         <w:rPr>
           <w:b/>
@@ -969,8 +1482,17 @@
         </w:rPr>
         <w:t>maia_device</w:t>
       </w:r>
-      <w:r>
-        <w:t>::ylut” not enforce a veto on Y Encoder mode?</w:t>
+      <w:proofErr w:type="spellEnd"/>
+      <w:r>
+        <w:t>::</w:t>
+      </w:r>
+      <w:proofErr w:type="spellStart"/>
+      <w:r>
+        <w:t>ylut</w:t>
+      </w:r>
+      <w:proofErr w:type="spellEnd"/>
+      <w:r>
+        <w:t>” not enforce a veto on Y Encoder mode?</w:t>
       </w:r>
       <w:r>
         <w:t xml:space="preserve"> </w:t>
@@ -1087,7 +1609,15 @@
         </w:numPr>
       </w:pPr>
       <w:r>
-        <w:t>PDF HowTo doc for beamline/ASCI</w:t>
+        <w:t xml:space="preserve">PDF </w:t>
+      </w:r>
+      <w:proofErr w:type="spellStart"/>
+      <w:r>
+        <w:t>HowTo</w:t>
+      </w:r>
+      <w:proofErr w:type="spellEnd"/>
+      <w:r>
+        <w:t xml:space="preserve"> doc for beamline/ASCI</w:t>
       </w:r>
     </w:p>
     <w:p>
@@ -1135,6 +1665,7 @@
         </w:numPr>
       </w:pPr>
       <w:r>
+        <w:lastRenderedPageBreak/>
         <w:t>Add to Worked Examples, or a cut-down set for beamline?</w:t>
       </w:r>
     </w:p>
@@ -1330,7 +1861,15 @@
         </w:numPr>
       </w:pPr>
       <w:r>
-        <w:t>Need to use ‘fit_setup’ GUI to load PCM (and data) and do calculation.</w:t>
+        <w:t>Need to use ‘</w:t>
+      </w:r>
+      <w:proofErr w:type="spellStart"/>
+      <w:r>
+        <w:t>fit_setup</w:t>
+      </w:r>
+      <w:proofErr w:type="spellEnd"/>
+      <w:r>
+        <w:t>’ GUI to load PCM (and data) and do calculation.</w:t>
       </w:r>
     </w:p>
     <w:p>
@@ -1342,7 +1881,15 @@
         </w:numPr>
       </w:pPr>
       <w:r>
-        <w:t>Results saved in ‘fit_results’ to PFR file.</w:t>
+        <w:t>Results saved in ‘</w:t>
+      </w:r>
+      <w:proofErr w:type="spellStart"/>
+      <w:r>
+        <w:t>fit_results</w:t>
+      </w:r>
+      <w:proofErr w:type="spellEnd"/>
+      <w:r>
+        <w:t>’ to PFR file.</w:t>
       </w:r>
     </w:p>
     <w:p>
@@ -1465,7 +2012,6 @@
         </w:numPr>
       </w:pPr>
       <w:r>
-        <w:lastRenderedPageBreak/>
         <w:t>Sorting from raw data</w:t>
       </w:r>
       <w:r>
@@ -1517,151 +2063,195 @@
         <w:rPr>
           <w:highlight w:val="yellow"/>
         </w:rPr>
-        <w:t>included in the ‘geopixe’ distribution</w:t>
-      </w:r>
-    </w:p>
-    <w:p>
-      <w:pPr>
-        <w:pStyle w:val="ListParagraph"/>
-        <w:numPr>
-          <w:ilvl w:val="3"/>
-          <w:numId w:val="6"/>
-        </w:numPr>
-      </w:pPr>
-      <w:r>
-        <w:t>Need to be able to construct a long list of tests and run them all</w:t>
-      </w:r>
-    </w:p>
-    <w:p>
-      <w:pPr>
-        <w:pStyle w:val="ListParagraph"/>
-        <w:numPr>
-          <w:ilvl w:val="4"/>
-          <w:numId w:val="6"/>
-        </w:numPr>
-      </w:pPr>
-      <w:r>
-        <w:t xml:space="preserve">Perhaps only after setting the Demo root path. </w:t>
-      </w:r>
-    </w:p>
-    <w:p>
-      <w:pPr>
-        <w:pStyle w:val="ListParagraph"/>
-        <w:numPr>
-          <w:ilvl w:val="4"/>
-          <w:numId w:val="6"/>
-        </w:numPr>
-      </w:pPr>
-      <w:r>
-        <w:t>Multiple for each test (e.g. a few yield sample/beam combinations).</w:t>
-      </w:r>
-    </w:p>
-    <w:p>
-      <w:pPr>
-        <w:pStyle w:val="ListParagraph"/>
-        <w:numPr>
-          <w:ilvl w:val="4"/>
-          <w:numId w:val="6"/>
-        </w:numPr>
-      </w:pPr>
-      <w:r>
-        <w:t>Maybe from a Wizard calling ‘geopixe_execute’ directly?</w:t>
-      </w:r>
-    </w:p>
-    <w:p>
-      <w:pPr>
-        <w:pStyle w:val="ListParagraph"/>
-        <w:numPr>
-          <w:ilvl w:val="4"/>
-          <w:numId w:val="6"/>
-        </w:numPr>
-      </w:pPr>
-      <w:r>
-        <w:t>After manually running each module (e.g. yields)</w:t>
-      </w:r>
-      <w:r>
-        <w:t>, or …</w:t>
-      </w:r>
-    </w:p>
-    <w:p>
-      <w:pPr>
-        <w:pStyle w:val="ListParagraph"/>
-        <w:numPr>
-          <w:ilvl w:val="4"/>
-          <w:numId w:val="6"/>
-        </w:numPr>
-      </w:pPr>
-      <w:r>
-        <w:t>Wizard could trigger ‘layer_setup’ to load LCM and run it</w:t>
-      </w:r>
-      <w:r>
-        <w:t>, etc</w:t>
-      </w:r>
-      <w:r>
-        <w:t>.</w:t>
-      </w:r>
-    </w:p>
-    <w:p>
-      <w:pPr>
-        <w:pStyle w:val="ListParagraph"/>
-        <w:numPr>
-          <w:ilvl w:val="2"/>
-          <w:numId w:val="6"/>
-        </w:numPr>
-      </w:pPr>
-      <w:r>
-        <w:t>May make sense to execute these by the GCF mechanism.</w:t>
-      </w:r>
-    </w:p>
-    <w:p>
-      <w:pPr>
-        <w:pStyle w:val="ListParagraph"/>
-        <w:numPr>
-          <w:ilvl w:val="3"/>
-          <w:numId w:val="6"/>
-        </w:numPr>
-      </w:pPr>
-      <w:r>
-        <w:t>Need to add entry points for yields and fitting.</w:t>
-      </w:r>
-    </w:p>
-    <w:p>
-      <w:pPr>
-        <w:pStyle w:val="ListParagraph"/>
-        <w:numPr>
-          <w:ilvl w:val="3"/>
-          <w:numId w:val="6"/>
-        </w:numPr>
-      </w:pPr>
-      <w:r>
-        <w:t>Then they can be run from a shell script.</w:t>
-      </w:r>
-    </w:p>
-    <w:p>
-      <w:pPr>
-        <w:pStyle w:val="ListParagraph"/>
-        <w:numPr>
-          <w:ilvl w:val="3"/>
-          <w:numId w:val="6"/>
-        </w:numPr>
-      </w:pPr>
-      <w:r>
-        <w:t>Need to log smart test results (minimal if results seem OK).</w:t>
-      </w:r>
-    </w:p>
-    <w:p>
-      <w:pPr>
-        <w:pStyle w:val="ListParagraph"/>
-        <w:numPr>
-          <w:ilvl w:val="3"/>
-          <w:numId w:val="6"/>
-        </w:numPr>
-      </w:pPr>
+        <w:t>included in the ‘</w:t>
+      </w:r>
+      <w:proofErr w:type="spellStart"/>
       <w:r>
         <w:rPr>
           <w:highlight w:val="yellow"/>
         </w:rPr>
-        <w:t>Perhaps detect lack of a .GCF file as argv[0</w:t>
+        <w:t>geopixe</w:t>
+      </w:r>
+      <w:proofErr w:type="spellEnd"/>
+      <w:r>
+        <w:rPr>
+          <w:highlight w:val="yellow"/>
+        </w:rPr>
+        <w:t>’ distribution</w:t>
+      </w:r>
+    </w:p>
+    <w:p>
+      <w:pPr>
+        <w:pStyle w:val="ListParagraph"/>
+        <w:numPr>
+          <w:ilvl w:val="3"/>
+          <w:numId w:val="6"/>
+        </w:numPr>
+      </w:pPr>
+      <w:r>
+        <w:t>Need to be able to construct a long list of tests and run them all</w:t>
+      </w:r>
+    </w:p>
+    <w:p>
+      <w:pPr>
+        <w:pStyle w:val="ListParagraph"/>
+        <w:numPr>
+          <w:ilvl w:val="4"/>
+          <w:numId w:val="6"/>
+        </w:numPr>
+      </w:pPr>
+      <w:r>
+        <w:t xml:space="preserve">Perhaps only after setting the Demo root path. </w:t>
+      </w:r>
+    </w:p>
+    <w:p>
+      <w:pPr>
+        <w:pStyle w:val="ListParagraph"/>
+        <w:numPr>
+          <w:ilvl w:val="4"/>
+          <w:numId w:val="6"/>
+        </w:numPr>
+      </w:pPr>
+      <w:r>
+        <w:t>Multiple for each test (e.g. a few yield sample/beam combinations).</w:t>
+      </w:r>
+    </w:p>
+    <w:p>
+      <w:pPr>
+        <w:pStyle w:val="ListParagraph"/>
+        <w:numPr>
+          <w:ilvl w:val="4"/>
+          <w:numId w:val="6"/>
+        </w:numPr>
+      </w:pPr>
+      <w:r>
+        <w:t>Maybe from a Wizard calling ‘</w:t>
+      </w:r>
+      <w:proofErr w:type="spellStart"/>
+      <w:r>
+        <w:t>geopixe_execute</w:t>
+      </w:r>
+      <w:proofErr w:type="spellEnd"/>
+      <w:r>
+        <w:t>’ directly?</w:t>
+      </w:r>
+    </w:p>
+    <w:p>
+      <w:pPr>
+        <w:pStyle w:val="ListParagraph"/>
+        <w:numPr>
+          <w:ilvl w:val="4"/>
+          <w:numId w:val="6"/>
+        </w:numPr>
+      </w:pPr>
+      <w:r>
+        <w:t>After manually running each module (e.g. yields)</w:t>
+      </w:r>
+      <w:r>
+        <w:t>, or …</w:t>
+      </w:r>
+    </w:p>
+    <w:p>
+      <w:pPr>
+        <w:pStyle w:val="ListParagraph"/>
+        <w:numPr>
+          <w:ilvl w:val="4"/>
+          <w:numId w:val="6"/>
+        </w:numPr>
+      </w:pPr>
+      <w:r>
+        <w:t>Wizard could trigger ‘</w:t>
+      </w:r>
+      <w:proofErr w:type="spellStart"/>
+      <w:r>
+        <w:t>layer_setup</w:t>
+      </w:r>
+      <w:proofErr w:type="spellEnd"/>
+      <w:r>
+        <w:t>’ to load LCM and run it</w:t>
+      </w:r>
+      <w:r>
+        <w:t>, etc</w:t>
+      </w:r>
+      <w:r>
+        <w:t>.</w:t>
+      </w:r>
+    </w:p>
+    <w:p>
+      <w:pPr>
+        <w:pStyle w:val="ListParagraph"/>
+        <w:numPr>
+          <w:ilvl w:val="2"/>
+          <w:numId w:val="6"/>
+        </w:numPr>
+      </w:pPr>
+      <w:r>
+        <w:t>May make sense to execute these by the GCF mechanism.</w:t>
+      </w:r>
+    </w:p>
+    <w:p>
+      <w:pPr>
+        <w:pStyle w:val="ListParagraph"/>
+        <w:numPr>
+          <w:ilvl w:val="3"/>
+          <w:numId w:val="6"/>
+        </w:numPr>
+      </w:pPr>
+      <w:r>
+        <w:t>Need to add entry points for yields and fitting.</w:t>
+      </w:r>
+    </w:p>
+    <w:p>
+      <w:pPr>
+        <w:pStyle w:val="ListParagraph"/>
+        <w:numPr>
+          <w:ilvl w:val="3"/>
+          <w:numId w:val="6"/>
+        </w:numPr>
+      </w:pPr>
+      <w:r>
+        <w:t>Then they can be run from a shell script.</w:t>
+      </w:r>
+    </w:p>
+    <w:p>
+      <w:pPr>
+        <w:pStyle w:val="ListParagraph"/>
+        <w:numPr>
+          <w:ilvl w:val="3"/>
+          <w:numId w:val="6"/>
+        </w:numPr>
+      </w:pPr>
+      <w:r>
+        <w:t>Need to log smart test results (minimal if results seem OK).</w:t>
+      </w:r>
+    </w:p>
+    <w:p>
+      <w:pPr>
+        <w:pStyle w:val="ListParagraph"/>
+        <w:numPr>
+          <w:ilvl w:val="3"/>
+          <w:numId w:val="6"/>
+        </w:numPr>
+      </w:pPr>
+      <w:r>
+        <w:rPr>
+          <w:highlight w:val="yellow"/>
+        </w:rPr>
+        <w:t xml:space="preserve">Perhaps detect lack of a .GCF file as </w:t>
+      </w:r>
+      <w:proofErr w:type="spellStart"/>
+      <w:r>
+        <w:rPr>
+          <w:highlight w:val="yellow"/>
+        </w:rPr>
+        <w:t>argv</w:t>
+      </w:r>
+      <w:proofErr w:type="spellEnd"/>
+      <w:r>
+        <w:rPr>
+          <w:highlight w:val="yellow"/>
+        </w:rPr>
+        <w:t>[0</w:t>
       </w:r>
       <w:r>
         <w:t>]</w:t>
@@ -1676,7 +2266,15 @@
         </w:numPr>
       </w:pPr>
       <w:r>
-        <w:t>interpret argv[0] as simply the routine to run.</w:t>
+        <w:t xml:space="preserve">interpret </w:t>
+      </w:r>
+      <w:proofErr w:type="spellStart"/>
+      <w:r>
+        <w:t>argv</w:t>
+      </w:r>
+      <w:proofErr w:type="spellEnd"/>
+      <w:r>
+        <w:t>[0] as simply the routine to run.</w:t>
       </w:r>
     </w:p>
     <w:p>
@@ -1787,6 +2385,7 @@
         </w:numPr>
       </w:pPr>
       <w:r>
+        <w:lastRenderedPageBreak/>
         <w:t>Use Wizard mechanisms to trigger various GUIs for imaging, yields, fitting …</w:t>
       </w:r>
     </w:p>
@@ -2034,7 +2633,15 @@
         <w:adjustRightInd w:val="0"/>
       </w:pPr>
       <w:r>
-        <w:t>To follow da_evt to DAI, as in Batch Sort.</w:t>
+        <w:t xml:space="preserve">To follow </w:t>
+      </w:r>
+      <w:proofErr w:type="spellStart"/>
+      <w:r>
+        <w:t>da_evt</w:t>
+      </w:r>
+      <w:proofErr w:type="spellEnd"/>
+      <w:r>
+        <w:t xml:space="preserve"> to DAI, as in Batch Sort.</w:t>
       </w:r>
     </w:p>
     <w:p>
@@ -2124,7 +2731,39 @@
         <w:adjustRightInd w:val="0"/>
       </w:pPr>
       <w:r>
-        <w:t>Perhaps add these as new keywords to ‘da_evt’ in GCF, which get detected (in ‘geopixe_do_command’) and removed from args passed to ‘da_evt’.</w:t>
+        <w:t>Perhaps add these as new keywords to ‘</w:t>
+      </w:r>
+      <w:proofErr w:type="spellStart"/>
+      <w:r>
+        <w:t>da_evt</w:t>
+      </w:r>
+      <w:proofErr w:type="spellEnd"/>
+      <w:r>
+        <w:t>’ in GCF, which get detected (in ‘</w:t>
+      </w:r>
+      <w:proofErr w:type="spellStart"/>
+      <w:r>
+        <w:t>geopixe_do_command</w:t>
+      </w:r>
+      <w:proofErr w:type="spellEnd"/>
+      <w:r>
+        <w:t xml:space="preserve">’) and removed from </w:t>
+      </w:r>
+      <w:proofErr w:type="spellStart"/>
+      <w:r>
+        <w:t>args</w:t>
+      </w:r>
+      <w:proofErr w:type="spellEnd"/>
+      <w:r>
+        <w:t xml:space="preserve"> passed to ‘</w:t>
+      </w:r>
+      <w:proofErr w:type="spellStart"/>
+      <w:r>
+        <w:t>da_evt</w:t>
+      </w:r>
+      <w:proofErr w:type="spellEnd"/>
+      <w:r>
+        <w:t>’.</w:t>
       </w:r>
     </w:p>
     <w:p>
@@ -2213,7 +2852,6 @@
         </w:numPr>
       </w:pPr>
       <w:r>
-        <w:lastRenderedPageBreak/>
         <w:t xml:space="preserve">Support for Unit Tests – see </w:t>
       </w:r>
       <w:r>
@@ -2451,18 +3089,34 @@
         </w:numPr>
       </w:pPr>
       <w:r>
-        <w:t>sort evt – 3D mode</w:t>
-      </w:r>
-    </w:p>
-    <w:p>
-      <w:pPr>
-        <w:numPr>
-          <w:ilvl w:val="3"/>
-          <w:numId w:val="6"/>
-        </w:numPr>
-      </w:pPr>
-      <w:r>
-        <w:t>“da_xanes_base” is undefined, when switching to tomo XY mode.</w:t>
+        <w:t xml:space="preserve">sort </w:t>
+      </w:r>
+      <w:proofErr w:type="spellStart"/>
+      <w:r>
+        <w:t>evt</w:t>
+      </w:r>
+      <w:proofErr w:type="spellEnd"/>
+      <w:r>
+        <w:t xml:space="preserve"> – 3D mode</w:t>
+      </w:r>
+    </w:p>
+    <w:p>
+      <w:pPr>
+        <w:numPr>
+          <w:ilvl w:val="3"/>
+          <w:numId w:val="6"/>
+        </w:numPr>
+      </w:pPr>
+      <w:r>
+        <w:t>“</w:t>
+      </w:r>
+      <w:proofErr w:type="spellStart"/>
+      <w:r>
+        <w:t>da_xanes_base</w:t>
+      </w:r>
+      <w:proofErr w:type="spellEnd"/>
+      <w:r>
+        <w:t>” is undefined, when switching to tomo XY mode.</w:t>
       </w:r>
     </w:p>
     <w:p>
@@ -2528,6 +3182,7 @@
         </w:numPr>
       </w:pPr>
       <w:r>
+        <w:lastRenderedPageBreak/>
         <w:t>e.g. Region spectra using all (most) channels?</w:t>
       </w:r>
     </w:p>
@@ -2673,7 +3328,15 @@
         <w:adjustRightInd w:val="0"/>
       </w:pPr>
       <w:r>
-        <w:t xml:space="preserve">Would need some extra ‘filter’ option on file_requester. </w:t>
+        <w:t xml:space="preserve">Would need some extra ‘filter’ option on </w:t>
+      </w:r>
+      <w:proofErr w:type="spellStart"/>
+      <w:r>
+        <w:t>file_requester</w:t>
+      </w:r>
+      <w:proofErr w:type="spellEnd"/>
+      <w:r>
+        <w:t xml:space="preserve">. </w:t>
       </w:r>
     </w:p>
     <w:p>
@@ -2691,7 +3354,15 @@
         <w:adjustRightInd w:val="0"/>
       </w:pPr>
       <w:r>
-        <w:t xml:space="preserve">Pass a ‘filter_routine’ option. </w:t>
+        <w:t>Pass a ‘</w:t>
+      </w:r>
+      <w:proofErr w:type="spellStart"/>
+      <w:r>
+        <w:t>filter_routine</w:t>
+      </w:r>
+      <w:proofErr w:type="spellEnd"/>
+      <w:r>
+        <w:t xml:space="preserve">’ option. </w:t>
       </w:r>
     </w:p>
     <w:p>
@@ -2838,7 +3509,15 @@
         <w:t>When selected from list, call routine</w:t>
       </w:r>
       <w:r>
-        <w:t xml:space="preserve"> (“??_special_filter)</w:t>
+        <w:t xml:space="preserve"> (“??_</w:t>
+      </w:r>
+      <w:proofErr w:type="spellStart"/>
+      <w:r>
+        <w:t>special_filter</w:t>
+      </w:r>
+      <w:proofErr w:type="spellEnd"/>
+      <w:r>
+        <w:t>)</w:t>
       </w:r>
     </w:p>
     <w:p>
@@ -2856,7 +3535,15 @@
         <w:adjustRightInd w:val="0"/>
       </w:pPr>
       <w:r>
-        <w:t>Pass ‘pspecial’ to allow old settings to return</w:t>
+        <w:t>Pass ‘</w:t>
+      </w:r>
+      <w:proofErr w:type="spellStart"/>
+      <w:r>
+        <w:t>pspecial</w:t>
+      </w:r>
+      <w:proofErr w:type="spellEnd"/>
+      <w:r>
+        <w:t>’ to allow old settings to return</w:t>
       </w:r>
     </w:p>
     <w:p>
@@ -2891,8 +3578,13 @@
         <w:autoSpaceDN w:val="0"/>
         <w:adjustRightInd w:val="0"/>
       </w:pPr>
-      <w:r>
-        <w:t>Pspecial pointer</w:t>
+      <w:proofErr w:type="spellStart"/>
+      <w:r>
+        <w:t>Pspecial</w:t>
+      </w:r>
+      <w:proofErr w:type="spellEnd"/>
+      <w:r>
+        <w:t xml:space="preserve"> pointer</w:t>
       </w:r>
     </w:p>
     <w:p>
@@ -2982,7 +3674,23 @@
         <w:adjustRightInd w:val="0"/>
       </w:pPr>
       <w:r>
-        <w:t>See “select_periodic”, which does this to ‘source_setup’</w:t>
+        <w:t>See “</w:t>
+      </w:r>
+      <w:proofErr w:type="spellStart"/>
+      <w:r>
+        <w:t>select_periodic</w:t>
+      </w:r>
+      <w:proofErr w:type="spellEnd"/>
+      <w:r>
+        <w:t>”, which does this to ‘</w:t>
+      </w:r>
+      <w:proofErr w:type="spellStart"/>
+      <w:r>
+        <w:t>source_setup</w:t>
+      </w:r>
+      <w:proofErr w:type="spellEnd"/>
+      <w:r>
+        <w:t>’</w:t>
       </w:r>
     </w:p>
     <w:p>
@@ -3024,7 +3732,6 @@
         <w:adjustRightInd w:val="0"/>
       </w:pPr>
       <w:r>
-        <w:lastRenderedPageBreak/>
         <w:t>Something better than planes 2-4</w:t>
       </w:r>
       <w:r>
@@ -3082,7 +3789,31 @@
         <w:adjustRightInd w:val="0"/>
       </w:pPr>
       <w:r>
-        <w:t xml:space="preserve">ASCII version seems to be missing: ca, cb, adc, n_det. </w:t>
+        <w:t xml:space="preserve">ASCII version seems to be missing: ca, </w:t>
+      </w:r>
+      <w:proofErr w:type="spellStart"/>
+      <w:r>
+        <w:t>cb</w:t>
+      </w:r>
+      <w:proofErr w:type="spellEnd"/>
+      <w:r>
+        <w:t xml:space="preserve">, </w:t>
+      </w:r>
+      <w:proofErr w:type="spellStart"/>
+      <w:r>
+        <w:t>adc</w:t>
+      </w:r>
+      <w:proofErr w:type="spellEnd"/>
+      <w:r>
+        <w:t xml:space="preserve">, </w:t>
+      </w:r>
+      <w:proofErr w:type="spellStart"/>
+      <w:r>
+        <w:t>n_det</w:t>
+      </w:r>
+      <w:proofErr w:type="spellEnd"/>
+      <w:r>
+        <w:t xml:space="preserve">. </w:t>
       </w:r>
     </w:p>
     <w:p>
@@ -3136,7 +3867,15 @@
         <w:adjustRightInd w:val="0"/>
       </w:pPr>
       <w:r>
-        <w:t xml:space="preserve">‘Get_linear’ probably assumes (single) old format vector. </w:t>
+        <w:t>‘</w:t>
+      </w:r>
+      <w:proofErr w:type="spellStart"/>
+      <w:r>
+        <w:t>Get_linear</w:t>
+      </w:r>
+      <w:proofErr w:type="spellEnd"/>
+      <w:r>
+        <w:t xml:space="preserve">’ probably assumes (single) old format vector. </w:t>
       </w:r>
     </w:p>
     <w:p>
@@ -3190,7 +3929,15 @@
         <w:adjustRightInd w:val="0"/>
       </w:pPr>
       <w:r>
-        <w:t>Where is ‘da.ecompress’ used?</w:t>
+        <w:t>Where is ‘</w:t>
+      </w:r>
+      <w:proofErr w:type="spellStart"/>
+      <w:r>
+        <w:t>da.ecompress</w:t>
+      </w:r>
+      <w:proofErr w:type="spellEnd"/>
+      <w:r>
+        <w:t>’ used?</w:t>
       </w:r>
       <w:r>
         <w:t xml:space="preserve"> Lund old format?</w:t>
@@ -3217,6 +3964,7 @@
       <w:r>
         <w:t xml:space="preserve">Does not export the </w:t>
       </w:r>
+      <w:proofErr w:type="spellStart"/>
       <w:r>
         <w:rPr>
           <w:i/>
@@ -3224,6 +3972,7 @@
         </w:rPr>
         <w:t>rGamma</w:t>
       </w:r>
+      <w:proofErr w:type="spellEnd"/>
       <w:r>
         <w:t xml:space="preserve"> matrix or </w:t>
       </w:r>
@@ -3294,9 +4043,11 @@
       <w:r>
         <w:t>Fudged in ‘</w:t>
       </w:r>
+      <w:proofErr w:type="spellStart"/>
       <w:r>
         <w:t>Spectrum_Mark_Pileup_Image</w:t>
       </w:r>
+      <w:proofErr w:type="spellEnd"/>
       <w:r>
         <w:t>’ at 0.2% fixed for now.</w:t>
       </w:r>
@@ -3400,6 +4151,7 @@
         <w:adjustRightInd w:val="0"/>
       </w:pPr>
       <w:r>
+        <w:lastRenderedPageBreak/>
         <w:t>Option to fix range, so it does not change.</w:t>
       </w:r>
     </w:p>
@@ -3700,8 +4452,13 @@
         </w:numPr>
       </w:pPr>
       <w:r>
-        <w:t>Need: include, refine, reject, clear menus – like corr</w:t>
-      </w:r>
+        <w:t xml:space="preserve">Need: include, refine, reject, clear menus – like </w:t>
+      </w:r>
+      <w:proofErr w:type="spellStart"/>
+      <w:r>
+        <w:t>corr</w:t>
+      </w:r>
+      <w:proofErr w:type="spellEnd"/>
     </w:p>
     <w:p>
       <w:pPr>
@@ -3730,7 +4487,6 @@
           <w:b/>
           <w:bCs/>
         </w:rPr>
-        <w:lastRenderedPageBreak/>
         <w:t>Operation order?</w:t>
       </w:r>
     </w:p>
@@ -3804,9 +4560,11 @@
       <w:r>
         <w:t>new ‘</w:t>
       </w:r>
+      <w:proofErr w:type="spellStart"/>
       <w:r>
         <w:t>widget_browser</w:t>
       </w:r>
+      <w:proofErr w:type="spellEnd"/>
       <w:r>
         <w:t>’</w:t>
       </w:r>
@@ -3823,7 +4581,15 @@
       </w:pPr>
       <w:bookmarkStart w:id="0" w:name="_Hlk126678996"/>
       <w:r>
-        <w:t>See ‘test_browser_wizard’ in project test</w:t>
+        <w:t>See ‘</w:t>
+      </w:r>
+      <w:proofErr w:type="spellStart"/>
+      <w:r>
+        <w:t>test_browser_wizard</w:t>
+      </w:r>
+      <w:proofErr w:type="spellEnd"/>
+      <w:r>
+        <w:t>’ in project test</w:t>
       </w:r>
       <w:r>
         <w:t>/IDL</w:t>
@@ -3951,7 +4717,15 @@
         </w:numPr>
       </w:pPr>
       <w:r>
-        <w:t>And then builds mpdam file and repeats as MPDA sort?</w:t>
+        <w:t xml:space="preserve">And then builds </w:t>
+      </w:r>
+      <w:proofErr w:type="spellStart"/>
+      <w:r>
+        <w:t>mpdam</w:t>
+      </w:r>
+      <w:proofErr w:type="spellEnd"/>
+      <w:r>
+        <w:t xml:space="preserve"> file and repeats as MPDA sort?</w:t>
       </w:r>
     </w:p>
     <w:p>
@@ -3984,6 +4758,7 @@
         </w:numPr>
       </w:pPr>
       <w:r>
+        <w:lastRenderedPageBreak/>
         <w:t>Extract suitable regions and spectra.</w:t>
       </w:r>
     </w:p>
@@ -4039,7 +4814,15 @@
         </w:numPr>
       </w:pPr>
       <w:r>
-        <w:t>Extend Sort Evt behaviour.</w:t>
+        <w:t xml:space="preserve">Extend Sort </w:t>
+      </w:r>
+      <w:proofErr w:type="spellStart"/>
+      <w:r>
+        <w:t>Evt</w:t>
+      </w:r>
+      <w:proofErr w:type="spellEnd"/>
+      <w:r>
+        <w:t xml:space="preserve"> behaviour.</w:t>
       </w:r>
     </w:p>
     <w:p>
@@ -4061,18 +4844,50 @@
         </w:numPr>
       </w:pPr>
       <w:r>
-        <w:t>If not cluster mode, how to do ‘geopixe_do_DA’?</w:t>
-      </w:r>
-    </w:p>
-    <w:p>
-      <w:pPr>
-        <w:numPr>
-          <w:ilvl w:val="3"/>
-          <w:numId w:val="6"/>
-        </w:numPr>
-      </w:pPr>
-      <w:r>
-        <w:t>Perhaps always build ‘args’ and call ‘geopixe_execute’ as used in ‘geopixe_do_command’.</w:t>
+        <w:t>If not cluster mode, how to do ‘</w:t>
+      </w:r>
+      <w:proofErr w:type="spellStart"/>
+      <w:r>
+        <w:t>geopixe_do_DA</w:t>
+      </w:r>
+      <w:proofErr w:type="spellEnd"/>
+      <w:r>
+        <w:t>’?</w:t>
+      </w:r>
+    </w:p>
+    <w:p>
+      <w:pPr>
+        <w:numPr>
+          <w:ilvl w:val="3"/>
+          <w:numId w:val="6"/>
+        </w:numPr>
+      </w:pPr>
+      <w:r>
+        <w:t>Perhaps always build ‘</w:t>
+      </w:r>
+      <w:proofErr w:type="spellStart"/>
+      <w:r>
+        <w:t>args</w:t>
+      </w:r>
+      <w:proofErr w:type="spellEnd"/>
+      <w:r>
+        <w:t>’ and call ‘</w:t>
+      </w:r>
+      <w:proofErr w:type="spellStart"/>
+      <w:r>
+        <w:t>geopixe_execute</w:t>
+      </w:r>
+      <w:proofErr w:type="spellEnd"/>
+      <w:r>
+        <w:t>’ as used in ‘</w:t>
+      </w:r>
+      <w:proofErr w:type="spellStart"/>
+      <w:r>
+        <w:t>geopixe_do_command</w:t>
+      </w:r>
+      <w:proofErr w:type="spellEnd"/>
+      <w:r>
+        <w:t>’.</w:t>
       </w:r>
     </w:p>
     <w:p>
@@ -4105,7 +4920,15 @@
         </w:numPr>
       </w:pPr>
       <w:r>
-        <w:t>Fit using straight Pt works, MPDA rel int poor (Lg too high).</w:t>
+        <w:t xml:space="preserve">Fit using straight Pt works, MPDA </w:t>
+      </w:r>
+      <w:proofErr w:type="spellStart"/>
+      <w:r>
+        <w:t>rel</w:t>
+      </w:r>
+      <w:proofErr w:type="spellEnd"/>
+      <w:r>
+        <w:t xml:space="preserve"> int poor (Lg too high).</w:t>
       </w:r>
     </w:p>
     <w:p>
@@ -4215,18 +5038,34 @@
         </w:numPr>
       </w:pPr>
       <w:r>
-        <w:t>Need a “wt%” tool/help to fill in composition matrix.</w:t>
-      </w:r>
-    </w:p>
-    <w:p>
-      <w:pPr>
-        <w:numPr>
-          <w:ilvl w:val="3"/>
-          <w:numId w:val="6"/>
-        </w:numPr>
-      </w:pPr>
-      <w:r>
-        <w:t>If define element columns first, then a “get” of a DA matrix row just fills in the wt% for these elements in the table?</w:t>
+        <w:t>Need a “</w:t>
+      </w:r>
+      <w:proofErr w:type="spellStart"/>
+      <w:r>
+        <w:t>wt</w:t>
+      </w:r>
+      <w:proofErr w:type="spellEnd"/>
+      <w:r>
+        <w:t>%” tool/help to fill in composition matrix.</w:t>
+      </w:r>
+    </w:p>
+    <w:p>
+      <w:pPr>
+        <w:numPr>
+          <w:ilvl w:val="3"/>
+          <w:numId w:val="6"/>
+        </w:numPr>
+      </w:pPr>
+      <w:r>
+        <w:t xml:space="preserve">If define element columns first, then a “get” of a DA matrix row just fills in the </w:t>
+      </w:r>
+      <w:proofErr w:type="spellStart"/>
+      <w:r>
+        <w:t>wt</w:t>
+      </w:r>
+      <w:proofErr w:type="spellEnd"/>
+      <w:r>
+        <w:t>% for these elements in the table?</w:t>
       </w:r>
     </w:p>
     <w:p>
@@ -4248,7 +5087,6 @@
         </w:numPr>
       </w:pPr>
       <w:r>
-        <w:lastRenderedPageBreak/>
         <w:t>Yield file does, so perhaps save this filename in DA matrix?</w:t>
       </w:r>
     </w:p>
@@ -4271,7 +5109,15 @@
         </w:numPr>
       </w:pPr>
       <w:r>
-        <w:t>Or, read_yield when typing in mineral name?</w:t>
+        <w:t xml:space="preserve">Or, </w:t>
+      </w:r>
+      <w:proofErr w:type="spellStart"/>
+      <w:r>
+        <w:t>read_yield</w:t>
+      </w:r>
+      <w:proofErr w:type="spellEnd"/>
+      <w:r>
+        <w:t xml:space="preserve"> when typing in mineral name?</w:t>
       </w:r>
     </w:p>
     <w:p>
@@ -4304,7 +5150,15 @@
         </w:numPr>
       </w:pPr>
       <w:r>
-        <w:t>Or, have a pop-up tool that reports wt% from a selected .yield file?</w:t>
+        <w:t xml:space="preserve">Or, have a pop-up tool that reports </w:t>
+      </w:r>
+      <w:proofErr w:type="spellStart"/>
+      <w:r>
+        <w:t>wt</w:t>
+      </w:r>
+      <w:proofErr w:type="spellEnd"/>
+      <w:r>
+        <w:t>% from a selected .yield file?</w:t>
       </w:r>
     </w:p>
     <w:p>
@@ -4411,7 +5265,15 @@
         </w:numPr>
       </w:pPr>
       <w:r>
-        <w:t>Build this into existing ‘correct_yields’ as tests and pop-ups.</w:t>
+        <w:t>Build this into existing ‘</w:t>
+      </w:r>
+      <w:proofErr w:type="spellStart"/>
+      <w:r>
+        <w:t>correct_yields</w:t>
+      </w:r>
+      <w:proofErr w:type="spellEnd"/>
+      <w:r>
+        <w:t>’ as tests and pop-ups.</w:t>
       </w:r>
     </w:p>
     <w:p>
@@ -4518,6 +5380,7 @@
         </w:numPr>
       </w:pPr>
       <w:r>
+        <w:lastRenderedPageBreak/>
         <w:t>May be fixed with IDL 9.0?</w:t>
       </w:r>
     </w:p>
@@ -4579,7 +5442,15 @@
         </w:numPr>
       </w:pPr>
       <w:r>
-        <w:t>Can ‘worker_progress’ keep it alive?</w:t>
+        <w:t>Can ‘</w:t>
+      </w:r>
+      <w:proofErr w:type="spellStart"/>
+      <w:r>
+        <w:t>worker_progress</w:t>
+      </w:r>
+      <w:proofErr w:type="spellEnd"/>
+      <w:r>
+        <w:t>’ keep it alive?</w:t>
       </w:r>
     </w:p>
     <w:p>
@@ -4611,8 +5482,13 @@
           <w:numId w:val="6"/>
         </w:numPr>
       </w:pPr>
-      <w:r>
-        <w:t xml:space="preserve">parallel_client </w:t>
+      <w:proofErr w:type="spellStart"/>
+      <w:r>
+        <w:t>parallel_client</w:t>
+      </w:r>
+      <w:proofErr w:type="spellEnd"/>
+      <w:r>
+        <w:t xml:space="preserve"> </w:t>
       </w:r>
     </w:p>
     <w:p>
@@ -4689,7 +5565,15 @@
         </w:numPr>
       </w:pPr>
       <w:r>
-        <w:t>Load command and args as before</w:t>
+        <w:t xml:space="preserve">Load command and </w:t>
+      </w:r>
+      <w:proofErr w:type="spellStart"/>
+      <w:r>
+        <w:t>args</w:t>
+      </w:r>
+      <w:proofErr w:type="spellEnd"/>
+      <w:r>
+        <w:t xml:space="preserve"> as before</w:t>
       </w:r>
     </w:p>
     <w:p>
@@ -4769,7 +5653,15 @@
         <w:t>Cancel from spawn background processes, in</w:t>
       </w:r>
       <w:r>
-        <w:t xml:space="preserve"> parallel_init?</w:t>
+        <w:t xml:space="preserve"> </w:t>
+      </w:r>
+      <w:proofErr w:type="spellStart"/>
+      <w:r>
+        <w:t>parallel_init</w:t>
+      </w:r>
+      <w:proofErr w:type="spellEnd"/>
+      <w:r>
+        <w:t>?</w:t>
       </w:r>
     </w:p>
     <w:p>
@@ -4802,161 +5694,225 @@
         </w:numPr>
       </w:pPr>
       <w:r>
+        <w:t xml:space="preserve">How to deal with Ga </w:t>
+      </w:r>
+      <w:proofErr w:type="spellStart"/>
+      <w:r>
+        <w:t>Kb</w:t>
+      </w:r>
+      <w:proofErr w:type="spellEnd"/>
+      <w:r>
+        <w:t xml:space="preserve"> peak in MM spectra</w:t>
+      </w:r>
+    </w:p>
+    <w:p>
+      <w:pPr>
+        <w:numPr>
+          <w:ilvl w:val="2"/>
+          <w:numId w:val="6"/>
+        </w:numPr>
+      </w:pPr>
+      <w:r>
+        <w:t>Follow Ga K lines from source through filter</w:t>
+      </w:r>
+    </w:p>
+    <w:p>
+      <w:pPr>
+        <w:numPr>
+          <w:ilvl w:val="3"/>
+          <w:numId w:val="6"/>
+        </w:numPr>
+      </w:pPr>
+      <w:r>
+        <w:t>How are In, Sn filtered?</w:t>
+      </w:r>
+    </w:p>
+    <w:p>
+      <w:pPr>
+        <w:numPr>
+          <w:ilvl w:val="2"/>
+          <w:numId w:val="6"/>
+        </w:numPr>
+      </w:pPr>
+      <w:r>
+        <w:t>Real source lines</w:t>
+      </w:r>
+    </w:p>
+    <w:p>
+      <w:pPr>
+        <w:numPr>
+          <w:ilvl w:val="3"/>
+          <w:numId w:val="6"/>
+        </w:numPr>
+      </w:pPr>
+      <w:r>
+        <w:t>Source lines are scattered back from sample, and so ‘appear’ to come from a decaying effective conc of these source elements into the sample. They don’t follow the depth profile of these elements (if they are present in the sample).</w:t>
+      </w:r>
+    </w:p>
+    <w:p>
+      <w:pPr>
+        <w:numPr>
+          <w:ilvl w:val="3"/>
+          <w:numId w:val="6"/>
+        </w:numPr>
+      </w:pPr>
+      <w:r>
+        <w:t xml:space="preserve">The </w:t>
+      </w:r>
+      <w:proofErr w:type="spellStart"/>
+      <w:r>
+        <w:t>rel</w:t>
+      </w:r>
+      <w:proofErr w:type="spellEnd"/>
+      <w:r>
+        <w:t xml:space="preserve">-int for these lines has been modified by source, windows, air and beam filters; they are not the same as </w:t>
+      </w:r>
+      <w:proofErr w:type="spellStart"/>
+      <w:r>
+        <w:t>rel</w:t>
+      </w:r>
+      <w:proofErr w:type="spellEnd"/>
+      <w:r>
+        <w:t xml:space="preserve">-int usually. It really needs a different model integration, with decay with depth as effective conc, and modification of the beam lines </w:t>
+      </w:r>
+      <w:proofErr w:type="spellStart"/>
+      <w:r>
+        <w:t>rel</w:t>
+      </w:r>
+      <w:proofErr w:type="spellEnd"/>
+      <w:r>
+        <w:t>-int on way out.</w:t>
+      </w:r>
+    </w:p>
+    <w:p>
+      <w:pPr>
+        <w:numPr>
+          <w:ilvl w:val="3"/>
+          <w:numId w:val="6"/>
+        </w:numPr>
+      </w:pPr>
+      <w:r>
+        <w:t>Then in a real spectrum, there may be BOTH real conc in sample and scattered lines from source, for the same element (e.g., Ga). Need to be able to select, perhaps, or combine?</w:t>
+      </w:r>
+    </w:p>
+    <w:p>
+      <w:pPr>
+        <w:numPr>
+          <w:ilvl w:val="2"/>
+          <w:numId w:val="6"/>
+        </w:numPr>
+      </w:pPr>
+      <w:r>
+        <w:t>Select source or sample lines?</w:t>
+      </w:r>
+    </w:p>
+    <w:p>
+      <w:pPr>
+        <w:numPr>
+          <w:ilvl w:val="3"/>
+          <w:numId w:val="6"/>
+        </w:numPr>
+      </w:pPr>
+      <w:r>
+        <w:t>‘</w:t>
+      </w:r>
+      <w:proofErr w:type="spellStart"/>
+      <w:r>
+        <w:t>get_lines</w:t>
+      </w:r>
+      <w:proofErr w:type="spellEnd"/>
+      <w:r>
+        <w:t xml:space="preserve">’ does not use source lines now, but it could, if enabled. Then these could be jammed in for matching Z and shell. Would still follow sample conc with depth, which is wrong, but may give reasonable </w:t>
+      </w:r>
+      <w:proofErr w:type="spellStart"/>
+      <w:r>
+        <w:t>rel</w:t>
+      </w:r>
+      <w:proofErr w:type="spellEnd"/>
+      <w:r>
+        <w:t>-int anyway.</w:t>
+      </w:r>
+    </w:p>
+    <w:p>
+      <w:pPr>
+        <w:numPr>
+          <w:ilvl w:val="3"/>
+          <w:numId w:val="6"/>
+        </w:numPr>
+      </w:pPr>
+      <w:r>
+        <w:t>Where to select source lines to take precedence?</w:t>
+      </w:r>
+    </w:p>
+    <w:p>
+      <w:pPr>
+        <w:numPr>
+          <w:ilvl w:val="4"/>
+          <w:numId w:val="6"/>
+        </w:numPr>
+      </w:pPr>
+      <w:r>
+        <w:t>Must be during yield calculation, not the fit.</w:t>
+      </w:r>
+    </w:p>
+    <w:p>
+      <w:pPr>
+        <w:numPr>
+          <w:ilvl w:val="4"/>
+          <w:numId w:val="6"/>
+        </w:numPr>
+      </w:pPr>
+      <w:r>
+        <w:t>Could select in ‘</w:t>
+      </w:r>
+      <w:proofErr w:type="spellStart"/>
+      <w:r>
+        <w:t>get_lines</w:t>
+      </w:r>
+      <w:proofErr w:type="spellEnd"/>
+      <w:r>
+        <w:t>’ called from ‘geo_yield2’.</w:t>
+      </w:r>
+    </w:p>
+    <w:p>
+      <w:pPr>
+        <w:numPr>
+          <w:ilvl w:val="3"/>
+          <w:numId w:val="6"/>
+        </w:numPr>
+      </w:pPr>
+      <w:r>
+        <w:t>Could simply assume that source lines take priority?</w:t>
+      </w:r>
+    </w:p>
+    <w:p>
+      <w:pPr>
+        <w:numPr>
+          <w:ilvl w:val="4"/>
+          <w:numId w:val="6"/>
+        </w:numPr>
+      </w:pPr>
+      <w:r>
+        <w:t>Then just jam them in, in ‘</w:t>
+      </w:r>
+      <w:proofErr w:type="spellStart"/>
+      <w:r>
+        <w:t>get_lines</w:t>
+      </w:r>
+      <w:proofErr w:type="spellEnd"/>
+      <w:r>
+        <w:t>’.</w:t>
+      </w:r>
+    </w:p>
+    <w:p>
+      <w:pPr>
+        <w:numPr>
+          <w:ilvl w:val="4"/>
+          <w:numId w:val="6"/>
+        </w:numPr>
+      </w:pPr>
+      <w:r>
         <w:lastRenderedPageBreak/>
-        <w:t>How to deal with Ga Kb peak in MM spectra</w:t>
-      </w:r>
-    </w:p>
-    <w:p>
-      <w:pPr>
-        <w:numPr>
-          <w:ilvl w:val="2"/>
-          <w:numId w:val="6"/>
-        </w:numPr>
-      </w:pPr>
-      <w:r>
-        <w:t>Follow Ga K lines from source through filter</w:t>
-      </w:r>
-    </w:p>
-    <w:p>
-      <w:pPr>
-        <w:numPr>
-          <w:ilvl w:val="3"/>
-          <w:numId w:val="6"/>
-        </w:numPr>
-      </w:pPr>
-      <w:r>
-        <w:t>How are In, Sn filtered?</w:t>
-      </w:r>
-    </w:p>
-    <w:p>
-      <w:pPr>
-        <w:numPr>
-          <w:ilvl w:val="2"/>
-          <w:numId w:val="6"/>
-        </w:numPr>
-      </w:pPr>
-      <w:r>
-        <w:t>Real source lines</w:t>
-      </w:r>
-    </w:p>
-    <w:p>
-      <w:pPr>
-        <w:numPr>
-          <w:ilvl w:val="3"/>
-          <w:numId w:val="6"/>
-        </w:numPr>
-      </w:pPr>
-      <w:r>
-        <w:t>Source lines are scattered back from sample, and so ‘appear’ to come from a decaying effective conc of these source elements into the sample. They don’t follow the depth profile of these elements (if they are present in the sample).</w:t>
-      </w:r>
-    </w:p>
-    <w:p>
-      <w:pPr>
-        <w:numPr>
-          <w:ilvl w:val="3"/>
-          <w:numId w:val="6"/>
-        </w:numPr>
-      </w:pPr>
-      <w:r>
-        <w:t>The rel-int for these lines has been modified by source, windows, air and beam filters; they are not the same as rel-int usually. It really needs a different model integration, with decay with depth as effective conc, and modification of the beam lines rel-int on way out.</w:t>
-      </w:r>
-    </w:p>
-    <w:p>
-      <w:pPr>
-        <w:numPr>
-          <w:ilvl w:val="3"/>
-          <w:numId w:val="6"/>
-        </w:numPr>
-      </w:pPr>
-      <w:r>
-        <w:t>Then in a real spectrum, there may be BOTH real conc in sample and scattered lines from source, for the same element (e.g., Ga). Need to be able to select, perhaps, or combine?</w:t>
-      </w:r>
-    </w:p>
-    <w:p>
-      <w:pPr>
-        <w:numPr>
-          <w:ilvl w:val="2"/>
-          <w:numId w:val="6"/>
-        </w:numPr>
-      </w:pPr>
-      <w:r>
-        <w:t>Select source or sample lines?</w:t>
-      </w:r>
-    </w:p>
-    <w:p>
-      <w:pPr>
-        <w:numPr>
-          <w:ilvl w:val="3"/>
-          <w:numId w:val="6"/>
-        </w:numPr>
-      </w:pPr>
-      <w:r>
-        <w:t>‘get_lines’ does not use source lines now, but it could, if enabled. Then these could be jammed in for matching Z and shell. Would still follow sample conc with depth, which is wrong, but may give reasonable rel-int anyway.</w:t>
-      </w:r>
-    </w:p>
-    <w:p>
-      <w:pPr>
-        <w:numPr>
-          <w:ilvl w:val="3"/>
-          <w:numId w:val="6"/>
-        </w:numPr>
-      </w:pPr>
-      <w:r>
-        <w:t>Where to select source lines to take precedence?</w:t>
-      </w:r>
-    </w:p>
-    <w:p>
-      <w:pPr>
-        <w:numPr>
-          <w:ilvl w:val="4"/>
-          <w:numId w:val="6"/>
-        </w:numPr>
-      </w:pPr>
-      <w:r>
-        <w:t>Must be during yield calculation, not the fit.</w:t>
-      </w:r>
-    </w:p>
-    <w:p>
-      <w:pPr>
-        <w:numPr>
-          <w:ilvl w:val="4"/>
-          <w:numId w:val="6"/>
-        </w:numPr>
-      </w:pPr>
-      <w:r>
-        <w:t>Could select in ‘get_lines’ called from ‘geo_yield2’.</w:t>
-      </w:r>
-    </w:p>
-    <w:p>
-      <w:pPr>
-        <w:numPr>
-          <w:ilvl w:val="3"/>
-          <w:numId w:val="6"/>
-        </w:numPr>
-      </w:pPr>
-      <w:r>
-        <w:t>Could simply assume that source lines take priority?</w:t>
-      </w:r>
-    </w:p>
-    <w:p>
-      <w:pPr>
-        <w:numPr>
-          <w:ilvl w:val="4"/>
-          <w:numId w:val="6"/>
-        </w:numPr>
-      </w:pPr>
-      <w:r>
-        <w:t>Then just jam them in, in ‘get_lines’.</w:t>
-      </w:r>
-    </w:p>
-    <w:p>
-      <w:pPr>
-        <w:numPr>
-          <w:ilvl w:val="4"/>
-          <w:numId w:val="6"/>
-        </w:numPr>
-      </w:pPr>
-      <w:r>
         <w:t>Make sure Ga K not filtered out somewhere …</w:t>
       </w:r>
     </w:p>
@@ -4979,40 +5935,112 @@
         </w:numPr>
       </w:pPr>
       <w:r>
-        <w:t>Could add a ‘sum_spread’ argument to pixe() to broaden sum peaks.</w:t>
-      </w:r>
-    </w:p>
-    <w:p>
-      <w:pPr>
-        <w:numPr>
-          <w:ilvl w:val="2"/>
-          <w:numId w:val="6"/>
-        </w:numPr>
-      </w:pPr>
-      <w:r>
-        <w:t>In ‘pixe’ set ‘sum’ flag (like ‘comp’) to broaden sum peaks in ‘line’ using a new ‘sum_spread’ parameter. Set this in ‘pixe_fit’ based on ‘sum_deficit’.</w:t>
-      </w:r>
-    </w:p>
-    <w:p>
-      <w:pPr>
-        <w:numPr>
-          <w:ilvl w:val="2"/>
-          <w:numId w:val="6"/>
-        </w:numPr>
-      </w:pPr>
-      <w:r>
-        <w:t>Try: sum_spread = (1.0 + sum_deficit/100.)^2</w:t>
-      </w:r>
-    </w:p>
-    <w:p>
-      <w:pPr>
-        <w:numPr>
-          <w:ilvl w:val="2"/>
-          <w:numId w:val="6"/>
-        </w:numPr>
-      </w:pPr>
-      <w:r>
-        <w:t>Test using spectrum: software/data/UQ-iXRF/Loren-July-2021/…</w:t>
+        <w:t>Could add a ‘</w:t>
+      </w:r>
+      <w:proofErr w:type="spellStart"/>
+      <w:r>
+        <w:t>sum_spread</w:t>
+      </w:r>
+      <w:proofErr w:type="spellEnd"/>
+      <w:r>
+        <w:t xml:space="preserve">’ argument to </w:t>
+      </w:r>
+      <w:proofErr w:type="spellStart"/>
+      <w:r>
+        <w:t>pixe</w:t>
+      </w:r>
+      <w:proofErr w:type="spellEnd"/>
+      <w:r>
+        <w:t>() to broaden sum peaks.</w:t>
+      </w:r>
+    </w:p>
+    <w:p>
+      <w:pPr>
+        <w:numPr>
+          <w:ilvl w:val="2"/>
+          <w:numId w:val="6"/>
+        </w:numPr>
+      </w:pPr>
+      <w:r>
+        <w:t>In ‘</w:t>
+      </w:r>
+      <w:proofErr w:type="spellStart"/>
+      <w:r>
+        <w:t>pixe</w:t>
+      </w:r>
+      <w:proofErr w:type="spellEnd"/>
+      <w:r>
+        <w:t>’ set ‘sum’ flag (like ‘comp’) to broaden sum peaks in ‘line’ using a new ‘</w:t>
+      </w:r>
+      <w:proofErr w:type="spellStart"/>
+      <w:r>
+        <w:t>sum_spread</w:t>
+      </w:r>
+      <w:proofErr w:type="spellEnd"/>
+      <w:r>
+        <w:t>’ parameter. Set this in ‘</w:t>
+      </w:r>
+      <w:proofErr w:type="spellStart"/>
+      <w:r>
+        <w:t>pixe_fit</w:t>
+      </w:r>
+      <w:proofErr w:type="spellEnd"/>
+      <w:r>
+        <w:t>’ based on ‘</w:t>
+      </w:r>
+      <w:proofErr w:type="spellStart"/>
+      <w:r>
+        <w:t>sum_deficit</w:t>
+      </w:r>
+      <w:proofErr w:type="spellEnd"/>
+      <w:r>
+        <w:t>’.</w:t>
+      </w:r>
+    </w:p>
+    <w:p>
+      <w:pPr>
+        <w:numPr>
+          <w:ilvl w:val="2"/>
+          <w:numId w:val="6"/>
+        </w:numPr>
+      </w:pPr>
+      <w:r>
+        <w:t xml:space="preserve">Try: </w:t>
+      </w:r>
+      <w:proofErr w:type="spellStart"/>
+      <w:r>
+        <w:t>sum_spread</w:t>
+      </w:r>
+      <w:proofErr w:type="spellEnd"/>
+      <w:r>
+        <w:t xml:space="preserve"> = (1.0 + </w:t>
+      </w:r>
+      <w:proofErr w:type="spellStart"/>
+      <w:r>
+        <w:t>sum_deficit</w:t>
+      </w:r>
+      <w:proofErr w:type="spellEnd"/>
+      <w:r>
+        <w:t>/100.)^2</w:t>
+      </w:r>
+    </w:p>
+    <w:p>
+      <w:pPr>
+        <w:numPr>
+          <w:ilvl w:val="2"/>
+          <w:numId w:val="6"/>
+        </w:numPr>
+      </w:pPr>
+      <w:r>
+        <w:t>Test using spectrum: software/data/UQ-</w:t>
+      </w:r>
+      <w:proofErr w:type="spellStart"/>
+      <w:r>
+        <w:t>iXRF</w:t>
+      </w:r>
+      <w:proofErr w:type="spellEnd"/>
+      <w:r>
+        <w:t>/Loren-July-2021/…</w:t>
       </w:r>
     </w:p>
     <w:p>
@@ -5022,19 +6050,40 @@
           <w:numId w:val="6"/>
         </w:numPr>
       </w:pPr>
-      <w:r>
-        <w:t xml:space="preserve">file_requester </w:t>
-      </w:r>
-    </w:p>
-    <w:p>
-      <w:pPr>
-        <w:numPr>
-          <w:ilvl w:val="2"/>
-          <w:numId w:val="6"/>
-        </w:numPr>
-      </w:pPr>
-      <w:r>
-        <w:t>Add controls under dir tree in ‘file_requester’:</w:t>
+      <w:proofErr w:type="spellStart"/>
+      <w:r>
+        <w:t>file_requester</w:t>
+      </w:r>
+      <w:proofErr w:type="spellEnd"/>
+      <w:r>
+        <w:t xml:space="preserve"> </w:t>
+      </w:r>
+    </w:p>
+    <w:p>
+      <w:pPr>
+        <w:numPr>
+          <w:ilvl w:val="2"/>
+          <w:numId w:val="6"/>
+        </w:numPr>
+      </w:pPr>
+      <w:r>
+        <w:t xml:space="preserve">Add controls under </w:t>
+      </w:r>
+      <w:proofErr w:type="spellStart"/>
+      <w:r>
+        <w:t>dir</w:t>
+      </w:r>
+      <w:proofErr w:type="spellEnd"/>
+      <w:r>
+        <w:t xml:space="preserve"> tree in ‘</w:t>
+      </w:r>
+      <w:proofErr w:type="spellStart"/>
+      <w:r>
+        <w:t>file_requester</w:t>
+      </w:r>
+      <w:proofErr w:type="spellEnd"/>
+      <w:r>
+        <w:t>’:</w:t>
       </w:r>
     </w:p>
     <w:p>
@@ -5078,18 +6127,34 @@
         </w:numPr>
       </w:pPr>
       <w:r>
-        <w:t>Knob arrow-key inc/dec appears too small?</w:t>
-      </w:r>
-    </w:p>
-    <w:p>
-      <w:pPr>
-        <w:numPr>
-          <w:ilvl w:val="3"/>
-          <w:numId w:val="6"/>
-        </w:numPr>
-      </w:pPr>
-      <w:r>
-        <w:t>Tests show it only incs/decs 1 integer unit and then no more with more clicks.</w:t>
+        <w:t xml:space="preserve">Knob arrow-key </w:t>
+      </w:r>
+      <w:proofErr w:type="spellStart"/>
+      <w:r>
+        <w:t>inc</w:t>
+      </w:r>
+      <w:proofErr w:type="spellEnd"/>
+      <w:r>
+        <w:t>/dec appears too small?</w:t>
+      </w:r>
+    </w:p>
+    <w:p>
+      <w:pPr>
+        <w:numPr>
+          <w:ilvl w:val="3"/>
+          <w:numId w:val="6"/>
+        </w:numPr>
+      </w:pPr>
+      <w:r>
+        <w:t xml:space="preserve">Tests show it only </w:t>
+      </w:r>
+      <w:proofErr w:type="spellStart"/>
+      <w:r>
+        <w:t>incs</w:t>
+      </w:r>
+      <w:proofErr w:type="spellEnd"/>
+      <w:r>
+        <w:t>/decs 1 integer unit and then no more with more clicks.</w:t>
       </w:r>
     </w:p>
     <w:p>
@@ -5166,18 +6231,34 @@
         </w:numPr>
       </w:pPr>
       <w:r>
-        <w:t>Perhaps add arrows at ends, like in Windows, and control the small inc/dec directly?</w:t>
-      </w:r>
-    </w:p>
-    <w:p>
-      <w:pPr>
-        <w:numPr>
-          <w:ilvl w:val="2"/>
-          <w:numId w:val="6"/>
-        </w:numPr>
-      </w:pPr>
-      <w:r>
-        <w:t>Make these inc/dec in ‘scroll’ steps.</w:t>
+        <w:t xml:space="preserve">Perhaps add arrows at ends, like in Windows, and control the small </w:t>
+      </w:r>
+      <w:proofErr w:type="spellStart"/>
+      <w:r>
+        <w:t>inc</w:t>
+      </w:r>
+      <w:proofErr w:type="spellEnd"/>
+      <w:r>
+        <w:t>/dec directly?</w:t>
+      </w:r>
+    </w:p>
+    <w:p>
+      <w:pPr>
+        <w:numPr>
+          <w:ilvl w:val="2"/>
+          <w:numId w:val="6"/>
+        </w:numPr>
+      </w:pPr>
+      <w:r>
+        <w:t xml:space="preserve">Make these </w:t>
+      </w:r>
+      <w:proofErr w:type="spellStart"/>
+      <w:r>
+        <w:t>inc</w:t>
+      </w:r>
+      <w:proofErr w:type="spellEnd"/>
+      <w:r>
+        <w:t>/dec in ‘scroll’ steps.</w:t>
       </w:r>
     </w:p>
     <w:p>
@@ -5211,9 +6292,11 @@
       <w:r>
         <w:t>Also, make these available via ‘</w:t>
       </w:r>
+      <w:proofErr w:type="spellStart"/>
       <w:r>
         <w:t>OnButton_Image_Process_Get</w:t>
       </w:r>
+      <w:proofErr w:type="spellEnd"/>
       <w:r>
         <w:t>’, so they work with “Get” and also triggered from “Apply Digital Filters” in batch sorting.</w:t>
       </w:r>
@@ -5240,7 +6323,6 @@
         </w:numPr>
       </w:pPr>
       <w:r>
-        <w:lastRenderedPageBreak/>
         <w:t>Possibles:</w:t>
       </w:r>
     </w:p>
@@ -5318,7 +6400,15 @@
         </w:numPr>
       </w:pPr>
       <w:r>
-        <w:t>X^(1./3), X^(1./5), X^(1./10), atan(x)</w:t>
+        <w:t xml:space="preserve">X^(1./3), X^(1./5), X^(1./10), </w:t>
+      </w:r>
+      <w:proofErr w:type="spellStart"/>
+      <w:r>
+        <w:t>atan</w:t>
+      </w:r>
+      <w:proofErr w:type="spellEnd"/>
+      <w:r>
+        <w:t>(x)</w:t>
       </w:r>
     </w:p>
     <w:p>
@@ -5338,7 +6428,23 @@
         <w:t>not</w:t>
       </w:r>
       <w:r>
-        <w:t xml:space="preserve"> have ‘asinh’ or ‘atanh’ functions.</w:t>
+        <w:t xml:space="preserve"> have ‘</w:t>
+      </w:r>
+      <w:proofErr w:type="spellStart"/>
+      <w:r>
+        <w:t>asinh</w:t>
+      </w:r>
+      <w:proofErr w:type="spellEnd"/>
+      <w:r>
+        <w:t>’ or ‘</w:t>
+      </w:r>
+      <w:proofErr w:type="spellStart"/>
+      <w:r>
+        <w:t>atanh</w:t>
+      </w:r>
+      <w:proofErr w:type="spellEnd"/>
+      <w:r>
+        <w:t>’ functions.</w:t>
       </w:r>
     </w:p>
     <w:p>
@@ -5393,7 +6499,23 @@
         </w:numPr>
       </w:pPr>
       <w:r>
-        <w:t>Perhaps use util routine:  ‘strip_file_keys, /file_m’ more universally?</w:t>
+        <w:t>Perhaps use util routine:  ‘</w:t>
+      </w:r>
+      <w:proofErr w:type="spellStart"/>
+      <w:r>
+        <w:t>strip_file_keys</w:t>
+      </w:r>
+      <w:proofErr w:type="spellEnd"/>
+      <w:r>
+        <w:t>, /</w:t>
+      </w:r>
+      <w:proofErr w:type="spellStart"/>
+      <w:r>
+        <w:t>file_m</w:t>
+      </w:r>
+      <w:proofErr w:type="spellEnd"/>
+      <w:r>
+        <w:t>’ more universally?</w:t>
       </w:r>
     </w:p>
     <w:p>

</xml_diff>

<commit_message>
Simple relative image error plugin.
</commit_message>
<xml_diff>
--- a/doc/GeoPIXE open mods needed.docx
+++ b/doc/GeoPIXE open mods needed.docx
@@ -7,7 +7,15 @@
         <w:pStyle w:val="Heading1"/>
       </w:pPr>
       <w:r>
-        <w:t>GeoPIXE mods needed – open source version</w:t>
+        <w:t xml:space="preserve">GeoPIXE mods needed – </w:t>
+      </w:r>
+      <w:proofErr w:type="gramStart"/>
+      <w:r>
+        <w:t>open source</w:t>
+      </w:r>
+      <w:proofErr w:type="gramEnd"/>
+      <w:r>
+        <w:t xml:space="preserve"> version</w:t>
       </w:r>
     </w:p>
     <w:p>
@@ -278,6 +286,1038 @@
         <w:autoSpaceDE w:val="0"/>
         <w:autoSpaceDN w:val="0"/>
         <w:adjustRightInd w:val="0"/>
+        <w:rPr>
+          <w:highlight w:val="green"/>
+        </w:rPr>
+      </w:pPr>
+      <w:r>
+        <w:rPr>
+          <w:highlight w:val="green"/>
+        </w:rPr>
+        <w:t>Fit overlays on regions spectra for MPDA images</w:t>
+      </w:r>
+    </w:p>
+    <w:p>
+      <w:pPr>
+        <w:widowControl w:val="0"/>
+        <w:numPr>
+          <w:ilvl w:val="2"/>
+          <w:numId w:val="6"/>
+        </w:numPr>
+        <w:tabs>
+          <w:tab w:val="left" w:pos="6521"/>
+        </w:tabs>
+        <w:autoSpaceDE w:val="0"/>
+        <w:autoSpaceDN w:val="0"/>
+        <w:adjustRightInd w:val="0"/>
+      </w:pPr>
+      <w:r>
+        <w:t xml:space="preserve">The element amplitudes seem inaccurate, making the “fit overlay” deficient/low, especially for some lighter elements. Always a bit low, not high (except </w:t>
+      </w:r>
+      <w:proofErr w:type="spellStart"/>
+      <w:r>
+        <w:t>BaL</w:t>
+      </w:r>
+      <w:proofErr w:type="spellEnd"/>
+      <w:r>
+        <w:t>).</w:t>
+      </w:r>
+    </w:p>
+    <w:p>
+      <w:pPr>
+        <w:widowControl w:val="0"/>
+        <w:numPr>
+          <w:ilvl w:val="2"/>
+          <w:numId w:val="6"/>
+        </w:numPr>
+        <w:tabs>
+          <w:tab w:val="left" w:pos="6521"/>
+        </w:tabs>
+        <w:autoSpaceDE w:val="0"/>
+        <w:autoSpaceDN w:val="0"/>
+        <w:adjustRightInd w:val="0"/>
+      </w:pPr>
+      <w:r>
+        <w:t>Some by about x2.</w:t>
+      </w:r>
+    </w:p>
+    <w:p>
+      <w:pPr>
+        <w:widowControl w:val="0"/>
+        <w:numPr>
+          <w:ilvl w:val="2"/>
+          <w:numId w:val="6"/>
+        </w:numPr>
+        <w:tabs>
+          <w:tab w:val="left" w:pos="6521"/>
+        </w:tabs>
+        <w:autoSpaceDE w:val="0"/>
+        <w:autoSpaceDN w:val="0"/>
+        <w:adjustRightInd w:val="0"/>
+      </w:pPr>
+      <w:r>
+        <w:t xml:space="preserve">Check scaling modelling over </w:t>
+      </w:r>
+      <w:proofErr w:type="spellStart"/>
+      <w:r>
+        <w:t>rG</w:t>
+      </w:r>
+      <w:proofErr w:type="spellEnd"/>
+      <w:r>
+        <w:t>, etc.</w:t>
+      </w:r>
+      <w:r>
+        <w:t xml:space="preserve"> in ‘</w:t>
+      </w:r>
+      <w:proofErr w:type="spellStart"/>
+      <w:r>
+        <w:t>build_da_fit</w:t>
+      </w:r>
+      <w:proofErr w:type="spellEnd"/>
+      <w:r>
+        <w:t>’</w:t>
+      </w:r>
+    </w:p>
+    <w:p>
+      <w:pPr>
+        <w:widowControl w:val="0"/>
+        <w:tabs>
+          <w:tab w:val="left" w:pos="6521"/>
+        </w:tabs>
+        <w:autoSpaceDE w:val="0"/>
+        <w:autoSpaceDN w:val="0"/>
+        <w:adjustRightInd w:val="0"/>
+      </w:pPr>
+    </w:p>
+    <w:p>
+      <w:pPr>
+        <w:widowControl w:val="0"/>
+        <w:tabs>
+          <w:tab w:val="left" w:pos="6521"/>
+        </w:tabs>
+        <w:autoSpaceDE w:val="0"/>
+        <w:autoSpaceDN w:val="0"/>
+        <w:adjustRightInd w:val="0"/>
+      </w:pPr>
+      <w:r>
+        <w:t>See 11163 example MPDA versus normal. Ca (j=6)</w:t>
+      </w:r>
+    </w:p>
+    <w:p>
+      <w:pPr>
+        <w:widowControl w:val="0"/>
+        <w:tabs>
+          <w:tab w:val="left" w:pos="6521"/>
+        </w:tabs>
+        <w:autoSpaceDE w:val="0"/>
+        <w:autoSpaceDN w:val="0"/>
+        <w:adjustRightInd w:val="0"/>
+      </w:pPr>
+    </w:p>
+    <w:p>
+      <w:pPr>
+        <w:widowControl w:val="0"/>
+        <w:tabs>
+          <w:tab w:val="left" w:pos="6521"/>
+        </w:tabs>
+        <w:autoSpaceDE w:val="0"/>
+        <w:autoSpaceDN w:val="0"/>
+        <w:adjustRightInd w:val="0"/>
+        <w:rPr>
+          <w:b/>
+          <w:bCs/>
+        </w:rPr>
+      </w:pPr>
+      <w:r>
+        <w:rPr>
+          <w:b/>
+          <w:bCs/>
+        </w:rPr>
+        <w:t>Ca: normal</w:t>
+      </w:r>
+    </w:p>
+    <w:p>
+      <w:pPr>
+        <w:widowControl w:val="0"/>
+        <w:tabs>
+          <w:tab w:val="left" w:pos="6521"/>
+        </w:tabs>
+        <w:autoSpaceDE w:val="0"/>
+        <w:autoSpaceDN w:val="0"/>
+        <w:adjustRightInd w:val="0"/>
+      </w:pPr>
+    </w:p>
+    <w:p>
+      <w:pPr>
+        <w:widowControl w:val="0"/>
+        <w:tabs>
+          <w:tab w:val="left" w:pos="6521"/>
+        </w:tabs>
+        <w:autoSpaceDE w:val="0"/>
+        <w:autoSpaceDN w:val="0"/>
+        <w:adjustRightInd w:val="0"/>
+      </w:pPr>
+      <w:r>
+        <w:t xml:space="preserve">scale = </w:t>
+      </w:r>
+      <w:proofErr w:type="spellStart"/>
+      <w:proofErr w:type="gramStart"/>
+      <w:r>
+        <w:t>matrix.yield</w:t>
+      </w:r>
+      <w:proofErr w:type="spellEnd"/>
+      <w:proofErr w:type="gramEnd"/>
+      <w:r>
+        <w:t>[j] * (*</w:t>
+      </w:r>
+      <w:proofErr w:type="spellStart"/>
+      <w:proofErr w:type="gramStart"/>
+      <w:r>
+        <w:t>pconc</w:t>
+      </w:r>
+      <w:proofErr w:type="spellEnd"/>
+      <w:r>
+        <w:t>)[</w:t>
+      </w:r>
+      <w:proofErr w:type="gramEnd"/>
+      <w:r>
+        <w:t xml:space="preserve">k] * charge * </w:t>
+      </w:r>
+      <w:proofErr w:type="spellStart"/>
+      <w:r>
+        <w:t>rG</w:t>
+      </w:r>
+      <w:proofErr w:type="spellEnd"/>
+      <w:r>
+        <w:t>[j]</w:t>
+      </w:r>
+    </w:p>
+    <w:p>
+      <w:pPr>
+        <w:widowControl w:val="0"/>
+        <w:tabs>
+          <w:tab w:val="left" w:pos="6521"/>
+        </w:tabs>
+        <w:autoSpaceDE w:val="0"/>
+        <w:autoSpaceDN w:val="0"/>
+        <w:adjustRightInd w:val="0"/>
+      </w:pPr>
+      <w:r>
+        <w:t xml:space="preserve">s = </w:t>
+      </w:r>
+      <w:proofErr w:type="spellStart"/>
+      <w:proofErr w:type="gramStart"/>
+      <w:r>
+        <w:t>matrix.pure</w:t>
+      </w:r>
+      <w:proofErr w:type="spellEnd"/>
+      <w:proofErr w:type="gramEnd"/>
+      <w:r>
+        <w:t>[</w:t>
+      </w:r>
+      <w:proofErr w:type="gramStart"/>
+      <w:r>
+        <w:t>*,j</w:t>
+      </w:r>
+      <w:proofErr w:type="gramEnd"/>
+      <w:r>
+        <w:t>]</w:t>
+      </w:r>
+    </w:p>
+    <w:p>
+      <w:pPr>
+        <w:widowControl w:val="0"/>
+        <w:tabs>
+          <w:tab w:val="left" w:pos="6521"/>
+        </w:tabs>
+        <w:autoSpaceDE w:val="0"/>
+        <w:autoSpaceDN w:val="0"/>
+        <w:adjustRightInd w:val="0"/>
+      </w:pPr>
+      <w:r>
+        <w:t xml:space="preserve">term = (s / </w:t>
+      </w:r>
+      <w:proofErr w:type="spellStart"/>
+      <w:r>
+        <w:t>cal_ratio</w:t>
+      </w:r>
+      <w:proofErr w:type="spellEnd"/>
+      <w:r>
+        <w:t>) * scale</w:t>
+      </w:r>
+    </w:p>
+    <w:p>
+      <w:pPr>
+        <w:widowControl w:val="0"/>
+        <w:tabs>
+          <w:tab w:val="left" w:pos="6521"/>
+        </w:tabs>
+        <w:autoSpaceDE w:val="0"/>
+        <w:autoSpaceDN w:val="0"/>
+        <w:adjustRightInd w:val="0"/>
+      </w:pPr>
+    </w:p>
+    <w:p>
+      <w:pPr>
+        <w:widowControl w:val="0"/>
+        <w:tabs>
+          <w:tab w:val="left" w:pos="6521"/>
+        </w:tabs>
+        <w:autoSpaceDE w:val="0"/>
+        <w:autoSpaceDN w:val="0"/>
+        <w:adjustRightInd w:val="0"/>
+      </w:pPr>
+      <w:r>
+        <w:t xml:space="preserve">python3.10 IDL 9.1 open&gt; </w:t>
+      </w:r>
+      <w:proofErr w:type="spellStart"/>
+      <w:proofErr w:type="gramStart"/>
+      <w:r>
+        <w:t>print,matrix</w:t>
+      </w:r>
+      <w:proofErr w:type="gramEnd"/>
+      <w:r>
+        <w:t>.yield</w:t>
+      </w:r>
+      <w:proofErr w:type="spellEnd"/>
+      <w:r>
+        <w:t>[j], (*</w:t>
+      </w:r>
+      <w:proofErr w:type="spellStart"/>
+      <w:proofErr w:type="gramStart"/>
+      <w:r>
+        <w:t>pconc</w:t>
+      </w:r>
+      <w:proofErr w:type="spellEnd"/>
+      <w:r>
+        <w:t>)[</w:t>
+      </w:r>
+      <w:proofErr w:type="gramEnd"/>
+      <w:r>
+        <w:t xml:space="preserve">k], </w:t>
+      </w:r>
+      <w:proofErr w:type="spellStart"/>
+      <w:r>
+        <w:t>rG</w:t>
+      </w:r>
+      <w:proofErr w:type="spellEnd"/>
+      <w:r>
+        <w:t>[j],</w:t>
+      </w:r>
+      <w:r>
+        <w:t xml:space="preserve"> </w:t>
+      </w:r>
+      <w:r>
+        <w:t>scale</w:t>
+      </w:r>
+    </w:p>
+    <w:p>
+      <w:pPr>
+        <w:widowControl w:val="0"/>
+        <w:tabs>
+          <w:tab w:val="left" w:pos="6521"/>
+        </w:tabs>
+        <w:autoSpaceDE w:val="0"/>
+        <w:autoSpaceDN w:val="0"/>
+        <w:adjustRightInd w:val="0"/>
+      </w:pPr>
+      <w:r>
+        <w:t xml:space="preserve">      14.4184      274616.      82.6920      8289.19</w:t>
+      </w:r>
+    </w:p>
+    <w:p>
+      <w:pPr>
+        <w:widowControl w:val="0"/>
+        <w:tabs>
+          <w:tab w:val="left" w:pos="6521"/>
+        </w:tabs>
+        <w:autoSpaceDE w:val="0"/>
+        <w:autoSpaceDN w:val="0"/>
+        <w:adjustRightInd w:val="0"/>
+      </w:pPr>
+    </w:p>
+    <w:p>
+      <w:pPr>
+        <w:widowControl w:val="0"/>
+        <w:tabs>
+          <w:tab w:val="left" w:pos="6521"/>
+        </w:tabs>
+        <w:autoSpaceDE w:val="0"/>
+        <w:autoSpaceDN w:val="0"/>
+        <w:adjustRightInd w:val="0"/>
+      </w:pPr>
+      <w:r>
+        <w:t>python3.10 IDL 9.1 open&gt; print, max(</w:t>
+      </w:r>
+      <w:proofErr w:type="spellStart"/>
+      <w:proofErr w:type="gramStart"/>
+      <w:r>
+        <w:t>matrix.pure</w:t>
+      </w:r>
+      <w:proofErr w:type="spellEnd"/>
+      <w:proofErr w:type="gramEnd"/>
+      <w:r>
+        <w:t>[</w:t>
+      </w:r>
+      <w:proofErr w:type="gramStart"/>
+      <w:r>
+        <w:t>*,j</w:t>
+      </w:r>
+      <w:proofErr w:type="gramEnd"/>
+      <w:r>
+        <w:t xml:space="preserve">,4]) * </w:t>
+      </w:r>
+      <w:proofErr w:type="spellStart"/>
+      <w:proofErr w:type="gramStart"/>
+      <w:r>
+        <w:t>matrix.yield</w:t>
+      </w:r>
+      <w:proofErr w:type="spellEnd"/>
+      <w:proofErr w:type="gramEnd"/>
+      <w:r>
+        <w:t>[j] * scale * (*</w:t>
+      </w:r>
+      <w:proofErr w:type="spellStart"/>
+      <w:proofErr w:type="gramStart"/>
+      <w:r>
+        <w:t>pconc</w:t>
+      </w:r>
+      <w:proofErr w:type="spellEnd"/>
+      <w:r>
+        <w:t>)[</w:t>
+      </w:r>
+      <w:proofErr w:type="gramEnd"/>
+      <w:r>
+        <w:t>j]*charge</w:t>
+      </w:r>
+    </w:p>
+    <w:p>
+      <w:pPr>
+        <w:widowControl w:val="0"/>
+        <w:tabs>
+          <w:tab w:val="left" w:pos="6521"/>
+        </w:tabs>
+        <w:autoSpaceDE w:val="0"/>
+        <w:autoSpaceDN w:val="0"/>
+        <w:adjustRightInd w:val="0"/>
+        <w:rPr>
+          <w:b/>
+          <w:bCs/>
+        </w:rPr>
+      </w:pPr>
+      <w:r>
+        <w:t xml:space="preserve">      </w:t>
+      </w:r>
+      <w:r>
+        <w:rPr>
+          <w:b/>
+          <w:bCs/>
+        </w:rPr>
+        <w:t>256.733</w:t>
+      </w:r>
+    </w:p>
+    <w:p>
+      <w:pPr>
+        <w:widowControl w:val="0"/>
+        <w:tabs>
+          <w:tab w:val="left" w:pos="6521"/>
+        </w:tabs>
+        <w:autoSpaceDE w:val="0"/>
+        <w:autoSpaceDN w:val="0"/>
+        <w:adjustRightInd w:val="0"/>
+      </w:pPr>
+    </w:p>
+    <w:p>
+      <w:pPr>
+        <w:widowControl w:val="0"/>
+        <w:tabs>
+          <w:tab w:val="left" w:pos="6521"/>
+        </w:tabs>
+        <w:autoSpaceDE w:val="0"/>
+        <w:autoSpaceDN w:val="0"/>
+        <w:adjustRightInd w:val="0"/>
+        <w:rPr>
+          <w:b/>
+          <w:bCs/>
+        </w:rPr>
+      </w:pPr>
+      <w:r>
+        <w:rPr>
+          <w:b/>
+          <w:bCs/>
+        </w:rPr>
+        <w:t>Ca: MPDA</w:t>
+      </w:r>
+    </w:p>
+    <w:p>
+      <w:pPr>
+        <w:widowControl w:val="0"/>
+        <w:tabs>
+          <w:tab w:val="left" w:pos="6521"/>
+        </w:tabs>
+        <w:autoSpaceDE w:val="0"/>
+        <w:autoSpaceDN w:val="0"/>
+        <w:adjustRightInd w:val="0"/>
+      </w:pPr>
+    </w:p>
+    <w:p>
+      <w:pPr>
+        <w:widowControl w:val="0"/>
+        <w:tabs>
+          <w:tab w:val="left" w:pos="6521"/>
+        </w:tabs>
+        <w:autoSpaceDE w:val="0"/>
+        <w:autoSpaceDN w:val="0"/>
+        <w:adjustRightInd w:val="0"/>
+      </w:pPr>
+      <w:r>
+        <w:t xml:space="preserve">scale = </w:t>
+      </w:r>
+      <w:proofErr w:type="spellStart"/>
+      <w:r>
+        <w:t>rG</w:t>
+      </w:r>
+      <w:proofErr w:type="spellEnd"/>
+      <w:r>
+        <w:t>[j]</w:t>
+      </w:r>
+    </w:p>
+    <w:p>
+      <w:pPr>
+        <w:widowControl w:val="0"/>
+        <w:tabs>
+          <w:tab w:val="left" w:pos="6521"/>
+        </w:tabs>
+        <w:autoSpaceDE w:val="0"/>
+        <w:autoSpaceDN w:val="0"/>
+        <w:adjustRightInd w:val="0"/>
+      </w:pPr>
+      <w:r>
+        <w:t>s = (*(*</w:t>
+      </w:r>
+      <w:proofErr w:type="spellStart"/>
+      <w:r>
+        <w:t>pregion</w:t>
+      </w:r>
+      <w:proofErr w:type="spellEnd"/>
+      <w:proofErr w:type="gramStart"/>
+      <w:r>
+        <w:t>).</w:t>
+      </w:r>
+      <w:proofErr w:type="spellStart"/>
+      <w:r>
+        <w:t>poverlay</w:t>
+      </w:r>
+      <w:proofErr w:type="spellEnd"/>
+      <w:proofErr w:type="gramEnd"/>
+      <w:r>
+        <w:t>)[</w:t>
+      </w:r>
+      <w:proofErr w:type="gramStart"/>
+      <w:r>
+        <w:t>*,j</w:t>
+      </w:r>
+      <w:proofErr w:type="gramEnd"/>
+      <w:r>
+        <w:t>]</w:t>
+      </w:r>
+    </w:p>
+    <w:p>
+      <w:pPr>
+        <w:widowControl w:val="0"/>
+        <w:tabs>
+          <w:tab w:val="left" w:pos="6521"/>
+        </w:tabs>
+        <w:autoSpaceDE w:val="0"/>
+        <w:autoSpaceDN w:val="0"/>
+        <w:adjustRightInd w:val="0"/>
+      </w:pPr>
+      <w:r>
+        <w:t xml:space="preserve">term = (s / </w:t>
+      </w:r>
+      <w:proofErr w:type="spellStart"/>
+      <w:r>
+        <w:t>cal_ratio</w:t>
+      </w:r>
+      <w:proofErr w:type="spellEnd"/>
+      <w:r>
+        <w:t>) * scale</w:t>
+      </w:r>
+    </w:p>
+    <w:p>
+      <w:pPr>
+        <w:widowControl w:val="0"/>
+        <w:tabs>
+          <w:tab w:val="left" w:pos="6521"/>
+        </w:tabs>
+        <w:autoSpaceDE w:val="0"/>
+        <w:autoSpaceDN w:val="0"/>
+        <w:adjustRightInd w:val="0"/>
+      </w:pPr>
+    </w:p>
+    <w:p>
+      <w:pPr>
+        <w:widowControl w:val="0"/>
+        <w:tabs>
+          <w:tab w:val="left" w:pos="6521"/>
+        </w:tabs>
+        <w:autoSpaceDE w:val="0"/>
+        <w:autoSpaceDN w:val="0"/>
+        <w:adjustRightInd w:val="0"/>
+      </w:pPr>
+      <w:proofErr w:type="spellStart"/>
+      <w:r>
+        <w:t>poverlay</w:t>
+      </w:r>
+      <w:proofErr w:type="spellEnd"/>
+      <w:r>
+        <w:t xml:space="preserve"> formed by summing over …</w:t>
+      </w:r>
+    </w:p>
+    <w:p>
+      <w:pPr>
+        <w:widowControl w:val="0"/>
+        <w:tabs>
+          <w:tab w:val="left" w:pos="6521"/>
+        </w:tabs>
+        <w:autoSpaceDE w:val="0"/>
+        <w:autoSpaceDN w:val="0"/>
+        <w:adjustRightInd w:val="0"/>
+      </w:pPr>
+      <w:proofErr w:type="gramStart"/>
+      <w:r>
+        <w:t>total( (</w:t>
+      </w:r>
+      <w:proofErr w:type="gramEnd"/>
+      <w:r>
+        <w:t>*(*p</w:t>
+      </w:r>
+      <w:proofErr w:type="gramStart"/>
+      <w:r>
+        <w:t>).image)[</w:t>
+      </w:r>
+      <w:proofErr w:type="spellStart"/>
+      <w:proofErr w:type="gramEnd"/>
+      <w:r>
+        <w:t>qe</w:t>
+      </w:r>
+      <w:proofErr w:type="spellEnd"/>
+      <w:r>
+        <w:t xml:space="preserve"> + </w:t>
+      </w:r>
+      <w:proofErr w:type="spellStart"/>
+      <w:r>
+        <w:t>i</w:t>
+      </w:r>
+      <w:proofErr w:type="spellEnd"/>
+      <w:r>
+        <w:t>*</w:t>
+      </w:r>
+      <w:proofErr w:type="spellStart"/>
+      <w:r>
+        <w:t>pixeln</w:t>
+      </w:r>
+      <w:proofErr w:type="spellEnd"/>
+      <w:r>
+        <w:t>] * (*(*p</w:t>
+      </w:r>
+      <w:proofErr w:type="gramStart"/>
+      <w:r>
+        <w:t>).yield)[</w:t>
+      </w:r>
+      <w:proofErr w:type="gramEnd"/>
+      <w:r>
+        <w:t>x2 + y2*</w:t>
+      </w:r>
+      <w:proofErr w:type="spellStart"/>
+      <w:r>
+        <w:t>xesize</w:t>
+      </w:r>
+      <w:proofErr w:type="spellEnd"/>
+      <w:r>
+        <w:t xml:space="preserve"> + pixeln2*</w:t>
+      </w:r>
+      <w:proofErr w:type="spellStart"/>
+      <w:r>
+        <w:t>i</w:t>
+      </w:r>
+      <w:proofErr w:type="spellEnd"/>
+      <w:r>
+        <w:t>] *</w:t>
+      </w:r>
+    </w:p>
+    <w:p>
+      <w:pPr>
+        <w:widowControl w:val="0"/>
+        <w:tabs>
+          <w:tab w:val="left" w:pos="6521"/>
+        </w:tabs>
+        <w:autoSpaceDE w:val="0"/>
+        <w:autoSpaceDN w:val="0"/>
+        <w:adjustRightInd w:val="0"/>
+      </w:pPr>
+      <w:r>
+        <w:t>(*(*p</w:t>
+      </w:r>
+      <w:proofErr w:type="gramStart"/>
+      <w:r>
+        <w:t>).phase)[</w:t>
+      </w:r>
+      <w:proofErr w:type="spellStart"/>
+      <w:proofErr w:type="gramEnd"/>
+      <w:r>
+        <w:t>qe</w:t>
+      </w:r>
+      <w:proofErr w:type="spellEnd"/>
+      <w:r>
+        <w:t xml:space="preserve"> + j*</w:t>
+      </w:r>
+      <w:proofErr w:type="spellStart"/>
+      <w:r>
+        <w:t>pixeln</w:t>
+      </w:r>
+      <w:proofErr w:type="spellEnd"/>
+      <w:proofErr w:type="gramStart"/>
+      <w:r>
+        <w:t>] )</w:t>
+      </w:r>
+      <w:proofErr w:type="gramEnd"/>
+      <w:r>
+        <w:t xml:space="preserve"> * </w:t>
+      </w:r>
+      <w:proofErr w:type="spellStart"/>
+      <w:proofErr w:type="gramStart"/>
+      <w:r>
+        <w:t>matrix.pure</w:t>
+      </w:r>
+      <w:proofErr w:type="spellEnd"/>
+      <w:proofErr w:type="gramEnd"/>
+      <w:r>
+        <w:t>[</w:t>
+      </w:r>
+      <w:proofErr w:type="gramStart"/>
+      <w:r>
+        <w:t>*,</w:t>
+      </w:r>
+      <w:proofErr w:type="spellStart"/>
+      <w:r>
+        <w:t>k</w:t>
+      </w:r>
+      <w:proofErr w:type="gramEnd"/>
+      <w:r>
+        <w:t>,j</w:t>
+      </w:r>
+      <w:proofErr w:type="spellEnd"/>
+      <w:r>
+        <w:t xml:space="preserve">]) </w:t>
+      </w:r>
+    </w:p>
+    <w:p>
+      <w:pPr>
+        <w:widowControl w:val="0"/>
+        <w:tabs>
+          <w:tab w:val="left" w:pos="6521"/>
+        </w:tabs>
+        <w:autoSpaceDE w:val="0"/>
+        <w:autoSpaceDN w:val="0"/>
+        <w:adjustRightInd w:val="0"/>
+      </w:pPr>
+    </w:p>
+    <w:p>
+      <w:pPr>
+        <w:widowControl w:val="0"/>
+        <w:tabs>
+          <w:tab w:val="left" w:pos="6521"/>
+        </w:tabs>
+        <w:autoSpaceDE w:val="0"/>
+        <w:autoSpaceDN w:val="0"/>
+        <w:adjustRightInd w:val="0"/>
+      </w:pPr>
+      <w:r>
+        <w:t xml:space="preserve">python3.10 IDL 9.1 open&gt; print, </w:t>
+      </w:r>
+      <w:proofErr w:type="spellStart"/>
+      <w:r>
+        <w:t>rg</w:t>
+      </w:r>
+      <w:proofErr w:type="spellEnd"/>
+      <w:r>
+        <w:t>[j], scale</w:t>
+      </w:r>
+    </w:p>
+    <w:p>
+      <w:pPr>
+        <w:widowControl w:val="0"/>
+        <w:tabs>
+          <w:tab w:val="left" w:pos="6521"/>
+        </w:tabs>
+        <w:autoSpaceDE w:val="0"/>
+        <w:autoSpaceDN w:val="0"/>
+        <w:adjustRightInd w:val="0"/>
+      </w:pPr>
+      <w:r>
+        <w:t xml:space="preserve">      82.8174      82.8174</w:t>
+      </w:r>
+    </w:p>
+    <w:p>
+      <w:pPr>
+        <w:widowControl w:val="0"/>
+        <w:tabs>
+          <w:tab w:val="left" w:pos="6521"/>
+        </w:tabs>
+        <w:autoSpaceDE w:val="0"/>
+        <w:autoSpaceDN w:val="0"/>
+        <w:adjustRightInd w:val="0"/>
+      </w:pPr>
+    </w:p>
+    <w:p>
+      <w:pPr>
+        <w:widowControl w:val="0"/>
+        <w:tabs>
+          <w:tab w:val="left" w:pos="6521"/>
+        </w:tabs>
+        <w:autoSpaceDE w:val="0"/>
+        <w:autoSpaceDN w:val="0"/>
+        <w:adjustRightInd w:val="0"/>
+      </w:pPr>
+      <w:r>
+        <w:t xml:space="preserve">python3.10 IDL 9.1 open&gt; print, </w:t>
+      </w:r>
+      <w:proofErr w:type="gramStart"/>
+      <w:r>
+        <w:t>max( (</w:t>
+      </w:r>
+      <w:proofErr w:type="gramEnd"/>
+      <w:r>
+        <w:t>*(*</w:t>
+      </w:r>
+      <w:proofErr w:type="spellStart"/>
+      <w:r>
+        <w:t>pregion</w:t>
+      </w:r>
+      <w:proofErr w:type="spellEnd"/>
+      <w:proofErr w:type="gramStart"/>
+      <w:r>
+        <w:t>).</w:t>
+      </w:r>
+      <w:proofErr w:type="spellStart"/>
+      <w:r>
+        <w:t>poverlay</w:t>
+      </w:r>
+      <w:proofErr w:type="spellEnd"/>
+      <w:proofErr w:type="gramEnd"/>
+      <w:r>
+        <w:t>)[</w:t>
+      </w:r>
+      <w:proofErr w:type="gramStart"/>
+      <w:r>
+        <w:t>*,j</w:t>
+      </w:r>
+      <w:proofErr w:type="gramEnd"/>
+      <w:r>
+        <w:t>]) * scale</w:t>
+      </w:r>
+    </w:p>
+    <w:p>
+      <w:pPr>
+        <w:widowControl w:val="0"/>
+        <w:tabs>
+          <w:tab w:val="left" w:pos="6521"/>
+        </w:tabs>
+        <w:autoSpaceDE w:val="0"/>
+        <w:autoSpaceDN w:val="0"/>
+        <w:adjustRightInd w:val="0"/>
+        <w:rPr>
+          <w:b/>
+          <w:bCs/>
+        </w:rPr>
+      </w:pPr>
+      <w:r>
+        <w:t xml:space="preserve">      </w:t>
+      </w:r>
+      <w:r>
+        <w:rPr>
+          <w:b/>
+          <w:bCs/>
+        </w:rPr>
+        <w:t>131.149</w:t>
+      </w:r>
+    </w:p>
+    <w:p>
+      <w:pPr>
+        <w:widowControl w:val="0"/>
+        <w:tabs>
+          <w:tab w:val="left" w:pos="6521"/>
+        </w:tabs>
+        <w:autoSpaceDE w:val="0"/>
+        <w:autoSpaceDN w:val="0"/>
+        <w:adjustRightInd w:val="0"/>
+      </w:pPr>
+    </w:p>
+    <w:p>
+      <w:pPr>
+        <w:widowControl w:val="0"/>
+        <w:tabs>
+          <w:tab w:val="left" w:pos="6521"/>
+        </w:tabs>
+        <w:autoSpaceDE w:val="0"/>
+        <w:autoSpaceDN w:val="0"/>
+        <w:adjustRightInd w:val="0"/>
+      </w:pPr>
+      <w:r>
+        <w:t>Seems to be down x2</w:t>
+      </w:r>
+    </w:p>
+    <w:p>
+      <w:pPr>
+        <w:widowControl w:val="0"/>
+        <w:tabs>
+          <w:tab w:val="left" w:pos="6521"/>
+        </w:tabs>
+        <w:autoSpaceDE w:val="0"/>
+        <w:autoSpaceDN w:val="0"/>
+        <w:adjustRightInd w:val="0"/>
+      </w:pPr>
+    </w:p>
+    <w:p>
+      <w:pPr>
+        <w:widowControl w:val="0"/>
+        <w:tabs>
+          <w:tab w:val="left" w:pos="6521"/>
+        </w:tabs>
+        <w:autoSpaceDE w:val="0"/>
+        <w:autoSpaceDN w:val="0"/>
+        <w:adjustRightInd w:val="0"/>
+      </w:pPr>
+      <w:r>
+        <w:t>Notes:</w:t>
+      </w:r>
+    </w:p>
+    <w:p>
+      <w:pPr>
+        <w:widowControl w:val="0"/>
+        <w:tabs>
+          <w:tab w:val="left" w:pos="6521"/>
+        </w:tabs>
+        <w:autoSpaceDE w:val="0"/>
+        <w:autoSpaceDN w:val="0"/>
+        <w:adjustRightInd w:val="0"/>
+      </w:pPr>
+      <w:r>
+        <w:t xml:space="preserve">1. For norm, conc is formed as sum over </w:t>
+      </w:r>
+      <w:proofErr w:type="gramStart"/>
+      <w:r>
+        <w:t>image  /</w:t>
+      </w:r>
+      <w:proofErr w:type="gramEnd"/>
+      <w:r>
+        <w:t xml:space="preserve"> </w:t>
+      </w:r>
+      <w:proofErr w:type="spellStart"/>
+      <w:r>
+        <w:t>fcharge</w:t>
+      </w:r>
+      <w:proofErr w:type="spellEnd"/>
+      <w:r>
+        <w:t xml:space="preserve"> (which is charge corrected for DT, PU)</w:t>
+      </w:r>
+    </w:p>
+    <w:p>
+      <w:pPr>
+        <w:widowControl w:val="0"/>
+        <w:tabs>
+          <w:tab w:val="left" w:pos="6521"/>
+        </w:tabs>
+        <w:autoSpaceDE w:val="0"/>
+        <w:autoSpaceDN w:val="0"/>
+        <w:adjustRightInd w:val="0"/>
+      </w:pPr>
+      <w:r>
+        <w:t>Is 'charge' for region this live charge?</w:t>
+      </w:r>
+      <w:r>
+        <w:tab/>
+        <w:t>Yes.</w:t>
+      </w:r>
+    </w:p>
+    <w:p>
+      <w:pPr>
+        <w:widowControl w:val="0"/>
+        <w:tabs>
+          <w:tab w:val="left" w:pos="6521"/>
+        </w:tabs>
+        <w:autoSpaceDE w:val="0"/>
+        <w:autoSpaceDN w:val="0"/>
+        <w:adjustRightInd w:val="0"/>
+        <w:rPr>
+          <w:b/>
+          <w:bCs/>
+        </w:rPr>
+      </w:pPr>
+      <w:r>
+        <w:t xml:space="preserve">2. </w:t>
+      </w:r>
+      <w:r>
+        <w:rPr>
+          <w:b/>
+          <w:bCs/>
+        </w:rPr>
+        <w:t>Ca map in MPDA is also down x2</w:t>
+      </w:r>
+    </w:p>
+    <w:p>
+      <w:pPr>
+        <w:widowControl w:val="0"/>
+        <w:tabs>
+          <w:tab w:val="left" w:pos="6521"/>
+        </w:tabs>
+        <w:autoSpaceDE w:val="0"/>
+        <w:autoSpaceDN w:val="0"/>
+        <w:adjustRightInd w:val="0"/>
+      </w:pPr>
+      <w:r>
+        <w:t xml:space="preserve">For this to work out, then yields </w:t>
+      </w:r>
+      <w:r>
+        <w:t xml:space="preserve">(in </w:t>
+      </w:r>
+      <w:proofErr w:type="spellStart"/>
+      <w:r>
+        <w:t>poverlay</w:t>
+      </w:r>
+      <w:proofErr w:type="spellEnd"/>
+      <w:r>
+        <w:t xml:space="preserve">) </w:t>
+      </w:r>
+      <w:r>
+        <w:t>need to be up x2.</w:t>
+      </w:r>
+    </w:p>
+    <w:p>
+      <w:pPr>
+        <w:widowControl w:val="0"/>
+        <w:tabs>
+          <w:tab w:val="left" w:pos="6521"/>
+        </w:tabs>
+        <w:autoSpaceDE w:val="0"/>
+        <w:autoSpaceDN w:val="0"/>
+        <w:adjustRightInd w:val="0"/>
+      </w:pPr>
+    </w:p>
+    <w:p>
+      <w:pPr>
+        <w:widowControl w:val="0"/>
+        <w:numPr>
+          <w:ilvl w:val="1"/>
+          <w:numId w:val="6"/>
+        </w:numPr>
+        <w:tabs>
+          <w:tab w:val="left" w:pos="6521"/>
+        </w:tabs>
+        <w:autoSpaceDE w:val="0"/>
+        <w:autoSpaceDN w:val="0"/>
+        <w:adjustRightInd w:val="0"/>
       </w:pPr>
       <w:proofErr w:type="spellStart"/>
       <w:r>
@@ -308,21 +1348,31 @@
       </w:r>
       <w:proofErr w:type="spellEnd"/>
       <w:r>
-        <w:t>, then the test to form the extensions “dame” comes out .</w:t>
+        <w:t xml:space="preserve">, then the test to form the extensions “dame” comes </w:t>
+      </w:r>
+      <w:proofErr w:type="gramStart"/>
+      <w:r>
+        <w:t>out .</w:t>
       </w:r>
       <w:proofErr w:type="spellStart"/>
       <w:r>
         <w:t>mpdam</w:t>
       </w:r>
       <w:proofErr w:type="spellEnd"/>
-      <w:r>
-        <w:t xml:space="preserve"> instead of .</w:t>
+      <w:proofErr w:type="gramEnd"/>
+      <w:r>
+        <w:t xml:space="preserve"> instead </w:t>
+      </w:r>
+      <w:proofErr w:type="gramStart"/>
+      <w:r>
+        <w:t>of .</w:t>
       </w:r>
       <w:proofErr w:type="spellStart"/>
       <w:r>
         <w:t>damx</w:t>
       </w:r>
       <w:proofErr w:type="spellEnd"/>
+      <w:proofErr w:type="gramEnd"/>
       <w:r>
         <w:t>.</w:t>
       </w:r>
@@ -350,13 +1400,26 @@
       </w:r>
       <w:proofErr w:type="spellEnd"/>
       <w:r>
-        <w:t>’ over and over): is trying to find .</w:t>
+        <w:t xml:space="preserve">’ </w:t>
+      </w:r>
+      <w:proofErr w:type="gramStart"/>
+      <w:r>
+        <w:t>over and over</w:t>
+      </w:r>
+      <w:proofErr w:type="gramEnd"/>
+      <w:r>
+        <w:t xml:space="preserve">): is trying to </w:t>
+      </w:r>
+      <w:proofErr w:type="gramStart"/>
+      <w:r>
+        <w:t>find .</w:t>
       </w:r>
       <w:proofErr w:type="spellStart"/>
       <w:r>
         <w:t>mpdam</w:t>
       </w:r>
       <w:proofErr w:type="spellEnd"/>
+      <w:proofErr w:type="gramEnd"/>
       <w:r>
         <w:t xml:space="preserve"> file instead of a .</w:t>
       </w:r>
@@ -367,6 +1430,37 @@
       <w:proofErr w:type="spellEnd"/>
       <w:r>
         <w:t xml:space="preserve"> file in execution of MPDA.</w:t>
+      </w:r>
+    </w:p>
+    <w:p>
+      <w:pPr>
+        <w:widowControl w:val="0"/>
+        <w:numPr>
+          <w:ilvl w:val="2"/>
+          <w:numId w:val="6"/>
+        </w:numPr>
+        <w:tabs>
+          <w:tab w:val="left" w:pos="6521"/>
+        </w:tabs>
+        <w:autoSpaceDE w:val="0"/>
+        <w:autoSpaceDN w:val="0"/>
+        <w:adjustRightInd w:val="0"/>
+      </w:pPr>
+      <w:proofErr w:type="gramStart"/>
+      <w:r>
+        <w:t>Actually, just</w:t>
+      </w:r>
+      <w:proofErr w:type="gramEnd"/>
+      <w:r>
+        <w:t xml:space="preserve"> clicking on “211730-Fe-Ti-Qtz.mpdam” filename in ‘</w:t>
+      </w:r>
+      <w:proofErr w:type="spellStart"/>
+      <w:r>
+        <w:t>file_requester</w:t>
+      </w:r>
+      <w:proofErr w:type="spellEnd"/>
+      <w:r>
+        <w:t>’ causes an infinite loop.</w:t>
       </w:r>
     </w:p>
     <w:p>
@@ -674,11 +1768,19 @@
       </w:r>
       <w:proofErr w:type="spellStart"/>
       <w:r>
-        <w:t>read_da</w:t>
-      </w:r>
-      <w:proofErr w:type="spellEnd"/>
-      <w:r>
-        <w:t>() returns arrays of ‘matrix’ and ‘yield’ over all phases, and set all ‘yield’ the same, so the inverse yield ratios all stay 1.</w:t>
+        <w:t>read_</w:t>
+      </w:r>
+      <w:proofErr w:type="gramStart"/>
+      <w:r>
+        <w:t>da</w:t>
+      </w:r>
+      <w:proofErr w:type="spellEnd"/>
+      <w:r>
+        <w:t>(</w:t>
+      </w:r>
+      <w:proofErr w:type="gramEnd"/>
+      <w:r>
+        <w:t>) returns arrays of ‘matrix’ and ‘yield’ over all phases, and set all ‘yield’ the same, so the inverse yield ratios all stay 1.</w:t>
       </w:r>
     </w:p>
     <w:p>
@@ -725,10 +1827,12 @@
         <w:t>Perhaps just set all ‘</w:t>
       </w:r>
       <w:proofErr w:type="spellStart"/>
+      <w:proofErr w:type="gramStart"/>
       <w:r>
         <w:t>matrix.yield</w:t>
       </w:r>
       <w:proofErr w:type="spellEnd"/>
+      <w:proofErr w:type="gramEnd"/>
       <w:r>
         <w:t xml:space="preserve">’ equal to </w:t>
       </w:r>
@@ -888,8 +1992,140 @@
         <w:adjustRightInd w:val="0"/>
       </w:pPr>
       <w:r>
+        <w:t>Apply MPDA sorting using new MPDAM.</w:t>
+      </w:r>
+    </w:p>
+    <w:p>
+      <w:pPr>
+        <w:widowControl w:val="0"/>
+        <w:numPr>
+          <w:ilvl w:val="3"/>
+          <w:numId w:val="6"/>
+        </w:numPr>
+        <w:tabs>
+          <w:tab w:val="left" w:pos="6521"/>
+        </w:tabs>
+        <w:autoSpaceDE w:val="0"/>
+        <w:autoSpaceDN w:val="0"/>
+        <w:adjustRightInd w:val="0"/>
+      </w:pPr>
+      <w:r>
+        <w:t>Does it track the backgrounds better?</w:t>
+      </w:r>
+    </w:p>
+    <w:p>
+      <w:pPr>
+        <w:widowControl w:val="0"/>
+        <w:numPr>
+          <w:ilvl w:val="3"/>
+          <w:numId w:val="6"/>
+        </w:numPr>
+        <w:tabs>
+          <w:tab w:val="left" w:pos="6521"/>
+        </w:tabs>
+        <w:autoSpaceDE w:val="0"/>
+        <w:autoSpaceDN w:val="0"/>
+        <w:adjustRightInd w:val="0"/>
+      </w:pPr>
+      <w:r>
+        <w:t>But perhaps it doesn’t do so well on spectrum overlay element peak heights.</w:t>
+      </w:r>
+    </w:p>
+    <w:p>
+      <w:pPr>
+        <w:widowControl w:val="0"/>
+        <w:numPr>
+          <w:ilvl w:val="3"/>
+          <w:numId w:val="6"/>
+        </w:numPr>
+        <w:tabs>
+          <w:tab w:val="left" w:pos="6521"/>
+        </w:tabs>
+        <w:autoSpaceDE w:val="0"/>
+        <w:autoSpaceDN w:val="0"/>
+        <w:adjustRightInd w:val="0"/>
+      </w:pPr>
+      <w:r>
+        <w:t>But may be suitable for a Wizard tool for automation of this:</w:t>
+      </w:r>
+    </w:p>
+    <w:p>
+      <w:pPr>
+        <w:widowControl w:val="0"/>
+        <w:numPr>
+          <w:ilvl w:val="4"/>
+          <w:numId w:val="6"/>
+        </w:numPr>
+        <w:tabs>
+          <w:tab w:val="left" w:pos="6521"/>
+        </w:tabs>
+        <w:autoSpaceDE w:val="0"/>
+        <w:autoSpaceDN w:val="0"/>
+        <w:adjustRightInd w:val="0"/>
+      </w:pPr>
+      <w:r>
+        <w:t>Have a region file and association extracted spectra.</w:t>
+      </w:r>
+    </w:p>
+    <w:p>
+      <w:pPr>
+        <w:widowControl w:val="0"/>
+        <w:numPr>
+          <w:ilvl w:val="4"/>
+          <w:numId w:val="6"/>
+        </w:numPr>
+        <w:tabs>
+          <w:tab w:val="left" w:pos="6521"/>
+        </w:tabs>
+        <w:autoSpaceDE w:val="0"/>
+        <w:autoSpaceDN w:val="0"/>
+        <w:adjustRightInd w:val="0"/>
+      </w:pPr>
+      <w:r>
         <w:lastRenderedPageBreak/>
-        <w:t>Apply MPDA sorting using new MPDAM.</w:t>
+        <w:t xml:space="preserve">Wizard can fit all using a given PCM, make DAMX for each, add </w:t>
+      </w:r>
+      <w:proofErr w:type="spellStart"/>
+      <w:r>
+        <w:t>concs</w:t>
+      </w:r>
+      <w:proofErr w:type="spellEnd"/>
+      <w:r>
+        <w:t xml:space="preserve"> of selected elements () to matrix </w:t>
+      </w:r>
+      <w:proofErr w:type="spellStart"/>
+      <w:r>
+        <w:t>wt</w:t>
+      </w:r>
+      <w:proofErr w:type="spellEnd"/>
+      <w:r>
+        <w:t xml:space="preserve">%, project onto endmembers, save as Phase maps, save a CORRECT file and generate a MPDAM file. User can </w:t>
+      </w:r>
+      <w:proofErr w:type="gramStart"/>
+      <w:r>
+        <w:t>simple</w:t>
+      </w:r>
+      <w:proofErr w:type="gramEnd"/>
+      <w:r>
+        <w:t xml:space="preserve"> use it as MPDA.</w:t>
+      </w:r>
+    </w:p>
+    <w:p>
+      <w:pPr>
+        <w:widowControl w:val="0"/>
+        <w:numPr>
+          <w:ilvl w:val="2"/>
+          <w:numId w:val="6"/>
+        </w:numPr>
+        <w:tabs>
+          <w:tab w:val="left" w:pos="6521"/>
+        </w:tabs>
+        <w:autoSpaceDE w:val="0"/>
+        <w:autoSpaceDN w:val="0"/>
+        <w:adjustRightInd w:val="0"/>
+      </w:pPr>
+      <w:r>
+        <w:t>Better method:</w:t>
       </w:r>
     </w:p>
     <w:p>
@@ -907,7 +2143,7 @@
         <w:adjustRightInd w:val="0"/>
       </w:pPr>
       <w:r>
-        <w:t>Does it track the backgrounds better?</w:t>
+        <w:t>As above but use more accurate yield calcs that use the measured hot-spot values (perhaps X1.2 of majors to allow for shift after Correction).</w:t>
       </w:r>
     </w:p>
     <w:p>
@@ -925,137 +2161,7 @@
         <w:adjustRightInd w:val="0"/>
       </w:pPr>
       <w:r>
-        <w:t>But perhaps it doesn’t do so well on spectrum overlay element peak heights.</w:t>
-      </w:r>
-    </w:p>
-    <w:p>
-      <w:pPr>
-        <w:widowControl w:val="0"/>
-        <w:numPr>
-          <w:ilvl w:val="3"/>
-          <w:numId w:val="6"/>
-        </w:numPr>
-        <w:tabs>
-          <w:tab w:val="left" w:pos="6521"/>
-        </w:tabs>
-        <w:autoSpaceDE w:val="0"/>
-        <w:autoSpaceDN w:val="0"/>
-        <w:adjustRightInd w:val="0"/>
-      </w:pPr>
-      <w:r>
-        <w:t>But may be suitable for a Wizard tool for automation of this:</w:t>
-      </w:r>
-    </w:p>
-    <w:p>
-      <w:pPr>
-        <w:widowControl w:val="0"/>
-        <w:numPr>
-          <w:ilvl w:val="4"/>
-          <w:numId w:val="6"/>
-        </w:numPr>
-        <w:tabs>
-          <w:tab w:val="left" w:pos="6521"/>
-        </w:tabs>
-        <w:autoSpaceDE w:val="0"/>
-        <w:autoSpaceDN w:val="0"/>
-        <w:adjustRightInd w:val="0"/>
-      </w:pPr>
-      <w:r>
-        <w:t>Have a region file and association extracted spectra.</w:t>
-      </w:r>
-    </w:p>
-    <w:p>
-      <w:pPr>
-        <w:widowControl w:val="0"/>
-        <w:numPr>
-          <w:ilvl w:val="4"/>
-          <w:numId w:val="6"/>
-        </w:numPr>
-        <w:tabs>
-          <w:tab w:val="left" w:pos="6521"/>
-        </w:tabs>
-        <w:autoSpaceDE w:val="0"/>
-        <w:autoSpaceDN w:val="0"/>
-        <w:adjustRightInd w:val="0"/>
-      </w:pPr>
-      <w:r>
-        <w:t xml:space="preserve">Wizard can fit all using a given PCM, make DAMX for each, add </w:t>
-      </w:r>
-      <w:proofErr w:type="spellStart"/>
-      <w:r>
-        <w:t>concs</w:t>
-      </w:r>
-      <w:proofErr w:type="spellEnd"/>
-      <w:r>
-        <w:t xml:space="preserve"> of selected elements () to matrix </w:t>
-      </w:r>
-      <w:proofErr w:type="spellStart"/>
-      <w:r>
-        <w:t>wt</w:t>
-      </w:r>
-      <w:proofErr w:type="spellEnd"/>
-      <w:r>
-        <w:t>%, project onto endmembers, save as Phase maps, save a CORRECT file and generate a MPDAM file. User can simple use it as MPDA.</w:t>
-      </w:r>
-    </w:p>
-    <w:p>
-      <w:pPr>
-        <w:widowControl w:val="0"/>
-        <w:numPr>
-          <w:ilvl w:val="2"/>
-          <w:numId w:val="6"/>
-        </w:numPr>
-        <w:tabs>
-          <w:tab w:val="left" w:pos="6521"/>
-        </w:tabs>
-        <w:autoSpaceDE w:val="0"/>
-        <w:autoSpaceDN w:val="0"/>
-        <w:adjustRightInd w:val="0"/>
-      </w:pPr>
-      <w:r>
-        <w:t>Better method:</w:t>
-      </w:r>
-    </w:p>
-    <w:p>
-      <w:pPr>
-        <w:widowControl w:val="0"/>
-        <w:numPr>
-          <w:ilvl w:val="3"/>
-          <w:numId w:val="6"/>
-        </w:numPr>
-        <w:tabs>
-          <w:tab w:val="left" w:pos="6521"/>
-        </w:tabs>
-        <w:autoSpaceDE w:val="0"/>
-        <w:autoSpaceDN w:val="0"/>
-        <w:adjustRightInd w:val="0"/>
-      </w:pPr>
-      <w:r>
-        <w:t>As above but use more accurate yield calcs that use the measured hot-spot values (perhaps X1.2 of majors to allow for shift after Correction).</w:t>
-      </w:r>
-    </w:p>
-    <w:p>
-      <w:pPr>
-        <w:widowControl w:val="0"/>
-        <w:numPr>
-          <w:ilvl w:val="3"/>
-          <w:numId w:val="6"/>
-        </w:numPr>
-        <w:tabs>
-          <w:tab w:val="left" w:pos="6521"/>
-        </w:tabs>
-        <w:autoSpaceDE w:val="0"/>
-        <w:autoSpaceDN w:val="0"/>
-        <w:adjustRightInd w:val="0"/>
-      </w:pPr>
-      <w:r>
-        <w:t>Does it track the backgrounds</w:t>
-      </w:r>
-      <w:r>
-        <w:t>, overlays and concentrations</w:t>
-      </w:r>
-      <w:r>
-        <w:t xml:space="preserve"> better?</w:t>
+        <w:t>Does it track the backgrounds, overlays and concentrations better?</w:t>
       </w:r>
     </w:p>
     <w:p>
@@ -1130,7 +2236,15 @@
         <w:adjustRightInd w:val="0"/>
       </w:pPr>
       <w:r>
-        <w:t>Will need 24 bit colours on display Draw.</w:t>
+        <w:t xml:space="preserve">Will need </w:t>
+      </w:r>
+      <w:proofErr w:type="gramStart"/>
+      <w:r>
+        <w:t>24 bit</w:t>
+      </w:r>
+      <w:proofErr w:type="gramEnd"/>
+      <w:r>
+        <w:t xml:space="preserve"> colours on display Draw.</w:t>
       </w:r>
     </w:p>
     <w:p>
@@ -1183,7 +2297,25 @@
         </w:numPr>
       </w:pPr>
       <w:r>
-        <w:t>Is this related to total variance measure (or ratio) per pixel?</w:t>
+        <w:t>Is this related to total variance measure (or ratio</w:t>
+      </w:r>
+      <w:r>
+        <w:t xml:space="preserve"> to simple Poisson</w:t>
+      </w:r>
+      <w:r>
+        <w:t>) per pixel?</w:t>
+      </w:r>
+    </w:p>
+    <w:p>
+      <w:pPr>
+        <w:pStyle w:val="ListParagraph"/>
+        <w:numPr>
+          <w:ilvl w:val="2"/>
+          <w:numId w:val="6"/>
+        </w:numPr>
+      </w:pPr>
+      <w:r>
+        <w:t>Perhaps better handled in Spectra DA overlays?</w:t>
       </w:r>
     </w:p>
     <w:p>
@@ -1480,13 +2612,22 @@
           <w:b/>
           <w:bCs/>
         </w:rPr>
-        <w:t>maia_device</w:t>
+        <w:t>maia_</w:t>
+      </w:r>
+      <w:proofErr w:type="gramStart"/>
+      <w:r>
+        <w:rPr>
+          <w:b/>
+          <w:bCs/>
+        </w:rPr>
+        <w:t>device</w:t>
       </w:r>
       <w:proofErr w:type="spellEnd"/>
       <w:r>
         <w:t>::</w:t>
       </w:r>
       <w:proofErr w:type="spellStart"/>
+      <w:proofErr w:type="gramEnd"/>
       <w:r>
         <w:t>ylut</w:t>
       </w:r>
@@ -1665,7 +2806,6 @@
         </w:numPr>
       </w:pPr>
       <w:r>
-        <w:lastRenderedPageBreak/>
         <w:t>Add to Worked Examples, or a cut-down set for beamline?</w:t>
       </w:r>
     </w:p>
@@ -1720,6 +2860,7 @@
         </w:numPr>
       </w:pPr>
       <w:r>
+        <w:lastRenderedPageBreak/>
         <w:t>Then check against these …</w:t>
       </w:r>
     </w:p>
@@ -2240,6 +3381,7 @@
         <w:t xml:space="preserve">Perhaps detect lack of a .GCF file as </w:t>
       </w:r>
       <w:proofErr w:type="spellStart"/>
+      <w:proofErr w:type="gramStart"/>
       <w:r>
         <w:rPr>
           <w:highlight w:val="yellow"/>
@@ -2251,7 +3393,14 @@
         <w:rPr>
           <w:highlight w:val="yellow"/>
         </w:rPr>
-        <w:t>[0</w:t>
+        <w:t>[</w:t>
+      </w:r>
+      <w:proofErr w:type="gramEnd"/>
+      <w:r>
+        <w:rPr>
+          <w:highlight w:val="yellow"/>
+        </w:rPr>
+        <w:t>0</w:t>
       </w:r>
       <w:r>
         <w:t>]</w:t>
@@ -2269,12 +3418,17 @@
         <w:t xml:space="preserve">interpret </w:t>
       </w:r>
       <w:proofErr w:type="spellStart"/>
+      <w:proofErr w:type="gramStart"/>
       <w:r>
         <w:t>argv</w:t>
       </w:r>
       <w:proofErr w:type="spellEnd"/>
       <w:r>
-        <w:t>[0] as simply the routine to run.</w:t>
+        <w:t>[</w:t>
+      </w:r>
+      <w:proofErr w:type="gramEnd"/>
+      <w:r>
+        <w:t>0] as simply the routine to run.</w:t>
       </w:r>
     </w:p>
     <w:p>
@@ -2309,8 +3463,13 @@
           <w:numId w:val="6"/>
         </w:numPr>
       </w:pPr>
-      <w:r>
-        <w:t>Or, make a GUI program that performs these tests and then does the compare and displays the results.</w:t>
+      <w:proofErr w:type="gramStart"/>
+      <w:r>
+        <w:t>Or,</w:t>
+      </w:r>
+      <w:proofErr w:type="gramEnd"/>
+      <w:r>
+        <w:t xml:space="preserve"> make a GUI program that performs these tests and then does the compare and displays the results.</w:t>
       </w:r>
     </w:p>
     <w:p>
@@ -2346,7 +3505,15 @@
         </w:numPr>
       </w:pPr>
       <w:r>
-        <w:t>Fit: compare fit and report rms% diff and also iterations, Chi, etc.</w:t>
+        <w:t xml:space="preserve">Fit: compare fit and report rms% diff </w:t>
+      </w:r>
+      <w:proofErr w:type="gramStart"/>
+      <w:r>
+        <w:t>and also</w:t>
+      </w:r>
+      <w:proofErr w:type="gramEnd"/>
+      <w:r>
+        <w:t xml:space="preserve"> iterations, Chi, etc.</w:t>
       </w:r>
     </w:p>
     <w:p>
@@ -2385,137 +3552,173 @@
         </w:numPr>
       </w:pPr>
       <w:r>
+        <w:t>Use Wizard mechanisms to trigger various GUIs for imaging, yields, fitting …</w:t>
+      </w:r>
+    </w:p>
+    <w:p>
+      <w:pPr>
+        <w:pStyle w:val="ListParagraph"/>
+        <w:numPr>
+          <w:ilvl w:val="3"/>
+          <w:numId w:val="6"/>
+        </w:numPr>
+      </w:pPr>
+      <w:r>
+        <w:t>Yields, fits, images could be ‘pages’ in Wizard</w:t>
+      </w:r>
+      <w:r>
+        <w:t>, with results in window.</w:t>
+      </w:r>
+    </w:p>
+    <w:p>
+      <w:pPr>
+        <w:pStyle w:val="ListParagraph"/>
+        <w:numPr>
+          <w:ilvl w:val="3"/>
+          <w:numId w:val="6"/>
+        </w:numPr>
+      </w:pPr>
+      <w:r>
+        <w:t>Only makes sense for GUI level triggers</w:t>
+      </w:r>
+      <w:r>
+        <w:t xml:space="preserve"> (some may need to be added)</w:t>
+      </w:r>
+      <w:r>
+        <w:t>.</w:t>
+      </w:r>
+    </w:p>
+    <w:p>
+      <w:pPr>
+        <w:pStyle w:val="ListParagraph"/>
+        <w:numPr>
+          <w:ilvl w:val="3"/>
+          <w:numId w:val="6"/>
+        </w:numPr>
+      </w:pPr>
+      <w:r>
+        <w:t>Need to log smart test results (minimal if results seem OK).</w:t>
+      </w:r>
+    </w:p>
+    <w:p>
+      <w:pPr>
+        <w:pStyle w:val="ListParagraph"/>
+        <w:numPr>
+          <w:ilvl w:val="2"/>
+          <w:numId w:val="6"/>
+        </w:numPr>
+      </w:pPr>
+      <w:r>
         <w:lastRenderedPageBreak/>
-        <w:t>Use Wizard mechanisms to trigger various GUIs for imaging, yields, fitting …</w:t>
-      </w:r>
-    </w:p>
-    <w:p>
-      <w:pPr>
-        <w:pStyle w:val="ListParagraph"/>
+        <w:t>Execute from a “tests” menu?</w:t>
+      </w:r>
+    </w:p>
+    <w:p>
+      <w:pPr>
+        <w:widowControl w:val="0"/>
+        <w:numPr>
+          <w:ilvl w:val="0"/>
+          <w:numId w:val="6"/>
+        </w:numPr>
+        <w:tabs>
+          <w:tab w:val="left" w:pos="6521"/>
+        </w:tabs>
+        <w:autoSpaceDE w:val="0"/>
+        <w:autoSpaceDN w:val="0"/>
+        <w:adjustRightInd w:val="0"/>
+      </w:pPr>
+      <w:r>
+        <w:t>GeoPIXE standalone module</w:t>
+      </w:r>
+    </w:p>
+    <w:p>
+      <w:pPr>
+        <w:widowControl w:val="0"/>
+        <w:numPr>
+          <w:ilvl w:val="1"/>
+          <w:numId w:val="6"/>
+        </w:numPr>
+        <w:tabs>
+          <w:tab w:val="left" w:pos="6521"/>
+        </w:tabs>
+        <w:autoSpaceDE w:val="0"/>
+        <w:autoSpaceDN w:val="0"/>
+        <w:adjustRightInd w:val="0"/>
+      </w:pPr>
+      <w:r>
+        <w:t>Modules for a pipeline:</w:t>
+      </w:r>
+    </w:p>
+    <w:p>
+      <w:pPr>
+        <w:widowControl w:val="0"/>
+        <w:numPr>
+          <w:ilvl w:val="2"/>
+          <w:numId w:val="6"/>
+        </w:numPr>
+        <w:tabs>
+          <w:tab w:val="left" w:pos="6521"/>
+        </w:tabs>
+        <w:autoSpaceDE w:val="0"/>
+        <w:autoSpaceDN w:val="0"/>
+        <w:adjustRightInd w:val="0"/>
+      </w:pPr>
+      <w:r>
+        <w:t>Other pipeline processing modules needed?</w:t>
+      </w:r>
+    </w:p>
+    <w:p>
+      <w:pPr>
+        <w:widowControl w:val="0"/>
         <w:numPr>
           <w:ilvl w:val="3"/>
           <w:numId w:val="6"/>
         </w:numPr>
-      </w:pPr>
-      <w:r>
-        <w:t>Yields, fits, images could be ‘pages’ in Wizard</w:t>
-      </w:r>
-      <w:r>
-        <w:t>, with results in window.</w:t>
-      </w:r>
-    </w:p>
-    <w:p>
-      <w:pPr>
-        <w:pStyle w:val="ListParagraph"/>
+        <w:tabs>
+          <w:tab w:val="left" w:pos="6521"/>
+        </w:tabs>
+        <w:autoSpaceDE w:val="0"/>
+        <w:autoSpaceDN w:val="0"/>
+        <w:adjustRightInd w:val="0"/>
+      </w:pPr>
+      <w:r>
+        <w:t>Export of DAI in some form</w:t>
+      </w:r>
+    </w:p>
+    <w:p>
+      <w:pPr>
+        <w:widowControl w:val="0"/>
+        <w:numPr>
+          <w:ilvl w:val="4"/>
+          <w:numId w:val="6"/>
+        </w:numPr>
+        <w:tabs>
+          <w:tab w:val="left" w:pos="6521"/>
+        </w:tabs>
+        <w:autoSpaceDE w:val="0"/>
+        <w:autoSpaceDN w:val="0"/>
+        <w:adjustRightInd w:val="0"/>
+      </w:pPr>
+      <w:r>
+        <w:t>HDF, binary DMT?</w:t>
+      </w:r>
+    </w:p>
+    <w:p>
+      <w:pPr>
+        <w:widowControl w:val="0"/>
         <w:numPr>
           <w:ilvl w:val="3"/>
           <w:numId w:val="6"/>
         </w:numPr>
-      </w:pPr>
-      <w:r>
-        <w:t>Only makes sense for GUI level triggers</w:t>
-      </w:r>
-      <w:r>
-        <w:t xml:space="preserve"> (some may need to be added)</w:t>
-      </w:r>
-      <w:r>
-        <w:t>.</w:t>
-      </w:r>
-    </w:p>
-    <w:p>
-      <w:pPr>
-        <w:pStyle w:val="ListParagraph"/>
-        <w:numPr>
-          <w:ilvl w:val="3"/>
-          <w:numId w:val="6"/>
-        </w:numPr>
-      </w:pPr>
-      <w:r>
-        <w:t>Need to log smart test results (minimal if results seem OK).</w:t>
-      </w:r>
-    </w:p>
-    <w:p>
-      <w:pPr>
-        <w:pStyle w:val="ListParagraph"/>
-        <w:numPr>
-          <w:ilvl w:val="2"/>
-          <w:numId w:val="6"/>
-        </w:numPr>
-      </w:pPr>
-      <w:r>
-        <w:t>Execute from a “tests” menu?</w:t>
-      </w:r>
-    </w:p>
-    <w:p>
-      <w:pPr>
-        <w:widowControl w:val="0"/>
-        <w:numPr>
-          <w:ilvl w:val="0"/>
-          <w:numId w:val="6"/>
-        </w:numPr>
-        <w:tabs>
-          <w:tab w:val="left" w:pos="6521"/>
-        </w:tabs>
-        <w:autoSpaceDE w:val="0"/>
-        <w:autoSpaceDN w:val="0"/>
-        <w:adjustRightInd w:val="0"/>
-      </w:pPr>
-      <w:r>
-        <w:t>GeoPIXE standalone module</w:t>
-      </w:r>
-    </w:p>
-    <w:p>
-      <w:pPr>
-        <w:widowControl w:val="0"/>
-        <w:numPr>
-          <w:ilvl w:val="1"/>
-          <w:numId w:val="6"/>
-        </w:numPr>
-        <w:tabs>
-          <w:tab w:val="left" w:pos="6521"/>
-        </w:tabs>
-        <w:autoSpaceDE w:val="0"/>
-        <w:autoSpaceDN w:val="0"/>
-        <w:adjustRightInd w:val="0"/>
-      </w:pPr>
-      <w:r>
-        <w:t>Modules for a pipeline:</w:t>
-      </w:r>
-    </w:p>
-    <w:p>
-      <w:pPr>
-        <w:widowControl w:val="0"/>
-        <w:numPr>
-          <w:ilvl w:val="2"/>
-          <w:numId w:val="6"/>
-        </w:numPr>
-        <w:tabs>
-          <w:tab w:val="left" w:pos="6521"/>
-        </w:tabs>
-        <w:autoSpaceDE w:val="0"/>
-        <w:autoSpaceDN w:val="0"/>
-        <w:adjustRightInd w:val="0"/>
-      </w:pPr>
-      <w:r>
-        <w:t>Other pipeline processing modules needed?</w:t>
-      </w:r>
-    </w:p>
-    <w:p>
-      <w:pPr>
-        <w:widowControl w:val="0"/>
-        <w:numPr>
-          <w:ilvl w:val="3"/>
-          <w:numId w:val="6"/>
-        </w:numPr>
-        <w:tabs>
-          <w:tab w:val="left" w:pos="6521"/>
-        </w:tabs>
-        <w:autoSpaceDE w:val="0"/>
-        <w:autoSpaceDN w:val="0"/>
-        <w:adjustRightInd w:val="0"/>
-      </w:pPr>
-      <w:r>
-        <w:t>Export of DAI in some form</w:t>
+        <w:tabs>
+          <w:tab w:val="left" w:pos="6521"/>
+        </w:tabs>
+        <w:autoSpaceDE w:val="0"/>
+        <w:autoSpaceDN w:val="0"/>
+        <w:adjustRightInd w:val="0"/>
+      </w:pPr>
+      <w:r>
+        <w:t>Image processing</w:t>
       </w:r>
     </w:p>
     <w:p>
@@ -2532,44 +3735,13 @@
         <w:autoSpaceDN w:val="0"/>
         <w:adjustRightInd w:val="0"/>
       </w:pPr>
-      <w:r>
-        <w:t>HDF, binary DMT?</w:t>
-      </w:r>
-    </w:p>
-    <w:p>
-      <w:pPr>
-        <w:widowControl w:val="0"/>
-        <w:numPr>
-          <w:ilvl w:val="3"/>
-          <w:numId w:val="6"/>
-        </w:numPr>
-        <w:tabs>
-          <w:tab w:val="left" w:pos="6521"/>
-        </w:tabs>
-        <w:autoSpaceDE w:val="0"/>
-        <w:autoSpaceDN w:val="0"/>
-        <w:adjustRightInd w:val="0"/>
-      </w:pPr>
-      <w:r>
-        <w:t>Image processing</w:t>
-      </w:r>
-    </w:p>
-    <w:p>
-      <w:pPr>
-        <w:widowControl w:val="0"/>
-        <w:numPr>
-          <w:ilvl w:val="4"/>
-          <w:numId w:val="6"/>
-        </w:numPr>
-        <w:tabs>
-          <w:tab w:val="left" w:pos="6521"/>
-        </w:tabs>
-        <w:autoSpaceDE w:val="0"/>
-        <w:autoSpaceDN w:val="0"/>
-        <w:adjustRightInd w:val="0"/>
-      </w:pPr>
-      <w:r>
-        <w:t xml:space="preserve">Zero pixel removal, which can be slow. </w:t>
+      <w:proofErr w:type="gramStart"/>
+      <w:r>
+        <w:t>Zero pixel</w:t>
+      </w:r>
+      <w:proofErr w:type="gramEnd"/>
+      <w:r>
+        <w:t xml:space="preserve"> removal, which can be slow. </w:t>
       </w:r>
     </w:p>
     <w:p>
@@ -2905,8 +4077,13 @@
         </w:numPr>
       </w:pPr>
       <w:r>
-        <w:t>No hour glass</w:t>
-      </w:r>
+        <w:t xml:space="preserve">No </w:t>
+      </w:r>
+      <w:proofErr w:type="gramStart"/>
+      <w:r>
+        <w:t>hour glass</w:t>
+      </w:r>
+      <w:proofErr w:type="gramEnd"/>
     </w:p>
     <w:p>
       <w:pPr>
@@ -3039,11 +4216,16 @@
         </w:numPr>
       </w:pPr>
       <w:r>
-        <w:t>Perhaps have a regular heartbeat</w:t>
+        <w:t xml:space="preserve">Perhaps have a </w:t>
+      </w:r>
+      <w:proofErr w:type="gramStart"/>
+      <w:r>
+        <w:t>regular heartbeat</w:t>
       </w:r>
       <w:r>
         <w:t>s</w:t>
       </w:r>
+      <w:proofErr w:type="gramEnd"/>
       <w:r>
         <w:t xml:space="preserve"> that read ‘test’?</w:t>
       </w:r>
@@ -3111,8 +4293,13 @@
         <w:t>“</w:t>
       </w:r>
       <w:proofErr w:type="spellStart"/>
-      <w:r>
-        <w:t>da_xanes_base</w:t>
+      <w:proofErr w:type="gramStart"/>
+      <w:r>
+        <w:t>da</w:t>
+      </w:r>
+      <w:proofErr w:type="gramEnd"/>
+      <w:r>
+        <w:t>_xanes_base</w:t>
       </w:r>
       <w:proofErr w:type="spellEnd"/>
       <w:r>
@@ -3182,7 +4369,6 @@
         </w:numPr>
       </w:pPr>
       <w:r>
-        <w:lastRenderedPageBreak/>
         <w:t>e.g. Region spectra using all (most) channels?</w:t>
       </w:r>
     </w:p>
@@ -3247,6 +4433,7 @@
         <w:adjustRightInd w:val="0"/>
       </w:pPr>
       <w:r>
+        <w:lastRenderedPageBreak/>
         <w:t>Preview elements</w:t>
       </w:r>
     </w:p>
@@ -3789,7 +4976,15 @@
         <w:adjustRightInd w:val="0"/>
       </w:pPr>
       <w:r>
-        <w:t xml:space="preserve">ASCII version seems to be missing: ca, </w:t>
+        <w:t xml:space="preserve">ASCII version seems to be </w:t>
+      </w:r>
+      <w:proofErr w:type="gramStart"/>
+      <w:r>
+        <w:t>missing:</w:t>
+      </w:r>
+      <w:proofErr w:type="gramEnd"/>
+      <w:r>
+        <w:t xml:space="preserve"> ca, </w:t>
       </w:r>
       <w:proofErr w:type="spellStart"/>
       <w:r>
@@ -3932,10 +5127,12 @@
         <w:t>Where is ‘</w:t>
       </w:r>
       <w:proofErr w:type="spellStart"/>
+      <w:proofErr w:type="gramStart"/>
       <w:r>
         <w:t>da.ecompress</w:t>
       </w:r>
       <w:proofErr w:type="spellEnd"/>
+      <w:proofErr w:type="gramEnd"/>
       <w:r>
         <w:t>’ used?</w:t>
       </w:r>
@@ -4151,79 +5348,79 @@
         <w:adjustRightInd w:val="0"/>
       </w:pPr>
       <w:r>
+        <w:t>Option to fix range, so it does not change.</w:t>
+      </w:r>
+    </w:p>
+    <w:p>
+      <w:pPr>
+        <w:widowControl w:val="0"/>
+        <w:numPr>
+          <w:ilvl w:val="1"/>
+          <w:numId w:val="6"/>
+        </w:numPr>
+        <w:tabs>
+          <w:tab w:val="left" w:pos="6521"/>
+        </w:tabs>
+        <w:autoSpaceDE w:val="0"/>
+        <w:autoSpaceDN w:val="0"/>
+        <w:adjustRightInd w:val="0"/>
+      </w:pPr>
+      <w:r>
+        <w:t>Image intensity low range box</w:t>
+      </w:r>
+    </w:p>
+    <w:p>
+      <w:pPr>
+        <w:widowControl w:val="0"/>
+        <w:numPr>
+          <w:ilvl w:val="2"/>
+          <w:numId w:val="6"/>
+        </w:numPr>
+        <w:tabs>
+          <w:tab w:val="left" w:pos="6521"/>
+        </w:tabs>
+        <w:autoSpaceDE w:val="0"/>
+        <w:autoSpaceDN w:val="0"/>
+        <w:adjustRightInd w:val="0"/>
+      </w:pPr>
+      <w:r>
+        <w:t>Like the high setting in RGB window, also set low value by number.</w:t>
+      </w:r>
+    </w:p>
+    <w:p>
+      <w:pPr>
+        <w:widowControl w:val="0"/>
+        <w:numPr>
+          <w:ilvl w:val="1"/>
+          <w:numId w:val="6"/>
+        </w:numPr>
+        <w:tabs>
+          <w:tab w:val="left" w:pos="6521"/>
+        </w:tabs>
+        <w:autoSpaceDE w:val="0"/>
+        <w:autoSpaceDN w:val="0"/>
+        <w:adjustRightInd w:val="0"/>
+      </w:pPr>
+      <w:r>
+        <w:t>3D spectral cube</w:t>
+      </w:r>
+    </w:p>
+    <w:p>
+      <w:pPr>
+        <w:widowControl w:val="0"/>
+        <w:numPr>
+          <w:ilvl w:val="2"/>
+          <w:numId w:val="6"/>
+        </w:numPr>
+        <w:tabs>
+          <w:tab w:val="left" w:pos="6521"/>
+        </w:tabs>
+        <w:autoSpaceDE w:val="0"/>
+        <w:autoSpaceDN w:val="0"/>
+        <w:adjustRightInd w:val="0"/>
+      </w:pPr>
+      <w:r>
         <w:lastRenderedPageBreak/>
-        <w:t>Option to fix range, so it does not change.</w:t>
-      </w:r>
-    </w:p>
-    <w:p>
-      <w:pPr>
-        <w:widowControl w:val="0"/>
-        <w:numPr>
-          <w:ilvl w:val="1"/>
-          <w:numId w:val="6"/>
-        </w:numPr>
-        <w:tabs>
-          <w:tab w:val="left" w:pos="6521"/>
-        </w:tabs>
-        <w:autoSpaceDE w:val="0"/>
-        <w:autoSpaceDN w:val="0"/>
-        <w:adjustRightInd w:val="0"/>
-      </w:pPr>
-      <w:r>
-        <w:t>Image intensity low range box</w:t>
-      </w:r>
-    </w:p>
-    <w:p>
-      <w:pPr>
-        <w:widowControl w:val="0"/>
-        <w:numPr>
-          <w:ilvl w:val="2"/>
-          <w:numId w:val="6"/>
-        </w:numPr>
-        <w:tabs>
-          <w:tab w:val="left" w:pos="6521"/>
-        </w:tabs>
-        <w:autoSpaceDE w:val="0"/>
-        <w:autoSpaceDN w:val="0"/>
-        <w:adjustRightInd w:val="0"/>
-      </w:pPr>
-      <w:r>
-        <w:t>Like the high setting in RGB window, also set low value by number.</w:t>
-      </w:r>
-    </w:p>
-    <w:p>
-      <w:pPr>
-        <w:widowControl w:val="0"/>
-        <w:numPr>
-          <w:ilvl w:val="1"/>
-          <w:numId w:val="6"/>
-        </w:numPr>
-        <w:tabs>
-          <w:tab w:val="left" w:pos="6521"/>
-        </w:tabs>
-        <w:autoSpaceDE w:val="0"/>
-        <w:autoSpaceDN w:val="0"/>
-        <w:adjustRightInd w:val="0"/>
-      </w:pPr>
-      <w:r>
-        <w:t>3D spectral cube</w:t>
-      </w:r>
-    </w:p>
-    <w:p>
-      <w:pPr>
-        <w:widowControl w:val="0"/>
-        <w:numPr>
-          <w:ilvl w:val="2"/>
-          <w:numId w:val="6"/>
-        </w:numPr>
-        <w:tabs>
-          <w:tab w:val="left" w:pos="6521"/>
-        </w:tabs>
-        <w:autoSpaceDE w:val="0"/>
-        <w:autoSpaceDN w:val="0"/>
-        <w:adjustRightInd w:val="0"/>
-      </w:pPr>
-      <w:r>
         <w:t>Can we load this into 3D window?</w:t>
       </w:r>
     </w:p>
@@ -4498,7 +5695,15 @@
         </w:numPr>
       </w:pPr>
       <w:r>
-        <w:t xml:space="preserve">Need to think about whether we need to introduce a "priority" in the order of these operations. For example, should we do a global "Correct Zero pixels" before individual median filters? Or should that be the other way round? Should all operations performed on an image be </w:t>
+        <w:t xml:space="preserve">Need to think about whether we need to introduce a "priority" in the order of these operations. For example, should we do a global "Correct Zero pixels" before individual median filters? Or should that be the other way round? Should all operations </w:t>
+      </w:r>
+      <w:proofErr w:type="gramStart"/>
+      <w:r>
+        <w:t>performed</w:t>
+      </w:r>
+      <w:proofErr w:type="gramEnd"/>
+      <w:r>
+        <w:t xml:space="preserve"> on an image be </w:t>
       </w:r>
       <w:r>
         <w:rPr>
@@ -4618,7 +5823,15 @@
         </w:numPr>
       </w:pPr>
       <w:r>
-        <w:t>Sequence ends if an error is found – should just skip to next?</w:t>
+        <w:t xml:space="preserve">Sequence ends if an error is found – should just skip </w:t>
+      </w:r>
+      <w:proofErr w:type="gramStart"/>
+      <w:r>
+        <w:t>to</w:t>
+      </w:r>
+      <w:proofErr w:type="gramEnd"/>
+      <w:r>
+        <w:t xml:space="preserve"> next?</w:t>
       </w:r>
     </w:p>
     <w:p>
@@ -4694,8 +5907,13 @@
           <w:numId w:val="6"/>
         </w:numPr>
       </w:pPr>
-      <w:r>
-        <w:t>Or, just a simple flow-on from a MPDA sort</w:t>
+      <w:proofErr w:type="gramStart"/>
+      <w:r>
+        <w:t>Or,</w:t>
+      </w:r>
+      <w:proofErr w:type="gramEnd"/>
+      <w:r>
+        <w:t xml:space="preserve"> just a simple flow-on from a MPDA sort</w:t>
       </w:r>
     </w:p>
     <w:p>
@@ -4747,7 +5965,15 @@
         </w:numPr>
       </w:pPr>
       <w:r>
-        <w:t>Building phase regions, all DA matrix files and a new .correct file.</w:t>
+        <w:t xml:space="preserve">Building phase regions, all DA matrix files and a </w:t>
+      </w:r>
+      <w:proofErr w:type="gramStart"/>
+      <w:r>
+        <w:t>new .correct</w:t>
+      </w:r>
+      <w:proofErr w:type="gramEnd"/>
+      <w:r>
+        <w:t xml:space="preserve"> file.</w:t>
       </w:r>
     </w:p>
     <w:p>
@@ -4758,8 +5984,65 @@
         </w:numPr>
       </w:pPr>
       <w:r>
+        <w:t>Extract suitable regions and spectra.</w:t>
+      </w:r>
+    </w:p>
+    <w:p>
+      <w:pPr>
+        <w:numPr>
+          <w:ilvl w:val="4"/>
+          <w:numId w:val="6"/>
+        </w:numPr>
+      </w:pPr>
+      <w:r>
+        <w:t>Fit spectra, with appropriate yield for phase, and make DA matrix.</w:t>
+      </w:r>
+    </w:p>
+    <w:p>
+      <w:pPr>
+        <w:numPr>
+          <w:ilvl w:val="4"/>
+          <w:numId w:val="6"/>
+        </w:numPr>
+      </w:pPr>
+      <w:r>
+        <w:t>Use “MPDA Master Weights” in DA matrix</w:t>
+      </w:r>
+    </w:p>
+    <w:p>
+      <w:pPr>
+        <w:numPr>
+          <w:ilvl w:val="4"/>
+          <w:numId w:val="6"/>
+        </w:numPr>
+      </w:pPr>
+      <w:proofErr w:type="gramStart"/>
+      <w:r>
+        <w:t>Construct .correct</w:t>
+      </w:r>
+      <w:proofErr w:type="gramEnd"/>
+      <w:r>
+        <w:t xml:space="preserve"> file.</w:t>
+      </w:r>
+    </w:p>
+    <w:p>
+      <w:pPr>
+        <w:numPr>
+          <w:ilvl w:val="3"/>
+          <w:numId w:val="6"/>
+        </w:numPr>
+      </w:pPr>
+      <w:r>
         <w:lastRenderedPageBreak/>
-        <w:t>Extract suitable regions and spectra.</w:t>
+        <w:t xml:space="preserve">Using an </w:t>
+      </w:r>
+      <w:proofErr w:type="gramStart"/>
+      <w:r>
+        <w:t>existing .correct</w:t>
+      </w:r>
+      <w:proofErr w:type="gramEnd"/>
+      <w:r>
+        <w:t xml:space="preserve"> file (including DA matrix files) to:</w:t>
       </w:r>
     </w:p>
     <w:p>
@@ -4770,7 +6053,195 @@
         </w:numPr>
       </w:pPr>
       <w:r>
-        <w:t>Fit spectra, with appropriate yield for phase, and make DA matrix.</w:t>
+        <w:t xml:space="preserve">Extend Sort </w:t>
+      </w:r>
+      <w:proofErr w:type="spellStart"/>
+      <w:r>
+        <w:t>Evt</w:t>
+      </w:r>
+      <w:proofErr w:type="spellEnd"/>
+      <w:r>
+        <w:t xml:space="preserve"> behaviour.</w:t>
+      </w:r>
+    </w:p>
+    <w:p>
+      <w:pPr>
+        <w:numPr>
+          <w:ilvl w:val="1"/>
+          <w:numId w:val="6"/>
+        </w:numPr>
+      </w:pPr>
+      <w:r>
+        <w:t>MPDA issues</w:t>
+      </w:r>
+    </w:p>
+    <w:p>
+      <w:pPr>
+        <w:numPr>
+          <w:ilvl w:val="2"/>
+          <w:numId w:val="6"/>
+        </w:numPr>
+      </w:pPr>
+      <w:r>
+        <w:t>If not cluster mode, how to do ‘</w:t>
+      </w:r>
+      <w:proofErr w:type="spellStart"/>
+      <w:r>
+        <w:t>geopixe_do_DA</w:t>
+      </w:r>
+      <w:proofErr w:type="spellEnd"/>
+      <w:r>
+        <w:t>’?</w:t>
+      </w:r>
+    </w:p>
+    <w:p>
+      <w:pPr>
+        <w:numPr>
+          <w:ilvl w:val="3"/>
+          <w:numId w:val="6"/>
+        </w:numPr>
+      </w:pPr>
+      <w:r>
+        <w:t>Perhaps always build ‘</w:t>
+      </w:r>
+      <w:proofErr w:type="spellStart"/>
+      <w:r>
+        <w:t>args</w:t>
+      </w:r>
+      <w:proofErr w:type="spellEnd"/>
+      <w:r>
+        <w:t>’ and call ‘</w:t>
+      </w:r>
+      <w:proofErr w:type="spellStart"/>
+      <w:r>
+        <w:t>geopixe_execute</w:t>
+      </w:r>
+      <w:proofErr w:type="spellEnd"/>
+      <w:r>
+        <w:t>’ as used in ‘</w:t>
+      </w:r>
+      <w:proofErr w:type="spellStart"/>
+      <w:r>
+        <w:t>geopixe_do_command</w:t>
+      </w:r>
+      <w:proofErr w:type="spellEnd"/>
+      <w:r>
+        <w:t>’.</w:t>
+      </w:r>
+    </w:p>
+    <w:p>
+      <w:pPr>
+        <w:numPr>
+          <w:ilvl w:val="3"/>
+          <w:numId w:val="6"/>
+        </w:numPr>
+      </w:pPr>
+      <w:r>
+        <w:t>But then can’t run in VM mode!</w:t>
+      </w:r>
+    </w:p>
+    <w:p>
+      <w:pPr>
+        <w:numPr>
+          <w:ilvl w:val="2"/>
+          <w:numId w:val="6"/>
+        </w:numPr>
+      </w:pPr>
+      <w:r>
+        <w:t xml:space="preserve">Pt hotspots may appear as only 3% Pt mineral and 97% silicates. But </w:t>
+      </w:r>
+      <w:proofErr w:type="gramStart"/>
+      <w:r>
+        <w:t>ALL of</w:t>
+      </w:r>
+      <w:proofErr w:type="gramEnd"/>
+      <w:r>
+        <w:t xml:space="preserve"> the Pt in them is from the Pt phase component. </w:t>
+      </w:r>
+    </w:p>
+    <w:p>
+      <w:pPr>
+        <w:numPr>
+          <w:ilvl w:val="3"/>
+          <w:numId w:val="6"/>
+        </w:numPr>
+      </w:pPr>
+      <w:r>
+        <w:t xml:space="preserve">Fit using straight Pt works, MPDA </w:t>
+      </w:r>
+      <w:proofErr w:type="spellStart"/>
+      <w:r>
+        <w:t>rel</w:t>
+      </w:r>
+      <w:proofErr w:type="spellEnd"/>
+      <w:r>
+        <w:t xml:space="preserve"> int poor (Lg too high).</w:t>
+      </w:r>
+    </w:p>
+    <w:p>
+      <w:pPr>
+        <w:numPr>
+          <w:ilvl w:val="3"/>
+          <w:numId w:val="6"/>
+        </w:numPr>
+      </w:pPr>
+      <w:r>
+        <w:t>What relative intensities should be used?</w:t>
+      </w:r>
+    </w:p>
+    <w:p>
+      <w:pPr>
+        <w:numPr>
+          <w:ilvl w:val="2"/>
+          <w:numId w:val="6"/>
+        </w:numPr>
+      </w:pPr>
+      <w:r>
+        <w:t>Perhaps distinguish between trace elements and majors in formula?</w:t>
+      </w:r>
+    </w:p>
+    <w:p>
+      <w:pPr>
+        <w:numPr>
+          <w:ilvl w:val="3"/>
+          <w:numId w:val="6"/>
+        </w:numPr>
+      </w:pPr>
+      <w:r>
+        <w:t>But you weight by phase DA matrix, not element.</w:t>
+      </w:r>
+    </w:p>
+    <w:p>
+      <w:pPr>
+        <w:numPr>
+          <w:ilvl w:val="1"/>
+          <w:numId w:val="6"/>
+        </w:numPr>
+      </w:pPr>
+      <w:r>
+        <w:t>Correct Yield Wizard</w:t>
+      </w:r>
+    </w:p>
+    <w:p>
+      <w:pPr>
+        <w:numPr>
+          <w:ilvl w:val="2"/>
+          <w:numId w:val="6"/>
+        </w:numPr>
+      </w:pPr>
+      <w:r>
+        <w:t>How to guide through regions analysis?</w:t>
+      </w:r>
+    </w:p>
+    <w:p>
+      <w:pPr>
+        <w:numPr>
+          <w:ilvl w:val="3"/>
+          <w:numId w:val="6"/>
+        </w:numPr>
+      </w:pPr>
+      <w:r>
+        <w:t>Define major distinct phases and extract spectra from them.</w:t>
       </w:r>
     </w:p>
     <w:p>
@@ -4781,7 +6252,7 @@
         </w:numPr>
       </w:pPr>
       <w:r>
-        <w:t>Use “MPDA Master Weights” in DA matrix</w:t>
+        <w:t>Try to find pixels close to the pure phases.</w:t>
       </w:r>
     </w:p>
     <w:p>
@@ -4792,7 +6263,7 @@
         </w:numPr>
       </w:pPr>
       <w:r>
-        <w:t>Construct .correct file.</w:t>
+        <w:t>Don’t want them too diluted with non-pure phase contributions.</w:t>
       </w:r>
     </w:p>
     <w:p>
@@ -4803,7 +6274,45 @@
         </w:numPr>
       </w:pPr>
       <w:r>
-        <w:t>Using an existing .correct file (including DA matrix files) to:</w:t>
+        <w:t>Fit each one to create a DA matrix for each using correct yields.</w:t>
+      </w:r>
+    </w:p>
+    <w:p>
+      <w:pPr>
+        <w:numPr>
+          <w:ilvl w:val="2"/>
+          <w:numId w:val="6"/>
+        </w:numPr>
+      </w:pPr>
+      <w:r>
+        <w:t>Need a “</w:t>
+      </w:r>
+      <w:proofErr w:type="spellStart"/>
+      <w:r>
+        <w:t>wt</w:t>
+      </w:r>
+      <w:proofErr w:type="spellEnd"/>
+      <w:r>
+        <w:t>%” tool/help to fill in composition matrix.</w:t>
+      </w:r>
+    </w:p>
+    <w:p>
+      <w:pPr>
+        <w:numPr>
+          <w:ilvl w:val="3"/>
+          <w:numId w:val="6"/>
+        </w:numPr>
+      </w:pPr>
+      <w:r>
+        <w:t xml:space="preserve">If define element columns first, then a “get” of a DA matrix row just fills in the </w:t>
+      </w:r>
+      <w:proofErr w:type="spellStart"/>
+      <w:r>
+        <w:t>wt</w:t>
+      </w:r>
+      <w:proofErr w:type="spellEnd"/>
+      <w:r>
+        <w:t>% for these elements in the table?</w:t>
       </w:r>
     </w:p>
     <w:p>
@@ -4814,45 +6323,75 @@
         </w:numPr>
       </w:pPr>
       <w:r>
-        <w:t xml:space="preserve">Extend Sort </w:t>
-      </w:r>
-      <w:proofErr w:type="spellStart"/>
-      <w:r>
-        <w:t>Evt</w:t>
-      </w:r>
-      <w:proofErr w:type="spellEnd"/>
-      <w:r>
-        <w:t xml:space="preserve"> behaviour.</w:t>
-      </w:r>
-    </w:p>
-    <w:p>
-      <w:pPr>
-        <w:numPr>
-          <w:ilvl w:val="1"/>
-          <w:numId w:val="6"/>
-        </w:numPr>
-      </w:pPr>
-      <w:r>
-        <w:t>MPDA issues</w:t>
-      </w:r>
-    </w:p>
-    <w:p>
-      <w:pPr>
-        <w:numPr>
-          <w:ilvl w:val="2"/>
-          <w:numId w:val="6"/>
-        </w:numPr>
-      </w:pPr>
-      <w:r>
-        <w:t>If not cluster mode, how to do ‘</w:t>
-      </w:r>
-      <w:proofErr w:type="spellStart"/>
-      <w:r>
-        <w:t>geopixe_do_DA</w:t>
-      </w:r>
-      <w:proofErr w:type="spellEnd"/>
-      <w:r>
-        <w:t>’?</w:t>
+        <w:t>DA matrix file does NOT have this info.</w:t>
+      </w:r>
+    </w:p>
+    <w:p>
+      <w:pPr>
+        <w:numPr>
+          <w:ilvl w:val="5"/>
+          <w:numId w:val="6"/>
+        </w:numPr>
+      </w:pPr>
+      <w:r>
+        <w:t>Yield file does, so perhaps save this filename in DA matrix?</w:t>
+      </w:r>
+    </w:p>
+    <w:p>
+      <w:pPr>
+        <w:numPr>
+          <w:ilvl w:val="5"/>
+          <w:numId w:val="6"/>
+        </w:numPr>
+      </w:pPr>
+      <w:r>
+        <w:t>New version would be a pain for existing files.</w:t>
+      </w:r>
+    </w:p>
+    <w:p>
+      <w:pPr>
+        <w:numPr>
+          <w:ilvl w:val="4"/>
+          <w:numId w:val="6"/>
+        </w:numPr>
+      </w:pPr>
+      <w:proofErr w:type="gramStart"/>
+      <w:r>
+        <w:t>Or,</w:t>
+      </w:r>
+      <w:proofErr w:type="gramEnd"/>
+      <w:r>
+        <w:t xml:space="preserve"> </w:t>
+      </w:r>
+      <w:proofErr w:type="spellStart"/>
+      <w:r>
+        <w:t>read_yield</w:t>
+      </w:r>
+      <w:proofErr w:type="spellEnd"/>
+      <w:r>
+        <w:t xml:space="preserve"> when typing in mineral name?</w:t>
+      </w:r>
+    </w:p>
+    <w:p>
+      <w:pPr>
+        <w:numPr>
+          <w:ilvl w:val="4"/>
+          <w:numId w:val="6"/>
+        </w:numPr>
+      </w:pPr>
+      <w:r>
+        <w:t>OK in COMAT file, as we use yield files there.</w:t>
+      </w:r>
+    </w:p>
+    <w:p>
+      <w:pPr>
+        <w:numPr>
+          <w:ilvl w:val="5"/>
+          <w:numId w:val="6"/>
+        </w:numPr>
+      </w:pPr>
+      <w:r>
+        <w:t>But do we want yields to override table entries?</w:t>
       </w:r>
     </w:p>
     <w:p>
@@ -4863,31 +6402,47 @@
         </w:numPr>
       </w:pPr>
       <w:r>
-        <w:t>Perhaps always build ‘</w:t>
-      </w:r>
-      <w:proofErr w:type="spellStart"/>
-      <w:r>
-        <w:t>args</w:t>
-      </w:r>
-      <w:proofErr w:type="spellEnd"/>
-      <w:r>
-        <w:t>’ and call ‘</w:t>
-      </w:r>
-      <w:proofErr w:type="spellStart"/>
-      <w:r>
-        <w:t>geopixe_execute</w:t>
-      </w:r>
-      <w:proofErr w:type="spellEnd"/>
-      <w:r>
-        <w:t>’ as used in ‘</w:t>
-      </w:r>
-      <w:proofErr w:type="spellStart"/>
-      <w:r>
-        <w:t>geopixe_do_command</w:t>
-      </w:r>
-      <w:proofErr w:type="spellEnd"/>
-      <w:r>
-        <w:t>’.</w:t>
+        <w:t xml:space="preserve">Or, have a pop-up tool that reports </w:t>
+      </w:r>
+      <w:proofErr w:type="spellStart"/>
+      <w:r>
+        <w:t>wt</w:t>
+      </w:r>
+      <w:proofErr w:type="spellEnd"/>
+      <w:r>
+        <w:t xml:space="preserve">% from a </w:t>
+      </w:r>
+      <w:proofErr w:type="gramStart"/>
+      <w:r>
+        <w:t>selected .yield</w:t>
+      </w:r>
+      <w:proofErr w:type="gramEnd"/>
+      <w:r>
+        <w:t xml:space="preserve"> file?</w:t>
+      </w:r>
+    </w:p>
+    <w:p>
+      <w:pPr>
+        <w:numPr>
+          <w:ilvl w:val="4"/>
+          <w:numId w:val="6"/>
+        </w:numPr>
+      </w:pPr>
+    </w:p>
+    <w:p>
+      <w:pPr>
+        <w:numPr>
+          <w:ilvl w:val="2"/>
+          <w:numId w:val="6"/>
+        </w:numPr>
+      </w:pPr>
+      <w:proofErr w:type="gramStart"/>
+      <w:r>
+        <w:t>Save .Correct</w:t>
+      </w:r>
+      <w:proofErr w:type="gramEnd"/>
+      <w:r>
+        <w:t xml:space="preserve"> file for image correction.</w:t>
       </w:r>
     </w:p>
     <w:p>
@@ -4898,18 +6453,29 @@
         </w:numPr>
       </w:pPr>
       <w:r>
-        <w:t>But then can’t run in VM mode!</w:t>
-      </w:r>
-    </w:p>
-    <w:p>
-      <w:pPr>
-        <w:numPr>
-          <w:ilvl w:val="2"/>
-          <w:numId w:val="6"/>
-        </w:numPr>
-      </w:pPr>
-      <w:r>
-        <w:t xml:space="preserve">Pt hotspots may appear as only 3% Pt mineral and 97% silicates. But ALL of the Pt in them is from the Pt phase component. </w:t>
+        <w:t>Do we correct images here, or below?</w:t>
+      </w:r>
+    </w:p>
+    <w:p>
+      <w:pPr>
+        <w:numPr>
+          <w:ilvl w:val="4"/>
+          <w:numId w:val="6"/>
+        </w:numPr>
+      </w:pPr>
+      <w:r>
+        <w:t>Have another tab for image correction and projecting phase maps.</w:t>
+      </w:r>
+    </w:p>
+    <w:p>
+      <w:pPr>
+        <w:numPr>
+          <w:ilvl w:val="4"/>
+          <w:numId w:val="6"/>
+        </w:numPr>
+      </w:pPr>
+      <w:r>
+        <w:t>Some overlap with first tab of MPDA Wizard?</w:t>
       </w:r>
     </w:p>
     <w:p>
@@ -4920,81 +6486,7 @@
         </w:numPr>
       </w:pPr>
       <w:r>
-        <w:t xml:space="preserve">Fit using straight Pt works, MPDA </w:t>
-      </w:r>
-      <w:proofErr w:type="spellStart"/>
-      <w:r>
-        <w:t>rel</w:t>
-      </w:r>
-      <w:proofErr w:type="spellEnd"/>
-      <w:r>
-        <w:t xml:space="preserve"> int poor (Lg too high).</w:t>
-      </w:r>
-    </w:p>
-    <w:p>
-      <w:pPr>
-        <w:numPr>
-          <w:ilvl w:val="3"/>
-          <w:numId w:val="6"/>
-        </w:numPr>
-      </w:pPr>
-      <w:r>
-        <w:t>What relative intensities should be used?</w:t>
-      </w:r>
-    </w:p>
-    <w:p>
-      <w:pPr>
-        <w:numPr>
-          <w:ilvl w:val="2"/>
-          <w:numId w:val="6"/>
-        </w:numPr>
-      </w:pPr>
-      <w:r>
-        <w:t>Perhaps distinguish between trace elements and majors in formula?</w:t>
-      </w:r>
-    </w:p>
-    <w:p>
-      <w:pPr>
-        <w:numPr>
-          <w:ilvl w:val="3"/>
-          <w:numId w:val="6"/>
-        </w:numPr>
-      </w:pPr>
-      <w:r>
-        <w:t>But you weight by phase DA matrix, not element.</w:t>
-      </w:r>
-    </w:p>
-    <w:p>
-      <w:pPr>
-        <w:numPr>
-          <w:ilvl w:val="1"/>
-          <w:numId w:val="6"/>
-        </w:numPr>
-      </w:pPr>
-      <w:r>
-        <w:t>Correct Yield Wizard</w:t>
-      </w:r>
-    </w:p>
-    <w:p>
-      <w:pPr>
-        <w:numPr>
-          <w:ilvl w:val="2"/>
-          <w:numId w:val="6"/>
-        </w:numPr>
-      </w:pPr>
-      <w:r>
-        <w:t>How to guide through regions analysis?</w:t>
-      </w:r>
-    </w:p>
-    <w:p>
-      <w:pPr>
-        <w:numPr>
-          <w:ilvl w:val="3"/>
-          <w:numId w:val="6"/>
-        </w:numPr>
-      </w:pPr>
-      <w:r>
-        <w:t>Define major distinct phases and extract spectra from them.</w:t>
+        <w:t>Should have guides, or tests, to ensure phases are reasonable</w:t>
       </w:r>
     </w:p>
     <w:p>
@@ -5005,7 +6497,7 @@
         </w:numPr>
       </w:pPr>
       <w:r>
-        <w:t>Try to find pixels close to the pure phases.</w:t>
+        <w:t>Should not go well above 1.0 before clipping.</w:t>
       </w:r>
     </w:p>
     <w:p>
@@ -5016,56 +6508,18 @@
         </w:numPr>
       </w:pPr>
       <w:r>
-        <w:t>Don’t want them too diluted with non-pure phase contributions.</w:t>
-      </w:r>
-    </w:p>
-    <w:p>
-      <w:pPr>
-        <w:numPr>
-          <w:ilvl w:val="3"/>
-          <w:numId w:val="6"/>
-        </w:numPr>
-      </w:pPr>
-      <w:r>
-        <w:t>Fit each one to create a DA matrix for each using correct yields.</w:t>
-      </w:r>
-    </w:p>
-    <w:p>
-      <w:pPr>
-        <w:numPr>
-          <w:ilvl w:val="2"/>
-          <w:numId w:val="6"/>
-        </w:numPr>
-      </w:pPr>
-      <w:r>
-        <w:t>Need a “</w:t>
-      </w:r>
-      <w:proofErr w:type="spellStart"/>
-      <w:r>
-        <w:t>wt</w:t>
-      </w:r>
-      <w:proofErr w:type="spellEnd"/>
-      <w:r>
-        <w:t>%” tool/help to fill in composition matrix.</w:t>
-      </w:r>
-    </w:p>
-    <w:p>
-      <w:pPr>
-        <w:numPr>
-          <w:ilvl w:val="3"/>
-          <w:numId w:val="6"/>
-        </w:numPr>
-      </w:pPr>
-      <w:r>
-        <w:t xml:space="preserve">If define element columns first, then a “get” of a DA matrix row just fills in the </w:t>
-      </w:r>
-      <w:proofErr w:type="spellStart"/>
-      <w:r>
-        <w:t>wt</w:t>
-      </w:r>
-      <w:proofErr w:type="spellEnd"/>
-      <w:r>
-        <w:t>% for these elements in the table?</w:t>
+        <w:t>Should not be too small (Rest too close to 1.0 for most pixels).</w:t>
+      </w:r>
+    </w:p>
+    <w:p>
+      <w:pPr>
+        <w:numPr>
+          <w:ilvl w:val="5"/>
+          <w:numId w:val="6"/>
+        </w:numPr>
+      </w:pPr>
+      <w:r>
+        <w:t>Exception might be bone-like endmember in tissue ‘Rest’.</w:t>
       </w:r>
     </w:p>
     <w:p>
@@ -5076,195 +6530,6 @@
         </w:numPr>
       </w:pPr>
       <w:r>
-        <w:t>DA matrix file does NOT have this info.</w:t>
-      </w:r>
-    </w:p>
-    <w:p>
-      <w:pPr>
-        <w:numPr>
-          <w:ilvl w:val="5"/>
-          <w:numId w:val="6"/>
-        </w:numPr>
-      </w:pPr>
-      <w:r>
-        <w:t>Yield file does, so perhaps save this filename in DA matrix?</w:t>
-      </w:r>
-    </w:p>
-    <w:p>
-      <w:pPr>
-        <w:numPr>
-          <w:ilvl w:val="5"/>
-          <w:numId w:val="6"/>
-        </w:numPr>
-      </w:pPr>
-      <w:r>
-        <w:t>New version would be a pain for existing files.</w:t>
-      </w:r>
-    </w:p>
-    <w:p>
-      <w:pPr>
-        <w:numPr>
-          <w:ilvl w:val="4"/>
-          <w:numId w:val="6"/>
-        </w:numPr>
-      </w:pPr>
-      <w:r>
-        <w:t xml:space="preserve">Or, </w:t>
-      </w:r>
-      <w:proofErr w:type="spellStart"/>
-      <w:r>
-        <w:t>read_yield</w:t>
-      </w:r>
-      <w:proofErr w:type="spellEnd"/>
-      <w:r>
-        <w:t xml:space="preserve"> when typing in mineral name?</w:t>
-      </w:r>
-    </w:p>
-    <w:p>
-      <w:pPr>
-        <w:numPr>
-          <w:ilvl w:val="4"/>
-          <w:numId w:val="6"/>
-        </w:numPr>
-      </w:pPr>
-      <w:r>
-        <w:t>OK in COMAT file, as we use yield files there.</w:t>
-      </w:r>
-    </w:p>
-    <w:p>
-      <w:pPr>
-        <w:numPr>
-          <w:ilvl w:val="5"/>
-          <w:numId w:val="6"/>
-        </w:numPr>
-      </w:pPr>
-      <w:r>
-        <w:t>But do we want yields to override table entries?</w:t>
-      </w:r>
-    </w:p>
-    <w:p>
-      <w:pPr>
-        <w:numPr>
-          <w:ilvl w:val="3"/>
-          <w:numId w:val="6"/>
-        </w:numPr>
-      </w:pPr>
-      <w:r>
-        <w:t xml:space="preserve">Or, have a pop-up tool that reports </w:t>
-      </w:r>
-      <w:proofErr w:type="spellStart"/>
-      <w:r>
-        <w:t>wt</w:t>
-      </w:r>
-      <w:proofErr w:type="spellEnd"/>
-      <w:r>
-        <w:t>% from a selected .yield file?</w:t>
-      </w:r>
-    </w:p>
-    <w:p>
-      <w:pPr>
-        <w:numPr>
-          <w:ilvl w:val="4"/>
-          <w:numId w:val="6"/>
-        </w:numPr>
-      </w:pPr>
-    </w:p>
-    <w:p>
-      <w:pPr>
-        <w:numPr>
-          <w:ilvl w:val="2"/>
-          <w:numId w:val="6"/>
-        </w:numPr>
-      </w:pPr>
-      <w:r>
-        <w:t>Save .Correct file for image correction.</w:t>
-      </w:r>
-    </w:p>
-    <w:p>
-      <w:pPr>
-        <w:numPr>
-          <w:ilvl w:val="3"/>
-          <w:numId w:val="6"/>
-        </w:numPr>
-      </w:pPr>
-      <w:r>
-        <w:t>Do we correct images here, or below?</w:t>
-      </w:r>
-    </w:p>
-    <w:p>
-      <w:pPr>
-        <w:numPr>
-          <w:ilvl w:val="4"/>
-          <w:numId w:val="6"/>
-        </w:numPr>
-      </w:pPr>
-      <w:r>
-        <w:t>Have another tab for image correction and projecting phase maps.</w:t>
-      </w:r>
-    </w:p>
-    <w:p>
-      <w:pPr>
-        <w:numPr>
-          <w:ilvl w:val="4"/>
-          <w:numId w:val="6"/>
-        </w:numPr>
-      </w:pPr>
-      <w:r>
-        <w:t>Some overlap with first tab of MPDA Wizard?</w:t>
-      </w:r>
-    </w:p>
-    <w:p>
-      <w:pPr>
-        <w:numPr>
-          <w:ilvl w:val="3"/>
-          <w:numId w:val="6"/>
-        </w:numPr>
-      </w:pPr>
-      <w:r>
-        <w:t>Should have guides, or tests, to ensure phases are reasonable</w:t>
-      </w:r>
-    </w:p>
-    <w:p>
-      <w:pPr>
-        <w:numPr>
-          <w:ilvl w:val="4"/>
-          <w:numId w:val="6"/>
-        </w:numPr>
-      </w:pPr>
-      <w:r>
-        <w:t>Should not go well above 1.0 before clipping.</w:t>
-      </w:r>
-    </w:p>
-    <w:p>
-      <w:pPr>
-        <w:numPr>
-          <w:ilvl w:val="4"/>
-          <w:numId w:val="6"/>
-        </w:numPr>
-      </w:pPr>
-      <w:r>
-        <w:t>Should not be too small (Rest too close to 1.0 for most pixels).</w:t>
-      </w:r>
-    </w:p>
-    <w:p>
-      <w:pPr>
-        <w:numPr>
-          <w:ilvl w:val="5"/>
-          <w:numId w:val="6"/>
-        </w:numPr>
-      </w:pPr>
-      <w:r>
-        <w:t>Exception might be bone-like endmember in tissue ‘Rest’.</w:t>
-      </w:r>
-    </w:p>
-    <w:p>
-      <w:pPr>
-        <w:numPr>
-          <w:ilvl w:val="4"/>
-          <w:numId w:val="6"/>
-        </w:numPr>
-      </w:pPr>
-      <w:r>
         <w:t>Build this into existing ‘</w:t>
       </w:r>
       <w:proofErr w:type="spellStart"/>
@@ -5284,7 +6549,15 @@
         </w:numPr>
       </w:pPr>
       <w:r>
-        <w:t>For MPDA, continue on …</w:t>
+        <w:t xml:space="preserve">For MPDA, </w:t>
+      </w:r>
+      <w:proofErr w:type="gramStart"/>
+      <w:r>
+        <w:t>continue on</w:t>
+      </w:r>
+      <w:proofErr w:type="gramEnd"/>
+      <w:r>
+        <w:t xml:space="preserve"> …</w:t>
       </w:r>
     </w:p>
     <w:p>
@@ -5380,7 +6653,6 @@
         </w:numPr>
       </w:pPr>
       <w:r>
-        <w:lastRenderedPageBreak/>
         <w:t>May be fixed with IDL 9.0?</w:t>
       </w:r>
     </w:p>
@@ -5431,6 +6703,7 @@
         </w:numPr>
       </w:pPr>
       <w:r>
+        <w:lastRenderedPageBreak/>
         <w:t>Process loops waiting for new command, sets shared memory flag (count?) – but what about during a long operation?</w:t>
       </w:r>
     </w:p>
@@ -5817,20 +7090,66 @@
         <w:t>‘</w:t>
       </w:r>
       <w:proofErr w:type="spellStart"/>
+      <w:proofErr w:type="gramStart"/>
+      <w:r>
+        <w:t>get</w:t>
+      </w:r>
+      <w:proofErr w:type="gramEnd"/>
+      <w:r>
+        <w:t>_lines</w:t>
+      </w:r>
+      <w:proofErr w:type="spellEnd"/>
+      <w:r>
+        <w:t xml:space="preserve">’ does not use source lines now, but it could, if enabled. Then these could be jammed in for matching Z and shell. Would still follow sample conc with depth, which is wrong, but may give reasonable </w:t>
+      </w:r>
+      <w:proofErr w:type="spellStart"/>
+      <w:r>
+        <w:t>rel</w:t>
+      </w:r>
+      <w:proofErr w:type="spellEnd"/>
+      <w:r>
+        <w:t>-int anyway.</w:t>
+      </w:r>
+    </w:p>
+    <w:p>
+      <w:pPr>
+        <w:numPr>
+          <w:ilvl w:val="3"/>
+          <w:numId w:val="6"/>
+        </w:numPr>
+      </w:pPr>
+      <w:r>
+        <w:t>Where to select source lines to take precedence?</w:t>
+      </w:r>
+    </w:p>
+    <w:p>
+      <w:pPr>
+        <w:numPr>
+          <w:ilvl w:val="4"/>
+          <w:numId w:val="6"/>
+        </w:numPr>
+      </w:pPr>
+      <w:r>
+        <w:t>Must be during yield calculation, not the fit.</w:t>
+      </w:r>
+    </w:p>
+    <w:p>
+      <w:pPr>
+        <w:numPr>
+          <w:ilvl w:val="4"/>
+          <w:numId w:val="6"/>
+        </w:numPr>
+      </w:pPr>
+      <w:r>
+        <w:t>Could select in ‘</w:t>
+      </w:r>
+      <w:proofErr w:type="spellStart"/>
       <w:r>
         <w:t>get_lines</w:t>
       </w:r>
       <w:proofErr w:type="spellEnd"/>
       <w:r>
-        <w:t xml:space="preserve">’ does not use source lines now, but it could, if enabled. Then these could be jammed in for matching Z and shell. Would still follow sample conc with depth, which is wrong, but may give reasonable </w:t>
-      </w:r>
-      <w:proofErr w:type="spellStart"/>
-      <w:r>
-        <w:t>rel</w:t>
-      </w:r>
-      <w:proofErr w:type="spellEnd"/>
-      <w:r>
-        <w:t>-int anyway.</w:t>
+        <w:t>’ called from ‘geo_yield2’.</w:t>
       </w:r>
     </w:p>
     <w:p>
@@ -5841,7 +7160,7 @@
         </w:numPr>
       </w:pPr>
       <w:r>
-        <w:t>Where to select source lines to take precedence?</w:t>
+        <w:t>Could simply assume that source lines take priority?</w:t>
       </w:r>
     </w:p>
     <w:p>
@@ -5852,7 +7171,15 @@
         </w:numPr>
       </w:pPr>
       <w:r>
-        <w:t>Must be during yield calculation, not the fit.</w:t>
+        <w:t>Then just jam them in, in ‘</w:t>
+      </w:r>
+      <w:proofErr w:type="spellStart"/>
+      <w:r>
+        <w:t>get_lines</w:t>
+      </w:r>
+      <w:proofErr w:type="spellEnd"/>
+      <w:r>
+        <w:t>’.</w:t>
       </w:r>
     </w:p>
     <w:p>
@@ -5863,41 +7190,90 @@
         </w:numPr>
       </w:pPr>
       <w:r>
-        <w:t>Could select in ‘</w:t>
-      </w:r>
-      <w:proofErr w:type="spellStart"/>
-      <w:r>
-        <w:t>get_lines</w:t>
-      </w:r>
-      <w:proofErr w:type="spellEnd"/>
-      <w:r>
-        <w:t>’ called from ‘geo_yield2’.</w:t>
-      </w:r>
-    </w:p>
-    <w:p>
-      <w:pPr>
-        <w:numPr>
-          <w:ilvl w:val="3"/>
-          <w:numId w:val="6"/>
-        </w:numPr>
-      </w:pPr>
-      <w:r>
-        <w:t>Could simply assume that source lines take priority?</w:t>
-      </w:r>
-    </w:p>
-    <w:p>
-      <w:pPr>
-        <w:numPr>
-          <w:ilvl w:val="4"/>
-          <w:numId w:val="6"/>
-        </w:numPr>
-      </w:pPr>
-      <w:r>
-        <w:t>Then just jam them in, in ‘</w:t>
-      </w:r>
-      <w:proofErr w:type="spellStart"/>
-      <w:r>
-        <w:t>get_lines</w:t>
+        <w:t>Make sure Ga K not filtered out somewhere …</w:t>
+      </w:r>
+    </w:p>
+    <w:p>
+      <w:pPr>
+        <w:numPr>
+          <w:ilvl w:val="1"/>
+          <w:numId w:val="6"/>
+        </w:numPr>
+      </w:pPr>
+      <w:r>
+        <w:t>Pileup peak widths</w:t>
+      </w:r>
+    </w:p>
+    <w:p>
+      <w:pPr>
+        <w:numPr>
+          <w:ilvl w:val="2"/>
+          <w:numId w:val="6"/>
+        </w:numPr>
+      </w:pPr>
+      <w:r>
+        <w:t>Could add a ‘</w:t>
+      </w:r>
+      <w:proofErr w:type="spellStart"/>
+      <w:r>
+        <w:t>sum_spread</w:t>
+      </w:r>
+      <w:proofErr w:type="spellEnd"/>
+      <w:r>
+        <w:t xml:space="preserve">’ argument to </w:t>
+      </w:r>
+      <w:proofErr w:type="spellStart"/>
+      <w:proofErr w:type="gramStart"/>
+      <w:r>
+        <w:t>pixe</w:t>
+      </w:r>
+      <w:proofErr w:type="spellEnd"/>
+      <w:r>
+        <w:t>(</w:t>
+      </w:r>
+      <w:proofErr w:type="gramEnd"/>
+      <w:r>
+        <w:t>) to broaden sum peaks.</w:t>
+      </w:r>
+    </w:p>
+    <w:p>
+      <w:pPr>
+        <w:numPr>
+          <w:ilvl w:val="2"/>
+          <w:numId w:val="6"/>
+        </w:numPr>
+      </w:pPr>
+      <w:r>
+        <w:lastRenderedPageBreak/>
+        <w:t>In ‘</w:t>
+      </w:r>
+      <w:proofErr w:type="spellStart"/>
+      <w:r>
+        <w:t>pixe</w:t>
+      </w:r>
+      <w:proofErr w:type="spellEnd"/>
+      <w:r>
+        <w:t>’ set ‘sum’ flag (like ‘comp’) to broaden sum peaks in ‘line’ using a new ‘</w:t>
+      </w:r>
+      <w:proofErr w:type="spellStart"/>
+      <w:r>
+        <w:t>sum_spread</w:t>
+      </w:r>
+      <w:proofErr w:type="spellEnd"/>
+      <w:r>
+        <w:t>’ parameter. Set this in ‘</w:t>
+      </w:r>
+      <w:proofErr w:type="spellStart"/>
+      <w:r>
+        <w:t>pixe_fit</w:t>
+      </w:r>
+      <w:proofErr w:type="spellEnd"/>
+      <w:r>
+        <w:t>’ based on ‘</w:t>
+      </w:r>
+      <w:proofErr w:type="spellStart"/>
+      <w:r>
+        <w:t>sum_deficit</w:t>
       </w:r>
       <w:proofErr w:type="spellEnd"/>
       <w:r>
@@ -5907,35 +7283,12 @@
     <w:p>
       <w:pPr>
         <w:numPr>
-          <w:ilvl w:val="4"/>
-          <w:numId w:val="6"/>
-        </w:numPr>
-      </w:pPr>
-      <w:r>
-        <w:lastRenderedPageBreak/>
-        <w:t>Make sure Ga K not filtered out somewhere …</w:t>
-      </w:r>
-    </w:p>
-    <w:p>
-      <w:pPr>
-        <w:numPr>
-          <w:ilvl w:val="1"/>
-          <w:numId w:val="6"/>
-        </w:numPr>
-      </w:pPr>
-      <w:r>
-        <w:t>Pileup peak widths</w:t>
-      </w:r>
-    </w:p>
-    <w:p>
-      <w:pPr>
-        <w:numPr>
-          <w:ilvl w:val="2"/>
-          <w:numId w:val="6"/>
-        </w:numPr>
-      </w:pPr>
-      <w:r>
-        <w:t>Could add a ‘</w:t>
+          <w:ilvl w:val="2"/>
+          <w:numId w:val="6"/>
+        </w:numPr>
+      </w:pPr>
+      <w:r>
+        <w:t xml:space="preserve">Try: </w:t>
       </w:r>
       <w:proofErr w:type="spellStart"/>
       <w:r>
@@ -5943,50 +7296,7 @@
       </w:r>
       <w:proofErr w:type="spellEnd"/>
       <w:r>
-        <w:t xml:space="preserve">’ argument to </w:t>
-      </w:r>
-      <w:proofErr w:type="spellStart"/>
-      <w:r>
-        <w:t>pixe</w:t>
-      </w:r>
-      <w:proofErr w:type="spellEnd"/>
-      <w:r>
-        <w:t>() to broaden sum peaks.</w:t>
-      </w:r>
-    </w:p>
-    <w:p>
-      <w:pPr>
-        <w:numPr>
-          <w:ilvl w:val="2"/>
-          <w:numId w:val="6"/>
-        </w:numPr>
-      </w:pPr>
-      <w:r>
-        <w:t>In ‘</w:t>
-      </w:r>
-      <w:proofErr w:type="spellStart"/>
-      <w:r>
-        <w:t>pixe</w:t>
-      </w:r>
-      <w:proofErr w:type="spellEnd"/>
-      <w:r>
-        <w:t>’ set ‘sum’ flag (like ‘comp’) to broaden sum peaks in ‘line’ using a new ‘</w:t>
-      </w:r>
-      <w:proofErr w:type="spellStart"/>
-      <w:r>
-        <w:t>sum_spread</w:t>
-      </w:r>
-      <w:proofErr w:type="spellEnd"/>
-      <w:r>
-        <w:t>’ parameter. Set this in ‘</w:t>
-      </w:r>
-      <w:proofErr w:type="spellStart"/>
-      <w:r>
-        <w:t>pixe_fit</w:t>
-      </w:r>
-      <w:proofErr w:type="spellEnd"/>
-      <w:r>
-        <w:t>’ based on ‘</w:t>
+        <w:t xml:space="preserve"> = (1.0 + </w:t>
       </w:r>
       <w:proofErr w:type="spellStart"/>
       <w:r>
@@ -5994,34 +7304,15 @@
       </w:r>
       <w:proofErr w:type="spellEnd"/>
       <w:r>
-        <w:t>’.</w:t>
-      </w:r>
-    </w:p>
-    <w:p>
-      <w:pPr>
-        <w:numPr>
-          <w:ilvl w:val="2"/>
-          <w:numId w:val="6"/>
-        </w:numPr>
-      </w:pPr>
-      <w:r>
-        <w:t xml:space="preserve">Try: </w:t>
-      </w:r>
-      <w:proofErr w:type="spellStart"/>
-      <w:r>
-        <w:t>sum_spread</w:t>
-      </w:r>
-      <w:proofErr w:type="spellEnd"/>
-      <w:r>
-        <w:t xml:space="preserve"> = (1.0 + </w:t>
-      </w:r>
-      <w:proofErr w:type="spellStart"/>
-      <w:r>
-        <w:t>sum_deficit</w:t>
-      </w:r>
-      <w:proofErr w:type="spellEnd"/>
-      <w:r>
-        <w:t>/100.)^2</w:t>
+        <w:t>/100</w:t>
+      </w:r>
+      <w:proofErr w:type="gramStart"/>
+      <w:r>
+        <w:t>.)^</w:t>
+      </w:r>
+      <w:proofErr w:type="gramEnd"/>
+      <w:r>
+        <w:t>2</w:t>
       </w:r>
     </w:p>
     <w:p>
@@ -6298,7 +7589,15 @@
       </w:r>
       <w:proofErr w:type="spellEnd"/>
       <w:r>
-        <w:t>’, so they work with “Get” and also triggered from “Apply Digital Filters” in batch sorting.</w:t>
+        <w:t xml:space="preserve">’, so they work with “Get” </w:t>
+      </w:r>
+      <w:proofErr w:type="gramStart"/>
+      <w:r>
+        <w:t>and also</w:t>
+      </w:r>
+      <w:proofErr w:type="gramEnd"/>
+      <w:r>
+        <w:t xml:space="preserve"> triggered from “Apply Digital Filters” in batch sorting.</w:t>
       </w:r>
     </w:p>
     <w:p>
@@ -6400,7 +7699,31 @@
         </w:numPr>
       </w:pPr>
       <w:r>
-        <w:t xml:space="preserve">X^(1./3), X^(1./5), X^(1./10), </w:t>
+        <w:t>X</w:t>
+      </w:r>
+      <w:proofErr w:type="gramStart"/>
+      <w:r>
+        <w:t>^(1./</w:t>
+      </w:r>
+      <w:proofErr w:type="gramEnd"/>
+      <w:r>
+        <w:t>3), X</w:t>
+      </w:r>
+      <w:proofErr w:type="gramStart"/>
+      <w:r>
+        <w:t>^(1./</w:t>
+      </w:r>
+      <w:proofErr w:type="gramEnd"/>
+      <w:r>
+        <w:t>5), X</w:t>
+      </w:r>
+      <w:proofErr w:type="gramStart"/>
+      <w:r>
+        <w:t>^(1./</w:t>
+      </w:r>
+      <w:proofErr w:type="gramEnd"/>
+      <w:r>
+        <w:t xml:space="preserve">10), </w:t>
       </w:r>
       <w:proofErr w:type="spellStart"/>
       <w:r>
@@ -6499,9 +7822,14 @@
         </w:numPr>
       </w:pPr>
       <w:r>
-        <w:t>Perhaps use util routine:  ‘</w:t>
-      </w:r>
-      <w:proofErr w:type="spellStart"/>
+        <w:t>Perhaps use util routine</w:t>
+      </w:r>
+      <w:proofErr w:type="gramStart"/>
+      <w:r>
+        <w:t>:  ‘</w:t>
+      </w:r>
+      <w:proofErr w:type="spellStart"/>
+      <w:proofErr w:type="gramEnd"/>
       <w:r>
         <w:t>strip_file_keys</w:t>
       </w:r>
@@ -9099,7 +10427,6 @@
   <w:style w:type="character" w:default="1" w:styleId="DefaultParagraphFont">
     <w:name w:val="Default Paragraph Font"/>
     <w:uiPriority w:val="1"/>
-    <w:semiHidden/>
     <w:unhideWhenUsed/>
   </w:style>
   <w:style w:type="table" w:default="1" w:styleId="TableNormal">

</xml_diff>